<commit_message>
docs(broker): publish live operations field guide
Signed-off-by: Lutar, Stephen P. <stephenlutar2@gmail.com>
</commit_message>
<xml_diff>
--- a/David_Leads_Broker_Guide.docx
+++ b/David_Leads_Broker_Guide.docx
@@ -4,32 +4,32 @@
   <w:body>
     <w:p>
       <w:pPr>
-        <w:spacing w:before="200" w:after="40"/>
+        <w:spacing w:after="60"/>
       </w:pPr>
       <w:r>
         <w:rPr>
           <w:rFonts w:ascii="Calibri" w:hAnsi="Calibri"/>
           <w:b/>
-          <w:i w:val="0"/>
-          <w:color w:val="148984"/>
-          <w:sz w:val="18"/>
+          <w:color w:val="B78327"/>
+          <w:sz w:val="19"/>
         </w:rPr>
-        <w:t>BROKER OPERATING GUIDE</w:t>
+        <w:t>BROKER ENABLEMENT PACK</w:t>
       </w:r>
     </w:p>
     <w:p>
       <w:pPr>
-        <w:spacing w:before="0" w:after="120"/>
+        <w:pStyle w:val="Title"/>
       </w:pPr>
       <w:r>
-        <w:rPr>
-          <w:rFonts w:ascii="Calibri" w:hAnsi="Calibri"/>
-          <w:b/>
-          <w:i w:val="0"/>
-          <w:color w:val="0B2545"/>
-          <w:sz w:val="60"/>
-        </w:rPr>
         <w:t>David Leads</w:t>
+      </w:r>
+    </w:p>
+    <w:p>
+      <w:pPr>
+        <w:pStyle w:val="Subtitle"/>
+      </w:pPr>
+      <w:r>
+        <w:t>A plain-English field guide for the live Eastern Market Cockpit</w:t>
       </w:r>
     </w:p>
     <w:p>
@@ -39,26 +39,174 @@
       <w:r>
         <w:rPr>
           <w:rFonts w:ascii="Calibri" w:hAnsi="Calibri"/>
-          <w:b w:val="0"/>
+          <w:b/>
+          <w:color w:val="5A6B7C"/>
+          <w:sz w:val="21"/>
+        </w:rPr>
+        <w:t>Prepared for David Abraham  |  Verified August 1, 2026</w:t>
+      </w:r>
+    </w:p>
+    <w:p>
+      <w:pPr>
+        <w:spacing w:before="80" w:after="200" w:line="288" w:lineRule="auto"/>
+        <w:shd w:fill="E8F6F4" w:val="clear"/>
+        <w:pBdr>
+          <w:left w:val="single" w:sz="18" w:space="8" w:color="168F89"/>
+        </w:pBdr>
+        <w:ind w:left="180" w:right="120"/>
+      </w:pPr>
+      <w:r>
+        <w:rPr>
+          <w:rFonts w:ascii="Calibri" w:hAnsi="Calibri"/>
+          <w:b/>
+          <w:color w:val="0A2540"/>
+        </w:rPr>
+        <w:t xml:space="preserve">Start here: </w:t>
+      </w:r>
+      <w:r>
+        <w:rPr>
+          <w:rFonts w:ascii="Calibri" w:hAnsi="Calibri"/>
+          <w:color w:val="1F2933"/>
+        </w:rPr>
+        <w:t>Viewing the live research workspace does not require a username, password, or access key. Open the web address below in Chrome, Edge, Safari, or a phone browser.</w:t>
+      </w:r>
+    </w:p>
+    <w:p>
+      <w:pPr>
+        <w:spacing w:after="320"/>
+      </w:pPr>
+      <w:hyperlink r:id="rId11">
+        <w:r>
+          <w:rPr>
+            <w:color w:val="168F89"/>
+            <w:u w:val="single"/>
+            <w:b/>
+            <w:rFonts w:ascii="Calibri" w:hAnsi="Calibri"/>
+            <w:sz w:val="22"/>
+          </w:rPr>
+          <w:t>Open David Leads</w:t>
+        </w:r>
+      </w:hyperlink>
+    </w:p>
+    <w:p>
+      <w:pPr>
+        <w:pStyle w:val="Heading1"/>
+        <w:keepNext/>
+      </w:pPr>
+      <w:r>
+        <w:t>What David Leads does</w:t>
+      </w:r>
+    </w:p>
+    <w:p>
+      <w:pPr>
+        <w:spacing w:after="120" w:line="300" w:lineRule="auto"/>
+      </w:pPr>
+      <w:r>
+        <w:rPr>
+          <w:rFonts w:ascii="Calibri" w:hAnsi="Calibri"/>
           <w:i w:val="0"/>
-          <w:color w:val="5C697A"/>
-          <w:sz w:val="28"/>
+          <w:color w:val="1F2933"/>
         </w:rPr>
-        <w:t>From verified public signal to the next lawful broker action</w:t>
+        <w:t>It gathers current organization-level records from official public sources, shows the business event that changed, explains why the timing may deserve research, and links back to the source record. It is a research desk, not a purchased contact list.</w:t>
+      </w:r>
+    </w:p>
+    <w:p>
+      <w:pPr>
+        <w:numPr>
+          <w:ilvl w:val="0"/>
+          <w:numId w:val="10"/>
+        </w:numPr>
+        <w:spacing w:after="80" w:line="300" w:lineRule="auto"/>
+      </w:pPr>
+      <w:r>
+        <w:rPr>
+          <w:rFonts w:ascii="Calibri" w:hAnsi="Calibri"/>
+          <w:color w:val="1F2933"/>
+        </w:rPr>
+        <w:t>Choose all 27 Eastern markets, a region, or one state.</w:t>
+      </w:r>
+    </w:p>
+    <w:p>
+      <w:pPr>
+        <w:numPr>
+          <w:ilvl w:val="0"/>
+          <w:numId w:val="10"/>
+        </w:numPr>
+        <w:spacing w:after="80" w:line="300" w:lineRule="auto"/>
+      </w:pPr>
+      <w:r>
+        <w:rPr>
+          <w:rFonts w:ascii="Calibri" w:hAnsi="Calibri"/>
+          <w:color w:val="1F2933"/>
+        </w:rPr>
+        <w:t>See live business and facility records with source links and receipts.</w:t>
+      </w:r>
+    </w:p>
+    <w:p>
+      <w:pPr>
+        <w:numPr>
+          <w:ilvl w:val="0"/>
+          <w:numId w:val="10"/>
+        </w:numPr>
+        <w:spacing w:after="80" w:line="300" w:lineRule="auto"/>
+      </w:pPr>
+      <w:r>
+        <w:rPr>
+          <w:rFonts w:ascii="Calibri" w:hAnsi="Calibri"/>
+          <w:color w:val="1F2933"/>
+        </w:rPr>
+        <w:t>Focus on the strongest timing signals before doing manual research.</w:t>
+      </w:r>
+    </w:p>
+    <w:p>
+      <w:pPr>
+        <w:numPr>
+          <w:ilvl w:val="0"/>
+          <w:numId w:val="10"/>
+        </w:numPr>
+        <w:spacing w:after="80" w:line="300" w:lineRule="auto"/>
+      </w:pPr>
+      <w:r>
+        <w:rPr>
+          <w:rFonts w:ascii="Calibri" w:hAnsi="Calibri"/>
+          <w:color w:val="1F2933"/>
+        </w:rPr>
+        <w:t>Keep every outreach decision behind a human compliance check.</w:t>
+      </w:r>
+    </w:p>
+    <w:p>
+      <w:pPr>
+        <w:pStyle w:val="Heading2"/>
+        <w:keepNext/>
+      </w:pPr>
+      <w:r>
+        <w:t>Verified live check</w:t>
+      </w:r>
+    </w:p>
+    <w:p>
+      <w:pPr>
+        <w:spacing w:after="120" w:line="300" w:lineRule="auto"/>
+      </w:pPr>
+      <w:r>
+        <w:rPr>
+          <w:rFonts w:ascii="Calibri" w:hAnsi="Calibri"/>
+          <w:i/>
+          <w:color w:val="5A6B7C"/>
+        </w:rPr>
+        <w:t>The figures below were observed during the August 1 verification. Counts change as public sources change.</w:t>
       </w:r>
     </w:p>
     <w:tbl>
       <w:tblPr>
-        <w:tblStyle w:val="TableGrid"/>
         <w:tblW w:type="dxa" w:w="9360"/>
-        <w:jc w:val="left"/>
         <w:tblLayout w:type="fixed"/>
         <w:tblLook w:firstColumn="1" w:firstRow="1" w:lastColumn="0" w:lastRow="0" w:noHBand="0" w:noVBand="1" w:val="04A0"/>
-        <w:tblInd w:type="dxa" w:w="120"/>
+        <w:jc w:val="left"/>
+        <w:tblInd w:w="120" w:type="dxa"/>
       </w:tblPr>
       <w:tblGrid>
-        <w:gridCol w:w="2200"/>
-        <w:gridCol w:w="7160"/>
+        <w:gridCol w:w="2700"/>
+        <w:gridCol w:w="6660"/>
       </w:tblGrid>
       <w:tr>
         <w:trPr>
@@ -66,356 +214,349 @@
         </w:trPr>
         <w:tc>
           <w:tcPr>
-            <w:tcW w:type="dxa" w:w="2200"/>
+            <w:tcW w:type="dxa" w:w="2700"/>
             <w:vAlign w:val="center"/>
-            <w:shd w:fill="0B2545"/>
             <w:tcMar>
-              <w:top w:w="130" w:type="dxa"/>
-              <w:bottom w:w="130" w:type="dxa"/>
+              <w:top w:w="80" w:type="dxa"/>
+              <w:bottom w:w="80" w:type="dxa"/>
+              <w:start w:w="120" w:type="dxa"/>
+              <w:end w:w="120" w:type="dxa"/>
+            </w:tcMar>
+            <w:shd w:fill="0A2540" w:val="clear"/>
+          </w:tcPr>
+          <w:p>
+            <w:pPr>
+              <w:spacing w:after="0" w:line="276" w:lineRule="auto"/>
+              <w:jc w:val="left"/>
+            </w:pPr>
+            <w:r>
+              <w:rPr>
+                <w:rFonts w:ascii="Calibri" w:hAnsi="Calibri"/>
+                <w:b/>
+                <w:color w:val="FFFFFF"/>
+                <w:sz w:val="21"/>
+              </w:rPr>
+              <w:t>Check</w:t>
+            </w:r>
+          </w:p>
+        </w:tc>
+        <w:tc>
+          <w:tcPr>
+            <w:tcW w:type="dxa" w:w="6660"/>
+            <w:vAlign w:val="center"/>
+            <w:tcMar>
+              <w:top w:w="80" w:type="dxa"/>
+              <w:bottom w:w="80" w:type="dxa"/>
+              <w:start w:w="120" w:type="dxa"/>
+              <w:end w:w="120" w:type="dxa"/>
+            </w:tcMar>
+            <w:shd w:fill="0A2540" w:val="clear"/>
+          </w:tcPr>
+          <w:p>
+            <w:pPr>
+              <w:spacing w:after="0" w:line="276" w:lineRule="auto"/>
+              <w:jc w:val="left"/>
+            </w:pPr>
+            <w:r>
+              <w:rPr>
+                <w:rFonts w:ascii="Calibri" w:hAnsi="Calibri"/>
+                <w:b/>
+                <w:color w:val="FFFFFF"/>
+                <w:sz w:val="21"/>
+              </w:rPr>
+              <w:t>Observed result</w:t>
+            </w:r>
+          </w:p>
+        </w:tc>
+      </w:tr>
+      <w:tr>
+        <w:tc>
+          <w:tcPr>
+            <w:tcW w:type="dxa" w:w="2700"/>
+            <w:vAlign w:val="center"/>
+            <w:tcMar>
+              <w:top w:w="80" w:type="dxa"/>
+              <w:bottom w:w="80" w:type="dxa"/>
               <w:start w:w="120" w:type="dxa"/>
               <w:end w:w="120" w:type="dxa"/>
             </w:tcMar>
           </w:tcPr>
           <w:p>
             <w:pPr>
-              <w:spacing w:after="0"/>
+              <w:spacing w:after="0" w:line="276" w:lineRule="auto"/>
+              <w:jc w:val="left"/>
             </w:pPr>
             <w:r>
               <w:rPr>
                 <w:rFonts w:ascii="Calibri" w:hAnsi="Calibri"/>
                 <w:b/>
-                <w:i w:val="0"/>
-                <w:color w:val="FFFFFF"/>
-                <w:sz w:val="17"/>
+                <w:color w:val="0A2540"/>
+                <w:sz w:val="21"/>
               </w:rPr>
-              <w:t>AT A GLANCE</w:t>
+              <w:t>Access</w:t>
             </w:r>
           </w:p>
         </w:tc>
         <w:tc>
           <w:tcPr>
-            <w:tcW w:type="dxa" w:w="7160"/>
+            <w:tcW w:type="dxa" w:w="6660"/>
             <w:vAlign w:val="center"/>
-            <w:shd w:fill="0B2545"/>
             <w:tcMar>
-              <w:top w:w="130" w:type="dxa"/>
-              <w:bottom w:w="130" w:type="dxa"/>
+              <w:top w:w="80" w:type="dxa"/>
+              <w:bottom w:w="80" w:type="dxa"/>
               <w:start w:w="120" w:type="dxa"/>
               <w:end w:w="120" w:type="dxa"/>
             </w:tcMar>
           </w:tcPr>
           <w:p>
             <w:pPr>
-              <w:spacing w:after="0"/>
+              <w:spacing w:after="0" w:line="276" w:lineRule="auto"/>
+              <w:jc w:val="left"/>
             </w:pPr>
             <w:r>
               <w:rPr>
                 <w:rFonts w:ascii="Calibri" w:hAnsi="Calibri"/>
-                <w:b/>
-                <w:i w:val="0"/>
-                <w:color w:val="FFFFFF"/>
-                <w:sz w:val="17"/>
+                <w:b w:val="0"/>
+                <w:color w:val="1F2933"/>
+                <w:sz w:val="21"/>
               </w:rPr>
-              <w:t>WHAT IT MEANS</w:t>
+              <w:t>Public research opens with no login.</w:t>
             </w:r>
           </w:p>
         </w:tc>
       </w:tr>
       <w:tr>
-        <w:trPr/>
         <w:tc>
           <w:tcPr>
-            <w:tcW w:type="dxa" w:w="2200"/>
+            <w:tcW w:type="dxa" w:w="2700"/>
+            <w:shd w:fill="F5F8FB" w:val="clear"/>
             <w:vAlign w:val="center"/>
-            <w:shd w:fill="E8EEF5"/>
             <w:tcMar>
-              <w:top w:w="130" w:type="dxa"/>
-              <w:bottom w:w="130" w:type="dxa"/>
+              <w:top w:w="80" w:type="dxa"/>
+              <w:bottom w:w="80" w:type="dxa"/>
               <w:start w:w="120" w:type="dxa"/>
               <w:end w:w="120" w:type="dxa"/>
             </w:tcMar>
           </w:tcPr>
           <w:p>
             <w:pPr>
-              <w:spacing w:after="40" w:line="264" w:lineRule="auto"/>
+              <w:spacing w:after="0" w:line="276" w:lineRule="auto"/>
+              <w:jc w:val="left"/>
             </w:pPr>
             <w:r>
               <w:rPr>
                 <w:rFonts w:ascii="Calibri" w:hAnsi="Calibri"/>
                 <w:b/>
-                <w:i w:val="0"/>
-                <w:color w:val="148984"/>
-                <w:sz w:val="17"/>
+                <w:color w:val="0A2540"/>
+                <w:sz w:val="21"/>
               </w:rPr>
-              <w:t>OPEN</w:t>
+              <w:t>Territory</w:t>
             </w:r>
           </w:p>
         </w:tc>
         <w:tc>
           <w:tcPr>
-            <w:tcW w:type="dxa" w:w="7160"/>
+            <w:tcW w:type="dxa" w:w="6660"/>
+            <w:shd w:fill="F5F8FB" w:val="clear"/>
             <w:vAlign w:val="center"/>
-            <w:shd w:fill="FFFFFF"/>
             <w:tcMar>
-              <w:top w:w="130" w:type="dxa"/>
-              <w:bottom w:w="130" w:type="dxa"/>
+              <w:top w:w="80" w:type="dxa"/>
+              <w:bottom w:w="80" w:type="dxa"/>
               <w:start w:w="120" w:type="dxa"/>
               <w:end w:w="120" w:type="dxa"/>
             </w:tcMar>
           </w:tcPr>
           <w:p>
             <w:pPr>
-              <w:spacing w:before="0" w:after="0" w:line="276" w:lineRule="auto"/>
+              <w:spacing w:after="0" w:line="276" w:lineRule="auto"/>
+              <w:jc w:val="left"/>
             </w:pPr>
             <w:r>
               <w:rPr>
                 <w:rFonts w:ascii="Calibri" w:hAnsi="Calibri"/>
-                <w:b/>
-                <w:i w:val="0"/>
-                <w:color w:val="0B2545"/>
+                <w:b w:val="0"/>
+                <w:color w:val="1F2933"/>
                 <w:sz w:val="21"/>
               </w:rPr>
-              <w:t>No login for the public research view</w:t>
+              <w:t>27 Eastern states are selectable on desktop and mobile.</w:t>
             </w:r>
           </w:p>
         </w:tc>
       </w:tr>
       <w:tr>
-        <w:trPr/>
         <w:tc>
           <w:tcPr>
-            <w:tcW w:type="dxa" w:w="2200"/>
+            <w:tcW w:type="dxa" w:w="2700"/>
             <w:vAlign w:val="center"/>
-            <w:shd w:fill="E8EEF5"/>
             <w:tcMar>
-              <w:top w:w="130" w:type="dxa"/>
-              <w:bottom w:w="130" w:type="dxa"/>
+              <w:top w:w="80" w:type="dxa"/>
+              <w:bottom w:w="80" w:type="dxa"/>
               <w:start w:w="120" w:type="dxa"/>
               <w:end w:w="120" w:type="dxa"/>
             </w:tcMar>
           </w:tcPr>
           <w:p>
             <w:pPr>
-              <w:spacing w:after="40" w:line="264" w:lineRule="auto"/>
+              <w:spacing w:after="0" w:line="276" w:lineRule="auto"/>
+              <w:jc w:val="left"/>
             </w:pPr>
             <w:r>
               <w:rPr>
                 <w:rFonts w:ascii="Calibri" w:hAnsi="Calibri"/>
                 <w:b/>
-                <w:i w:val="0"/>
-                <w:color w:val="148984"/>
-                <w:sz w:val="17"/>
+                <w:color w:val="0A2540"/>
+                <w:sz w:val="21"/>
               </w:rPr>
-              <w:t>COVERAGE</w:t>
+              <w:t>Live records</w:t>
             </w:r>
           </w:p>
         </w:tc>
         <w:tc>
           <w:tcPr>
-            <w:tcW w:type="dxa" w:w="7160"/>
+            <w:tcW w:type="dxa" w:w="6660"/>
             <w:vAlign w:val="center"/>
-            <w:shd w:fill="FFFFFF"/>
             <w:tcMar>
-              <w:top w:w="130" w:type="dxa"/>
-              <w:bottom w:w="130" w:type="dxa"/>
+              <w:top w:w="80" w:type="dxa"/>
+              <w:bottom w:w="80" w:type="dxa"/>
               <w:start w:w="120" w:type="dxa"/>
               <w:end w:w="120" w:type="dxa"/>
             </w:tcMar>
           </w:tcPr>
           <w:p>
             <w:pPr>
-              <w:spacing w:before="0" w:after="0" w:line="276" w:lineRule="auto"/>
+              <w:spacing w:after="0" w:line="276" w:lineRule="auto"/>
+              <w:jc w:val="left"/>
             </w:pPr>
             <w:r>
               <w:rPr>
                 <w:rFonts w:ascii="Calibri" w:hAnsi="Calibri"/>
-                <w:b/>
-                <w:i w:val="0"/>
-                <w:color w:val="0B2545"/>
+                <w:b w:val="0"/>
+                <w:color w:val="1F2933"/>
                 <w:sz w:val="21"/>
               </w:rPr>
-              <w:t>27 Eastern U.S. markets</w:t>
+              <w:t>70 live records across the Eastern view; 53 in a deeper New York pull.</w:t>
             </w:r>
           </w:p>
         </w:tc>
       </w:tr>
       <w:tr>
-        <w:trPr/>
         <w:tc>
           <w:tcPr>
-            <w:tcW w:type="dxa" w:w="2200"/>
+            <w:tcW w:type="dxa" w:w="2700"/>
+            <w:shd w:fill="F5F8FB" w:val="clear"/>
             <w:vAlign w:val="center"/>
-            <w:shd w:fill="E8EEF5"/>
             <w:tcMar>
-              <w:top w:w="130" w:type="dxa"/>
-              <w:bottom w:w="130" w:type="dxa"/>
+              <w:top w:w="80" w:type="dxa"/>
+              <w:bottom w:w="80" w:type="dxa"/>
               <w:start w:w="120" w:type="dxa"/>
               <w:end w:w="120" w:type="dxa"/>
             </w:tcMar>
           </w:tcPr>
           <w:p>
             <w:pPr>
-              <w:spacing w:after="40" w:line="264" w:lineRule="auto"/>
+              <w:spacing w:after="0" w:line="276" w:lineRule="auto"/>
+              <w:jc w:val="left"/>
             </w:pPr>
             <w:r>
               <w:rPr>
                 <w:rFonts w:ascii="Calibri" w:hAnsi="Calibri"/>
                 <w:b/>
-                <w:i w:val="0"/>
-                <w:color w:val="148984"/>
-                <w:sz w:val="17"/>
+                <w:color w:val="0A2540"/>
+                <w:sz w:val="21"/>
               </w:rPr>
-              <w:t>PRIMARY USE</w:t>
+              <w:t>Examples</w:t>
             </w:r>
           </w:p>
         </w:tc>
         <w:tc>
           <w:tcPr>
-            <w:tcW w:type="dxa" w:w="7160"/>
+            <w:tcW w:type="dxa" w:w="6660"/>
+            <w:shd w:fill="F5F8FB" w:val="clear"/>
             <w:vAlign w:val="center"/>
-            <w:shd w:fill="FFFFFF"/>
             <w:tcMar>
-              <w:top w:w="130" w:type="dxa"/>
-              <w:bottom w:w="130" w:type="dxa"/>
+              <w:top w:w="80" w:type="dxa"/>
+              <w:bottom w:w="80" w:type="dxa"/>
               <w:start w:w="120" w:type="dxa"/>
               <w:end w:w="120" w:type="dxa"/>
             </w:tcMar>
           </w:tcPr>
           <w:p>
             <w:pPr>
-              <w:spacing w:before="0" w:after="0" w:line="276" w:lineRule="auto"/>
+              <w:spacing w:after="0" w:line="276" w:lineRule="auto"/>
+              <w:jc w:val="left"/>
             </w:pPr>
             <w:r>
               <w:rPr>
                 <w:rFonts w:ascii="Calibri" w:hAnsi="Calibri"/>
-                <w:b/>
-                <w:i w:val="0"/>
-                <w:color w:val="0B2545"/>
+                <w:b w:val="0"/>
+                <w:color w:val="1F2933"/>
                 <w:sz w:val="21"/>
               </w:rPr>
-              <w:t>Choose what to research first</w:t>
+              <w:t>0 sample records in the verified live pulls.</w:t>
             </w:r>
           </w:p>
         </w:tc>
       </w:tr>
       <w:tr>
-        <w:trPr/>
         <w:tc>
           <w:tcPr>
-            <w:tcW w:type="dxa" w:w="2200"/>
+            <w:tcW w:type="dxa" w:w="2700"/>
             <w:vAlign w:val="center"/>
-            <w:shd w:fill="E8EEF5"/>
             <w:tcMar>
-              <w:top w:w="130" w:type="dxa"/>
-              <w:bottom w:w="130" w:type="dxa"/>
+              <w:top w:w="80" w:type="dxa"/>
+              <w:bottom w:w="80" w:type="dxa"/>
               <w:start w:w="120" w:type="dxa"/>
               <w:end w:w="120" w:type="dxa"/>
             </w:tcMar>
           </w:tcPr>
           <w:p>
             <w:pPr>
-              <w:spacing w:after="40" w:line="264" w:lineRule="auto"/>
+              <w:spacing w:after="0" w:line="276" w:lineRule="auto"/>
+              <w:jc w:val="left"/>
             </w:pPr>
             <w:r>
               <w:rPr>
                 <w:rFonts w:ascii="Calibri" w:hAnsi="Calibri"/>
                 <w:b/>
-                <w:i w:val="0"/>
-                <w:color w:val="148984"/>
-                <w:sz w:val="17"/>
+                <w:color w:val="0A2540"/>
+                <w:sz w:val="21"/>
               </w:rPr>
-              <w:t>CONTACT</w:t>
+              <w:t>Health</w:t>
             </w:r>
           </w:p>
         </w:tc>
         <w:tc>
           <w:tcPr>
-            <w:tcW w:type="dxa" w:w="7160"/>
+            <w:tcW w:type="dxa" w:w="6660"/>
             <w:vAlign w:val="center"/>
-            <w:shd w:fill="FFFFFF"/>
             <w:tcMar>
-              <w:top w:w="130" w:type="dxa"/>
-              <w:bottom w:w="130" w:type="dxa"/>
+              <w:top w:w="80" w:type="dxa"/>
+              <w:bottom w:w="80" w:type="dxa"/>
               <w:start w:w="120" w:type="dxa"/>
               <w:end w:w="120" w:type="dxa"/>
             </w:tcMar>
           </w:tcPr>
           <w:p>
             <w:pPr>
-              <w:spacing w:before="0" w:after="0" w:line="276" w:lineRule="auto"/>
+              <w:spacing w:after="0" w:line="276" w:lineRule="auto"/>
+              <w:jc w:val="left"/>
             </w:pPr>
             <w:r>
               <w:rPr>
                 <w:rFonts w:ascii="Calibri" w:hAnsi="Calibri"/>
-                <w:b/>
-                <w:i w:val="0"/>
-                <w:color w:val="0B2545"/>
+                <w:b w:val="0"/>
+                <w:color w:val="1F2933"/>
                 <w:sz w:val="21"/>
               </w:rPr>
-              <w:t>Always blocked until protected clearance</w:t>
+              <w:t>Application, public data, and broker database all reported ready.</w:t>
             </w:r>
           </w:p>
         </w:tc>
       </w:tr>
     </w:tbl>
     <w:p>
-      <w:pPr>
-        <w:spacing w:before="0" w:after="40" w:line="300" w:lineRule="auto"/>
-      </w:pPr>
       <w:r>
-        <w:rPr>
-          <w:rFonts w:ascii="Calibri" w:hAnsi="Calibri"/>
-          <w:b/>
-          <w:i w:val="0"/>
-          <w:color w:val="148984"/>
-          <w:sz w:val="18"/>
-        </w:rPr>
-        <w:t>Open the application</w:t>
-      </w:r>
-    </w:p>
-    <w:p>
-      <w:pPr>
-        <w:spacing w:before="0" w:after="240" w:line="300" w:lineRule="auto"/>
-      </w:pPr>
-      <w:r>
-        <w:rPr>
-          <w:rFonts w:ascii="Calibri" w:hAnsi="Calibri"/>
-          <w:b/>
-          <w:i w:val="0"/>
-          <w:color w:val="2E74B5"/>
-          <w:sz w:val="24"/>
-        </w:rPr>
-        <w:t>https://szlholdings-david-leads.hf.space/</w:t>
-      </w:r>
-    </w:p>
-    <w:p>
-      <w:pPr>
-        <w:spacing w:before="80" w:after="200" w:line="288" w:lineRule="auto"/>
-        <w:ind w:left="173" w:right="173"/>
-        <w:shd w:fill="E7F5F3"/>
-        <w:pBdr>
-          <w:left w:val="single" w:sz="18" w:space="8" w:color="148984"/>
-        </w:pBdr>
-      </w:pPr>
-      <w:r>
-        <w:rPr>
-          <w:rFonts w:ascii="Calibri" w:hAnsi="Calibri"/>
-          <w:b/>
-          <w:i w:val="0"/>
-          <w:color w:val="0B2545"/>
-          <w:sz w:val="22"/>
-        </w:rPr>
-        <w:t xml:space="preserve">The simple rule: </w:t>
-      </w:r>
-      <w:r>
-        <w:rPr>
-          <w:rFonts w:ascii="Calibri" w:hAnsi="Calibri"/>
-          <w:b w:val="0"/>
-          <w:i w:val="0"/>
-          <w:color w:val="1C2737"/>
-          <w:sz w:val="22"/>
-        </w:rPr>
-        <w:t>Use David Leads to decide what to research first. Use the official record to verify why. Use the protected clearance process to decide whether contact is permitted.</w:t>
+        <w:br w:type="page"/>
       </w:r>
     </w:p>
     <w:p>
@@ -424,52 +565,273 @@
         <w:keepNext/>
       </w:pPr>
       <w:r>
-        <w:t>What this application does</w:t>
+        <w:t>Your first five minutes</w:t>
       </w:r>
     </w:p>
     <w:p>
       <w:pPr>
-        <w:spacing w:before="0" w:after="120" w:line="300" w:lineRule="auto"/>
+        <w:numPr>
+          <w:ilvl w:val="0"/>
+          <w:numId w:val="11"/>
+        </w:numPr>
+        <w:spacing w:after="80" w:line="300" w:lineRule="auto"/>
       </w:pPr>
       <w:r>
         <w:rPr>
           <w:rFonts w:ascii="Calibri" w:hAnsi="Calibri"/>
-          <w:b w:val="0"/>
+          <w:color w:val="1F2933"/>
+        </w:rPr>
+        <w:t>Open the link. The research workspace loads without a login.</w:t>
+      </w:r>
+    </w:p>
+    <w:p>
+      <w:pPr>
+        <w:numPr>
+          <w:ilvl w:val="0"/>
+          <w:numId w:val="11"/>
+        </w:numPr>
+        <w:spacing w:after="80" w:line="300" w:lineRule="auto"/>
+      </w:pPr>
+      <w:r>
+        <w:rPr>
+          <w:rFonts w:ascii="Calibri" w:hAnsi="Calibri"/>
+          <w:color w:val="1F2933"/>
+        </w:rPr>
+        <w:t>Choose All East, a region, or one state. One state runs a deeper pull.</w:t>
+      </w:r>
+    </w:p>
+    <w:p>
+      <w:pPr>
+        <w:numPr>
+          <w:ilvl w:val="0"/>
+          <w:numId w:val="11"/>
+        </w:numPr>
+        <w:spacing w:after="80" w:line="300" w:lineRule="auto"/>
+      </w:pPr>
+      <w:r>
+        <w:rPr>
+          <w:rFonts w:ascii="Calibri" w:hAnsi="Calibri"/>
+          <w:color w:val="1F2933"/>
+        </w:rPr>
+        <w:t>Read the Broker brief near the top. It points to the strongest current timing pattern.</w:t>
+      </w:r>
+    </w:p>
+    <w:p>
+      <w:pPr>
+        <w:numPr>
+          <w:ilvl w:val="0"/>
+          <w:numId w:val="11"/>
+        </w:numPr>
+        <w:spacing w:after="80" w:line="300" w:lineRule="auto"/>
+      </w:pPr>
+      <w:r>
+        <w:rPr>
+          <w:rFonts w:ascii="Calibri" w:hAnsi="Calibri"/>
+          <w:color w:val="1F2933"/>
+        </w:rPr>
+        <w:t>Use the deal-moment buttons to narrow the list: life-plan timing, growth and awards, operational change, or needs research.</w:t>
+      </w:r>
+    </w:p>
+    <w:p>
+      <w:pPr>
+        <w:numPr>
+          <w:ilvl w:val="0"/>
+          <w:numId w:val="11"/>
+        </w:numPr>
+        <w:spacing w:after="80" w:line="300" w:lineRule="auto"/>
+      </w:pPr>
+      <w:r>
+        <w:rPr>
+          <w:rFonts w:ascii="Calibri" w:hAnsi="Calibri"/>
+          <w:color w:val="1F2933"/>
+        </w:rPr>
+        <w:t>Open an organization to see the public event, likely fit, evidence, limits, and the next research step.</w:t>
+      </w:r>
+    </w:p>
+    <w:p>
+      <w:pPr>
+        <w:numPr>
+          <w:ilvl w:val="0"/>
+          <w:numId w:val="11"/>
+        </w:numPr>
+        <w:spacing w:after="80" w:line="300" w:lineRule="auto"/>
+      </w:pPr>
+      <w:r>
+        <w:rPr>
+          <w:rFonts w:ascii="Calibri" w:hAnsi="Calibri"/>
+          <w:color w:val="1F2933"/>
+        </w:rPr>
+        <w:t>Open the official source before using any claim in a conversation.</w:t>
+      </w:r>
+    </w:p>
+    <w:p>
+      <w:pPr>
+        <w:pStyle w:val="Heading2"/>
+        <w:keepNext/>
+      </w:pPr>
+      <w:r>
+        <w:t>What the screen is telling you</w:t>
+      </w:r>
+    </w:p>
+    <w:p>
+      <w:pPr>
+        <w:spacing w:after="120" w:line="300" w:lineRule="auto"/>
+      </w:pPr>
+      <w:r>
+        <w:rPr>
+          <w:rFonts w:ascii="Calibri" w:hAnsi="Calibri"/>
+          <w:b/>
+          <w:color w:val="0A2540"/>
+        </w:rPr>
+        <w:t xml:space="preserve">Live organizations. </w:t>
+      </w:r>
+      <w:r>
+        <w:rPr>
+          <w:rFonts w:ascii="Calibri" w:hAnsi="Calibri"/>
           <w:i w:val="0"/>
-          <w:color w:val="1C2737"/>
-          <w:sz w:val="22"/>
+          <w:color w:val="1F2933"/>
         </w:rPr>
-        <w:t>David Leads organizes official organization-level records into a practical research queue. It shows the company, the observed change, the timing, the likely protection-planning fit, and the evidence behind the item.</w:t>
+        <w:t>Live organizations</w:t>
+      </w:r>
+    </w:p>
+    <w:p>
+      <w:pPr>
+        <w:spacing w:after="120" w:line="300" w:lineRule="auto"/>
+      </w:pPr>
+      <w:r>
+        <w:rPr>
+          <w:rFonts w:ascii="Calibri" w:hAnsi="Calibri"/>
+          <w:i w:val="0"/>
+          <w:color w:val="1F2933"/>
+        </w:rPr>
+        <w:t>The number of official records in the selected market. The count changes with the territory and source response.</w:t>
+      </w:r>
+    </w:p>
+    <w:p>
+      <w:pPr>
+        <w:spacing w:after="120" w:line="300" w:lineRule="auto"/>
+      </w:pPr>
+      <w:r>
+        <w:rPr>
+          <w:rFonts w:ascii="Calibri" w:hAnsi="Calibri"/>
+          <w:b/>
+          <w:color w:val="0A2540"/>
+        </w:rPr>
+        <w:t xml:space="preserve">Source coverage. </w:t>
+      </w:r>
+      <w:r>
+        <w:rPr>
+          <w:rFonts w:ascii="Calibri" w:hAnsi="Calibri"/>
+          <w:i w:val="0"/>
+          <w:color w:val="1F2933"/>
+        </w:rPr>
+        <w:t>Source coverage</w:t>
+      </w:r>
+    </w:p>
+    <w:p>
+      <w:pPr>
+        <w:spacing w:after="120" w:line="300" w:lineRule="auto"/>
+      </w:pPr>
+      <w:r>
+        <w:rPr>
+          <w:rFonts w:ascii="Calibri" w:hAnsi="Calibri"/>
+          <w:i w:val="0"/>
+          <w:color w:val="1F2933"/>
+        </w:rPr>
+        <w:t>How many source lanes answered live. An unavailable source remains visible; it is never replaced by a fake record.</w:t>
+      </w:r>
+    </w:p>
+    <w:p>
+      <w:pPr>
+        <w:spacing w:after="120" w:line="300" w:lineRule="auto"/>
+      </w:pPr>
+      <w:r>
+        <w:rPr>
+          <w:rFonts w:ascii="Calibri" w:hAnsi="Calibri"/>
+          <w:b/>
+          <w:color w:val="0A2540"/>
+        </w:rPr>
+        <w:t xml:space="preserve">Needs research. </w:t>
+      </w:r>
+      <w:r>
+        <w:rPr>
+          <w:rFonts w:ascii="Calibri" w:hAnsi="Calibri"/>
+          <w:i w:val="0"/>
+          <w:color w:val="1F2933"/>
+        </w:rPr>
+        <w:t>Needs research</w:t>
+      </w:r>
+    </w:p>
+    <w:p>
+      <w:pPr>
+        <w:spacing w:after="120" w:line="300" w:lineRule="auto"/>
+      </w:pPr>
+      <w:r>
+        <w:rPr>
+          <w:rFonts w:ascii="Calibri" w:hAnsi="Calibri"/>
+          <w:i w:val="0"/>
+          <w:color w:val="1F2933"/>
+        </w:rPr>
+        <w:t>Records worth checking. This is not the number of people cleared for contact.</w:t>
+      </w:r>
+    </w:p>
+    <w:p>
+      <w:pPr>
+        <w:spacing w:after="120" w:line="300" w:lineRule="auto"/>
+      </w:pPr>
+      <w:r>
+        <w:rPr>
+          <w:rFonts w:ascii="Calibri" w:hAnsi="Calibri"/>
+          <w:b/>
+          <w:color w:val="0A2540"/>
+        </w:rPr>
+        <w:t xml:space="preserve">Timing window. </w:t>
+      </w:r>
+      <w:r>
+        <w:rPr>
+          <w:rFonts w:ascii="Calibri" w:hAnsi="Calibri"/>
+          <w:i w:val="0"/>
+          <w:color w:val="1F2933"/>
+        </w:rPr>
+        <w:t>Timing window</w:t>
+      </w:r>
+    </w:p>
+    <w:p>
+      <w:pPr>
+        <w:spacing w:after="120" w:line="300" w:lineRule="auto"/>
+      </w:pPr>
+      <w:r>
+        <w:rPr>
+          <w:rFonts w:ascii="Calibri" w:hAnsi="Calibri"/>
+          <w:i w:val="0"/>
+          <w:color w:val="1F2933"/>
+        </w:rPr>
+        <w:t>A date or filing field that may make the organization worth researching now. It is not proof of a sale, renewal, dissatisfaction, or insurance need.</w:t>
       </w:r>
     </w:p>
     <w:p>
       <w:pPr>
         <w:spacing w:before="80" w:after="200" w:line="288" w:lineRule="auto"/>
-        <w:ind w:left="173" w:right="173"/>
-        <w:shd w:fill="FFF7E5"/>
+        <w:shd w:fill="FFF7E6" w:val="clear"/>
         <w:pBdr>
-          <w:left w:val="single" w:sz="18" w:space="8" w:color="B78921"/>
+          <w:left w:val="single" w:sz="18" w:space="8" w:color="168F89"/>
         </w:pBdr>
+        <w:ind w:left="180" w:right="120"/>
       </w:pPr>
       <w:r>
         <w:rPr>
           <w:rFonts w:ascii="Calibri" w:hAnsi="Calibri"/>
           <w:b/>
-          <w:i w:val="0"/>
-          <w:color w:val="0B2545"/>
-          <w:sz w:val="22"/>
+          <w:color w:val="0A2540"/>
         </w:rPr>
-        <w:t xml:space="preserve">Important: </w:t>
+        <w:t xml:space="preserve">The key distinction: </w:t>
       </w:r>
       <w:r>
         <w:rPr>
           <w:rFonts w:ascii="Calibri" w:hAnsi="Calibri"/>
-          <w:b w:val="0"/>
-          <w:i w:val="0"/>
-          <w:color w:val="1C2737"/>
-          <w:sz w:val="22"/>
+          <w:color w:val="1F2933"/>
         </w:rPr>
-        <w:t>It is not a purchased contact list. It never turns a public record into permission to call, email, market, or make an underwriting decision.</w:t>
+        <w:t>A visible public record is permission to research the organization. It is not permission to call, text, email, quote, or recommend a product.</w:t>
       </w:r>
     </w:p>
     <w:p>
@@ -483,142 +845,503 @@
         <w:keepNext/>
       </w:pPr>
       <w:r>
-        <w:t>Start your day in five minutes</w:t>
+        <w:t>How to use one opportunity</w:t>
       </w:r>
     </w:p>
     <w:p>
       <w:pPr>
-        <w:pStyle w:val="ListNumber"/>
+        <w:pStyle w:val="Heading2"/>
+        <w:keepNext/>
+      </w:pPr>
+      <w:r>
+        <w:t>1. Verify the moment</w:t>
+      </w:r>
+    </w:p>
+    <w:p>
+      <w:pPr>
         <w:spacing w:after="120" w:line="300" w:lineRule="auto"/>
-        <w:ind w:left="540" w:hanging="271"/>
       </w:pPr>
       <w:r>
         <w:rPr>
           <w:rFonts w:ascii="Calibri" w:hAnsi="Calibri"/>
-          <w:b/>
           <w:i w:val="0"/>
-          <w:color w:val="0B2545"/>
-          <w:sz w:val="22"/>
+          <w:color w:val="1F2933"/>
         </w:rPr>
-        <w:t xml:space="preserve">Read the Broker brief. </w:t>
-      </w:r>
-      <w:r>
-        <w:rPr>
-          <w:rFonts w:ascii="Calibri" w:hAnsi="Calibri"/>
-          <w:b w:val="0"/>
-          <w:i w:val="0"/>
-          <w:color w:val="1C2737"/>
-          <w:sz w:val="22"/>
-        </w:rPr>
-        <w:t>It summarizes the strongest timing pattern in the current official-source pull.</w:t>
+        <w:t>Open the official source and confirm the organization name, date, location, and the exact event shown. If the record cannot be confirmed, stop and mark it for later research.</w:t>
       </w:r>
     </w:p>
     <w:p>
       <w:pPr>
-        <w:pStyle w:val="ListNumber"/>
+        <w:pStyle w:val="Heading2"/>
+        <w:keepNext/>
+      </w:pPr>
+      <w:r>
+        <w:t>2. Qualify the fit</w:t>
+      </w:r>
+    </w:p>
+    <w:p>
+      <w:pPr>
         <w:spacing w:after="120" w:line="300" w:lineRule="auto"/>
-        <w:ind w:left="540" w:hanging="271"/>
       </w:pPr>
       <w:r>
         <w:rPr>
           <w:rFonts w:ascii="Calibri" w:hAnsi="Calibri"/>
-          <w:b/>
           <w:i w:val="0"/>
-          <w:color w:val="0B2545"/>
-          <w:sz w:val="22"/>
+          <w:color w:val="1F2933"/>
         </w:rPr>
-        <w:t xml:space="preserve">Choose a territory. </w:t>
-      </w:r>
-      <w:r>
-        <w:rPr>
-          <w:rFonts w:ascii="Calibri" w:hAnsi="Calibri"/>
-          <w:b w:val="0"/>
-          <w:i w:val="0"/>
-          <w:color w:val="1C2737"/>
-          <w:sz w:val="22"/>
-        </w:rPr>
-        <w:t>Select All East, a region, or one state. One state runs a deeper market-specific search.</w:t>
+        <w:t>Visit the organization's own website. Understand what it does, whether the public event appears relevant, and whether a business-published channel exists. Treat the suggested product fit as a question to investigate, not an answer.</w:t>
       </w:r>
     </w:p>
     <w:p>
       <w:pPr>
-        <w:pStyle w:val="ListNumber"/>
+        <w:pStyle w:val="Heading2"/>
+        <w:keepNext/>
+      </w:pPr>
+      <w:r>
+        <w:t>3. Clear outreach</w:t>
+      </w:r>
+    </w:p>
+    <w:p>
+      <w:pPr>
         <w:spacing w:after="120" w:line="300" w:lineRule="auto"/>
-        <w:ind w:left="540" w:hanging="271"/>
       </w:pPr>
       <w:r>
         <w:rPr>
           <w:rFonts w:ascii="Calibri" w:hAnsi="Calibri"/>
-          <w:b/>
           <w:i w:val="0"/>
-          <w:color w:val="0B2545"/>
-          <w:sz w:val="22"/>
+          <w:color w:val="1F2933"/>
         </w:rPr>
-        <w:t xml:space="preserve">Choose a deal moment. </w:t>
-      </w:r>
-      <w:r>
-        <w:rPr>
-          <w:rFonts w:ascii="Calibri" w:hAnsi="Calibri"/>
-          <w:b w:val="0"/>
-          <w:i w:val="0"/>
-          <w:color w:val="1C2737"/>
-          <w:sz w:val="22"/>
-        </w:rPr>
-        <w:t>Use Life-plan timing, Growth &amp; awards, Operational change, or Needs research.</w:t>
+        <w:t>Before contact, complete the required suppression, licensing, state-rule, purpose, and channel checks in the protected broker workflow. The public workspace intentionally keeps call-ready at zero.</w:t>
       </w:r>
     </w:p>
     <w:p>
       <w:pPr>
-        <w:pStyle w:val="ListNumber"/>
-        <w:spacing w:after="120" w:line="300" w:lineRule="auto"/>
-        <w:ind w:left="540" w:hanging="271"/>
+        <w:pStyle w:val="Heading2"/>
+        <w:keepNext/>
       </w:pPr>
       <w:r>
-        <w:rPr>
-          <w:rFonts w:ascii="Calibri" w:hAnsi="Calibri"/>
-          <w:b/>
-          <w:i w:val="0"/>
-          <w:color w:val="0B2545"/>
-          <w:sz w:val="22"/>
-        </w:rPr>
-        <w:t xml:space="preserve">Open the strongest account. </w:t>
-      </w:r>
-      <w:r>
-        <w:rPr>
-          <w:rFonts w:ascii="Calibri" w:hAnsi="Calibri"/>
-          <w:b w:val="0"/>
-          <w:i w:val="0"/>
-          <w:color w:val="1C2737"/>
-          <w:sz w:val="22"/>
-        </w:rPr>
-        <w:t>Review the timing, likely fit, evidence, limitations, and three-step broker action.</w:t>
+        <w:t>Read the record correctly</w:t>
       </w:r>
     </w:p>
+    <w:tbl>
+      <w:tblPr>
+        <w:tblW w:type="dxa" w:w="9360"/>
+        <w:tblLayout w:type="fixed"/>
+        <w:tblLook w:firstColumn="1" w:firstRow="1" w:lastColumn="0" w:lastRow="0" w:noHBand="0" w:noVBand="1" w:val="04A0"/>
+        <w:jc w:val="left"/>
+        <w:tblInd w:w="120" w:type="dxa"/>
+      </w:tblPr>
+      <w:tblGrid>
+        <w:gridCol w:w="2700"/>
+        <w:gridCol w:w="6660"/>
+      </w:tblGrid>
+      <w:tr>
+        <w:trPr>
+          <w:tblHeader w:val="true"/>
+        </w:trPr>
+        <w:tc>
+          <w:tcPr>
+            <w:tcW w:type="dxa" w:w="2700"/>
+            <w:vAlign w:val="center"/>
+            <w:tcMar>
+              <w:top w:w="80" w:type="dxa"/>
+              <w:bottom w:w="80" w:type="dxa"/>
+              <w:start w:w="120" w:type="dxa"/>
+              <w:end w:w="120" w:type="dxa"/>
+            </w:tcMar>
+            <w:shd w:fill="0A2540" w:val="clear"/>
+          </w:tcPr>
+          <w:p>
+            <w:pPr>
+              <w:spacing w:after="0" w:line="276" w:lineRule="auto"/>
+              <w:jc w:val="left"/>
+            </w:pPr>
+            <w:r>
+              <w:rPr>
+                <w:rFonts w:ascii="Calibri" w:hAnsi="Calibri"/>
+                <w:b/>
+                <w:color w:val="FFFFFF"/>
+                <w:sz w:val="21"/>
+              </w:rPr>
+              <w:t>Label</w:t>
+            </w:r>
+          </w:p>
+        </w:tc>
+        <w:tc>
+          <w:tcPr>
+            <w:tcW w:type="dxa" w:w="6660"/>
+            <w:vAlign w:val="center"/>
+            <w:tcMar>
+              <w:top w:w="80" w:type="dxa"/>
+              <w:bottom w:w="80" w:type="dxa"/>
+              <w:start w:w="120" w:type="dxa"/>
+              <w:end w:w="120" w:type="dxa"/>
+            </w:tcMar>
+            <w:shd w:fill="0A2540" w:val="clear"/>
+          </w:tcPr>
+          <w:p>
+            <w:pPr>
+              <w:spacing w:after="0" w:line="276" w:lineRule="auto"/>
+              <w:jc w:val="left"/>
+            </w:pPr>
+            <w:r>
+              <w:rPr>
+                <w:rFonts w:ascii="Calibri" w:hAnsi="Calibri"/>
+                <w:b/>
+                <w:color w:val="FFFFFF"/>
+                <w:sz w:val="21"/>
+              </w:rPr>
+              <w:t>Plain-English meaning</w:t>
+            </w:r>
+          </w:p>
+        </w:tc>
+      </w:tr>
+      <w:tr>
+        <w:tc>
+          <w:tcPr>
+            <w:tcW w:type="dxa" w:w="2700"/>
+            <w:vAlign w:val="center"/>
+            <w:tcMar>
+              <w:top w:w="80" w:type="dxa"/>
+              <w:bottom w:w="80" w:type="dxa"/>
+              <w:start w:w="120" w:type="dxa"/>
+              <w:end w:w="120" w:type="dxa"/>
+            </w:tcMar>
+          </w:tcPr>
+          <w:p>
+            <w:pPr>
+              <w:spacing w:after="0" w:line="276" w:lineRule="auto"/>
+              <w:jc w:val="left"/>
+            </w:pPr>
+            <w:r>
+              <w:rPr>
+                <w:rFonts w:ascii="Calibri" w:hAnsi="Calibri"/>
+                <w:b/>
+                <w:color w:val="0A2540"/>
+                <w:sz w:val="21"/>
+              </w:rPr>
+              <w:t>Verified deal moment</w:t>
+            </w:r>
+          </w:p>
+        </w:tc>
+        <w:tc>
+          <w:tcPr>
+            <w:tcW w:type="dxa" w:w="6660"/>
+            <w:vAlign w:val="center"/>
+            <w:tcMar>
+              <w:top w:w="80" w:type="dxa"/>
+              <w:bottom w:w="80" w:type="dxa"/>
+              <w:start w:w="120" w:type="dxa"/>
+              <w:end w:w="120" w:type="dxa"/>
+            </w:tcMar>
+          </w:tcPr>
+          <w:p>
+            <w:pPr>
+              <w:spacing w:after="0" w:line="276" w:lineRule="auto"/>
+              <w:jc w:val="left"/>
+            </w:pPr>
+            <w:r>
+              <w:rPr>
+                <w:rFonts w:ascii="Calibri" w:hAnsi="Calibri"/>
+                <w:b w:val="0"/>
+                <w:color w:val="1F2933"/>
+                <w:sz w:val="21"/>
+              </w:rPr>
+              <w:t>The fact returned by the official source.</w:t>
+            </w:r>
+          </w:p>
+        </w:tc>
+      </w:tr>
+      <w:tr>
+        <w:tc>
+          <w:tcPr>
+            <w:tcW w:type="dxa" w:w="2700"/>
+            <w:shd w:fill="F5F8FB" w:val="clear"/>
+            <w:vAlign w:val="center"/>
+            <w:tcMar>
+              <w:top w:w="80" w:type="dxa"/>
+              <w:bottom w:w="80" w:type="dxa"/>
+              <w:start w:w="120" w:type="dxa"/>
+              <w:end w:w="120" w:type="dxa"/>
+            </w:tcMar>
+          </w:tcPr>
+          <w:p>
+            <w:pPr>
+              <w:spacing w:after="0" w:line="276" w:lineRule="auto"/>
+              <w:jc w:val="left"/>
+            </w:pPr>
+            <w:r>
+              <w:rPr>
+                <w:rFonts w:ascii="Calibri" w:hAnsi="Calibri"/>
+                <w:b/>
+                <w:color w:val="0A2540"/>
+                <w:sz w:val="21"/>
+              </w:rPr>
+              <w:t>Why now</w:t>
+            </w:r>
+          </w:p>
+        </w:tc>
+        <w:tc>
+          <w:tcPr>
+            <w:tcW w:type="dxa" w:w="6660"/>
+            <w:shd w:fill="F5F8FB" w:val="clear"/>
+            <w:vAlign w:val="center"/>
+            <w:tcMar>
+              <w:top w:w="80" w:type="dxa"/>
+              <w:bottom w:w="80" w:type="dxa"/>
+              <w:start w:w="120" w:type="dxa"/>
+              <w:end w:w="120" w:type="dxa"/>
+            </w:tcMar>
+          </w:tcPr>
+          <w:p>
+            <w:pPr>
+              <w:spacing w:after="0" w:line="276" w:lineRule="auto"/>
+              <w:jc w:val="left"/>
+            </w:pPr>
+            <w:r>
+              <w:rPr>
+                <w:rFonts w:ascii="Calibri" w:hAnsi="Calibri"/>
+                <w:b w:val="0"/>
+                <w:color w:val="1F2933"/>
+                <w:sz w:val="21"/>
+              </w:rPr>
+              <w:t>Why the event may deserve timely research.</w:t>
+            </w:r>
+          </w:p>
+        </w:tc>
+      </w:tr>
+      <w:tr>
+        <w:tc>
+          <w:tcPr>
+            <w:tcW w:type="dxa" w:w="2700"/>
+            <w:vAlign w:val="center"/>
+            <w:tcMar>
+              <w:top w:w="80" w:type="dxa"/>
+              <w:bottom w:w="80" w:type="dxa"/>
+              <w:start w:w="120" w:type="dxa"/>
+              <w:end w:w="120" w:type="dxa"/>
+            </w:tcMar>
+          </w:tcPr>
+          <w:p>
+            <w:pPr>
+              <w:spacing w:after="0" w:line="276" w:lineRule="auto"/>
+              <w:jc w:val="left"/>
+            </w:pPr>
+            <w:r>
+              <w:rPr>
+                <w:rFonts w:ascii="Calibri" w:hAnsi="Calibri"/>
+                <w:b/>
+                <w:color w:val="0A2540"/>
+                <w:sz w:val="21"/>
+              </w:rPr>
+              <w:t>Likely fit</w:t>
+            </w:r>
+          </w:p>
+        </w:tc>
+        <w:tc>
+          <w:tcPr>
+            <w:tcW w:type="dxa" w:w="6660"/>
+            <w:vAlign w:val="center"/>
+            <w:tcMar>
+              <w:top w:w="80" w:type="dxa"/>
+              <w:bottom w:w="80" w:type="dxa"/>
+              <w:start w:w="120" w:type="dxa"/>
+              <w:end w:w="120" w:type="dxa"/>
+            </w:tcMar>
+          </w:tcPr>
+          <w:p>
+            <w:pPr>
+              <w:spacing w:after="0" w:line="276" w:lineRule="auto"/>
+              <w:jc w:val="left"/>
+            </w:pPr>
+            <w:r>
+              <w:rPr>
+                <w:rFonts w:ascii="Calibri" w:hAnsi="Calibri"/>
+                <w:b w:val="0"/>
+                <w:color w:val="1F2933"/>
+                <w:sz w:val="21"/>
+              </w:rPr>
+              <w:t>A business question to investigate, not advice or eligibility.</w:t>
+            </w:r>
+          </w:p>
+        </w:tc>
+      </w:tr>
+      <w:tr>
+        <w:tc>
+          <w:tcPr>
+            <w:tcW w:type="dxa" w:w="2700"/>
+            <w:shd w:fill="F5F8FB" w:val="clear"/>
+            <w:vAlign w:val="center"/>
+            <w:tcMar>
+              <w:top w:w="80" w:type="dxa"/>
+              <w:bottom w:w="80" w:type="dxa"/>
+              <w:start w:w="120" w:type="dxa"/>
+              <w:end w:w="120" w:type="dxa"/>
+            </w:tcMar>
+          </w:tcPr>
+          <w:p>
+            <w:pPr>
+              <w:spacing w:after="0" w:line="276" w:lineRule="auto"/>
+              <w:jc w:val="left"/>
+            </w:pPr>
+            <w:r>
+              <w:rPr>
+                <w:rFonts w:ascii="Calibri" w:hAnsi="Calibri"/>
+                <w:b/>
+                <w:color w:val="0A2540"/>
+                <w:sz w:val="21"/>
+              </w:rPr>
+              <w:t>Evidence</w:t>
+            </w:r>
+          </w:p>
+        </w:tc>
+        <w:tc>
+          <w:tcPr>
+            <w:tcW w:type="dxa" w:w="6660"/>
+            <w:shd w:fill="F5F8FB" w:val="clear"/>
+            <w:vAlign w:val="center"/>
+            <w:tcMar>
+              <w:top w:w="80" w:type="dxa"/>
+              <w:bottom w:w="80" w:type="dxa"/>
+              <w:start w:w="120" w:type="dxa"/>
+              <w:end w:w="120" w:type="dxa"/>
+            </w:tcMar>
+          </w:tcPr>
+          <w:p>
+            <w:pPr>
+              <w:spacing w:after="0" w:line="276" w:lineRule="auto"/>
+              <w:jc w:val="left"/>
+            </w:pPr>
+            <w:r>
+              <w:rPr>
+                <w:rFonts w:ascii="Calibri" w:hAnsi="Calibri"/>
+                <w:b w:val="0"/>
+                <w:color w:val="1F2933"/>
+                <w:sz w:val="21"/>
+              </w:rPr>
+              <w:t>The source link, record ID, and receipt attached to the item.</w:t>
+            </w:r>
+          </w:p>
+        </w:tc>
+      </w:tr>
+      <w:tr>
+        <w:tc>
+          <w:tcPr>
+            <w:tcW w:type="dxa" w:w="2700"/>
+            <w:vAlign w:val="center"/>
+            <w:tcMar>
+              <w:top w:w="80" w:type="dxa"/>
+              <w:bottom w:w="80" w:type="dxa"/>
+              <w:start w:w="120" w:type="dxa"/>
+              <w:end w:w="120" w:type="dxa"/>
+            </w:tcMar>
+          </w:tcPr>
+          <w:p>
+            <w:pPr>
+              <w:spacing w:after="0" w:line="276" w:lineRule="auto"/>
+              <w:jc w:val="left"/>
+            </w:pPr>
+            <w:r>
+              <w:rPr>
+                <w:rFonts w:ascii="Calibri" w:hAnsi="Calibri"/>
+                <w:b/>
+                <w:color w:val="0A2540"/>
+                <w:sz w:val="21"/>
+              </w:rPr>
+              <w:t>Limitations</w:t>
+            </w:r>
+          </w:p>
+        </w:tc>
+        <w:tc>
+          <w:tcPr>
+            <w:tcW w:type="dxa" w:w="6660"/>
+            <w:vAlign w:val="center"/>
+            <w:tcMar>
+              <w:top w:w="80" w:type="dxa"/>
+              <w:bottom w:w="80" w:type="dxa"/>
+              <w:start w:w="120" w:type="dxa"/>
+              <w:end w:w="120" w:type="dxa"/>
+            </w:tcMar>
+          </w:tcPr>
+          <w:p>
+            <w:pPr>
+              <w:spacing w:after="0" w:line="276" w:lineRule="auto"/>
+              <w:jc w:val="left"/>
+            </w:pPr>
+            <w:r>
+              <w:rPr>
+                <w:rFonts w:ascii="Calibri" w:hAnsi="Calibri"/>
+                <w:b w:val="0"/>
+                <w:color w:val="1F2933"/>
+                <w:sz w:val="21"/>
+              </w:rPr>
+              <w:t>What the public record does not prove.</w:t>
+            </w:r>
+          </w:p>
+        </w:tc>
+      </w:tr>
+      <w:tr>
+        <w:tc>
+          <w:tcPr>
+            <w:tcW w:type="dxa" w:w="2700"/>
+            <w:shd w:fill="F5F8FB" w:val="clear"/>
+            <w:vAlign w:val="center"/>
+            <w:tcMar>
+              <w:top w:w="80" w:type="dxa"/>
+              <w:bottom w:w="80" w:type="dxa"/>
+              <w:start w:w="120" w:type="dxa"/>
+              <w:end w:w="120" w:type="dxa"/>
+            </w:tcMar>
+          </w:tcPr>
+          <w:p>
+            <w:pPr>
+              <w:spacing w:after="0" w:line="276" w:lineRule="auto"/>
+              <w:jc w:val="left"/>
+            </w:pPr>
+            <w:r>
+              <w:rPr>
+                <w:rFonts w:ascii="Calibri" w:hAnsi="Calibri"/>
+                <w:b/>
+                <w:color w:val="0A2540"/>
+                <w:sz w:val="21"/>
+              </w:rPr>
+              <w:t>Call ready</w:t>
+            </w:r>
+          </w:p>
+        </w:tc>
+        <w:tc>
+          <w:tcPr>
+            <w:tcW w:type="dxa" w:w="6660"/>
+            <w:shd w:fill="F5F8FB" w:val="clear"/>
+            <w:vAlign w:val="center"/>
+            <w:tcMar>
+              <w:top w:w="80" w:type="dxa"/>
+              <w:bottom w:w="80" w:type="dxa"/>
+              <w:start w:w="120" w:type="dxa"/>
+              <w:end w:w="120" w:type="dxa"/>
+            </w:tcMar>
+          </w:tcPr>
+          <w:p>
+            <w:pPr>
+              <w:spacing w:after="0" w:line="276" w:lineRule="auto"/>
+              <w:jc w:val="left"/>
+            </w:pPr>
+            <w:r>
+              <w:rPr>
+                <w:rFonts w:ascii="Calibri" w:hAnsi="Calibri"/>
+                <w:b w:val="0"/>
+                <w:color w:val="1F2933"/>
+                <w:sz w:val="21"/>
+              </w:rPr>
+              <w:t>Whether outreach checks have passed. Public view stays at zero.</w:t>
+            </w:r>
+          </w:p>
+        </w:tc>
+      </w:tr>
+    </w:tbl>
     <w:p>
-      <w:pPr>
-        <w:pStyle w:val="ListNumber"/>
-        <w:spacing w:after="120" w:line="300" w:lineRule="auto"/>
-        <w:ind w:left="540" w:hanging="271"/>
-      </w:pPr>
       <w:r>
-        <w:rPr>
-          <w:rFonts w:ascii="Calibri" w:hAnsi="Calibri"/>
-          <w:b/>
-          <w:i w:val="0"/>
-          <w:color w:val="0B2545"/>
-          <w:sz w:val="22"/>
-        </w:rPr>
-        <w:t xml:space="preserve">Verify before doing anything else. </w:t>
-      </w:r>
-      <w:r>
-        <w:rPr>
-          <w:rFonts w:ascii="Calibri" w:hAnsi="Calibri"/>
-          <w:b w:val="0"/>
-          <w:i w:val="0"/>
-          <w:color w:val="1C2737"/>
-          <w:sz w:val="22"/>
-        </w:rPr>
-        <w:t>Open the cited official record and confirm that the organization and event are current.</w:t>
+        <w:br w:type="page"/>
       </w:r>
     </w:p>
     <w:p>
@@ -627,145 +1350,786 @@
         <w:keepNext/>
       </w:pPr>
       <w:r>
-        <w:t>The four deal-moment lanes</w:t>
+        <w:t>Where the live records come from</w:t>
       </w:r>
     </w:p>
     <w:p>
       <w:pPr>
-        <w:pStyle w:val="ListBullet"/>
-        <w:spacing w:after="80" w:line="300" w:lineRule="auto"/>
-        <w:ind w:left="540" w:hanging="271"/>
+        <w:spacing w:after="120" w:line="300" w:lineRule="auto"/>
       </w:pPr>
       <w:r>
         <w:rPr>
           <w:rFonts w:ascii="Calibri" w:hAnsi="Calibri"/>
-          <w:b/>
           <w:i w:val="0"/>
-          <w:color w:val="0B2545"/>
-          <w:sz w:val="22"/>
+          <w:color w:val="1F2933"/>
         </w:rPr>
-        <w:t>Life-plan timing:</w:t>
+        <w:t>The application checks official public sources independently. Each lane reports LIVE, UNAVAILABLE, or NOT APPLICABLE for the selected market.</w:t>
       </w:r>
+    </w:p>
+    <w:tbl>
+      <w:tblPr>
+        <w:tblW w:type="dxa" w:w="9360"/>
+        <w:tblLayout w:type="fixed"/>
+        <w:tblLook w:firstColumn="1" w:firstRow="1" w:lastColumn="0" w:lastRow="0" w:noHBand="0" w:noVBand="1" w:val="04A0"/>
+        <w:jc w:val="left"/>
+        <w:tblInd w:w="120" w:type="dxa"/>
+      </w:tblPr>
+      <w:tblGrid>
+        <w:gridCol w:w="3150"/>
+        <w:gridCol w:w="1650"/>
+        <w:gridCol w:w="4560"/>
+      </w:tblGrid>
+      <w:tr>
+        <w:trPr>
+          <w:tblHeader w:val="true"/>
+        </w:trPr>
+        <w:tc>
+          <w:tcPr>
+            <w:tcW w:type="dxa" w:w="3150"/>
+            <w:vAlign w:val="center"/>
+            <w:tcMar>
+              <w:top w:w="80" w:type="dxa"/>
+              <w:bottom w:w="80" w:type="dxa"/>
+              <w:start w:w="120" w:type="dxa"/>
+              <w:end w:w="120" w:type="dxa"/>
+            </w:tcMar>
+            <w:shd w:fill="0A2540" w:val="clear"/>
+          </w:tcPr>
+          <w:p>
+            <w:pPr>
+              <w:spacing w:after="0" w:line="276" w:lineRule="auto"/>
+              <w:jc w:val="left"/>
+            </w:pPr>
+            <w:r>
+              <w:rPr>
+                <w:rFonts w:ascii="Calibri" w:hAnsi="Calibri"/>
+                <w:b/>
+                <w:color w:val="FFFFFF"/>
+                <w:sz w:val="20"/>
+              </w:rPr>
+              <w:t>Official source</w:t>
+            </w:r>
+          </w:p>
+        </w:tc>
+        <w:tc>
+          <w:tcPr>
+            <w:tcW w:type="dxa" w:w="1650"/>
+            <w:vAlign w:val="center"/>
+            <w:tcMar>
+              <w:top w:w="80" w:type="dxa"/>
+              <w:bottom w:w="80" w:type="dxa"/>
+              <w:start w:w="120" w:type="dxa"/>
+              <w:end w:w="120" w:type="dxa"/>
+            </w:tcMar>
+            <w:shd w:fill="0A2540" w:val="clear"/>
+          </w:tcPr>
+          <w:p>
+            <w:pPr>
+              <w:spacing w:after="0" w:line="276" w:lineRule="auto"/>
+              <w:jc w:val="left"/>
+            </w:pPr>
+            <w:r>
+              <w:rPr>
+                <w:rFonts w:ascii="Calibri" w:hAnsi="Calibri"/>
+                <w:b/>
+                <w:color w:val="FFFFFF"/>
+                <w:sz w:val="20"/>
+              </w:rPr>
+              <w:t>Verified state</w:t>
+            </w:r>
+          </w:p>
+        </w:tc>
+        <w:tc>
+          <w:tcPr>
+            <w:tcW w:type="dxa" w:w="4560"/>
+            <w:vAlign w:val="center"/>
+            <w:tcMar>
+              <w:top w:w="80" w:type="dxa"/>
+              <w:bottom w:w="80" w:type="dxa"/>
+              <w:start w:w="120" w:type="dxa"/>
+              <w:end w:w="120" w:type="dxa"/>
+            </w:tcMar>
+            <w:shd w:fill="0A2540" w:val="clear"/>
+          </w:tcPr>
+          <w:p>
+            <w:pPr>
+              <w:spacing w:after="0" w:line="276" w:lineRule="auto"/>
+              <w:jc w:val="left"/>
+            </w:pPr>
+            <w:r>
+              <w:rPr>
+                <w:rFonts w:ascii="Calibri" w:hAnsi="Calibri"/>
+                <w:b/>
+                <w:color w:val="FFFFFF"/>
+                <w:sz w:val="20"/>
+              </w:rPr>
+              <w:t>What it can show</w:t>
+            </w:r>
+          </w:p>
+        </w:tc>
+      </w:tr>
+      <w:tr>
+        <w:tc>
+          <w:tcPr>
+            <w:tcW w:type="dxa" w:w="3150"/>
+            <w:vAlign w:val="center"/>
+            <w:tcMar>
+              <w:top w:w="80" w:type="dxa"/>
+              <w:bottom w:w="80" w:type="dxa"/>
+              <w:start w:w="120" w:type="dxa"/>
+              <w:end w:w="120" w:type="dxa"/>
+            </w:tcMar>
+          </w:tcPr>
+          <w:p>
+            <w:pPr>
+              <w:spacing w:after="0" w:line="276" w:lineRule="auto"/>
+              <w:jc w:val="left"/>
+            </w:pPr>
+            <w:r>
+              <w:rPr>
+                <w:rFonts w:ascii="Calibri" w:hAnsi="Calibri"/>
+                <w:b/>
+                <w:color w:val="0A2540"/>
+                <w:sz w:val="20"/>
+              </w:rPr>
+              <w:t>U.S. Department of Labor Form 5500</w:t>
+            </w:r>
+          </w:p>
+        </w:tc>
+        <w:tc>
+          <w:tcPr>
+            <w:tcW w:type="dxa" w:w="1650"/>
+            <w:vAlign w:val="center"/>
+            <w:tcMar>
+              <w:top w:w="80" w:type="dxa"/>
+              <w:bottom w:w="80" w:type="dxa"/>
+              <w:start w:w="120" w:type="dxa"/>
+              <w:end w:w="120" w:type="dxa"/>
+            </w:tcMar>
+          </w:tcPr>
+          <w:p>
+            <w:pPr>
+              <w:spacing w:after="0" w:line="276" w:lineRule="auto"/>
+              <w:jc w:val="left"/>
+            </w:pPr>
+            <w:r>
+              <w:rPr>
+                <w:rFonts w:ascii="Calibri" w:hAnsi="Calibri"/>
+                <w:b/>
+                <w:color w:val="168F89"/>
+                <w:sz w:val="20"/>
+              </w:rPr>
+              <w:t>LIVE</w:t>
+            </w:r>
+          </w:p>
+        </w:tc>
+        <w:tc>
+          <w:tcPr>
+            <w:tcW w:type="dxa" w:w="4560"/>
+            <w:vAlign w:val="center"/>
+            <w:tcMar>
+              <w:top w:w="80" w:type="dxa"/>
+              <w:bottom w:w="80" w:type="dxa"/>
+              <w:start w:w="120" w:type="dxa"/>
+              <w:end w:w="120" w:type="dxa"/>
+            </w:tcMar>
+          </w:tcPr>
+          <w:p>
+            <w:pPr>
+              <w:spacing w:after="0" w:line="276" w:lineRule="auto"/>
+              <w:jc w:val="left"/>
+            </w:pPr>
+            <w:r>
+              <w:rPr>
+                <w:rFonts w:ascii="Calibri" w:hAnsi="Calibri"/>
+                <w:b w:val="0"/>
+                <w:color w:val="1F2933"/>
+                <w:sz w:val="20"/>
+              </w:rPr>
+              <w:t>Benefit-plan filings and reported plan or policy timing fields.</w:t>
+            </w:r>
+          </w:p>
+        </w:tc>
+      </w:tr>
+      <w:tr>
+        <w:tc>
+          <w:tcPr>
+            <w:tcW w:type="dxa" w:w="3150"/>
+            <w:shd w:fill="F5F8FB" w:val="clear"/>
+            <w:vAlign w:val="center"/>
+            <w:tcMar>
+              <w:top w:w="80" w:type="dxa"/>
+              <w:bottom w:w="80" w:type="dxa"/>
+              <w:start w:w="120" w:type="dxa"/>
+              <w:end w:w="120" w:type="dxa"/>
+            </w:tcMar>
+          </w:tcPr>
+          <w:p>
+            <w:pPr>
+              <w:spacing w:after="0" w:line="276" w:lineRule="auto"/>
+              <w:jc w:val="left"/>
+            </w:pPr>
+            <w:r>
+              <w:rPr>
+                <w:rFonts w:ascii="Calibri" w:hAnsi="Calibri"/>
+                <w:b/>
+                <w:color w:val="0A2540"/>
+                <w:sz w:val="20"/>
+              </w:rPr>
+              <w:t>FMCSA Company Census</w:t>
+            </w:r>
+          </w:p>
+        </w:tc>
+        <w:tc>
+          <w:tcPr>
+            <w:tcW w:type="dxa" w:w="1650"/>
+            <w:shd w:fill="F5F8FB" w:val="clear"/>
+            <w:vAlign w:val="center"/>
+            <w:tcMar>
+              <w:top w:w="80" w:type="dxa"/>
+              <w:bottom w:w="80" w:type="dxa"/>
+              <w:start w:w="120" w:type="dxa"/>
+              <w:end w:w="120" w:type="dxa"/>
+            </w:tcMar>
+          </w:tcPr>
+          <w:p>
+            <w:pPr>
+              <w:spacing w:after="0" w:line="276" w:lineRule="auto"/>
+              <w:jc w:val="left"/>
+            </w:pPr>
+            <w:r>
+              <w:rPr>
+                <w:rFonts w:ascii="Calibri" w:hAnsi="Calibri"/>
+                <w:b/>
+                <w:color w:val="168F89"/>
+                <w:sz w:val="20"/>
+              </w:rPr>
+              <w:t>LIVE</w:t>
+            </w:r>
+          </w:p>
+        </w:tc>
+        <w:tc>
+          <w:tcPr>
+            <w:tcW w:type="dxa" w:w="4560"/>
+            <w:shd w:fill="F5F8FB" w:val="clear"/>
+            <w:vAlign w:val="center"/>
+            <w:tcMar>
+              <w:top w:w="80" w:type="dxa"/>
+              <w:bottom w:w="80" w:type="dxa"/>
+              <w:start w:w="120" w:type="dxa"/>
+              <w:end w:w="120" w:type="dxa"/>
+            </w:tcMar>
+          </w:tcPr>
+          <w:p>
+            <w:pPr>
+              <w:spacing w:after="0" w:line="276" w:lineRule="auto"/>
+              <w:jc w:val="left"/>
+            </w:pPr>
+            <w:r>
+              <w:rPr>
+                <w:rFonts w:ascii="Calibri" w:hAnsi="Calibri"/>
+                <w:b w:val="0"/>
+                <w:color w:val="1F2933"/>
+                <w:sz w:val="20"/>
+              </w:rPr>
+              <w:t>Organization-level carrier registration activity.</w:t>
+            </w:r>
+          </w:p>
+        </w:tc>
+      </w:tr>
+      <w:tr>
+        <w:tc>
+          <w:tcPr>
+            <w:tcW w:type="dxa" w:w="3150"/>
+            <w:vAlign w:val="center"/>
+            <w:tcMar>
+              <w:top w:w="80" w:type="dxa"/>
+              <w:bottom w:w="80" w:type="dxa"/>
+              <w:start w:w="120" w:type="dxa"/>
+              <w:end w:w="120" w:type="dxa"/>
+            </w:tcMar>
+          </w:tcPr>
+          <w:p>
+            <w:pPr>
+              <w:spacing w:after="0" w:line="276" w:lineRule="auto"/>
+              <w:jc w:val="left"/>
+            </w:pPr>
+            <w:r>
+              <w:rPr>
+                <w:rFonts w:ascii="Calibri" w:hAnsi="Calibri"/>
+                <w:b/>
+                <w:color w:val="0A2540"/>
+                <w:sz w:val="20"/>
+              </w:rPr>
+              <w:t>USAspending</w:t>
+            </w:r>
+          </w:p>
+        </w:tc>
+        <w:tc>
+          <w:tcPr>
+            <w:tcW w:type="dxa" w:w="1650"/>
+            <w:vAlign w:val="center"/>
+            <w:tcMar>
+              <w:top w:w="80" w:type="dxa"/>
+              <w:bottom w:w="80" w:type="dxa"/>
+              <w:start w:w="120" w:type="dxa"/>
+              <w:end w:w="120" w:type="dxa"/>
+            </w:tcMar>
+          </w:tcPr>
+          <w:p>
+            <w:pPr>
+              <w:spacing w:after="0" w:line="276" w:lineRule="auto"/>
+              <w:jc w:val="left"/>
+            </w:pPr>
+            <w:r>
+              <w:rPr>
+                <w:rFonts w:ascii="Calibri" w:hAnsi="Calibri"/>
+                <w:b/>
+                <w:color w:val="168F89"/>
+                <w:sz w:val="20"/>
+              </w:rPr>
+              <w:t>LIVE</w:t>
+            </w:r>
+          </w:p>
+        </w:tc>
+        <w:tc>
+          <w:tcPr>
+            <w:tcW w:type="dxa" w:w="4560"/>
+            <w:vAlign w:val="center"/>
+            <w:tcMar>
+              <w:top w:w="80" w:type="dxa"/>
+              <w:bottom w:w="80" w:type="dxa"/>
+              <w:start w:w="120" w:type="dxa"/>
+              <w:end w:w="120" w:type="dxa"/>
+            </w:tcMar>
+          </w:tcPr>
+          <w:p>
+            <w:pPr>
+              <w:spacing w:after="0" w:line="276" w:lineRule="auto"/>
+              <w:jc w:val="left"/>
+            </w:pPr>
+            <w:r>
+              <w:rPr>
+                <w:rFonts w:ascii="Calibri" w:hAnsi="Calibri"/>
+                <w:b w:val="0"/>
+                <w:color w:val="1F2933"/>
+                <w:sz w:val="20"/>
+              </w:rPr>
+              <w:t>Federal contract activity in the current query window.</w:t>
+            </w:r>
+          </w:p>
+        </w:tc>
+      </w:tr>
+      <w:tr>
+        <w:tc>
+          <w:tcPr>
+            <w:tcW w:type="dxa" w:w="3150"/>
+            <w:shd w:fill="F5F8FB" w:val="clear"/>
+            <w:vAlign w:val="center"/>
+            <w:tcMar>
+              <w:top w:w="80" w:type="dxa"/>
+              <w:bottom w:w="80" w:type="dxa"/>
+              <w:start w:w="120" w:type="dxa"/>
+              <w:end w:w="120" w:type="dxa"/>
+            </w:tcMar>
+          </w:tcPr>
+          <w:p>
+            <w:pPr>
+              <w:spacing w:after="0" w:line="276" w:lineRule="auto"/>
+              <w:jc w:val="left"/>
+            </w:pPr>
+            <w:r>
+              <w:rPr>
+                <w:rFonts w:ascii="Calibri" w:hAnsi="Calibri"/>
+                <w:b/>
+                <w:color w:val="0A2540"/>
+                <w:sz w:val="20"/>
+              </w:rPr>
+              <w:t>EPA ECHO</w:t>
+            </w:r>
+          </w:p>
+        </w:tc>
+        <w:tc>
+          <w:tcPr>
+            <w:tcW w:type="dxa" w:w="1650"/>
+            <w:shd w:fill="F5F8FB" w:val="clear"/>
+            <w:vAlign w:val="center"/>
+            <w:tcMar>
+              <w:top w:w="80" w:type="dxa"/>
+              <w:bottom w:w="80" w:type="dxa"/>
+              <w:start w:w="120" w:type="dxa"/>
+              <w:end w:w="120" w:type="dxa"/>
+            </w:tcMar>
+          </w:tcPr>
+          <w:p>
+            <w:pPr>
+              <w:spacing w:after="0" w:line="276" w:lineRule="auto"/>
+              <w:jc w:val="left"/>
+            </w:pPr>
+            <w:r>
+              <w:rPr>
+                <w:rFonts w:ascii="Calibri" w:hAnsi="Calibri"/>
+                <w:b/>
+                <w:color w:val="168F89"/>
+                <w:sz w:val="20"/>
+              </w:rPr>
+              <w:t>LIVE</w:t>
+            </w:r>
+          </w:p>
+        </w:tc>
+        <w:tc>
+          <w:tcPr>
+            <w:tcW w:type="dxa" w:w="4560"/>
+            <w:shd w:fill="F5F8FB" w:val="clear"/>
+            <w:vAlign w:val="center"/>
+            <w:tcMar>
+              <w:top w:w="80" w:type="dxa"/>
+              <w:bottom w:w="80" w:type="dxa"/>
+              <w:start w:w="120" w:type="dxa"/>
+              <w:end w:w="120" w:type="dxa"/>
+            </w:tcMar>
+          </w:tcPr>
+          <w:p>
+            <w:pPr>
+              <w:spacing w:after="0" w:line="276" w:lineRule="auto"/>
+              <w:jc w:val="left"/>
+            </w:pPr>
+            <w:r>
+              <w:rPr>
+                <w:rFonts w:ascii="Calibri" w:hAnsi="Calibri"/>
+                <w:b w:val="0"/>
+                <w:color w:val="1F2933"/>
+                <w:sz w:val="20"/>
+              </w:rPr>
+              <w:t>Organization and facility compliance-monitoring activity.</w:t>
+            </w:r>
+          </w:p>
+        </w:tc>
+      </w:tr>
+      <w:tr>
+        <w:tc>
+          <w:tcPr>
+            <w:tcW w:type="dxa" w:w="3150"/>
+            <w:vAlign w:val="center"/>
+            <w:tcMar>
+              <w:top w:w="80" w:type="dxa"/>
+              <w:bottom w:w="80" w:type="dxa"/>
+              <w:start w:w="120" w:type="dxa"/>
+              <w:end w:w="120" w:type="dxa"/>
+            </w:tcMar>
+          </w:tcPr>
+          <w:p>
+            <w:pPr>
+              <w:spacing w:after="0" w:line="276" w:lineRule="auto"/>
+              <w:jc w:val="left"/>
+            </w:pPr>
+            <w:r>
+              <w:rPr>
+                <w:rFonts w:ascii="Calibri" w:hAnsi="Calibri"/>
+                <w:b/>
+                <w:color w:val="0A2540"/>
+                <w:sz w:val="20"/>
+              </w:rPr>
+              <w:t>FCC ULS</w:t>
+            </w:r>
+          </w:p>
+        </w:tc>
+        <w:tc>
+          <w:tcPr>
+            <w:tcW w:type="dxa" w:w="1650"/>
+            <w:vAlign w:val="center"/>
+            <w:tcMar>
+              <w:top w:w="80" w:type="dxa"/>
+              <w:bottom w:w="80" w:type="dxa"/>
+              <w:start w:w="120" w:type="dxa"/>
+              <w:end w:w="120" w:type="dxa"/>
+            </w:tcMar>
+          </w:tcPr>
+          <w:p>
+            <w:pPr>
+              <w:spacing w:after="0" w:line="276" w:lineRule="auto"/>
+              <w:jc w:val="left"/>
+            </w:pPr>
+            <w:r>
+              <w:rPr>
+                <w:rFonts w:ascii="Calibri" w:hAnsi="Calibri"/>
+                <w:b/>
+                <w:color w:val="B78327"/>
+                <w:sz w:val="20"/>
+              </w:rPr>
+              <w:t>UNAVAILABLE</w:t>
+            </w:r>
+          </w:p>
+        </w:tc>
+        <w:tc>
+          <w:tcPr>
+            <w:tcW w:type="dxa" w:w="4560"/>
+            <w:vAlign w:val="center"/>
+            <w:tcMar>
+              <w:top w:w="80" w:type="dxa"/>
+              <w:bottom w:w="80" w:type="dxa"/>
+              <w:start w:w="120" w:type="dxa"/>
+              <w:end w:w="120" w:type="dxa"/>
+            </w:tcMar>
+          </w:tcPr>
+          <w:p>
+            <w:pPr>
+              <w:spacing w:after="0" w:line="276" w:lineRule="auto"/>
+              <w:jc w:val="left"/>
+            </w:pPr>
+            <w:r>
+              <w:rPr>
+                <w:rFonts w:ascii="Calibri" w:hAnsi="Calibri"/>
+                <w:b w:val="0"/>
+                <w:color w:val="1F2933"/>
+                <w:sz w:val="20"/>
+              </w:rPr>
+              <w:t>Organization wireless-license activity when the source answers.</w:t>
+            </w:r>
+          </w:p>
+        </w:tc>
+      </w:tr>
+      <w:tr>
+        <w:tc>
+          <w:tcPr>
+            <w:tcW w:type="dxa" w:w="3150"/>
+            <w:shd w:fill="F5F8FB" w:val="clear"/>
+            <w:vAlign w:val="center"/>
+            <w:tcMar>
+              <w:top w:w="80" w:type="dxa"/>
+              <w:bottom w:w="80" w:type="dxa"/>
+              <w:start w:w="120" w:type="dxa"/>
+              <w:end w:w="120" w:type="dxa"/>
+            </w:tcMar>
+          </w:tcPr>
+          <w:p>
+            <w:pPr>
+              <w:spacing w:after="0" w:line="276" w:lineRule="auto"/>
+              <w:jc w:val="left"/>
+            </w:pPr>
+            <w:r>
+              <w:rPr>
+                <w:rFonts w:ascii="Calibri" w:hAnsi="Calibri"/>
+                <w:b/>
+                <w:color w:val="0A2540"/>
+                <w:sz w:val="20"/>
+              </w:rPr>
+              <w:t>Chicago business licenses</w:t>
+            </w:r>
+          </w:p>
+        </w:tc>
+        <w:tc>
+          <w:tcPr>
+            <w:tcW w:type="dxa" w:w="1650"/>
+            <w:shd w:fill="F5F8FB" w:val="clear"/>
+            <w:vAlign w:val="center"/>
+            <w:tcMar>
+              <w:top w:w="80" w:type="dxa"/>
+              <w:bottom w:w="80" w:type="dxa"/>
+              <w:start w:w="120" w:type="dxa"/>
+              <w:end w:w="120" w:type="dxa"/>
+            </w:tcMar>
+          </w:tcPr>
+          <w:p>
+            <w:pPr>
+              <w:spacing w:after="0" w:line="276" w:lineRule="auto"/>
+              <w:jc w:val="left"/>
+            </w:pPr>
+            <w:r>
+              <w:rPr>
+                <w:rFonts w:ascii="Calibri" w:hAnsi="Calibri"/>
+                <w:b/>
+                <w:color w:val="B78327"/>
+                <w:sz w:val="20"/>
+              </w:rPr>
+              <w:t>UNAVAILABLE</w:t>
+            </w:r>
+          </w:p>
+        </w:tc>
+        <w:tc>
+          <w:tcPr>
+            <w:tcW w:type="dxa" w:w="4560"/>
+            <w:shd w:fill="F5F8FB" w:val="clear"/>
+            <w:vAlign w:val="center"/>
+            <w:tcMar>
+              <w:top w:w="80" w:type="dxa"/>
+              <w:bottom w:w="80" w:type="dxa"/>
+              <w:start w:w="120" w:type="dxa"/>
+              <w:end w:w="120" w:type="dxa"/>
+            </w:tcMar>
+          </w:tcPr>
+          <w:p>
+            <w:pPr>
+              <w:spacing w:after="0" w:line="276" w:lineRule="auto"/>
+              <w:jc w:val="left"/>
+            </w:pPr>
+            <w:r>
+              <w:rPr>
+                <w:rFonts w:ascii="Calibri" w:hAnsi="Calibri"/>
+                <w:b w:val="0"/>
+                <w:color w:val="1F2933"/>
+                <w:sz w:val="20"/>
+              </w:rPr>
+              <w:t>New active business-license records when applicable.</w:t>
+            </w:r>
+          </w:p>
+        </w:tc>
+      </w:tr>
+      <w:tr>
+        <w:tc>
+          <w:tcPr>
+            <w:tcW w:type="dxa" w:w="3150"/>
+            <w:vAlign w:val="center"/>
+            <w:tcMar>
+              <w:top w:w="80" w:type="dxa"/>
+              <w:bottom w:w="80" w:type="dxa"/>
+              <w:start w:w="120" w:type="dxa"/>
+              <w:end w:w="120" w:type="dxa"/>
+            </w:tcMar>
+          </w:tcPr>
+          <w:p>
+            <w:pPr>
+              <w:spacing w:after="0" w:line="276" w:lineRule="auto"/>
+              <w:jc w:val="left"/>
+            </w:pPr>
+            <w:r>
+              <w:rPr>
+                <w:rFonts w:ascii="Calibri" w:hAnsi="Calibri"/>
+                <w:b/>
+                <w:color w:val="0A2540"/>
+                <w:sz w:val="20"/>
+              </w:rPr>
+              <w:t>SAM.gov entity updates</w:t>
+            </w:r>
+          </w:p>
+        </w:tc>
+        <w:tc>
+          <w:tcPr>
+            <w:tcW w:type="dxa" w:w="1650"/>
+            <w:vAlign w:val="center"/>
+            <w:tcMar>
+              <w:top w:w="80" w:type="dxa"/>
+              <w:bottom w:w="80" w:type="dxa"/>
+              <w:start w:w="120" w:type="dxa"/>
+              <w:end w:w="120" w:type="dxa"/>
+            </w:tcMar>
+          </w:tcPr>
+          <w:p>
+            <w:pPr>
+              <w:spacing w:after="0" w:line="276" w:lineRule="auto"/>
+              <w:jc w:val="left"/>
+            </w:pPr>
+            <w:r>
+              <w:rPr>
+                <w:rFonts w:ascii="Calibri" w:hAnsi="Calibri"/>
+                <w:b/>
+                <w:color w:val="B78327"/>
+                <w:sz w:val="20"/>
+              </w:rPr>
+              <w:t>UNAVAILABLE</w:t>
+            </w:r>
+          </w:p>
+        </w:tc>
+        <w:tc>
+          <w:tcPr>
+            <w:tcW w:type="dxa" w:w="4560"/>
+            <w:vAlign w:val="center"/>
+            <w:tcMar>
+              <w:top w:w="80" w:type="dxa"/>
+              <w:bottom w:w="80" w:type="dxa"/>
+              <w:start w:w="120" w:type="dxa"/>
+              <w:end w:w="120" w:type="dxa"/>
+            </w:tcMar>
+          </w:tcPr>
+          <w:p>
+            <w:pPr>
+              <w:spacing w:after="0" w:line="276" w:lineRule="auto"/>
+              <w:jc w:val="left"/>
+            </w:pPr>
+            <w:r>
+              <w:rPr>
+                <w:rFonts w:ascii="Calibri" w:hAnsi="Calibri"/>
+                <w:b w:val="0"/>
+                <w:color w:val="1F2933"/>
+                <w:sz w:val="20"/>
+              </w:rPr>
+              <w:t>Active entity updates when the source and credential are available.</w:t>
+            </w:r>
+          </w:p>
+        </w:tc>
+      </w:tr>
+    </w:tbl>
+    <w:p>
+      <w:pPr>
+        <w:pStyle w:val="Heading2"/>
+        <w:keepNext/>
+      </w:pPr>
       <w:r>
-        <w:rPr>
-          <w:rFonts w:ascii="Calibri" w:hAnsi="Calibri"/>
-          <w:b w:val="0"/>
-          <w:i w:val="0"/>
-          <w:color w:val="1C2737"/>
-          <w:sz w:val="22"/>
-        </w:rPr>
-        <w:t xml:space="preserve"> Employers whose official Department of Labor filing reports a group-life benefit and a plan or policy anniversary.</w:t>
+        <w:t>What is deliberately excluded</w:t>
       </w:r>
     </w:p>
     <w:p>
       <w:pPr>
-        <w:pStyle w:val="ListBullet"/>
+        <w:numPr>
+          <w:ilvl w:val="0"/>
+          <w:numId w:val="10"/>
+        </w:numPr>
         <w:spacing w:after="80" w:line="300" w:lineRule="auto"/>
-        <w:ind w:left="540" w:hanging="271"/>
       </w:pPr>
       <w:r>
         <w:rPr>
           <w:rFonts w:ascii="Calibri" w:hAnsi="Calibri"/>
-          <w:b/>
-          <w:i w:val="0"/>
-          <w:color w:val="0B2545"/>
-          <w:sz w:val="22"/>
+          <w:color w:val="1F2933"/>
         </w:rPr>
-        <w:t>Growth &amp; awards:</w:t>
-      </w:r>
-      <w:r>
-        <w:rPr>
-          <w:rFonts w:ascii="Calibri" w:hAnsi="Calibri"/>
-          <w:b w:val="0"/>
-          <w:i w:val="0"/>
-          <w:color w:val="1C2737"/>
-          <w:sz w:val="22"/>
-        </w:rPr>
-        <w:t xml:space="preserve"> Current federal contract activity that may justify a business-protection, continuity, or workforce review.</w:t>
+        <w:t>Personal social-media profiles, private contacts, and hidden contact enrichment.</w:t>
       </w:r>
     </w:p>
     <w:p>
       <w:pPr>
-        <w:pStyle w:val="ListBullet"/>
+        <w:numPr>
+          <w:ilvl w:val="0"/>
+          <w:numId w:val="10"/>
+        </w:numPr>
         <w:spacing w:after="80" w:line="300" w:lineRule="auto"/>
-        <w:ind w:left="540" w:hanging="271"/>
       </w:pPr>
       <w:r>
         <w:rPr>
           <w:rFonts w:ascii="Calibri" w:hAnsi="Calibri"/>
-          <w:b/>
-          <w:i w:val="0"/>
-          <w:color w:val="0B2545"/>
-          <w:sz w:val="22"/>
+          <w:color w:val="1F2933"/>
         </w:rPr>
-        <w:t>Operational change:</w:t>
-      </w:r>
-      <w:r>
-        <w:rPr>
-          <w:rFonts w:ascii="Calibri" w:hAnsi="Calibri"/>
-          <w:b w:val="0"/>
-          <w:i w:val="0"/>
-          <w:color w:val="1C2737"/>
-          <w:sz w:val="22"/>
-        </w:rPr>
-        <w:t xml:space="preserve"> Carrier registrations, facility monitoring activity, and other official organization events.</w:t>
+        <w:t>Health, age, race, religion, family status, wealth, or insurability inferences.</w:t>
       </w:r>
     </w:p>
     <w:p>
       <w:pPr>
-        <w:pStyle w:val="ListBullet"/>
+        <w:numPr>
+          <w:ilvl w:val="0"/>
+          <w:numId w:val="10"/>
+        </w:numPr>
         <w:spacing w:after="80" w:line="300" w:lineRule="auto"/>
-        <w:ind w:left="540" w:hanging="271"/>
       </w:pPr>
       <w:r>
         <w:rPr>
           <w:rFonts w:ascii="Calibri" w:hAnsi="Calibri"/>
-          <w:b/>
-          <w:i w:val="0"/>
-          <w:color w:val="0B2545"/>
-          <w:sz w:val="22"/>
+          <w:color w:val="1F2933"/>
         </w:rPr>
-        <w:t>Needs research:</w:t>
-      </w:r>
-      <w:r>
-        <w:rPr>
-          <w:rFonts w:ascii="Calibri" w:hAnsi="Calibri"/>
-          <w:b w:val="0"/>
-          <w:i w:val="0"/>
-          <w:color w:val="1C2737"/>
-          <w:sz w:val="22"/>
-        </w:rPr>
-        <w:t xml:space="preserve"> Every account that still requires source verification, product-fit review, and protected contact clearance.</w:t>
+        <w:t>Named filing signers, administrators, donors, or executives used as personal leads.</w:t>
       </w:r>
     </w:p>
     <w:p>
       <w:pPr>
-        <w:spacing w:before="80" w:after="200" w:line="288" w:lineRule="auto"/>
-        <w:ind w:left="173" w:right="173"/>
-        <w:shd w:fill="E7F5F3"/>
-        <w:pBdr>
-          <w:left w:val="single" w:sz="18" w:space="8" w:color="148984"/>
-        </w:pBdr>
+        <w:numPr>
+          <w:ilvl w:val="0"/>
+          <w:numId w:val="10"/>
+        </w:numPr>
+        <w:spacing w:after="80" w:line="300" w:lineRule="auto"/>
       </w:pPr>
       <w:r>
         <w:rPr>
           <w:rFonts w:ascii="Calibri" w:hAnsi="Calibri"/>
-          <w:b/>
-          <w:i w:val="0"/>
-          <w:color w:val="0B2545"/>
-          <w:sz w:val="22"/>
+          <w:color w:val="1F2933"/>
         </w:rPr>
-        <w:t xml:space="preserve">Timing label: </w:t>
-      </w:r>
-      <w:r>
-        <w:rPr>
-          <w:rFonts w:ascii="Calibri" w:hAnsi="Calibri"/>
-          <w:b w:val="0"/>
-          <w:i w:val="0"/>
-          <w:color w:val="1C2737"/>
-          <w:sz w:val="22"/>
-        </w:rPr>
-        <w:t>A Form 5500 anniversary is a research hypothesis. It is not proof of a renewal, dissatisfaction, buying intent, eligibility, or insurability.</w:t>
+        <w:t>Automatic contact permission, automatic quoting, or an underwriting conclusion.</w:t>
       </w:r>
     </w:p>
     <w:p>
@@ -779,7 +2143,7 @@
         <w:keepNext/>
       </w:pPr>
       <w:r>
-        <w:t>How to read an account</w:t>
+        <w:t>A practical daily routine</w:t>
       </w:r>
     </w:p>
     <w:p>
@@ -788,22 +2152,71 @@
         <w:keepNext/>
       </w:pPr>
       <w:r>
-        <w:t>Verified deal moment</w:t>
+        <w:t>Morning: choose the research queue</w:t>
       </w:r>
     </w:p>
     <w:p>
       <w:pPr>
-        <w:spacing w:before="0" w:after="120" w:line="300" w:lineRule="auto"/>
+        <w:numPr>
+          <w:ilvl w:val="0"/>
+          <w:numId w:val="10"/>
+        </w:numPr>
+        <w:spacing w:after="80" w:line="300" w:lineRule="auto"/>
       </w:pPr>
       <w:r>
         <w:rPr>
           <w:rFonts w:ascii="Calibri" w:hAnsi="Calibri"/>
-          <w:b w:val="0"/>
-          <w:i w:val="0"/>
-          <w:color w:val="1C2737"/>
-          <w:sz w:val="22"/>
+          <w:color w:val="1F2933"/>
         </w:rPr>
-        <w:t>The organization-level fact returned by the official source. Read this before the product idea.</w:t>
+        <w:t>Open the Broker view and check the release stamp.</w:t>
+      </w:r>
+    </w:p>
+    <w:p>
+      <w:pPr>
+        <w:numPr>
+          <w:ilvl w:val="0"/>
+          <w:numId w:val="10"/>
+        </w:numPr>
+        <w:spacing w:after="80" w:line="300" w:lineRule="auto"/>
+      </w:pPr>
+      <w:r>
+        <w:rPr>
+          <w:rFonts w:ascii="Calibri" w:hAnsi="Calibri"/>
+          <w:color w:val="1F2933"/>
+        </w:rPr>
+        <w:t>Choose your state or region; start with one state for depth.</w:t>
+      </w:r>
+    </w:p>
+    <w:p>
+      <w:pPr>
+        <w:numPr>
+          <w:ilvl w:val="0"/>
+          <w:numId w:val="10"/>
+        </w:numPr>
+        <w:spacing w:after="80" w:line="300" w:lineRule="auto"/>
+      </w:pPr>
+      <w:r>
+        <w:rPr>
+          <w:rFonts w:ascii="Calibri" w:hAnsi="Calibri"/>
+          <w:color w:val="1F2933"/>
+        </w:rPr>
+        <w:t>Read the Broker brief and pick five organizations to verify.</w:t>
+      </w:r>
+    </w:p>
+    <w:p>
+      <w:pPr>
+        <w:numPr>
+          <w:ilvl w:val="0"/>
+          <w:numId w:val="10"/>
+        </w:numPr>
+        <w:spacing w:after="80" w:line="300" w:lineRule="auto"/>
+      </w:pPr>
+      <w:r>
+        <w:rPr>
+          <w:rFonts w:ascii="Calibri" w:hAnsi="Calibri"/>
+          <w:color w:val="1F2933"/>
+        </w:rPr>
+        <w:t>Open every official source before writing a note.</w:t>
       </w:r>
     </w:p>
     <w:p>
@@ -812,22 +2225,71 @@
         <w:keepNext/>
       </w:pPr>
       <w:r>
-        <w:t>Timing</w:t>
+        <w:t>Research block: turn records into qualified questions</w:t>
       </w:r>
     </w:p>
     <w:p>
       <w:pPr>
-        <w:spacing w:before="0" w:after="120" w:line="300" w:lineRule="auto"/>
+        <w:numPr>
+          <w:ilvl w:val="0"/>
+          <w:numId w:val="10"/>
+        </w:numPr>
+        <w:spacing w:after="80" w:line="300" w:lineRule="auto"/>
       </w:pPr>
       <w:r>
         <w:rPr>
           <w:rFonts w:ascii="Calibri" w:hAnsi="Calibri"/>
-          <w:b w:val="0"/>
-          <w:i w:val="0"/>
-          <w:color w:val="1C2737"/>
-          <w:sz w:val="22"/>
+          <w:color w:val="1F2933"/>
         </w:rPr>
-        <w:t>The observed date or the next anniversary calculated from a previously reported plan or policy period.</w:t>
+        <w:t>Confirm the organization and event on the official record.</w:t>
+      </w:r>
+    </w:p>
+    <w:p>
+      <w:pPr>
+        <w:numPr>
+          <w:ilvl w:val="0"/>
+          <w:numId w:val="10"/>
+        </w:numPr>
+        <w:spacing w:after="80" w:line="300" w:lineRule="auto"/>
+      </w:pPr>
+      <w:r>
+        <w:rPr>
+          <w:rFonts w:ascii="Calibri" w:hAnsi="Calibri"/>
+          <w:color w:val="1F2933"/>
+        </w:rPr>
+        <w:t>Check the organization's own website for current operations and a business-published channel.</w:t>
+      </w:r>
+    </w:p>
+    <w:p>
+      <w:pPr>
+        <w:numPr>
+          <w:ilvl w:val="0"/>
+          <w:numId w:val="10"/>
+        </w:numPr>
+        <w:spacing w:after="80" w:line="300" w:lineRule="auto"/>
+      </w:pPr>
+      <w:r>
+        <w:rPr>
+          <w:rFonts w:ascii="Calibri" w:hAnsi="Calibri"/>
+          <w:color w:val="1F2933"/>
+        </w:rPr>
+        <w:t>Write down what is known, what is inferred, and what remains unknown.</w:t>
+      </w:r>
+    </w:p>
+    <w:p>
+      <w:pPr>
+        <w:numPr>
+          <w:ilvl w:val="0"/>
+          <w:numId w:val="10"/>
+        </w:numPr>
+        <w:spacing w:after="80" w:line="300" w:lineRule="auto"/>
+      </w:pPr>
+      <w:r>
+        <w:rPr>
+          <w:rFonts w:ascii="Calibri" w:hAnsi="Calibri"/>
+          <w:color w:val="1F2933"/>
+        </w:rPr>
+        <w:t>Do not copy sensitive person-level fields into your notes.</w:t>
       </w:r>
     </w:p>
     <w:p>
@@ -836,160 +2298,176 @@
         <w:keepNext/>
       </w:pPr>
       <w:r>
-        <w:t>Likely fit</w:t>
+        <w:t>Before any outreach</w:t>
       </w:r>
     </w:p>
     <w:p>
       <w:pPr>
-        <w:spacing w:before="0" w:after="120" w:line="300" w:lineRule="auto"/>
-      </w:pPr>
-      <w:r>
-        <w:rPr>
-          <w:rFonts w:ascii="Calibri" w:hAnsi="Calibri"/>
-          <w:b w:val="0"/>
-          <w:i w:val="0"/>
-          <w:color w:val="1C2737"/>
-          <w:sz w:val="22"/>
-        </w:rPr>
-        <w:t>A reason to investigate protection planning. It is not a recommendation, quote, coverage determination, or statement that David is appointed or licensed for every product shown by the source.</w:t>
-      </w:r>
-    </w:p>
-    <w:p>
-      <w:pPr>
-        <w:pStyle w:val="Heading2"/>
-        <w:keepNext/>
-      </w:pPr>
-      <w:r>
-        <w:t>Evidence</w:t>
-      </w:r>
-    </w:p>
-    <w:p>
-      <w:pPr>
-        <w:spacing w:before="0" w:after="120" w:line="300" w:lineRule="auto"/>
-      </w:pPr>
-      <w:r>
-        <w:rPr>
-          <w:rFonts w:ascii="Calibri" w:hAnsi="Calibri"/>
-          <w:b w:val="0"/>
-          <w:i w:val="0"/>
-          <w:color w:val="1C2737"/>
-          <w:sz w:val="22"/>
-        </w:rPr>
-        <w:t>Direct filing or official record shows the evidence class. Source receipt linked means the normalized observation has a checkable proof record.</w:t>
-      </w:r>
-    </w:p>
-    <w:p>
-      <w:pPr>
-        <w:pStyle w:val="Heading2"/>
-        <w:keepNext/>
-      </w:pPr>
-      <w:r>
-        <w:t>Contact state</w:t>
-      </w:r>
-    </w:p>
-    <w:p>
-      <w:pPr>
-        <w:spacing w:before="0" w:after="120" w:line="300" w:lineRule="auto"/>
-      </w:pPr>
-      <w:r>
-        <w:rPr>
-          <w:rFonts w:ascii="Calibri" w:hAnsi="Calibri"/>
-          <w:b w:val="0"/>
-          <w:i w:val="0"/>
-          <w:color w:val="1C2737"/>
-          <w:sz w:val="22"/>
-        </w:rPr>
-        <w:t>Cleared to contact stays at zero in the public view. That is intentional. Public visibility does not create consent.</w:t>
-      </w:r>
-    </w:p>
-    <w:p>
-      <w:pPr>
-        <w:pStyle w:val="Heading1"/>
-        <w:keepNext/>
-      </w:pPr>
-      <w:r>
-        <w:t>The three-step broker action</w:t>
-      </w:r>
-    </w:p>
-    <w:p>
-      <w:pPr>
-        <w:pStyle w:val="ListNumber"/>
-        <w:spacing w:after="120" w:line="300" w:lineRule="auto"/>
-        <w:ind w:left="540" w:hanging="271"/>
+        <w:numPr>
+          <w:ilvl w:val="0"/>
+          <w:numId w:val="10"/>
+        </w:numPr>
+        <w:spacing w:after="80" w:line="300" w:lineRule="auto"/>
       </w:pPr>
       <w:r>
         <w:rPr>
           <w:rFonts w:ascii="Calibri" w:hAnsi="Calibri"/>
           <w:b/>
-          <w:i w:val="0"/>
-          <w:color w:val="0B2545"/>
-          <w:sz w:val="22"/>
+          <w:color w:val="0A2540"/>
         </w:rPr>
-        <w:t xml:space="preserve">Verify the moment. </w:t>
+        <w:t xml:space="preserve">Check: </w:t>
       </w:r>
       <w:r>
         <w:rPr>
           <w:rFonts w:ascii="Calibri" w:hAnsi="Calibri"/>
-          <w:b w:val="0"/>
-          <w:i w:val="0"/>
-          <w:color w:val="1C2737"/>
-          <w:sz w:val="22"/>
+          <w:color w:val="1F2933"/>
         </w:rPr>
-        <w:t>Open the cited source and confirm the organization, reported date, and relevant filing field.</w:t>
+        <w:t>The organization and event were verified.</w:t>
       </w:r>
     </w:p>
     <w:p>
       <w:pPr>
-        <w:pStyle w:val="ListNumber"/>
-        <w:spacing w:after="120" w:line="300" w:lineRule="auto"/>
-        <w:ind w:left="540" w:hanging="271"/>
+        <w:numPr>
+          <w:ilvl w:val="0"/>
+          <w:numId w:val="10"/>
+        </w:numPr>
+        <w:spacing w:after="80" w:line="300" w:lineRule="auto"/>
       </w:pPr>
       <w:r>
         <w:rPr>
           <w:rFonts w:ascii="Calibri" w:hAnsi="Calibri"/>
           <w:b/>
-          <w:i w:val="0"/>
-          <w:color w:val="0B2545"/>
-          <w:sz w:val="22"/>
+          <w:color w:val="0A2540"/>
         </w:rPr>
-        <w:t xml:space="preserve">Qualify the fit. </w:t>
+        <w:t xml:space="preserve">Check: </w:t>
       </w:r>
       <w:r>
         <w:rPr>
           <w:rFonts w:ascii="Calibri" w:hAnsi="Calibri"/>
-          <w:b w:val="0"/>
-          <w:i w:val="0"/>
-          <w:color w:val="1C2737"/>
-          <w:sz w:val="22"/>
+          <w:color w:val="1F2933"/>
         </w:rPr>
-        <w:t>Use the organization’s own website to understand its operations and find a business-published channel.</w:t>
+        <w:t>The channel was published by the business itself.</w:t>
       </w:r>
     </w:p>
     <w:p>
       <w:pPr>
-        <w:pStyle w:val="ListNumber"/>
-        <w:spacing w:after="120" w:line="300" w:lineRule="auto"/>
-        <w:ind w:left="540" w:hanging="271"/>
+        <w:numPr>
+          <w:ilvl w:val="0"/>
+          <w:numId w:val="10"/>
+        </w:numPr>
+        <w:spacing w:after="80" w:line="300" w:lineRule="auto"/>
       </w:pPr>
       <w:r>
         <w:rPr>
           <w:rFonts w:ascii="Calibri" w:hAnsi="Calibri"/>
           <w:b/>
-          <w:i w:val="0"/>
-          <w:color w:val="0B2545"/>
-          <w:sz w:val="22"/>
+          <w:color w:val="0A2540"/>
         </w:rPr>
-        <w:t xml:space="preserve">Clear outreach. </w:t>
+        <w:t xml:space="preserve">Check: </w:t>
       </w:r>
       <w:r>
         <w:rPr>
           <w:rFonts w:ascii="Calibri" w:hAnsi="Calibri"/>
-          <w:b w:val="0"/>
-          <w:i w:val="0"/>
-          <w:color w:val="1C2737"/>
-          <w:sz w:val="22"/>
+          <w:color w:val="1F2933"/>
         </w:rPr>
-        <w:t>In the protected workflow, complete suppression, licensing, state-rule, purpose, and channel checks before any call or email.</w:t>
+        <w:t>Suppression and Do-Not-Contact checks passed.</w:t>
+      </w:r>
+    </w:p>
+    <w:p>
+      <w:pPr>
+        <w:numPr>
+          <w:ilvl w:val="0"/>
+          <w:numId w:val="10"/>
+        </w:numPr>
+        <w:spacing w:after="80" w:line="300" w:lineRule="auto"/>
+      </w:pPr>
+      <w:r>
+        <w:rPr>
+          <w:rFonts w:ascii="Calibri" w:hAnsi="Calibri"/>
+          <w:b/>
+          <w:color w:val="0A2540"/>
+        </w:rPr>
+        <w:t xml:space="preserve">Check: </w:t>
+      </w:r>
+      <w:r>
+        <w:rPr>
+          <w:rFonts w:ascii="Calibri" w:hAnsi="Calibri"/>
+          <w:color w:val="1F2933"/>
+        </w:rPr>
+        <w:t>Licensing and state rules were checked.</w:t>
+      </w:r>
+    </w:p>
+    <w:p>
+      <w:pPr>
+        <w:numPr>
+          <w:ilvl w:val="0"/>
+          <w:numId w:val="10"/>
+        </w:numPr>
+        <w:spacing w:after="80" w:line="300" w:lineRule="auto"/>
+      </w:pPr>
+      <w:r>
+        <w:rPr>
+          <w:rFonts w:ascii="Calibri" w:hAnsi="Calibri"/>
+          <w:b/>
+          <w:color w:val="0A2540"/>
+        </w:rPr>
+        <w:t xml:space="preserve">Check: </w:t>
+      </w:r>
+      <w:r>
+        <w:rPr>
+          <w:rFonts w:ascii="Calibri" w:hAnsi="Calibri"/>
+          <w:color w:val="1F2933"/>
+        </w:rPr>
+        <w:t>The purpose and product discussion are permitted.</w:t>
+      </w:r>
+    </w:p>
+    <w:p>
+      <w:pPr>
+        <w:numPr>
+          <w:ilvl w:val="0"/>
+          <w:numId w:val="10"/>
+        </w:numPr>
+        <w:spacing w:after="80" w:line="300" w:lineRule="auto"/>
+      </w:pPr>
+      <w:r>
+        <w:rPr>
+          <w:rFonts w:ascii="Calibri" w:hAnsi="Calibri"/>
+          <w:b/>
+          <w:color w:val="0A2540"/>
+        </w:rPr>
+        <w:t xml:space="preserve">Check: </w:t>
+      </w:r>
+      <w:r>
+        <w:rPr>
+          <w:rFonts w:ascii="Calibri" w:hAnsi="Calibri"/>
+          <w:color w:val="1F2933"/>
+        </w:rPr>
+        <w:t>The record does not rely on a sample or unavailable source.</w:t>
+      </w:r>
+    </w:p>
+    <w:p>
+      <w:pPr>
+        <w:spacing w:before="80" w:after="200" w:line="288" w:lineRule="auto"/>
+        <w:shd w:fill="FFF7E6" w:val="clear"/>
+        <w:pBdr>
+          <w:left w:val="single" w:sz="18" w:space="8" w:color="168F89"/>
+        </w:pBdr>
+        <w:ind w:left="180" w:right="120"/>
+      </w:pPr>
+      <w:r>
+        <w:rPr>
+          <w:rFonts w:ascii="Calibri" w:hAnsi="Calibri"/>
+          <w:b/>
+          <w:color w:val="0A2540"/>
+        </w:rPr>
+        <w:t xml:space="preserve">If any check is missing: </w:t>
+      </w:r>
+      <w:r>
+        <w:rPr>
+          <w:rFonts w:ascii="Calibri" w:hAnsi="Calibri"/>
+          <w:color w:val="1F2933"/>
+        </w:rPr>
+        <w:t>Do more research or stop. The application is designed to make uncertainty visible, not to push every record into a call list.</w:t>
       </w:r>
     </w:p>
     <w:p>
@@ -1003,92 +2481,244 @@
         <w:keepNext/>
       </w:pPr>
       <w:r>
-        <w:t>What David Leads never assumes</w:t>
+        <w:t>Five-minute meeting walkthrough</w:t>
       </w:r>
     </w:p>
     <w:p>
       <w:pPr>
-        <w:pStyle w:val="ListBullet"/>
-        <w:spacing w:after="80" w:line="300" w:lineRule="auto"/>
-        <w:ind w:left="540" w:hanging="271"/>
+        <w:spacing w:after="120" w:line="300" w:lineRule="auto"/>
       </w:pPr>
       <w:r>
         <w:rPr>
           <w:rFonts w:ascii="Calibri" w:hAnsi="Calibri"/>
-          <w:b w:val="0"/>
-          <w:i w:val="0"/>
-          <w:color w:val="1C2737"/>
-          <w:sz w:val="22"/>
+          <w:i/>
+          <w:color w:val="5A6B7C"/>
         </w:rPr>
-        <w:t>A public record is not consent or permission to contact.</w:t>
+        <w:t>Use this sequence when showing David Leads to a broker, manager, or investor.</w:t>
       </w:r>
     </w:p>
     <w:p>
       <w:pPr>
-        <w:pStyle w:val="ListBullet"/>
+        <w:numPr>
+          <w:ilvl w:val="0"/>
+          <w:numId w:val="11"/>
+        </w:numPr>
         <w:spacing w:after="80" w:line="300" w:lineRule="auto"/>
-        <w:ind w:left="540" w:hanging="271"/>
       </w:pPr>
       <w:r>
         <w:rPr>
           <w:rFonts w:ascii="Calibri" w:hAnsi="Calibri"/>
-          <w:b w:val="0"/>
-          <w:i w:val="0"/>
-          <w:color w:val="1C2737"/>
-          <w:sz w:val="22"/>
+          <w:color w:val="1F2933"/>
         </w:rPr>
-        <w:t>Observed activity is not revenue, intent, insurability, or a deal value.</w:t>
+        <w:t>Open the app and say: 'This is live organization research from official public records, not a contact list.'</w:t>
       </w:r>
     </w:p>
     <w:p>
       <w:pPr>
-        <w:pStyle w:val="ListBullet"/>
+        <w:numPr>
+          <w:ilvl w:val="0"/>
+          <w:numId w:val="11"/>
+        </w:numPr>
         <w:spacing w:after="80" w:line="300" w:lineRule="auto"/>
-        <w:ind w:left="540" w:hanging="271"/>
       </w:pPr>
       <w:r>
         <w:rPr>
           <w:rFonts w:ascii="Calibri" w:hAnsi="Calibri"/>
-          <w:b w:val="0"/>
-          <w:i w:val="0"/>
-          <w:color w:val="1C2737"/>
-          <w:sz w:val="22"/>
+          <w:color w:val="1F2933"/>
         </w:rPr>
-        <w:t>The system does not infer health, age, race, religion, family status, or private wealth.</w:t>
+        <w:t>Show the 27-state territory selector and focus New York.</w:t>
       </w:r>
     </w:p>
     <w:p>
       <w:pPr>
-        <w:pStyle w:val="ListBullet"/>
+        <w:numPr>
+          <w:ilvl w:val="0"/>
+          <w:numId w:val="11"/>
+        </w:numPr>
         <w:spacing w:after="80" w:line="300" w:lineRule="auto"/>
-        <w:ind w:left="540" w:hanging="271"/>
       </w:pPr>
       <w:r>
         <w:rPr>
           <w:rFonts w:ascii="Calibri" w:hAnsi="Calibri"/>
-          <w:b w:val="0"/>
-          <w:i w:val="0"/>
-          <w:color w:val="1C2737"/>
-          <w:sz w:val="22"/>
+          <w:color w:val="1F2933"/>
         </w:rPr>
-        <w:t>The system does not scrape social profiles or use named executives, insiders, signers, or donors as personal wealth leads.</w:t>
+        <w:t>Point to Live organizations, Source coverage, and Needs research. Explain that unavailable sources stay visible.</w:t>
       </w:r>
     </w:p>
     <w:p>
       <w:pPr>
-        <w:pStyle w:val="ListBullet"/>
+        <w:numPr>
+          <w:ilvl w:val="0"/>
+          <w:numId w:val="11"/>
+        </w:numPr>
         <w:spacing w:after="80" w:line="300" w:lineRule="auto"/>
-        <w:ind w:left="540" w:hanging="271"/>
       </w:pPr>
       <w:r>
         <w:rPr>
           <w:rFonts w:ascii="Calibri" w:hAnsi="Calibri"/>
-          <w:b w:val="0"/>
-          <w:i w:val="0"/>
-          <w:color w:val="1C2737"/>
-          <w:sz w:val="22"/>
+          <w:color w:val="1F2933"/>
         </w:rPr>
-        <w:t>The public view never exposes broker notes, saved channels, clearance decisions, outcomes, or exports.</w:t>
+        <w:t>Open one organization. Read the event, why now, official source, and limitations.</w:t>
+      </w:r>
+    </w:p>
+    <w:p>
+      <w:pPr>
+        <w:numPr>
+          <w:ilvl w:val="0"/>
+          <w:numId w:val="11"/>
+        </w:numPr>
+        <w:spacing w:after="80" w:line="300" w:lineRule="auto"/>
+      </w:pPr>
+      <w:r>
+        <w:rPr>
+          <w:rFonts w:ascii="Calibri" w:hAnsi="Calibri"/>
+          <w:color w:val="1F2933"/>
+        </w:rPr>
+        <w:t>Show the receipt or proof link. Explain that the public record can be checked before use.</w:t>
+      </w:r>
+    </w:p>
+    <w:p>
+      <w:pPr>
+        <w:numPr>
+          <w:ilvl w:val="0"/>
+          <w:numId w:val="11"/>
+        </w:numPr>
+        <w:spacing w:after="80" w:line="300" w:lineRule="auto"/>
+      </w:pPr>
+      <w:r>
+        <w:rPr>
+          <w:rFonts w:ascii="Calibri" w:hAnsi="Calibri"/>
+          <w:color w:val="1F2933"/>
+        </w:rPr>
+        <w:t>End with the contact gate: research is public; outreach still requires protected human clearance.</w:t>
+      </w:r>
+    </w:p>
+    <w:p>
+      <w:pPr>
+        <w:pStyle w:val="Heading2"/>
+        <w:keepNext/>
+      </w:pPr>
+      <w:r>
+        <w:t>A simple opening line</w:t>
+      </w:r>
+    </w:p>
+    <w:p>
+      <w:pPr>
+        <w:spacing w:before="80" w:after="200" w:line="288" w:lineRule="auto"/>
+        <w:shd w:fill="E8EEF5" w:val="clear"/>
+        <w:pBdr>
+          <w:left w:val="single" w:sz="18" w:space="8" w:color="168F89"/>
+        </w:pBdr>
+        <w:ind w:left="180" w:right="120"/>
+      </w:pPr>
+      <w:r>
+        <w:rPr>
+          <w:rFonts w:ascii="Calibri" w:hAnsi="Calibri"/>
+          <w:b/>
+          <w:color w:val="0A2540"/>
+        </w:rPr>
+        <w:t xml:space="preserve">Say: </w:t>
+      </w:r>
+      <w:r>
+        <w:rPr>
+          <w:rFonts w:ascii="Calibri" w:hAnsi="Calibri"/>
+          <w:color w:val="1F2933"/>
+        </w:rPr>
+        <w:t>David Leads helps you decide which organizations to research first, why the timing may matter, and exactly which official record to verify before a compliant conversation.</w:t>
+      </w:r>
+    </w:p>
+    <w:p>
+      <w:pPr>
+        <w:pStyle w:val="Heading2"/>
+        <w:keepNext/>
+      </w:pPr>
+      <w:r>
+        <w:t>What not to claim</w:t>
+      </w:r>
+    </w:p>
+    <w:p>
+      <w:pPr>
+        <w:numPr>
+          <w:ilvl w:val="0"/>
+          <w:numId w:val="10"/>
+        </w:numPr>
+        <w:spacing w:after="80" w:line="300" w:lineRule="auto"/>
+      </w:pPr>
+      <w:r>
+        <w:rPr>
+          <w:rFonts w:ascii="Calibri" w:hAnsi="Calibri"/>
+          <w:color w:val="1F2933"/>
+        </w:rPr>
+        <w:t>Do not say every record is a lead ready to call.</w:t>
+      </w:r>
+    </w:p>
+    <w:p>
+      <w:pPr>
+        <w:numPr>
+          <w:ilvl w:val="0"/>
+          <w:numId w:val="10"/>
+        </w:numPr>
+        <w:spacing w:after="80" w:line="300" w:lineRule="auto"/>
+      </w:pPr>
+      <w:r>
+        <w:rPr>
+          <w:rFonts w:ascii="Calibri" w:hAnsi="Calibri"/>
+          <w:color w:val="1F2933"/>
+        </w:rPr>
+        <w:t>Do not say a filing proves need, dissatisfaction, renewal, eligibility, or buying intent.</w:t>
+      </w:r>
+    </w:p>
+    <w:p>
+      <w:pPr>
+        <w:numPr>
+          <w:ilvl w:val="0"/>
+          <w:numId w:val="10"/>
+        </w:numPr>
+        <w:spacing w:after="80" w:line="300" w:lineRule="auto"/>
+      </w:pPr>
+      <w:r>
+        <w:rPr>
+          <w:rFonts w:ascii="Calibri" w:hAnsi="Calibri"/>
+          <w:color w:val="1F2933"/>
+        </w:rPr>
+        <w:t>Do not say a product fit is a recommendation or quote.</w:t>
+      </w:r>
+    </w:p>
+    <w:p>
+      <w:pPr>
+        <w:numPr>
+          <w:ilvl w:val="0"/>
+          <w:numId w:val="10"/>
+        </w:numPr>
+        <w:spacing w:after="80" w:line="300" w:lineRule="auto"/>
+      </w:pPr>
+      <w:r>
+        <w:rPr>
+          <w:rFonts w:ascii="Calibri" w:hAnsi="Calibri"/>
+          <w:color w:val="1F2933"/>
+        </w:rPr>
+        <w:t>Do not say the system uses private profiles or secret contact data.</w:t>
+      </w:r>
+    </w:p>
+    <w:p>
+      <w:pPr>
+        <w:numPr>
+          <w:ilvl w:val="0"/>
+          <w:numId w:val="10"/>
+        </w:numPr>
+        <w:spacing w:after="80" w:line="300" w:lineRule="auto"/>
+      </w:pPr>
+      <w:r>
+        <w:rPr>
+          <w:rFonts w:ascii="Calibri" w:hAnsi="Calibri"/>
+          <w:color w:val="1F2933"/>
+        </w:rPr>
+        <w:t>Do not call a source LIVE if the coverage panel says UNAVAILABLE.</w:t>
+      </w:r>
+    </w:p>
+    <w:p>
+      <w:r>
+        <w:br w:type="page"/>
       </w:r>
     </w:p>
     <w:p>
@@ -1097,266 +2727,470 @@
         <w:keepNext/>
       </w:pPr>
       <w:r>
-        <w:t>Department of Labor privacy boundary</w:t>
+        <w:t>If something looks wrong</w:t>
       </w:r>
     </w:p>
-    <w:p>
-      <w:pPr>
-        <w:spacing w:before="0" w:after="120" w:line="300" w:lineRule="auto"/>
-      </w:pPr>
-      <w:r>
-        <w:rPr>
-          <w:rFonts w:ascii="Calibri" w:hAnsi="Calibri"/>
-          <w:b w:val="0"/>
-          <w:i w:val="0"/>
-          <w:color w:val="1C2737"/>
-          <w:sz w:val="22"/>
-        </w:rPr>
-        <w:t>The life-plan lane keeps only the organization, public location, plan-period dates, participant count, reported carriers, and benefit categories needed for the research card.</w:t>
-      </w:r>
-    </w:p>
-    <w:p>
-      <w:pPr>
-        <w:spacing w:before="80" w:after="200" w:line="288" w:lineRule="auto"/>
-        <w:ind w:left="173" w:right="173"/>
-        <w:shd w:fill="FFF7E5"/>
-        <w:pBdr>
-          <w:left w:val="single" w:sz="18" w:space="8" w:color="B78921"/>
-        </w:pBdr>
-      </w:pPr>
-      <w:r>
-        <w:rPr>
-          <w:rFonts w:ascii="Calibri" w:hAnsi="Calibri"/>
-          <w:b/>
-          <w:i w:val="0"/>
-          <w:color w:val="0B2545"/>
-          <w:sz w:val="22"/>
-        </w:rPr>
-        <w:t xml:space="preserve">Excluded: </w:t>
-      </w:r>
-      <w:r>
-        <w:rPr>
-          <w:rFonts w:ascii="Calibri" w:hAnsi="Calibri"/>
-          <w:b w:val="0"/>
-          <w:i w:val="0"/>
-          <w:color w:val="1C2737"/>
-          <w:sz w:val="22"/>
-        </w:rPr>
-        <w:t>EINs, phone numbers, named administrators and signers, preparers, broker identities, commissions, and person-level addresses are not retained.</w:t>
-      </w:r>
-    </w:p>
+    <w:tbl>
+      <w:tblPr>
+        <w:tblW w:type="dxa" w:w="9360"/>
+        <w:tblLayout w:type="fixed"/>
+        <w:tblLook w:firstColumn="1" w:firstRow="1" w:lastColumn="0" w:lastRow="0" w:noHBand="0" w:noVBand="1" w:val="04A0"/>
+        <w:jc w:val="left"/>
+        <w:tblInd w:w="120" w:type="dxa"/>
+      </w:tblPr>
+      <w:tblGrid>
+        <w:gridCol w:w="3150"/>
+        <w:gridCol w:w="6210"/>
+      </w:tblGrid>
+      <w:tr>
+        <w:trPr>
+          <w:tblHeader w:val="true"/>
+        </w:trPr>
+        <w:tc>
+          <w:tcPr>
+            <w:tcW w:type="dxa" w:w="3150"/>
+            <w:vAlign w:val="center"/>
+            <w:tcMar>
+              <w:top w:w="80" w:type="dxa"/>
+              <w:bottom w:w="80" w:type="dxa"/>
+              <w:start w:w="120" w:type="dxa"/>
+              <w:end w:w="120" w:type="dxa"/>
+            </w:tcMar>
+            <w:shd w:fill="0A2540" w:val="clear"/>
+          </w:tcPr>
+          <w:p>
+            <w:pPr>
+              <w:spacing w:after="0" w:line="276" w:lineRule="auto"/>
+              <w:jc w:val="left"/>
+            </w:pPr>
+            <w:r>
+              <w:rPr>
+                <w:rFonts w:ascii="Calibri" w:hAnsi="Calibri"/>
+                <w:b/>
+                <w:color w:val="FFFFFF"/>
+                <w:sz w:val="21"/>
+              </w:rPr>
+              <w:t>What you see</w:t>
+            </w:r>
+          </w:p>
+        </w:tc>
+        <w:tc>
+          <w:tcPr>
+            <w:tcW w:type="dxa" w:w="6210"/>
+            <w:vAlign w:val="center"/>
+            <w:tcMar>
+              <w:top w:w="80" w:type="dxa"/>
+              <w:bottom w:w="80" w:type="dxa"/>
+              <w:start w:w="120" w:type="dxa"/>
+              <w:end w:w="120" w:type="dxa"/>
+            </w:tcMar>
+            <w:shd w:fill="0A2540" w:val="clear"/>
+          </w:tcPr>
+          <w:p>
+            <w:pPr>
+              <w:spacing w:after="0" w:line="276" w:lineRule="auto"/>
+              <w:jc w:val="left"/>
+            </w:pPr>
+            <w:r>
+              <w:rPr>
+                <w:rFonts w:ascii="Calibri" w:hAnsi="Calibri"/>
+                <w:b/>
+                <w:color w:val="FFFFFF"/>
+                <w:sz w:val="21"/>
+              </w:rPr>
+              <w:t>What to do</w:t>
+            </w:r>
+          </w:p>
+        </w:tc>
+      </w:tr>
+      <w:tr>
+        <w:tc>
+          <w:tcPr>
+            <w:tcW w:type="dxa" w:w="3150"/>
+            <w:vAlign w:val="center"/>
+            <w:tcMar>
+              <w:top w:w="80" w:type="dxa"/>
+              <w:bottom w:w="80" w:type="dxa"/>
+              <w:start w:w="120" w:type="dxa"/>
+              <w:end w:w="120" w:type="dxa"/>
+            </w:tcMar>
+          </w:tcPr>
+          <w:p>
+            <w:pPr>
+              <w:spacing w:after="0" w:line="276" w:lineRule="auto"/>
+              <w:jc w:val="left"/>
+            </w:pPr>
+            <w:r>
+              <w:rPr>
+                <w:rFonts w:ascii="Calibri" w:hAnsi="Calibri"/>
+                <w:b/>
+                <w:color w:val="0A2540"/>
+                <w:sz w:val="21"/>
+              </w:rPr>
+              <w:t>The page is still opening</w:t>
+            </w:r>
+          </w:p>
+        </w:tc>
+        <w:tc>
+          <w:tcPr>
+            <w:tcW w:type="dxa" w:w="6210"/>
+            <w:vAlign w:val="center"/>
+            <w:tcMar>
+              <w:top w:w="80" w:type="dxa"/>
+              <w:bottom w:w="80" w:type="dxa"/>
+              <w:start w:w="120" w:type="dxa"/>
+              <w:end w:w="120" w:type="dxa"/>
+            </w:tcMar>
+          </w:tcPr>
+          <w:p>
+            <w:pPr>
+              <w:spacing w:after="0" w:line="276" w:lineRule="auto"/>
+              <w:jc w:val="left"/>
+            </w:pPr>
+            <w:r>
+              <w:rPr>
+                <w:rFonts w:ascii="Calibri" w:hAnsi="Calibri"/>
+                <w:b w:val="0"/>
+                <w:color w:val="1F2933"/>
+                <w:sz w:val="21"/>
+              </w:rPr>
+              <w:t>Wait for the opening screen to disappear, then refresh once.</w:t>
+            </w:r>
+          </w:p>
+        </w:tc>
+      </w:tr>
+      <w:tr>
+        <w:tc>
+          <w:tcPr>
+            <w:tcW w:type="dxa" w:w="3150"/>
+            <w:shd w:fill="F5F8FB" w:val="clear"/>
+            <w:vAlign w:val="center"/>
+            <w:tcMar>
+              <w:top w:w="80" w:type="dxa"/>
+              <w:bottom w:w="80" w:type="dxa"/>
+              <w:start w:w="120" w:type="dxa"/>
+              <w:end w:w="120" w:type="dxa"/>
+            </w:tcMar>
+          </w:tcPr>
+          <w:p>
+            <w:pPr>
+              <w:spacing w:after="0" w:line="276" w:lineRule="auto"/>
+              <w:jc w:val="left"/>
+            </w:pPr>
+            <w:r>
+              <w:rPr>
+                <w:rFonts w:ascii="Calibri" w:hAnsi="Calibri"/>
+                <w:b/>
+                <w:color w:val="0A2540"/>
+                <w:sz w:val="21"/>
+              </w:rPr>
+              <w:t>A source says UNAVAILABLE</w:t>
+            </w:r>
+          </w:p>
+        </w:tc>
+        <w:tc>
+          <w:tcPr>
+            <w:tcW w:type="dxa" w:w="6210"/>
+            <w:shd w:fill="F5F8FB" w:val="clear"/>
+            <w:vAlign w:val="center"/>
+            <w:tcMar>
+              <w:top w:w="80" w:type="dxa"/>
+              <w:bottom w:w="80" w:type="dxa"/>
+              <w:start w:w="120" w:type="dxa"/>
+              <w:end w:w="120" w:type="dxa"/>
+            </w:tcMar>
+          </w:tcPr>
+          <w:p>
+            <w:pPr>
+              <w:spacing w:after="0" w:line="276" w:lineRule="auto"/>
+              <w:jc w:val="left"/>
+            </w:pPr>
+            <w:r>
+              <w:rPr>
+                <w:rFonts w:ascii="Calibri" w:hAnsi="Calibri"/>
+                <w:b w:val="0"/>
+                <w:color w:val="1F2933"/>
+                <w:sz w:val="21"/>
+              </w:rPr>
+              <w:t>Use another live source or return later. Do not treat the outage as a zero or a live result.</w:t>
+            </w:r>
+          </w:p>
+        </w:tc>
+      </w:tr>
+      <w:tr>
+        <w:tc>
+          <w:tcPr>
+            <w:tcW w:type="dxa" w:w="3150"/>
+            <w:vAlign w:val="center"/>
+            <w:tcMar>
+              <w:top w:w="80" w:type="dxa"/>
+              <w:bottom w:w="80" w:type="dxa"/>
+              <w:start w:w="120" w:type="dxa"/>
+              <w:end w:w="120" w:type="dxa"/>
+            </w:tcMar>
+          </w:tcPr>
+          <w:p>
+            <w:pPr>
+              <w:spacing w:after="0" w:line="276" w:lineRule="auto"/>
+              <w:jc w:val="left"/>
+            </w:pPr>
+            <w:r>
+              <w:rPr>
+                <w:rFonts w:ascii="Calibri" w:hAnsi="Calibri"/>
+                <w:b/>
+                <w:color w:val="0A2540"/>
+                <w:sz w:val="21"/>
+              </w:rPr>
+              <w:t>A state has few records</w:t>
+            </w:r>
+          </w:p>
+        </w:tc>
+        <w:tc>
+          <w:tcPr>
+            <w:tcW w:type="dxa" w:w="6210"/>
+            <w:vAlign w:val="center"/>
+            <w:tcMar>
+              <w:top w:w="80" w:type="dxa"/>
+              <w:bottom w:w="80" w:type="dxa"/>
+              <w:start w:w="120" w:type="dxa"/>
+              <w:end w:w="120" w:type="dxa"/>
+            </w:tcMar>
+          </w:tcPr>
+          <w:p>
+            <w:pPr>
+              <w:spacing w:after="0" w:line="276" w:lineRule="auto"/>
+              <w:jc w:val="left"/>
+            </w:pPr>
+            <w:r>
+              <w:rPr>
+                <w:rFonts w:ascii="Calibri" w:hAnsi="Calibri"/>
+                <w:b w:val="0"/>
+                <w:color w:val="1F2933"/>
+                <w:sz w:val="21"/>
+              </w:rPr>
+              <w:t>Select that one state to run the deeper state-specific pull.</w:t>
+            </w:r>
+          </w:p>
+        </w:tc>
+      </w:tr>
+      <w:tr>
+        <w:tc>
+          <w:tcPr>
+            <w:tcW w:type="dxa" w:w="3150"/>
+            <w:shd w:fill="F5F8FB" w:val="clear"/>
+            <w:vAlign w:val="center"/>
+            <w:tcMar>
+              <w:top w:w="80" w:type="dxa"/>
+              <w:bottom w:w="80" w:type="dxa"/>
+              <w:start w:w="120" w:type="dxa"/>
+              <w:end w:w="120" w:type="dxa"/>
+            </w:tcMar>
+          </w:tcPr>
+          <w:p>
+            <w:pPr>
+              <w:spacing w:after="0" w:line="276" w:lineRule="auto"/>
+              <w:jc w:val="left"/>
+            </w:pPr>
+            <w:r>
+              <w:rPr>
+                <w:rFonts w:ascii="Calibri" w:hAnsi="Calibri"/>
+                <w:b/>
+                <w:color w:val="0A2540"/>
+                <w:sz w:val="21"/>
+              </w:rPr>
+              <w:t>The count changed</w:t>
+            </w:r>
+          </w:p>
+        </w:tc>
+        <w:tc>
+          <w:tcPr>
+            <w:tcW w:type="dxa" w:w="6210"/>
+            <w:shd w:fill="F5F8FB" w:val="clear"/>
+            <w:vAlign w:val="center"/>
+            <w:tcMar>
+              <w:top w:w="80" w:type="dxa"/>
+              <w:bottom w:w="80" w:type="dxa"/>
+              <w:start w:w="120" w:type="dxa"/>
+              <w:end w:w="120" w:type="dxa"/>
+            </w:tcMar>
+          </w:tcPr>
+          <w:p>
+            <w:pPr>
+              <w:spacing w:after="0" w:line="276" w:lineRule="auto"/>
+              <w:jc w:val="left"/>
+            </w:pPr>
+            <w:r>
+              <w:rPr>
+                <w:rFonts w:ascii="Calibri" w:hAnsi="Calibri"/>
+                <w:b w:val="0"/>
+                <w:color w:val="1F2933"/>
+                <w:sz w:val="21"/>
+              </w:rPr>
+              <w:t>That is expected. Counts follow current public-source responses and the chosen territory.</w:t>
+            </w:r>
+          </w:p>
+        </w:tc>
+      </w:tr>
+      <w:tr>
+        <w:tc>
+          <w:tcPr>
+            <w:tcW w:type="dxa" w:w="3150"/>
+            <w:vAlign w:val="center"/>
+            <w:tcMar>
+              <w:top w:w="80" w:type="dxa"/>
+              <w:bottom w:w="80" w:type="dxa"/>
+              <w:start w:w="120" w:type="dxa"/>
+              <w:end w:w="120" w:type="dxa"/>
+            </w:tcMar>
+          </w:tcPr>
+          <w:p>
+            <w:pPr>
+              <w:spacing w:after="0" w:line="276" w:lineRule="auto"/>
+              <w:jc w:val="left"/>
+            </w:pPr>
+            <w:r>
+              <w:rPr>
+                <w:rFonts w:ascii="Calibri" w:hAnsi="Calibri"/>
+                <w:b/>
+                <w:color w:val="0A2540"/>
+                <w:sz w:val="21"/>
+              </w:rPr>
+              <w:t>A record looks surprising</w:t>
+            </w:r>
+          </w:p>
+        </w:tc>
+        <w:tc>
+          <w:tcPr>
+            <w:tcW w:type="dxa" w:w="6210"/>
+            <w:vAlign w:val="center"/>
+            <w:tcMar>
+              <w:top w:w="80" w:type="dxa"/>
+              <w:bottom w:w="80" w:type="dxa"/>
+              <w:start w:w="120" w:type="dxa"/>
+              <w:end w:w="120" w:type="dxa"/>
+            </w:tcMar>
+          </w:tcPr>
+          <w:p>
+            <w:pPr>
+              <w:spacing w:after="0" w:line="276" w:lineRule="auto"/>
+              <w:jc w:val="left"/>
+            </w:pPr>
+            <w:r>
+              <w:rPr>
+                <w:rFonts w:ascii="Calibri" w:hAnsi="Calibri"/>
+                <w:b w:val="0"/>
+                <w:color w:val="1F2933"/>
+                <w:sz w:val="21"/>
+              </w:rPr>
+              <w:t>Open the official source and confirm it. If it cannot be confirmed, do not use it.</w:t>
+            </w:r>
+          </w:p>
+        </w:tc>
+      </w:tr>
+      <w:tr>
+        <w:tc>
+          <w:tcPr>
+            <w:tcW w:type="dxa" w:w="3150"/>
+            <w:shd w:fill="F5F8FB" w:val="clear"/>
+            <w:vAlign w:val="center"/>
+            <w:tcMar>
+              <w:top w:w="80" w:type="dxa"/>
+              <w:bottom w:w="80" w:type="dxa"/>
+              <w:start w:w="120" w:type="dxa"/>
+              <w:end w:w="120" w:type="dxa"/>
+            </w:tcMar>
+          </w:tcPr>
+          <w:p>
+            <w:pPr>
+              <w:spacing w:after="0" w:line="276" w:lineRule="auto"/>
+              <w:jc w:val="left"/>
+            </w:pPr>
+            <w:r>
+              <w:rPr>
+                <w:rFonts w:ascii="Calibri" w:hAnsi="Calibri"/>
+                <w:b/>
+                <w:color w:val="0A2540"/>
+                <w:sz w:val="21"/>
+              </w:rPr>
+              <w:t>You need saved notes or outreach actions</w:t>
+            </w:r>
+          </w:p>
+        </w:tc>
+        <w:tc>
+          <w:tcPr>
+            <w:tcW w:type="dxa" w:w="6210"/>
+            <w:shd w:fill="F5F8FB" w:val="clear"/>
+            <w:vAlign w:val="center"/>
+            <w:tcMar>
+              <w:top w:w="80" w:type="dxa"/>
+              <w:bottom w:w="80" w:type="dxa"/>
+              <w:start w:w="120" w:type="dxa"/>
+              <w:end w:w="120" w:type="dxa"/>
+            </w:tcMar>
+          </w:tcPr>
+          <w:p>
+            <w:pPr>
+              <w:spacing w:after="0" w:line="276" w:lineRule="auto"/>
+              <w:jc w:val="left"/>
+            </w:pPr>
+            <w:r>
+              <w:rPr>
+                <w:rFonts w:ascii="Calibri" w:hAnsi="Calibri"/>
+                <w:b w:val="0"/>
+                <w:color w:val="1F2933"/>
+                <w:sz w:val="21"/>
+              </w:rPr>
+              <w:t>Those functions belong in the protected broker workflow and are not exposed in the public research view.</w:t>
+            </w:r>
+          </w:p>
+        </w:tc>
+      </w:tr>
+    </w:tbl>
     <w:p>
       <w:pPr>
         <w:pStyle w:val="Heading1"/>
         <w:keepNext/>
       </w:pPr>
       <w:r>
-        <w:t>When a source is unavailable</w:t>
+        <w:t>The one rule to remember</w:t>
       </w:r>
     </w:p>
     <w:p>
       <w:pPr>
-        <w:pStyle w:val="ListNumber"/>
-        <w:spacing w:after="120" w:line="300" w:lineRule="auto"/>
-        <w:ind w:left="540" w:hanging="271"/>
+        <w:spacing w:before="80" w:after="200" w:line="288" w:lineRule="auto"/>
+        <w:shd w:fill="E8F6F4" w:val="clear"/>
+        <w:pBdr>
+          <w:left w:val="single" w:sz="18" w:space="8" w:color="168F89"/>
+        </w:pBdr>
+        <w:ind w:left="180" w:right="120"/>
       </w:pPr>
       <w:r>
         <w:rPr>
           <w:rFonts w:ascii="Calibri" w:hAnsi="Calibri"/>
           <w:b/>
-          <w:i w:val="0"/>
-          <w:color w:val="0B2545"/>
-          <w:sz w:val="22"/>
+          <w:color w:val="0A2540"/>
         </w:rPr>
-        <w:t xml:space="preserve">Open Market coverage. </w:t>
+        <w:t xml:space="preserve">Use David Leads to decide what to research first. </w:t>
       </w:r>
       <w:r>
         <w:rPr>
           <w:rFonts w:ascii="Calibri" w:hAnsi="Calibri"/>
-          <w:b w:val="0"/>
-          <w:i w:val="0"/>
-          <w:color w:val="1C2737"/>
-          <w:sz w:val="22"/>
+          <w:color w:val="1F2933"/>
         </w:rPr>
-        <w:t>Each source reports LIVE, UNAVAILABLE, or NOT APPLICABLE.</w:t>
+        <w:t>Use the official record to verify why. Use the protected clearance process to decide whether contact is permitted.</w:t>
       </w:r>
     </w:p>
     <w:p>
       <w:pPr>
-        <w:pStyle w:val="ListNumber"/>
         <w:spacing w:after="120" w:line="300" w:lineRule="auto"/>
-        <w:ind w:left="540" w:hanging="271"/>
       </w:pPr>
       <w:r>
         <w:rPr>
           <w:rFonts w:ascii="Calibri" w:hAnsi="Calibri"/>
-          <w:b/>
-          <w:i w:val="0"/>
-          <w:color w:val="0B2545"/>
-          <w:sz w:val="22"/>
+          <w:i/>
+          <w:color w:val="5A6B7C"/>
         </w:rPr>
-        <w:t xml:space="preserve">Read the reason. </w:t>
-      </w:r>
-      <w:r>
-        <w:rPr>
-          <w:rFonts w:ascii="Calibri" w:hAnsi="Calibri"/>
-          <w:b w:val="0"/>
-          <w:i w:val="0"/>
-          <w:color w:val="1C2737"/>
-          <w:sz w:val="22"/>
-        </w:rPr>
-        <w:t>A missing credential, source outage, or territory mismatch remains visible.</w:t>
-      </w:r>
-    </w:p>
-    <w:p>
-      <w:pPr>
-        <w:pStyle w:val="ListNumber"/>
-        <w:spacing w:after="120" w:line="300" w:lineRule="auto"/>
-        <w:ind w:left="540" w:hanging="271"/>
-      </w:pPr>
-      <w:r>
-        <w:rPr>
-          <w:rFonts w:ascii="Calibri" w:hAnsi="Calibri"/>
-          <w:b/>
-          <w:i w:val="0"/>
-          <w:color w:val="0B2545"/>
-          <w:sz w:val="22"/>
-        </w:rPr>
-        <w:t xml:space="preserve">Do not work around it. </w:t>
-      </w:r>
-      <w:r>
-        <w:rPr>
-          <w:rFonts w:ascii="Calibri" w:hAnsi="Calibri"/>
-          <w:b w:val="0"/>
-          <w:i w:val="0"/>
-          <w:color w:val="1C2737"/>
-          <w:sz w:val="22"/>
-        </w:rPr>
-        <w:t>The application never substitutes a fake lead for an unavailable source.</w:t>
-      </w:r>
-    </w:p>
-    <w:p>
-      <w:pPr>
-        <w:pStyle w:val="Heading1"/>
-        <w:keepNext/>
-      </w:pPr>
-      <w:r>
-        <w:t>Best practice before every outreach decision</w:t>
-      </w:r>
-    </w:p>
-    <w:p>
-      <w:pPr>
-        <w:pStyle w:val="ListBullet"/>
-        <w:spacing w:after="80" w:line="300" w:lineRule="auto"/>
-        <w:ind w:left="540" w:hanging="271"/>
-      </w:pPr>
-      <w:r>
-        <w:rPr>
-          <w:rFonts w:ascii="Calibri" w:hAnsi="Calibri"/>
-          <w:b w:val="0"/>
-          <w:i w:val="0"/>
-          <w:color w:val="1C2737"/>
-          <w:sz w:val="22"/>
-        </w:rPr>
-        <w:t>Confirm the official record is current.</w:t>
-      </w:r>
-    </w:p>
-    <w:p>
-      <w:pPr>
-        <w:pStyle w:val="ListBullet"/>
-        <w:spacing w:after="80" w:line="300" w:lineRule="auto"/>
-        <w:ind w:left="540" w:hanging="271"/>
-      </w:pPr>
-      <w:r>
-        <w:rPr>
-          <w:rFonts w:ascii="Calibri" w:hAnsi="Calibri"/>
-          <w:b w:val="0"/>
-          <w:i w:val="0"/>
-          <w:color w:val="1C2737"/>
-          <w:sz w:val="22"/>
-        </w:rPr>
-        <w:t>Confirm the product and jurisdiction are within David’s approved scope.</w:t>
-      </w:r>
-    </w:p>
-    <w:p>
-      <w:pPr>
-        <w:pStyle w:val="ListBullet"/>
-        <w:spacing w:after="80" w:line="300" w:lineRule="auto"/>
-        <w:ind w:left="540" w:hanging="271"/>
-      </w:pPr>
-      <w:r>
-        <w:rPr>
-          <w:rFonts w:ascii="Calibri" w:hAnsi="Calibri"/>
-          <w:b w:val="0"/>
-          <w:i w:val="0"/>
-          <w:color w:val="1C2737"/>
-          <w:sz w:val="22"/>
-        </w:rPr>
-        <w:t>Use only a business-published channel from the organization’s own website.</w:t>
-      </w:r>
-    </w:p>
-    <w:p>
-      <w:pPr>
-        <w:pStyle w:val="ListBullet"/>
-        <w:spacing w:after="80" w:line="300" w:lineRule="auto"/>
-        <w:ind w:left="540" w:hanging="271"/>
-      </w:pPr>
-      <w:r>
-        <w:rPr>
-          <w:rFonts w:ascii="Calibri" w:hAnsi="Calibri"/>
-          <w:b w:val="0"/>
-          <w:i w:val="0"/>
-          <w:color w:val="1C2737"/>
-          <w:sz w:val="22"/>
-        </w:rPr>
-        <w:t>Complete all suppression, licensing, state-rule, and purpose checks.</w:t>
-      </w:r>
-    </w:p>
-    <w:p>
-      <w:pPr>
-        <w:pStyle w:val="ListBullet"/>
-        <w:spacing w:after="80" w:line="300" w:lineRule="auto"/>
-        <w:ind w:left="540" w:hanging="271"/>
-      </w:pPr>
-      <w:r>
-        <w:rPr>
-          <w:rFonts w:ascii="Calibri" w:hAnsi="Calibri"/>
-          <w:b w:val="0"/>
-          <w:i w:val="0"/>
-          <w:color w:val="1C2737"/>
-          <w:sz w:val="22"/>
-        </w:rPr>
-        <w:t>Record time-limited clearance in the protected workflow.</w:t>
-      </w:r>
-    </w:p>
-    <w:p>
-      <w:pPr>
-        <w:spacing w:before="80" w:after="200" w:line="288" w:lineRule="auto"/>
-        <w:ind w:left="173" w:right="173"/>
-        <w:shd w:fill="E7F5F3"/>
-        <w:pBdr>
-          <w:left w:val="single" w:sz="18" w:space="8" w:color="148984"/>
-        </w:pBdr>
-      </w:pPr>
-      <w:r>
-        <w:rPr>
-          <w:rFonts w:ascii="Calibri" w:hAnsi="Calibri"/>
-          <w:b/>
-          <w:i w:val="0"/>
-          <w:color w:val="0B2545"/>
-          <w:sz w:val="22"/>
-        </w:rPr>
-        <w:t xml:space="preserve">Remember: </w:t>
-      </w:r>
-      <w:r>
-        <w:rPr>
-          <w:rFonts w:ascii="Calibri" w:hAnsi="Calibri"/>
-          <w:b w:val="0"/>
-          <w:i w:val="0"/>
-          <w:color w:val="1C2737"/>
-          <w:sz w:val="22"/>
-        </w:rPr>
-        <w:t>The software helps David focus his research. David’s licensed judgment and the protected clearance process decide whether any next action is appropriate.</w:t>
+        <w:t>Public organization data only. No passwords or access keys are printed in this guide.</w:t>
       </w:r>
     </w:p>
     <w:sectPr>
@@ -1376,22 +3210,24 @@
   <w:p>
     <w:pPr>
       <w:pStyle w:val="Footer"/>
-      <w:spacing w:before="0" w:after="0"/>
       <w:jc w:val="right"/>
     </w:pPr>
     <w:r>
       <w:rPr>
         <w:rFonts w:ascii="Calibri" w:hAnsi="Calibri"/>
-        <w:b w:val="0"/>
-        <w:i w:val="0"/>
-        <w:color w:val="5C697A"/>
+        <w:color w:val="5A6B7C"/>
         <w:sz w:val="17"/>
       </w:rPr>
-      <w:t xml:space="preserve">David Leads | Broker Guide   •   Page </w:t>
+      <w:t xml:space="preserve">Verified operating guide  |  August 2026  |  </w:t>
     </w:r>
     <w:r>
+      <w:rPr>
+        <w:rFonts w:ascii="Calibri" w:hAnsi="Calibri"/>
+        <w:color w:val="5A6B7C"/>
+        <w:sz w:val="18"/>
+      </w:rPr>
       <w:fldChar w:fldCharType="begin"/>
-      <w:instrText xml:space="preserve">PAGE</w:instrText>
+      <w:instrText xml:space="preserve"> PAGE </w:instrText>
       <w:fldChar w:fldCharType="separate"/>
       <w:t>1</w:t>
       <w:fldChar w:fldCharType="end"/>
@@ -1412,21 +3248,10 @@
       <w:rPr>
         <w:rFonts w:ascii="Calibri" w:hAnsi="Calibri"/>
         <w:b/>
-        <w:i w:val="0"/>
-        <w:color w:val="148984"/>
+        <w:color w:val="5A6B7C"/>
         <w:sz w:val="17"/>
       </w:rPr>
-      <w:t>DAVID LEADS</w:t>
-    </w:r>
-    <w:r>
-      <w:rPr>
-        <w:rFonts w:ascii="Calibri" w:hAnsi="Calibri"/>
-        <w:b w:val="0"/>
-        <w:i w:val="0"/>
-        <w:color w:val="5C697A"/>
-        <w:sz w:val="17"/>
-      </w:rPr>
-      <w:t xml:space="preserve">   |   Eastern Market Cockpit</w:t>
+      <w:t>DAVID LEADS  |  BROKER FIELD GUIDE</w:t>
     </w:r>
   </w:p>
 </w:hdr>
@@ -1631,6 +3456,50 @@
   </w:num>
   <w:num w:numId="9">
     <w:abstractNumId w:val="0"/>
+  </w:num>
+  <w:abstractNum w:abstractNumId="9">
+    <w:multiLevelType w:val="singleLevel"/>
+    <w:lvl w:ilvl="0">
+      <w:start w:val="1"/>
+      <w:numFmt w:val="bullet"/>
+      <w:lvlText w:val="•"/>
+      <w:suff w:val="tab"/>
+      <w:pPr>
+        <w:tabs>
+          <w:tab w:val="num" w:pos="540"/>
+        </w:tabs>
+        <w:ind w:left="540" w:hanging="270"/>
+        <w:spacing w:after="80" w:line="300" w:lineRule="auto"/>
+      </w:pPr>
+      <w:rPr>
+        <w:rFonts w:ascii="Calibri" w:hAnsi="Calibri"/>
+      </w:rPr>
+    </w:lvl>
+  </w:abstractNum>
+  <w:num w:numId="10">
+    <w:abstractNumId w:val="9"/>
+  </w:num>
+  <w:abstractNum w:abstractNumId="10">
+    <w:multiLevelType w:val="singleLevel"/>
+    <w:lvl w:ilvl="0">
+      <w:start w:val="1"/>
+      <w:numFmt w:val="decimal"/>
+      <w:lvlText w:val="%1."/>
+      <w:suff w:val="tab"/>
+      <w:pPr>
+        <w:tabs>
+          <w:tab w:val="num" w:pos="540"/>
+        </w:tabs>
+        <w:ind w:left="540" w:hanging="270"/>
+        <w:spacing w:after="80" w:line="300" w:lineRule="auto"/>
+      </w:pPr>
+      <w:rPr>
+        <w:rFonts w:ascii="Calibri" w:hAnsi="Calibri"/>
+      </w:rPr>
+    </w:lvl>
+  </w:abstractNum>
+  <w:num w:numId="11">
+    <w:abstractNumId w:val="10"/>
   </w:num>
 </w:numbering>
 </file>
@@ -1800,7 +3669,7 @@
     </w:pPr>
     <w:rPr>
       <w:rFonts w:ascii="Calibri" w:hAnsi="Calibri"/>
-      <w:color w:val="1C2737"/>
+      <w:color w:val="1F2933"/>
       <w:sz w:val="22"/>
     </w:rPr>
   </w:style>
@@ -1866,7 +3735,7 @@
       <w:rFonts w:asciiTheme="majorHAnsi" w:eastAsiaTheme="majorEastAsia" w:hAnsiTheme="majorHAnsi" w:cstheme="majorBidi" w:ascii="Calibri" w:hAnsi="Calibri"/>
       <w:b/>
       <w:bCs/>
-      <w:color w:val="2E74B5"/>
+      <w:color w:val="0A2540"/>
       <w:sz w:val="32"/>
       <w:szCs w:val="28"/>
     </w:rPr>
@@ -1890,7 +3759,7 @@
       <w:rFonts w:asciiTheme="majorHAnsi" w:eastAsiaTheme="majorEastAsia" w:hAnsiTheme="majorHAnsi" w:cstheme="majorBidi" w:ascii="Calibri" w:hAnsi="Calibri"/>
       <w:b/>
       <w:bCs/>
-      <w:color w:val="2E74B5"/>
+      <w:color w:val="168F89"/>
       <w:sz w:val="26"/>
       <w:szCs w:val="26"/>
     </w:rPr>
@@ -1914,7 +3783,7 @@
       <w:rFonts w:asciiTheme="majorHAnsi" w:eastAsiaTheme="majorEastAsia" w:hAnsiTheme="majorHAnsi" w:cstheme="majorBidi" w:ascii="Calibri" w:hAnsi="Calibri"/>
       <w:b/>
       <w:bCs/>
-      <w:color w:val="1F4D78"/>
+      <w:color w:val="0A2540"/>
       <w:sz w:val="24"/>
     </w:rPr>
   </w:style>
@@ -2149,15 +4018,16 @@
       <w:pBdr>
         <w:bottom w:val="single" w:sz="8" w:space="4" w:color="4F81BD" w:themeColor="accent1"/>
       </w:pBdr>
-      <w:spacing w:after="300" w:line="240" w:lineRule="auto"/>
+      <w:spacing w:after="160" w:line="240" w:lineRule="auto" w:before="0"/>
       <w:contextualSpacing/>
     </w:pPr>
     <w:rPr>
-      <w:rFonts w:asciiTheme="majorHAnsi" w:eastAsiaTheme="majorEastAsia" w:hAnsiTheme="majorHAnsi" w:cstheme="majorBidi"/>
-      <w:color w:val="17365D" w:themeColor="text2" w:themeShade="BF"/>
+      <w:rFonts w:asciiTheme="majorHAnsi" w:eastAsiaTheme="majorEastAsia" w:hAnsiTheme="majorHAnsi" w:cstheme="majorBidi" w:ascii="Calibri" w:hAnsi="Calibri"/>
+      <w:b/>
+      <w:color w:val="0A2540"/>
       <w:spacing w:val="5"/>
       <w:kern w:val="28"/>
-      <w:sz w:val="52"/>
+      <w:sz w:val="56"/>
       <w:szCs w:val="52"/>
     </w:rPr>
   </w:style>
@@ -2188,14 +4058,15 @@
       <w:numPr>
         <w:ilvl w:val="1"/>
       </w:numPr>
+      <w:spacing w:after="360"/>
     </w:pPr>
     <w:rPr>
-      <w:rFonts w:asciiTheme="majorHAnsi" w:eastAsiaTheme="majorEastAsia" w:hAnsiTheme="majorHAnsi" w:cstheme="majorBidi"/>
+      <w:rFonts w:asciiTheme="majorHAnsi" w:eastAsiaTheme="majorEastAsia" w:hAnsiTheme="majorHAnsi" w:cstheme="majorBidi" w:ascii="Calibri" w:hAnsi="Calibri"/>
       <w:i/>
       <w:iCs/>
-      <w:color w:val="4F81BD" w:themeColor="accent1"/>
+      <w:color w:val="5A6B7C"/>
       <w:spacing w:val="15"/>
-      <w:sz w:val="24"/>
+      <w:sz w:val="27"/>
       <w:szCs w:val="24"/>
     </w:rPr>
   </w:style>
@@ -2331,14 +4202,8 @@
       <w:numPr>
         <w:numId w:val="1"/>
       </w:numPr>
-      <w:spacing w:after="80" w:line="300" w:lineRule="auto"/>
-      <w:ind w:left="540" w:hanging="271"/>
       <w:contextualSpacing/>
     </w:pPr>
-    <w:rPr>
-      <w:rFonts w:ascii="Calibri" w:hAnsi="Calibri"/>
-      <w:sz w:val="22"/>
-    </w:rPr>
   </w:style>
   <w:style w:type="paragraph" w:styleId="ListBullet2">
     <w:name w:val="List Bullet 2"/>
@@ -2376,14 +4241,8 @@
       <w:numPr>
         <w:numId w:val="5"/>
       </w:numPr>
-      <w:spacing w:after="80" w:line="300" w:lineRule="auto"/>
-      <w:ind w:left="540" w:hanging="271"/>
       <w:contextualSpacing/>
     </w:pPr>
-    <w:rPr>
-      <w:rFonts w:ascii="Calibri" w:hAnsi="Calibri"/>
-      <w:sz w:val="22"/>
-    </w:rPr>
   </w:style>
   <w:style w:type="paragraph" w:styleId="ListNumber2">
     <w:name w:val="List Number 2"/>

</xml_diff>

<commit_message>
docs(broker): publish live operations field guide (#75)
Signed-off-by: Lutar, Stephen P. <stephenlutar2@gmail.com>
</commit_message>
<xml_diff>
--- a/David_Leads_Broker_Guide.docx
+++ b/David_Leads_Broker_Guide.docx
@@ -4,32 +4,32 @@
   <w:body>
     <w:p>
       <w:pPr>
-        <w:spacing w:before="200" w:after="40"/>
+        <w:spacing w:after="60"/>
       </w:pPr>
       <w:r>
         <w:rPr>
           <w:rFonts w:ascii="Calibri" w:hAnsi="Calibri"/>
           <w:b/>
-          <w:i w:val="0"/>
-          <w:color w:val="148984"/>
-          <w:sz w:val="18"/>
+          <w:color w:val="B78327"/>
+          <w:sz w:val="19"/>
         </w:rPr>
-        <w:t>BROKER OPERATING GUIDE</w:t>
+        <w:t>BROKER ENABLEMENT PACK</w:t>
       </w:r>
     </w:p>
     <w:p>
       <w:pPr>
-        <w:spacing w:before="0" w:after="120"/>
+        <w:pStyle w:val="Title"/>
       </w:pPr>
       <w:r>
-        <w:rPr>
-          <w:rFonts w:ascii="Calibri" w:hAnsi="Calibri"/>
-          <w:b/>
-          <w:i w:val="0"/>
-          <w:color w:val="0B2545"/>
-          <w:sz w:val="60"/>
-        </w:rPr>
         <w:t>David Leads</w:t>
+      </w:r>
+    </w:p>
+    <w:p>
+      <w:pPr>
+        <w:pStyle w:val="Subtitle"/>
+      </w:pPr>
+      <w:r>
+        <w:t>A plain-English field guide for the live Eastern Market Cockpit</w:t>
       </w:r>
     </w:p>
     <w:p>
@@ -39,26 +39,174 @@
       <w:r>
         <w:rPr>
           <w:rFonts w:ascii="Calibri" w:hAnsi="Calibri"/>
-          <w:b w:val="0"/>
+          <w:b/>
+          <w:color w:val="5A6B7C"/>
+          <w:sz w:val="21"/>
+        </w:rPr>
+        <w:t>Prepared for David Abraham  |  Verified August 1, 2026</w:t>
+      </w:r>
+    </w:p>
+    <w:p>
+      <w:pPr>
+        <w:spacing w:before="80" w:after="200" w:line="288" w:lineRule="auto"/>
+        <w:shd w:fill="E8F6F4" w:val="clear"/>
+        <w:pBdr>
+          <w:left w:val="single" w:sz="18" w:space="8" w:color="168F89"/>
+        </w:pBdr>
+        <w:ind w:left="180" w:right="120"/>
+      </w:pPr>
+      <w:r>
+        <w:rPr>
+          <w:rFonts w:ascii="Calibri" w:hAnsi="Calibri"/>
+          <w:b/>
+          <w:color w:val="0A2540"/>
+        </w:rPr>
+        <w:t xml:space="preserve">Start here: </w:t>
+      </w:r>
+      <w:r>
+        <w:rPr>
+          <w:rFonts w:ascii="Calibri" w:hAnsi="Calibri"/>
+          <w:color w:val="1F2933"/>
+        </w:rPr>
+        <w:t>Viewing the live research workspace does not require a username, password, or access key. Open the web address below in Chrome, Edge, Safari, or a phone browser.</w:t>
+      </w:r>
+    </w:p>
+    <w:p>
+      <w:pPr>
+        <w:spacing w:after="320"/>
+      </w:pPr>
+      <w:hyperlink r:id="rId11">
+        <w:r>
+          <w:rPr>
+            <w:color w:val="168F89"/>
+            <w:u w:val="single"/>
+            <w:b/>
+            <w:rFonts w:ascii="Calibri" w:hAnsi="Calibri"/>
+            <w:sz w:val="22"/>
+          </w:rPr>
+          <w:t>Open David Leads</w:t>
+        </w:r>
+      </w:hyperlink>
+    </w:p>
+    <w:p>
+      <w:pPr>
+        <w:pStyle w:val="Heading1"/>
+        <w:keepNext/>
+      </w:pPr>
+      <w:r>
+        <w:t>What David Leads does</w:t>
+      </w:r>
+    </w:p>
+    <w:p>
+      <w:pPr>
+        <w:spacing w:after="120" w:line="300" w:lineRule="auto"/>
+      </w:pPr>
+      <w:r>
+        <w:rPr>
+          <w:rFonts w:ascii="Calibri" w:hAnsi="Calibri"/>
           <w:i w:val="0"/>
-          <w:color w:val="5C697A"/>
-          <w:sz w:val="28"/>
+          <w:color w:val="1F2933"/>
         </w:rPr>
-        <w:t>From verified public signal to the next lawful broker action</w:t>
+        <w:t>It gathers current organization-level records from official public sources, shows the business event that changed, explains why the timing may deserve research, and links back to the source record. It is a research desk, not a purchased contact list.</w:t>
+      </w:r>
+    </w:p>
+    <w:p>
+      <w:pPr>
+        <w:numPr>
+          <w:ilvl w:val="0"/>
+          <w:numId w:val="10"/>
+        </w:numPr>
+        <w:spacing w:after="80" w:line="300" w:lineRule="auto"/>
+      </w:pPr>
+      <w:r>
+        <w:rPr>
+          <w:rFonts w:ascii="Calibri" w:hAnsi="Calibri"/>
+          <w:color w:val="1F2933"/>
+        </w:rPr>
+        <w:t>Choose all 27 Eastern markets, a region, or one state.</w:t>
+      </w:r>
+    </w:p>
+    <w:p>
+      <w:pPr>
+        <w:numPr>
+          <w:ilvl w:val="0"/>
+          <w:numId w:val="10"/>
+        </w:numPr>
+        <w:spacing w:after="80" w:line="300" w:lineRule="auto"/>
+      </w:pPr>
+      <w:r>
+        <w:rPr>
+          <w:rFonts w:ascii="Calibri" w:hAnsi="Calibri"/>
+          <w:color w:val="1F2933"/>
+        </w:rPr>
+        <w:t>See live business and facility records with source links and receipts.</w:t>
+      </w:r>
+    </w:p>
+    <w:p>
+      <w:pPr>
+        <w:numPr>
+          <w:ilvl w:val="0"/>
+          <w:numId w:val="10"/>
+        </w:numPr>
+        <w:spacing w:after="80" w:line="300" w:lineRule="auto"/>
+      </w:pPr>
+      <w:r>
+        <w:rPr>
+          <w:rFonts w:ascii="Calibri" w:hAnsi="Calibri"/>
+          <w:color w:val="1F2933"/>
+        </w:rPr>
+        <w:t>Focus on the strongest timing signals before doing manual research.</w:t>
+      </w:r>
+    </w:p>
+    <w:p>
+      <w:pPr>
+        <w:numPr>
+          <w:ilvl w:val="0"/>
+          <w:numId w:val="10"/>
+        </w:numPr>
+        <w:spacing w:after="80" w:line="300" w:lineRule="auto"/>
+      </w:pPr>
+      <w:r>
+        <w:rPr>
+          <w:rFonts w:ascii="Calibri" w:hAnsi="Calibri"/>
+          <w:color w:val="1F2933"/>
+        </w:rPr>
+        <w:t>Keep every outreach decision behind a human compliance check.</w:t>
+      </w:r>
+    </w:p>
+    <w:p>
+      <w:pPr>
+        <w:pStyle w:val="Heading2"/>
+        <w:keepNext/>
+      </w:pPr>
+      <w:r>
+        <w:t>Verified live check</w:t>
+      </w:r>
+    </w:p>
+    <w:p>
+      <w:pPr>
+        <w:spacing w:after="120" w:line="300" w:lineRule="auto"/>
+      </w:pPr>
+      <w:r>
+        <w:rPr>
+          <w:rFonts w:ascii="Calibri" w:hAnsi="Calibri"/>
+          <w:i/>
+          <w:color w:val="5A6B7C"/>
+        </w:rPr>
+        <w:t>The figures below were observed during the August 1 verification. Counts change as public sources change.</w:t>
       </w:r>
     </w:p>
     <w:tbl>
       <w:tblPr>
-        <w:tblStyle w:val="TableGrid"/>
         <w:tblW w:type="dxa" w:w="9360"/>
-        <w:jc w:val="left"/>
         <w:tblLayout w:type="fixed"/>
         <w:tblLook w:firstColumn="1" w:firstRow="1" w:lastColumn="0" w:lastRow="0" w:noHBand="0" w:noVBand="1" w:val="04A0"/>
-        <w:tblInd w:type="dxa" w:w="120"/>
+        <w:jc w:val="left"/>
+        <w:tblInd w:w="120" w:type="dxa"/>
       </w:tblPr>
       <w:tblGrid>
-        <w:gridCol w:w="2200"/>
-        <w:gridCol w:w="7160"/>
+        <w:gridCol w:w="2700"/>
+        <w:gridCol w:w="6660"/>
       </w:tblGrid>
       <w:tr>
         <w:trPr>
@@ -66,356 +214,349 @@
         </w:trPr>
         <w:tc>
           <w:tcPr>
-            <w:tcW w:type="dxa" w:w="2200"/>
+            <w:tcW w:type="dxa" w:w="2700"/>
             <w:vAlign w:val="center"/>
-            <w:shd w:fill="0B2545"/>
             <w:tcMar>
-              <w:top w:w="130" w:type="dxa"/>
-              <w:bottom w:w="130" w:type="dxa"/>
+              <w:top w:w="80" w:type="dxa"/>
+              <w:bottom w:w="80" w:type="dxa"/>
+              <w:start w:w="120" w:type="dxa"/>
+              <w:end w:w="120" w:type="dxa"/>
+            </w:tcMar>
+            <w:shd w:fill="0A2540" w:val="clear"/>
+          </w:tcPr>
+          <w:p>
+            <w:pPr>
+              <w:spacing w:after="0" w:line="276" w:lineRule="auto"/>
+              <w:jc w:val="left"/>
+            </w:pPr>
+            <w:r>
+              <w:rPr>
+                <w:rFonts w:ascii="Calibri" w:hAnsi="Calibri"/>
+                <w:b/>
+                <w:color w:val="FFFFFF"/>
+                <w:sz w:val="21"/>
+              </w:rPr>
+              <w:t>Check</w:t>
+            </w:r>
+          </w:p>
+        </w:tc>
+        <w:tc>
+          <w:tcPr>
+            <w:tcW w:type="dxa" w:w="6660"/>
+            <w:vAlign w:val="center"/>
+            <w:tcMar>
+              <w:top w:w="80" w:type="dxa"/>
+              <w:bottom w:w="80" w:type="dxa"/>
+              <w:start w:w="120" w:type="dxa"/>
+              <w:end w:w="120" w:type="dxa"/>
+            </w:tcMar>
+            <w:shd w:fill="0A2540" w:val="clear"/>
+          </w:tcPr>
+          <w:p>
+            <w:pPr>
+              <w:spacing w:after="0" w:line="276" w:lineRule="auto"/>
+              <w:jc w:val="left"/>
+            </w:pPr>
+            <w:r>
+              <w:rPr>
+                <w:rFonts w:ascii="Calibri" w:hAnsi="Calibri"/>
+                <w:b/>
+                <w:color w:val="FFFFFF"/>
+                <w:sz w:val="21"/>
+              </w:rPr>
+              <w:t>Observed result</w:t>
+            </w:r>
+          </w:p>
+        </w:tc>
+      </w:tr>
+      <w:tr>
+        <w:tc>
+          <w:tcPr>
+            <w:tcW w:type="dxa" w:w="2700"/>
+            <w:vAlign w:val="center"/>
+            <w:tcMar>
+              <w:top w:w="80" w:type="dxa"/>
+              <w:bottom w:w="80" w:type="dxa"/>
               <w:start w:w="120" w:type="dxa"/>
               <w:end w:w="120" w:type="dxa"/>
             </w:tcMar>
           </w:tcPr>
           <w:p>
             <w:pPr>
-              <w:spacing w:after="0"/>
+              <w:spacing w:after="0" w:line="276" w:lineRule="auto"/>
+              <w:jc w:val="left"/>
             </w:pPr>
             <w:r>
               <w:rPr>
                 <w:rFonts w:ascii="Calibri" w:hAnsi="Calibri"/>
                 <w:b/>
-                <w:i w:val="0"/>
-                <w:color w:val="FFFFFF"/>
-                <w:sz w:val="17"/>
+                <w:color w:val="0A2540"/>
+                <w:sz w:val="21"/>
               </w:rPr>
-              <w:t>AT A GLANCE</w:t>
+              <w:t>Access</w:t>
             </w:r>
           </w:p>
         </w:tc>
         <w:tc>
           <w:tcPr>
-            <w:tcW w:type="dxa" w:w="7160"/>
+            <w:tcW w:type="dxa" w:w="6660"/>
             <w:vAlign w:val="center"/>
-            <w:shd w:fill="0B2545"/>
             <w:tcMar>
-              <w:top w:w="130" w:type="dxa"/>
-              <w:bottom w:w="130" w:type="dxa"/>
+              <w:top w:w="80" w:type="dxa"/>
+              <w:bottom w:w="80" w:type="dxa"/>
               <w:start w:w="120" w:type="dxa"/>
               <w:end w:w="120" w:type="dxa"/>
             </w:tcMar>
           </w:tcPr>
           <w:p>
             <w:pPr>
-              <w:spacing w:after="0"/>
+              <w:spacing w:after="0" w:line="276" w:lineRule="auto"/>
+              <w:jc w:val="left"/>
             </w:pPr>
             <w:r>
               <w:rPr>
                 <w:rFonts w:ascii="Calibri" w:hAnsi="Calibri"/>
-                <w:b/>
-                <w:i w:val="0"/>
-                <w:color w:val="FFFFFF"/>
-                <w:sz w:val="17"/>
+                <w:b w:val="0"/>
+                <w:color w:val="1F2933"/>
+                <w:sz w:val="21"/>
               </w:rPr>
-              <w:t>WHAT IT MEANS</w:t>
+              <w:t>Public research opens with no login.</w:t>
             </w:r>
           </w:p>
         </w:tc>
       </w:tr>
       <w:tr>
-        <w:trPr/>
         <w:tc>
           <w:tcPr>
-            <w:tcW w:type="dxa" w:w="2200"/>
+            <w:tcW w:type="dxa" w:w="2700"/>
+            <w:shd w:fill="F5F8FB" w:val="clear"/>
             <w:vAlign w:val="center"/>
-            <w:shd w:fill="E8EEF5"/>
             <w:tcMar>
-              <w:top w:w="130" w:type="dxa"/>
-              <w:bottom w:w="130" w:type="dxa"/>
+              <w:top w:w="80" w:type="dxa"/>
+              <w:bottom w:w="80" w:type="dxa"/>
               <w:start w:w="120" w:type="dxa"/>
               <w:end w:w="120" w:type="dxa"/>
             </w:tcMar>
           </w:tcPr>
           <w:p>
             <w:pPr>
-              <w:spacing w:after="40" w:line="264" w:lineRule="auto"/>
+              <w:spacing w:after="0" w:line="276" w:lineRule="auto"/>
+              <w:jc w:val="left"/>
             </w:pPr>
             <w:r>
               <w:rPr>
                 <w:rFonts w:ascii="Calibri" w:hAnsi="Calibri"/>
                 <w:b/>
-                <w:i w:val="0"/>
-                <w:color w:val="148984"/>
-                <w:sz w:val="17"/>
+                <w:color w:val="0A2540"/>
+                <w:sz w:val="21"/>
               </w:rPr>
-              <w:t>OPEN</w:t>
+              <w:t>Territory</w:t>
             </w:r>
           </w:p>
         </w:tc>
         <w:tc>
           <w:tcPr>
-            <w:tcW w:type="dxa" w:w="7160"/>
+            <w:tcW w:type="dxa" w:w="6660"/>
+            <w:shd w:fill="F5F8FB" w:val="clear"/>
             <w:vAlign w:val="center"/>
-            <w:shd w:fill="FFFFFF"/>
             <w:tcMar>
-              <w:top w:w="130" w:type="dxa"/>
-              <w:bottom w:w="130" w:type="dxa"/>
+              <w:top w:w="80" w:type="dxa"/>
+              <w:bottom w:w="80" w:type="dxa"/>
               <w:start w:w="120" w:type="dxa"/>
               <w:end w:w="120" w:type="dxa"/>
             </w:tcMar>
           </w:tcPr>
           <w:p>
             <w:pPr>
-              <w:spacing w:before="0" w:after="0" w:line="276" w:lineRule="auto"/>
+              <w:spacing w:after="0" w:line="276" w:lineRule="auto"/>
+              <w:jc w:val="left"/>
             </w:pPr>
             <w:r>
               <w:rPr>
                 <w:rFonts w:ascii="Calibri" w:hAnsi="Calibri"/>
-                <w:b/>
-                <w:i w:val="0"/>
-                <w:color w:val="0B2545"/>
+                <w:b w:val="0"/>
+                <w:color w:val="1F2933"/>
                 <w:sz w:val="21"/>
               </w:rPr>
-              <w:t>No login for the public research view</w:t>
+              <w:t>27 Eastern states are selectable on desktop and mobile.</w:t>
             </w:r>
           </w:p>
         </w:tc>
       </w:tr>
       <w:tr>
-        <w:trPr/>
         <w:tc>
           <w:tcPr>
-            <w:tcW w:type="dxa" w:w="2200"/>
+            <w:tcW w:type="dxa" w:w="2700"/>
             <w:vAlign w:val="center"/>
-            <w:shd w:fill="E8EEF5"/>
             <w:tcMar>
-              <w:top w:w="130" w:type="dxa"/>
-              <w:bottom w:w="130" w:type="dxa"/>
+              <w:top w:w="80" w:type="dxa"/>
+              <w:bottom w:w="80" w:type="dxa"/>
               <w:start w:w="120" w:type="dxa"/>
               <w:end w:w="120" w:type="dxa"/>
             </w:tcMar>
           </w:tcPr>
           <w:p>
             <w:pPr>
-              <w:spacing w:after="40" w:line="264" w:lineRule="auto"/>
+              <w:spacing w:after="0" w:line="276" w:lineRule="auto"/>
+              <w:jc w:val="left"/>
             </w:pPr>
             <w:r>
               <w:rPr>
                 <w:rFonts w:ascii="Calibri" w:hAnsi="Calibri"/>
                 <w:b/>
-                <w:i w:val="0"/>
-                <w:color w:val="148984"/>
-                <w:sz w:val="17"/>
+                <w:color w:val="0A2540"/>
+                <w:sz w:val="21"/>
               </w:rPr>
-              <w:t>COVERAGE</w:t>
+              <w:t>Live records</w:t>
             </w:r>
           </w:p>
         </w:tc>
         <w:tc>
           <w:tcPr>
-            <w:tcW w:type="dxa" w:w="7160"/>
+            <w:tcW w:type="dxa" w:w="6660"/>
             <w:vAlign w:val="center"/>
-            <w:shd w:fill="FFFFFF"/>
             <w:tcMar>
-              <w:top w:w="130" w:type="dxa"/>
-              <w:bottom w:w="130" w:type="dxa"/>
+              <w:top w:w="80" w:type="dxa"/>
+              <w:bottom w:w="80" w:type="dxa"/>
               <w:start w:w="120" w:type="dxa"/>
               <w:end w:w="120" w:type="dxa"/>
             </w:tcMar>
           </w:tcPr>
           <w:p>
             <w:pPr>
-              <w:spacing w:before="0" w:after="0" w:line="276" w:lineRule="auto"/>
+              <w:spacing w:after="0" w:line="276" w:lineRule="auto"/>
+              <w:jc w:val="left"/>
             </w:pPr>
             <w:r>
               <w:rPr>
                 <w:rFonts w:ascii="Calibri" w:hAnsi="Calibri"/>
-                <w:b/>
-                <w:i w:val="0"/>
-                <w:color w:val="0B2545"/>
+                <w:b w:val="0"/>
+                <w:color w:val="1F2933"/>
                 <w:sz w:val="21"/>
               </w:rPr>
-              <w:t>27 Eastern U.S. markets</w:t>
+              <w:t>70 live records across the Eastern view; 53 in a deeper New York pull.</w:t>
             </w:r>
           </w:p>
         </w:tc>
       </w:tr>
       <w:tr>
-        <w:trPr/>
         <w:tc>
           <w:tcPr>
-            <w:tcW w:type="dxa" w:w="2200"/>
+            <w:tcW w:type="dxa" w:w="2700"/>
+            <w:shd w:fill="F5F8FB" w:val="clear"/>
             <w:vAlign w:val="center"/>
-            <w:shd w:fill="E8EEF5"/>
             <w:tcMar>
-              <w:top w:w="130" w:type="dxa"/>
-              <w:bottom w:w="130" w:type="dxa"/>
+              <w:top w:w="80" w:type="dxa"/>
+              <w:bottom w:w="80" w:type="dxa"/>
               <w:start w:w="120" w:type="dxa"/>
               <w:end w:w="120" w:type="dxa"/>
             </w:tcMar>
           </w:tcPr>
           <w:p>
             <w:pPr>
-              <w:spacing w:after="40" w:line="264" w:lineRule="auto"/>
+              <w:spacing w:after="0" w:line="276" w:lineRule="auto"/>
+              <w:jc w:val="left"/>
             </w:pPr>
             <w:r>
               <w:rPr>
                 <w:rFonts w:ascii="Calibri" w:hAnsi="Calibri"/>
                 <w:b/>
-                <w:i w:val="0"/>
-                <w:color w:val="148984"/>
-                <w:sz w:val="17"/>
+                <w:color w:val="0A2540"/>
+                <w:sz w:val="21"/>
               </w:rPr>
-              <w:t>PRIMARY USE</w:t>
+              <w:t>Examples</w:t>
             </w:r>
           </w:p>
         </w:tc>
         <w:tc>
           <w:tcPr>
-            <w:tcW w:type="dxa" w:w="7160"/>
+            <w:tcW w:type="dxa" w:w="6660"/>
+            <w:shd w:fill="F5F8FB" w:val="clear"/>
             <w:vAlign w:val="center"/>
-            <w:shd w:fill="FFFFFF"/>
             <w:tcMar>
-              <w:top w:w="130" w:type="dxa"/>
-              <w:bottom w:w="130" w:type="dxa"/>
+              <w:top w:w="80" w:type="dxa"/>
+              <w:bottom w:w="80" w:type="dxa"/>
               <w:start w:w="120" w:type="dxa"/>
               <w:end w:w="120" w:type="dxa"/>
             </w:tcMar>
           </w:tcPr>
           <w:p>
             <w:pPr>
-              <w:spacing w:before="0" w:after="0" w:line="276" w:lineRule="auto"/>
+              <w:spacing w:after="0" w:line="276" w:lineRule="auto"/>
+              <w:jc w:val="left"/>
             </w:pPr>
             <w:r>
               <w:rPr>
                 <w:rFonts w:ascii="Calibri" w:hAnsi="Calibri"/>
-                <w:b/>
-                <w:i w:val="0"/>
-                <w:color w:val="0B2545"/>
+                <w:b w:val="0"/>
+                <w:color w:val="1F2933"/>
                 <w:sz w:val="21"/>
               </w:rPr>
-              <w:t>Choose what to research first</w:t>
+              <w:t>0 sample records in the verified live pulls.</w:t>
             </w:r>
           </w:p>
         </w:tc>
       </w:tr>
       <w:tr>
-        <w:trPr/>
         <w:tc>
           <w:tcPr>
-            <w:tcW w:type="dxa" w:w="2200"/>
+            <w:tcW w:type="dxa" w:w="2700"/>
             <w:vAlign w:val="center"/>
-            <w:shd w:fill="E8EEF5"/>
             <w:tcMar>
-              <w:top w:w="130" w:type="dxa"/>
-              <w:bottom w:w="130" w:type="dxa"/>
+              <w:top w:w="80" w:type="dxa"/>
+              <w:bottom w:w="80" w:type="dxa"/>
               <w:start w:w="120" w:type="dxa"/>
               <w:end w:w="120" w:type="dxa"/>
             </w:tcMar>
           </w:tcPr>
           <w:p>
             <w:pPr>
-              <w:spacing w:after="40" w:line="264" w:lineRule="auto"/>
+              <w:spacing w:after="0" w:line="276" w:lineRule="auto"/>
+              <w:jc w:val="left"/>
             </w:pPr>
             <w:r>
               <w:rPr>
                 <w:rFonts w:ascii="Calibri" w:hAnsi="Calibri"/>
                 <w:b/>
-                <w:i w:val="0"/>
-                <w:color w:val="148984"/>
-                <w:sz w:val="17"/>
+                <w:color w:val="0A2540"/>
+                <w:sz w:val="21"/>
               </w:rPr>
-              <w:t>CONTACT</w:t>
+              <w:t>Health</w:t>
             </w:r>
           </w:p>
         </w:tc>
         <w:tc>
           <w:tcPr>
-            <w:tcW w:type="dxa" w:w="7160"/>
+            <w:tcW w:type="dxa" w:w="6660"/>
             <w:vAlign w:val="center"/>
-            <w:shd w:fill="FFFFFF"/>
             <w:tcMar>
-              <w:top w:w="130" w:type="dxa"/>
-              <w:bottom w:w="130" w:type="dxa"/>
+              <w:top w:w="80" w:type="dxa"/>
+              <w:bottom w:w="80" w:type="dxa"/>
               <w:start w:w="120" w:type="dxa"/>
               <w:end w:w="120" w:type="dxa"/>
             </w:tcMar>
           </w:tcPr>
           <w:p>
             <w:pPr>
-              <w:spacing w:before="0" w:after="0" w:line="276" w:lineRule="auto"/>
+              <w:spacing w:after="0" w:line="276" w:lineRule="auto"/>
+              <w:jc w:val="left"/>
             </w:pPr>
             <w:r>
               <w:rPr>
                 <w:rFonts w:ascii="Calibri" w:hAnsi="Calibri"/>
-                <w:b/>
-                <w:i w:val="0"/>
-                <w:color w:val="0B2545"/>
+                <w:b w:val="0"/>
+                <w:color w:val="1F2933"/>
                 <w:sz w:val="21"/>
               </w:rPr>
-              <w:t>Always blocked until protected clearance</w:t>
+              <w:t>Application, public data, and broker database all reported ready.</w:t>
             </w:r>
           </w:p>
         </w:tc>
       </w:tr>
     </w:tbl>
     <w:p>
-      <w:pPr>
-        <w:spacing w:before="0" w:after="40" w:line="300" w:lineRule="auto"/>
-      </w:pPr>
       <w:r>
-        <w:rPr>
-          <w:rFonts w:ascii="Calibri" w:hAnsi="Calibri"/>
-          <w:b/>
-          <w:i w:val="0"/>
-          <w:color w:val="148984"/>
-          <w:sz w:val="18"/>
-        </w:rPr>
-        <w:t>Open the application</w:t>
-      </w:r>
-    </w:p>
-    <w:p>
-      <w:pPr>
-        <w:spacing w:before="0" w:after="240" w:line="300" w:lineRule="auto"/>
-      </w:pPr>
-      <w:r>
-        <w:rPr>
-          <w:rFonts w:ascii="Calibri" w:hAnsi="Calibri"/>
-          <w:b/>
-          <w:i w:val="0"/>
-          <w:color w:val="2E74B5"/>
-          <w:sz w:val="24"/>
-        </w:rPr>
-        <w:t>https://szlholdings-david-leads.hf.space/</w:t>
-      </w:r>
-    </w:p>
-    <w:p>
-      <w:pPr>
-        <w:spacing w:before="80" w:after="200" w:line="288" w:lineRule="auto"/>
-        <w:ind w:left="173" w:right="173"/>
-        <w:shd w:fill="E7F5F3"/>
-        <w:pBdr>
-          <w:left w:val="single" w:sz="18" w:space="8" w:color="148984"/>
-        </w:pBdr>
-      </w:pPr>
-      <w:r>
-        <w:rPr>
-          <w:rFonts w:ascii="Calibri" w:hAnsi="Calibri"/>
-          <w:b/>
-          <w:i w:val="0"/>
-          <w:color w:val="0B2545"/>
-          <w:sz w:val="22"/>
-        </w:rPr>
-        <w:t xml:space="preserve">The simple rule: </w:t>
-      </w:r>
-      <w:r>
-        <w:rPr>
-          <w:rFonts w:ascii="Calibri" w:hAnsi="Calibri"/>
-          <w:b w:val="0"/>
-          <w:i w:val="0"/>
-          <w:color w:val="1C2737"/>
-          <w:sz w:val="22"/>
-        </w:rPr>
-        <w:t>Use David Leads to decide what to research first. Use the official record to verify why. Use the protected clearance process to decide whether contact is permitted.</w:t>
+        <w:br w:type="page"/>
       </w:r>
     </w:p>
     <w:p>
@@ -424,52 +565,273 @@
         <w:keepNext/>
       </w:pPr>
       <w:r>
-        <w:t>What this application does</w:t>
+        <w:t>Your first five minutes</w:t>
       </w:r>
     </w:p>
     <w:p>
       <w:pPr>
-        <w:spacing w:before="0" w:after="120" w:line="300" w:lineRule="auto"/>
+        <w:numPr>
+          <w:ilvl w:val="0"/>
+          <w:numId w:val="11"/>
+        </w:numPr>
+        <w:spacing w:after="80" w:line="300" w:lineRule="auto"/>
       </w:pPr>
       <w:r>
         <w:rPr>
           <w:rFonts w:ascii="Calibri" w:hAnsi="Calibri"/>
-          <w:b w:val="0"/>
+          <w:color w:val="1F2933"/>
+        </w:rPr>
+        <w:t>Open the link. The research workspace loads without a login.</w:t>
+      </w:r>
+    </w:p>
+    <w:p>
+      <w:pPr>
+        <w:numPr>
+          <w:ilvl w:val="0"/>
+          <w:numId w:val="11"/>
+        </w:numPr>
+        <w:spacing w:after="80" w:line="300" w:lineRule="auto"/>
+      </w:pPr>
+      <w:r>
+        <w:rPr>
+          <w:rFonts w:ascii="Calibri" w:hAnsi="Calibri"/>
+          <w:color w:val="1F2933"/>
+        </w:rPr>
+        <w:t>Choose All East, a region, or one state. One state runs a deeper pull.</w:t>
+      </w:r>
+    </w:p>
+    <w:p>
+      <w:pPr>
+        <w:numPr>
+          <w:ilvl w:val="0"/>
+          <w:numId w:val="11"/>
+        </w:numPr>
+        <w:spacing w:after="80" w:line="300" w:lineRule="auto"/>
+      </w:pPr>
+      <w:r>
+        <w:rPr>
+          <w:rFonts w:ascii="Calibri" w:hAnsi="Calibri"/>
+          <w:color w:val="1F2933"/>
+        </w:rPr>
+        <w:t>Read the Broker brief near the top. It points to the strongest current timing pattern.</w:t>
+      </w:r>
+    </w:p>
+    <w:p>
+      <w:pPr>
+        <w:numPr>
+          <w:ilvl w:val="0"/>
+          <w:numId w:val="11"/>
+        </w:numPr>
+        <w:spacing w:after="80" w:line="300" w:lineRule="auto"/>
+      </w:pPr>
+      <w:r>
+        <w:rPr>
+          <w:rFonts w:ascii="Calibri" w:hAnsi="Calibri"/>
+          <w:color w:val="1F2933"/>
+        </w:rPr>
+        <w:t>Use the deal-moment buttons to narrow the list: life-plan timing, growth and awards, operational change, or needs research.</w:t>
+      </w:r>
+    </w:p>
+    <w:p>
+      <w:pPr>
+        <w:numPr>
+          <w:ilvl w:val="0"/>
+          <w:numId w:val="11"/>
+        </w:numPr>
+        <w:spacing w:after="80" w:line="300" w:lineRule="auto"/>
+      </w:pPr>
+      <w:r>
+        <w:rPr>
+          <w:rFonts w:ascii="Calibri" w:hAnsi="Calibri"/>
+          <w:color w:val="1F2933"/>
+        </w:rPr>
+        <w:t>Open an organization to see the public event, likely fit, evidence, limits, and the next research step.</w:t>
+      </w:r>
+    </w:p>
+    <w:p>
+      <w:pPr>
+        <w:numPr>
+          <w:ilvl w:val="0"/>
+          <w:numId w:val="11"/>
+        </w:numPr>
+        <w:spacing w:after="80" w:line="300" w:lineRule="auto"/>
+      </w:pPr>
+      <w:r>
+        <w:rPr>
+          <w:rFonts w:ascii="Calibri" w:hAnsi="Calibri"/>
+          <w:color w:val="1F2933"/>
+        </w:rPr>
+        <w:t>Open the official source before using any claim in a conversation.</w:t>
+      </w:r>
+    </w:p>
+    <w:p>
+      <w:pPr>
+        <w:pStyle w:val="Heading2"/>
+        <w:keepNext/>
+      </w:pPr>
+      <w:r>
+        <w:t>What the screen is telling you</w:t>
+      </w:r>
+    </w:p>
+    <w:p>
+      <w:pPr>
+        <w:spacing w:after="120" w:line="300" w:lineRule="auto"/>
+      </w:pPr>
+      <w:r>
+        <w:rPr>
+          <w:rFonts w:ascii="Calibri" w:hAnsi="Calibri"/>
+          <w:b/>
+          <w:color w:val="0A2540"/>
+        </w:rPr>
+        <w:t xml:space="preserve">Live organizations. </w:t>
+      </w:r>
+      <w:r>
+        <w:rPr>
+          <w:rFonts w:ascii="Calibri" w:hAnsi="Calibri"/>
           <w:i w:val="0"/>
-          <w:color w:val="1C2737"/>
-          <w:sz w:val="22"/>
+          <w:color w:val="1F2933"/>
         </w:rPr>
-        <w:t>David Leads organizes official organization-level records into a practical research queue. It shows the company, the observed change, the timing, the likely protection-planning fit, and the evidence behind the item.</w:t>
+        <w:t>Live organizations</w:t>
+      </w:r>
+    </w:p>
+    <w:p>
+      <w:pPr>
+        <w:spacing w:after="120" w:line="300" w:lineRule="auto"/>
+      </w:pPr>
+      <w:r>
+        <w:rPr>
+          <w:rFonts w:ascii="Calibri" w:hAnsi="Calibri"/>
+          <w:i w:val="0"/>
+          <w:color w:val="1F2933"/>
+        </w:rPr>
+        <w:t>The number of official records in the selected market. The count changes with the territory and source response.</w:t>
+      </w:r>
+    </w:p>
+    <w:p>
+      <w:pPr>
+        <w:spacing w:after="120" w:line="300" w:lineRule="auto"/>
+      </w:pPr>
+      <w:r>
+        <w:rPr>
+          <w:rFonts w:ascii="Calibri" w:hAnsi="Calibri"/>
+          <w:b/>
+          <w:color w:val="0A2540"/>
+        </w:rPr>
+        <w:t xml:space="preserve">Source coverage. </w:t>
+      </w:r>
+      <w:r>
+        <w:rPr>
+          <w:rFonts w:ascii="Calibri" w:hAnsi="Calibri"/>
+          <w:i w:val="0"/>
+          <w:color w:val="1F2933"/>
+        </w:rPr>
+        <w:t>Source coverage</w:t>
+      </w:r>
+    </w:p>
+    <w:p>
+      <w:pPr>
+        <w:spacing w:after="120" w:line="300" w:lineRule="auto"/>
+      </w:pPr>
+      <w:r>
+        <w:rPr>
+          <w:rFonts w:ascii="Calibri" w:hAnsi="Calibri"/>
+          <w:i w:val="0"/>
+          <w:color w:val="1F2933"/>
+        </w:rPr>
+        <w:t>How many source lanes answered live. An unavailable source remains visible; it is never replaced by a fake record.</w:t>
+      </w:r>
+    </w:p>
+    <w:p>
+      <w:pPr>
+        <w:spacing w:after="120" w:line="300" w:lineRule="auto"/>
+      </w:pPr>
+      <w:r>
+        <w:rPr>
+          <w:rFonts w:ascii="Calibri" w:hAnsi="Calibri"/>
+          <w:b/>
+          <w:color w:val="0A2540"/>
+        </w:rPr>
+        <w:t xml:space="preserve">Needs research. </w:t>
+      </w:r>
+      <w:r>
+        <w:rPr>
+          <w:rFonts w:ascii="Calibri" w:hAnsi="Calibri"/>
+          <w:i w:val="0"/>
+          <w:color w:val="1F2933"/>
+        </w:rPr>
+        <w:t>Needs research</w:t>
+      </w:r>
+    </w:p>
+    <w:p>
+      <w:pPr>
+        <w:spacing w:after="120" w:line="300" w:lineRule="auto"/>
+      </w:pPr>
+      <w:r>
+        <w:rPr>
+          <w:rFonts w:ascii="Calibri" w:hAnsi="Calibri"/>
+          <w:i w:val="0"/>
+          <w:color w:val="1F2933"/>
+        </w:rPr>
+        <w:t>Records worth checking. This is not the number of people cleared for contact.</w:t>
+      </w:r>
+    </w:p>
+    <w:p>
+      <w:pPr>
+        <w:spacing w:after="120" w:line="300" w:lineRule="auto"/>
+      </w:pPr>
+      <w:r>
+        <w:rPr>
+          <w:rFonts w:ascii="Calibri" w:hAnsi="Calibri"/>
+          <w:b/>
+          <w:color w:val="0A2540"/>
+        </w:rPr>
+        <w:t xml:space="preserve">Timing window. </w:t>
+      </w:r>
+      <w:r>
+        <w:rPr>
+          <w:rFonts w:ascii="Calibri" w:hAnsi="Calibri"/>
+          <w:i w:val="0"/>
+          <w:color w:val="1F2933"/>
+        </w:rPr>
+        <w:t>Timing window</w:t>
+      </w:r>
+    </w:p>
+    <w:p>
+      <w:pPr>
+        <w:spacing w:after="120" w:line="300" w:lineRule="auto"/>
+      </w:pPr>
+      <w:r>
+        <w:rPr>
+          <w:rFonts w:ascii="Calibri" w:hAnsi="Calibri"/>
+          <w:i w:val="0"/>
+          <w:color w:val="1F2933"/>
+        </w:rPr>
+        <w:t>A date or filing field that may make the organization worth researching now. It is not proof of a sale, renewal, dissatisfaction, or insurance need.</w:t>
       </w:r>
     </w:p>
     <w:p>
       <w:pPr>
         <w:spacing w:before="80" w:after="200" w:line="288" w:lineRule="auto"/>
-        <w:ind w:left="173" w:right="173"/>
-        <w:shd w:fill="FFF7E5"/>
+        <w:shd w:fill="FFF7E6" w:val="clear"/>
         <w:pBdr>
-          <w:left w:val="single" w:sz="18" w:space="8" w:color="B78921"/>
+          <w:left w:val="single" w:sz="18" w:space="8" w:color="168F89"/>
         </w:pBdr>
+        <w:ind w:left="180" w:right="120"/>
       </w:pPr>
       <w:r>
         <w:rPr>
           <w:rFonts w:ascii="Calibri" w:hAnsi="Calibri"/>
           <w:b/>
-          <w:i w:val="0"/>
-          <w:color w:val="0B2545"/>
-          <w:sz w:val="22"/>
+          <w:color w:val="0A2540"/>
         </w:rPr>
-        <w:t xml:space="preserve">Important: </w:t>
+        <w:t xml:space="preserve">The key distinction: </w:t>
       </w:r>
       <w:r>
         <w:rPr>
           <w:rFonts w:ascii="Calibri" w:hAnsi="Calibri"/>
-          <w:b w:val="0"/>
-          <w:i w:val="0"/>
-          <w:color w:val="1C2737"/>
-          <w:sz w:val="22"/>
+          <w:color w:val="1F2933"/>
         </w:rPr>
-        <w:t>It is not a purchased contact list. It never turns a public record into permission to call, email, market, or make an underwriting decision.</w:t>
+        <w:t>A visible public record is permission to research the organization. It is not permission to call, text, email, quote, or recommend a product.</w:t>
       </w:r>
     </w:p>
     <w:p>
@@ -483,142 +845,503 @@
         <w:keepNext/>
       </w:pPr>
       <w:r>
-        <w:t>Start your day in five minutes</w:t>
+        <w:t>How to use one opportunity</w:t>
       </w:r>
     </w:p>
     <w:p>
       <w:pPr>
-        <w:pStyle w:val="ListNumber"/>
+        <w:pStyle w:val="Heading2"/>
+        <w:keepNext/>
+      </w:pPr>
+      <w:r>
+        <w:t>1. Verify the moment</w:t>
+      </w:r>
+    </w:p>
+    <w:p>
+      <w:pPr>
         <w:spacing w:after="120" w:line="300" w:lineRule="auto"/>
-        <w:ind w:left="540" w:hanging="271"/>
       </w:pPr>
       <w:r>
         <w:rPr>
           <w:rFonts w:ascii="Calibri" w:hAnsi="Calibri"/>
-          <w:b/>
           <w:i w:val="0"/>
-          <w:color w:val="0B2545"/>
-          <w:sz w:val="22"/>
+          <w:color w:val="1F2933"/>
         </w:rPr>
-        <w:t xml:space="preserve">Read the Broker brief. </w:t>
-      </w:r>
-      <w:r>
-        <w:rPr>
-          <w:rFonts w:ascii="Calibri" w:hAnsi="Calibri"/>
-          <w:b w:val="0"/>
-          <w:i w:val="0"/>
-          <w:color w:val="1C2737"/>
-          <w:sz w:val="22"/>
-        </w:rPr>
-        <w:t>It summarizes the strongest timing pattern in the current official-source pull.</w:t>
+        <w:t>Open the official source and confirm the organization name, date, location, and the exact event shown. If the record cannot be confirmed, stop and mark it for later research.</w:t>
       </w:r>
     </w:p>
     <w:p>
       <w:pPr>
-        <w:pStyle w:val="ListNumber"/>
+        <w:pStyle w:val="Heading2"/>
+        <w:keepNext/>
+      </w:pPr>
+      <w:r>
+        <w:t>2. Qualify the fit</w:t>
+      </w:r>
+    </w:p>
+    <w:p>
+      <w:pPr>
         <w:spacing w:after="120" w:line="300" w:lineRule="auto"/>
-        <w:ind w:left="540" w:hanging="271"/>
       </w:pPr>
       <w:r>
         <w:rPr>
           <w:rFonts w:ascii="Calibri" w:hAnsi="Calibri"/>
-          <w:b/>
           <w:i w:val="0"/>
-          <w:color w:val="0B2545"/>
-          <w:sz w:val="22"/>
+          <w:color w:val="1F2933"/>
         </w:rPr>
-        <w:t xml:space="preserve">Choose a territory. </w:t>
-      </w:r>
-      <w:r>
-        <w:rPr>
-          <w:rFonts w:ascii="Calibri" w:hAnsi="Calibri"/>
-          <w:b w:val="0"/>
-          <w:i w:val="0"/>
-          <w:color w:val="1C2737"/>
-          <w:sz w:val="22"/>
-        </w:rPr>
-        <w:t>Select All East, a region, or one state. One state runs a deeper market-specific search.</w:t>
+        <w:t>Visit the organization's own website. Understand what it does, whether the public event appears relevant, and whether a business-published channel exists. Treat the suggested product fit as a question to investigate, not an answer.</w:t>
       </w:r>
     </w:p>
     <w:p>
       <w:pPr>
-        <w:pStyle w:val="ListNumber"/>
+        <w:pStyle w:val="Heading2"/>
+        <w:keepNext/>
+      </w:pPr>
+      <w:r>
+        <w:t>3. Clear outreach</w:t>
+      </w:r>
+    </w:p>
+    <w:p>
+      <w:pPr>
         <w:spacing w:after="120" w:line="300" w:lineRule="auto"/>
-        <w:ind w:left="540" w:hanging="271"/>
       </w:pPr>
       <w:r>
         <w:rPr>
           <w:rFonts w:ascii="Calibri" w:hAnsi="Calibri"/>
-          <w:b/>
           <w:i w:val="0"/>
-          <w:color w:val="0B2545"/>
-          <w:sz w:val="22"/>
+          <w:color w:val="1F2933"/>
         </w:rPr>
-        <w:t xml:space="preserve">Choose a deal moment. </w:t>
-      </w:r>
-      <w:r>
-        <w:rPr>
-          <w:rFonts w:ascii="Calibri" w:hAnsi="Calibri"/>
-          <w:b w:val="0"/>
-          <w:i w:val="0"/>
-          <w:color w:val="1C2737"/>
-          <w:sz w:val="22"/>
-        </w:rPr>
-        <w:t>Use Life-plan timing, Growth &amp; awards, Operational change, or Needs research.</w:t>
+        <w:t>Before contact, complete the required suppression, licensing, state-rule, purpose, and channel checks in the protected broker workflow. The public workspace intentionally keeps call-ready at zero.</w:t>
       </w:r>
     </w:p>
     <w:p>
       <w:pPr>
-        <w:pStyle w:val="ListNumber"/>
-        <w:spacing w:after="120" w:line="300" w:lineRule="auto"/>
-        <w:ind w:left="540" w:hanging="271"/>
+        <w:pStyle w:val="Heading2"/>
+        <w:keepNext/>
       </w:pPr>
       <w:r>
-        <w:rPr>
-          <w:rFonts w:ascii="Calibri" w:hAnsi="Calibri"/>
-          <w:b/>
-          <w:i w:val="0"/>
-          <w:color w:val="0B2545"/>
-          <w:sz w:val="22"/>
-        </w:rPr>
-        <w:t xml:space="preserve">Open the strongest account. </w:t>
-      </w:r>
-      <w:r>
-        <w:rPr>
-          <w:rFonts w:ascii="Calibri" w:hAnsi="Calibri"/>
-          <w:b w:val="0"/>
-          <w:i w:val="0"/>
-          <w:color w:val="1C2737"/>
-          <w:sz w:val="22"/>
-        </w:rPr>
-        <w:t>Review the timing, likely fit, evidence, limitations, and three-step broker action.</w:t>
+        <w:t>Read the record correctly</w:t>
       </w:r>
     </w:p>
+    <w:tbl>
+      <w:tblPr>
+        <w:tblW w:type="dxa" w:w="9360"/>
+        <w:tblLayout w:type="fixed"/>
+        <w:tblLook w:firstColumn="1" w:firstRow="1" w:lastColumn="0" w:lastRow="0" w:noHBand="0" w:noVBand="1" w:val="04A0"/>
+        <w:jc w:val="left"/>
+        <w:tblInd w:w="120" w:type="dxa"/>
+      </w:tblPr>
+      <w:tblGrid>
+        <w:gridCol w:w="2700"/>
+        <w:gridCol w:w="6660"/>
+      </w:tblGrid>
+      <w:tr>
+        <w:trPr>
+          <w:tblHeader w:val="true"/>
+        </w:trPr>
+        <w:tc>
+          <w:tcPr>
+            <w:tcW w:type="dxa" w:w="2700"/>
+            <w:vAlign w:val="center"/>
+            <w:tcMar>
+              <w:top w:w="80" w:type="dxa"/>
+              <w:bottom w:w="80" w:type="dxa"/>
+              <w:start w:w="120" w:type="dxa"/>
+              <w:end w:w="120" w:type="dxa"/>
+            </w:tcMar>
+            <w:shd w:fill="0A2540" w:val="clear"/>
+          </w:tcPr>
+          <w:p>
+            <w:pPr>
+              <w:spacing w:after="0" w:line="276" w:lineRule="auto"/>
+              <w:jc w:val="left"/>
+            </w:pPr>
+            <w:r>
+              <w:rPr>
+                <w:rFonts w:ascii="Calibri" w:hAnsi="Calibri"/>
+                <w:b/>
+                <w:color w:val="FFFFFF"/>
+                <w:sz w:val="21"/>
+              </w:rPr>
+              <w:t>Label</w:t>
+            </w:r>
+          </w:p>
+        </w:tc>
+        <w:tc>
+          <w:tcPr>
+            <w:tcW w:type="dxa" w:w="6660"/>
+            <w:vAlign w:val="center"/>
+            <w:tcMar>
+              <w:top w:w="80" w:type="dxa"/>
+              <w:bottom w:w="80" w:type="dxa"/>
+              <w:start w:w="120" w:type="dxa"/>
+              <w:end w:w="120" w:type="dxa"/>
+            </w:tcMar>
+            <w:shd w:fill="0A2540" w:val="clear"/>
+          </w:tcPr>
+          <w:p>
+            <w:pPr>
+              <w:spacing w:after="0" w:line="276" w:lineRule="auto"/>
+              <w:jc w:val="left"/>
+            </w:pPr>
+            <w:r>
+              <w:rPr>
+                <w:rFonts w:ascii="Calibri" w:hAnsi="Calibri"/>
+                <w:b/>
+                <w:color w:val="FFFFFF"/>
+                <w:sz w:val="21"/>
+              </w:rPr>
+              <w:t>Plain-English meaning</w:t>
+            </w:r>
+          </w:p>
+        </w:tc>
+      </w:tr>
+      <w:tr>
+        <w:tc>
+          <w:tcPr>
+            <w:tcW w:type="dxa" w:w="2700"/>
+            <w:vAlign w:val="center"/>
+            <w:tcMar>
+              <w:top w:w="80" w:type="dxa"/>
+              <w:bottom w:w="80" w:type="dxa"/>
+              <w:start w:w="120" w:type="dxa"/>
+              <w:end w:w="120" w:type="dxa"/>
+            </w:tcMar>
+          </w:tcPr>
+          <w:p>
+            <w:pPr>
+              <w:spacing w:after="0" w:line="276" w:lineRule="auto"/>
+              <w:jc w:val="left"/>
+            </w:pPr>
+            <w:r>
+              <w:rPr>
+                <w:rFonts w:ascii="Calibri" w:hAnsi="Calibri"/>
+                <w:b/>
+                <w:color w:val="0A2540"/>
+                <w:sz w:val="21"/>
+              </w:rPr>
+              <w:t>Verified deal moment</w:t>
+            </w:r>
+          </w:p>
+        </w:tc>
+        <w:tc>
+          <w:tcPr>
+            <w:tcW w:type="dxa" w:w="6660"/>
+            <w:vAlign w:val="center"/>
+            <w:tcMar>
+              <w:top w:w="80" w:type="dxa"/>
+              <w:bottom w:w="80" w:type="dxa"/>
+              <w:start w:w="120" w:type="dxa"/>
+              <w:end w:w="120" w:type="dxa"/>
+            </w:tcMar>
+          </w:tcPr>
+          <w:p>
+            <w:pPr>
+              <w:spacing w:after="0" w:line="276" w:lineRule="auto"/>
+              <w:jc w:val="left"/>
+            </w:pPr>
+            <w:r>
+              <w:rPr>
+                <w:rFonts w:ascii="Calibri" w:hAnsi="Calibri"/>
+                <w:b w:val="0"/>
+                <w:color w:val="1F2933"/>
+                <w:sz w:val="21"/>
+              </w:rPr>
+              <w:t>The fact returned by the official source.</w:t>
+            </w:r>
+          </w:p>
+        </w:tc>
+      </w:tr>
+      <w:tr>
+        <w:tc>
+          <w:tcPr>
+            <w:tcW w:type="dxa" w:w="2700"/>
+            <w:shd w:fill="F5F8FB" w:val="clear"/>
+            <w:vAlign w:val="center"/>
+            <w:tcMar>
+              <w:top w:w="80" w:type="dxa"/>
+              <w:bottom w:w="80" w:type="dxa"/>
+              <w:start w:w="120" w:type="dxa"/>
+              <w:end w:w="120" w:type="dxa"/>
+            </w:tcMar>
+          </w:tcPr>
+          <w:p>
+            <w:pPr>
+              <w:spacing w:after="0" w:line="276" w:lineRule="auto"/>
+              <w:jc w:val="left"/>
+            </w:pPr>
+            <w:r>
+              <w:rPr>
+                <w:rFonts w:ascii="Calibri" w:hAnsi="Calibri"/>
+                <w:b/>
+                <w:color w:val="0A2540"/>
+                <w:sz w:val="21"/>
+              </w:rPr>
+              <w:t>Why now</w:t>
+            </w:r>
+          </w:p>
+        </w:tc>
+        <w:tc>
+          <w:tcPr>
+            <w:tcW w:type="dxa" w:w="6660"/>
+            <w:shd w:fill="F5F8FB" w:val="clear"/>
+            <w:vAlign w:val="center"/>
+            <w:tcMar>
+              <w:top w:w="80" w:type="dxa"/>
+              <w:bottom w:w="80" w:type="dxa"/>
+              <w:start w:w="120" w:type="dxa"/>
+              <w:end w:w="120" w:type="dxa"/>
+            </w:tcMar>
+          </w:tcPr>
+          <w:p>
+            <w:pPr>
+              <w:spacing w:after="0" w:line="276" w:lineRule="auto"/>
+              <w:jc w:val="left"/>
+            </w:pPr>
+            <w:r>
+              <w:rPr>
+                <w:rFonts w:ascii="Calibri" w:hAnsi="Calibri"/>
+                <w:b w:val="0"/>
+                <w:color w:val="1F2933"/>
+                <w:sz w:val="21"/>
+              </w:rPr>
+              <w:t>Why the event may deserve timely research.</w:t>
+            </w:r>
+          </w:p>
+        </w:tc>
+      </w:tr>
+      <w:tr>
+        <w:tc>
+          <w:tcPr>
+            <w:tcW w:type="dxa" w:w="2700"/>
+            <w:vAlign w:val="center"/>
+            <w:tcMar>
+              <w:top w:w="80" w:type="dxa"/>
+              <w:bottom w:w="80" w:type="dxa"/>
+              <w:start w:w="120" w:type="dxa"/>
+              <w:end w:w="120" w:type="dxa"/>
+            </w:tcMar>
+          </w:tcPr>
+          <w:p>
+            <w:pPr>
+              <w:spacing w:after="0" w:line="276" w:lineRule="auto"/>
+              <w:jc w:val="left"/>
+            </w:pPr>
+            <w:r>
+              <w:rPr>
+                <w:rFonts w:ascii="Calibri" w:hAnsi="Calibri"/>
+                <w:b/>
+                <w:color w:val="0A2540"/>
+                <w:sz w:val="21"/>
+              </w:rPr>
+              <w:t>Likely fit</w:t>
+            </w:r>
+          </w:p>
+        </w:tc>
+        <w:tc>
+          <w:tcPr>
+            <w:tcW w:type="dxa" w:w="6660"/>
+            <w:vAlign w:val="center"/>
+            <w:tcMar>
+              <w:top w:w="80" w:type="dxa"/>
+              <w:bottom w:w="80" w:type="dxa"/>
+              <w:start w:w="120" w:type="dxa"/>
+              <w:end w:w="120" w:type="dxa"/>
+            </w:tcMar>
+          </w:tcPr>
+          <w:p>
+            <w:pPr>
+              <w:spacing w:after="0" w:line="276" w:lineRule="auto"/>
+              <w:jc w:val="left"/>
+            </w:pPr>
+            <w:r>
+              <w:rPr>
+                <w:rFonts w:ascii="Calibri" w:hAnsi="Calibri"/>
+                <w:b w:val="0"/>
+                <w:color w:val="1F2933"/>
+                <w:sz w:val="21"/>
+              </w:rPr>
+              <w:t>A business question to investigate, not advice or eligibility.</w:t>
+            </w:r>
+          </w:p>
+        </w:tc>
+      </w:tr>
+      <w:tr>
+        <w:tc>
+          <w:tcPr>
+            <w:tcW w:type="dxa" w:w="2700"/>
+            <w:shd w:fill="F5F8FB" w:val="clear"/>
+            <w:vAlign w:val="center"/>
+            <w:tcMar>
+              <w:top w:w="80" w:type="dxa"/>
+              <w:bottom w:w="80" w:type="dxa"/>
+              <w:start w:w="120" w:type="dxa"/>
+              <w:end w:w="120" w:type="dxa"/>
+            </w:tcMar>
+          </w:tcPr>
+          <w:p>
+            <w:pPr>
+              <w:spacing w:after="0" w:line="276" w:lineRule="auto"/>
+              <w:jc w:val="left"/>
+            </w:pPr>
+            <w:r>
+              <w:rPr>
+                <w:rFonts w:ascii="Calibri" w:hAnsi="Calibri"/>
+                <w:b/>
+                <w:color w:val="0A2540"/>
+                <w:sz w:val="21"/>
+              </w:rPr>
+              <w:t>Evidence</w:t>
+            </w:r>
+          </w:p>
+        </w:tc>
+        <w:tc>
+          <w:tcPr>
+            <w:tcW w:type="dxa" w:w="6660"/>
+            <w:shd w:fill="F5F8FB" w:val="clear"/>
+            <w:vAlign w:val="center"/>
+            <w:tcMar>
+              <w:top w:w="80" w:type="dxa"/>
+              <w:bottom w:w="80" w:type="dxa"/>
+              <w:start w:w="120" w:type="dxa"/>
+              <w:end w:w="120" w:type="dxa"/>
+            </w:tcMar>
+          </w:tcPr>
+          <w:p>
+            <w:pPr>
+              <w:spacing w:after="0" w:line="276" w:lineRule="auto"/>
+              <w:jc w:val="left"/>
+            </w:pPr>
+            <w:r>
+              <w:rPr>
+                <w:rFonts w:ascii="Calibri" w:hAnsi="Calibri"/>
+                <w:b w:val="0"/>
+                <w:color w:val="1F2933"/>
+                <w:sz w:val="21"/>
+              </w:rPr>
+              <w:t>The source link, record ID, and receipt attached to the item.</w:t>
+            </w:r>
+          </w:p>
+        </w:tc>
+      </w:tr>
+      <w:tr>
+        <w:tc>
+          <w:tcPr>
+            <w:tcW w:type="dxa" w:w="2700"/>
+            <w:vAlign w:val="center"/>
+            <w:tcMar>
+              <w:top w:w="80" w:type="dxa"/>
+              <w:bottom w:w="80" w:type="dxa"/>
+              <w:start w:w="120" w:type="dxa"/>
+              <w:end w:w="120" w:type="dxa"/>
+            </w:tcMar>
+          </w:tcPr>
+          <w:p>
+            <w:pPr>
+              <w:spacing w:after="0" w:line="276" w:lineRule="auto"/>
+              <w:jc w:val="left"/>
+            </w:pPr>
+            <w:r>
+              <w:rPr>
+                <w:rFonts w:ascii="Calibri" w:hAnsi="Calibri"/>
+                <w:b/>
+                <w:color w:val="0A2540"/>
+                <w:sz w:val="21"/>
+              </w:rPr>
+              <w:t>Limitations</w:t>
+            </w:r>
+          </w:p>
+        </w:tc>
+        <w:tc>
+          <w:tcPr>
+            <w:tcW w:type="dxa" w:w="6660"/>
+            <w:vAlign w:val="center"/>
+            <w:tcMar>
+              <w:top w:w="80" w:type="dxa"/>
+              <w:bottom w:w="80" w:type="dxa"/>
+              <w:start w:w="120" w:type="dxa"/>
+              <w:end w:w="120" w:type="dxa"/>
+            </w:tcMar>
+          </w:tcPr>
+          <w:p>
+            <w:pPr>
+              <w:spacing w:after="0" w:line="276" w:lineRule="auto"/>
+              <w:jc w:val="left"/>
+            </w:pPr>
+            <w:r>
+              <w:rPr>
+                <w:rFonts w:ascii="Calibri" w:hAnsi="Calibri"/>
+                <w:b w:val="0"/>
+                <w:color w:val="1F2933"/>
+                <w:sz w:val="21"/>
+              </w:rPr>
+              <w:t>What the public record does not prove.</w:t>
+            </w:r>
+          </w:p>
+        </w:tc>
+      </w:tr>
+      <w:tr>
+        <w:tc>
+          <w:tcPr>
+            <w:tcW w:type="dxa" w:w="2700"/>
+            <w:shd w:fill="F5F8FB" w:val="clear"/>
+            <w:vAlign w:val="center"/>
+            <w:tcMar>
+              <w:top w:w="80" w:type="dxa"/>
+              <w:bottom w:w="80" w:type="dxa"/>
+              <w:start w:w="120" w:type="dxa"/>
+              <w:end w:w="120" w:type="dxa"/>
+            </w:tcMar>
+          </w:tcPr>
+          <w:p>
+            <w:pPr>
+              <w:spacing w:after="0" w:line="276" w:lineRule="auto"/>
+              <w:jc w:val="left"/>
+            </w:pPr>
+            <w:r>
+              <w:rPr>
+                <w:rFonts w:ascii="Calibri" w:hAnsi="Calibri"/>
+                <w:b/>
+                <w:color w:val="0A2540"/>
+                <w:sz w:val="21"/>
+              </w:rPr>
+              <w:t>Call ready</w:t>
+            </w:r>
+          </w:p>
+        </w:tc>
+        <w:tc>
+          <w:tcPr>
+            <w:tcW w:type="dxa" w:w="6660"/>
+            <w:shd w:fill="F5F8FB" w:val="clear"/>
+            <w:vAlign w:val="center"/>
+            <w:tcMar>
+              <w:top w:w="80" w:type="dxa"/>
+              <w:bottom w:w="80" w:type="dxa"/>
+              <w:start w:w="120" w:type="dxa"/>
+              <w:end w:w="120" w:type="dxa"/>
+            </w:tcMar>
+          </w:tcPr>
+          <w:p>
+            <w:pPr>
+              <w:spacing w:after="0" w:line="276" w:lineRule="auto"/>
+              <w:jc w:val="left"/>
+            </w:pPr>
+            <w:r>
+              <w:rPr>
+                <w:rFonts w:ascii="Calibri" w:hAnsi="Calibri"/>
+                <w:b w:val="0"/>
+                <w:color w:val="1F2933"/>
+                <w:sz w:val="21"/>
+              </w:rPr>
+              <w:t>Whether outreach checks have passed. Public view stays at zero.</w:t>
+            </w:r>
+          </w:p>
+        </w:tc>
+      </w:tr>
+    </w:tbl>
     <w:p>
-      <w:pPr>
-        <w:pStyle w:val="ListNumber"/>
-        <w:spacing w:after="120" w:line="300" w:lineRule="auto"/>
-        <w:ind w:left="540" w:hanging="271"/>
-      </w:pPr>
       <w:r>
-        <w:rPr>
-          <w:rFonts w:ascii="Calibri" w:hAnsi="Calibri"/>
-          <w:b/>
-          <w:i w:val="0"/>
-          <w:color w:val="0B2545"/>
-          <w:sz w:val="22"/>
-        </w:rPr>
-        <w:t xml:space="preserve">Verify before doing anything else. </w:t>
-      </w:r>
-      <w:r>
-        <w:rPr>
-          <w:rFonts w:ascii="Calibri" w:hAnsi="Calibri"/>
-          <w:b w:val="0"/>
-          <w:i w:val="0"/>
-          <w:color w:val="1C2737"/>
-          <w:sz w:val="22"/>
-        </w:rPr>
-        <w:t>Open the cited official record and confirm that the organization and event are current.</w:t>
+        <w:br w:type="page"/>
       </w:r>
     </w:p>
     <w:p>
@@ -627,145 +1350,786 @@
         <w:keepNext/>
       </w:pPr>
       <w:r>
-        <w:t>The four deal-moment lanes</w:t>
+        <w:t>Where the live records come from</w:t>
       </w:r>
     </w:p>
     <w:p>
       <w:pPr>
-        <w:pStyle w:val="ListBullet"/>
-        <w:spacing w:after="80" w:line="300" w:lineRule="auto"/>
-        <w:ind w:left="540" w:hanging="271"/>
+        <w:spacing w:after="120" w:line="300" w:lineRule="auto"/>
       </w:pPr>
       <w:r>
         <w:rPr>
           <w:rFonts w:ascii="Calibri" w:hAnsi="Calibri"/>
-          <w:b/>
           <w:i w:val="0"/>
-          <w:color w:val="0B2545"/>
-          <w:sz w:val="22"/>
+          <w:color w:val="1F2933"/>
         </w:rPr>
-        <w:t>Life-plan timing:</w:t>
+        <w:t>The application checks official public sources independently. Each lane reports LIVE, UNAVAILABLE, or NOT APPLICABLE for the selected market.</w:t>
       </w:r>
+    </w:p>
+    <w:tbl>
+      <w:tblPr>
+        <w:tblW w:type="dxa" w:w="9360"/>
+        <w:tblLayout w:type="fixed"/>
+        <w:tblLook w:firstColumn="1" w:firstRow="1" w:lastColumn="0" w:lastRow="0" w:noHBand="0" w:noVBand="1" w:val="04A0"/>
+        <w:jc w:val="left"/>
+        <w:tblInd w:w="120" w:type="dxa"/>
+      </w:tblPr>
+      <w:tblGrid>
+        <w:gridCol w:w="3150"/>
+        <w:gridCol w:w="1650"/>
+        <w:gridCol w:w="4560"/>
+      </w:tblGrid>
+      <w:tr>
+        <w:trPr>
+          <w:tblHeader w:val="true"/>
+        </w:trPr>
+        <w:tc>
+          <w:tcPr>
+            <w:tcW w:type="dxa" w:w="3150"/>
+            <w:vAlign w:val="center"/>
+            <w:tcMar>
+              <w:top w:w="80" w:type="dxa"/>
+              <w:bottom w:w="80" w:type="dxa"/>
+              <w:start w:w="120" w:type="dxa"/>
+              <w:end w:w="120" w:type="dxa"/>
+            </w:tcMar>
+            <w:shd w:fill="0A2540" w:val="clear"/>
+          </w:tcPr>
+          <w:p>
+            <w:pPr>
+              <w:spacing w:after="0" w:line="276" w:lineRule="auto"/>
+              <w:jc w:val="left"/>
+            </w:pPr>
+            <w:r>
+              <w:rPr>
+                <w:rFonts w:ascii="Calibri" w:hAnsi="Calibri"/>
+                <w:b/>
+                <w:color w:val="FFFFFF"/>
+                <w:sz w:val="20"/>
+              </w:rPr>
+              <w:t>Official source</w:t>
+            </w:r>
+          </w:p>
+        </w:tc>
+        <w:tc>
+          <w:tcPr>
+            <w:tcW w:type="dxa" w:w="1650"/>
+            <w:vAlign w:val="center"/>
+            <w:tcMar>
+              <w:top w:w="80" w:type="dxa"/>
+              <w:bottom w:w="80" w:type="dxa"/>
+              <w:start w:w="120" w:type="dxa"/>
+              <w:end w:w="120" w:type="dxa"/>
+            </w:tcMar>
+            <w:shd w:fill="0A2540" w:val="clear"/>
+          </w:tcPr>
+          <w:p>
+            <w:pPr>
+              <w:spacing w:after="0" w:line="276" w:lineRule="auto"/>
+              <w:jc w:val="left"/>
+            </w:pPr>
+            <w:r>
+              <w:rPr>
+                <w:rFonts w:ascii="Calibri" w:hAnsi="Calibri"/>
+                <w:b/>
+                <w:color w:val="FFFFFF"/>
+                <w:sz w:val="20"/>
+              </w:rPr>
+              <w:t>Verified state</w:t>
+            </w:r>
+          </w:p>
+        </w:tc>
+        <w:tc>
+          <w:tcPr>
+            <w:tcW w:type="dxa" w:w="4560"/>
+            <w:vAlign w:val="center"/>
+            <w:tcMar>
+              <w:top w:w="80" w:type="dxa"/>
+              <w:bottom w:w="80" w:type="dxa"/>
+              <w:start w:w="120" w:type="dxa"/>
+              <w:end w:w="120" w:type="dxa"/>
+            </w:tcMar>
+            <w:shd w:fill="0A2540" w:val="clear"/>
+          </w:tcPr>
+          <w:p>
+            <w:pPr>
+              <w:spacing w:after="0" w:line="276" w:lineRule="auto"/>
+              <w:jc w:val="left"/>
+            </w:pPr>
+            <w:r>
+              <w:rPr>
+                <w:rFonts w:ascii="Calibri" w:hAnsi="Calibri"/>
+                <w:b/>
+                <w:color w:val="FFFFFF"/>
+                <w:sz w:val="20"/>
+              </w:rPr>
+              <w:t>What it can show</w:t>
+            </w:r>
+          </w:p>
+        </w:tc>
+      </w:tr>
+      <w:tr>
+        <w:tc>
+          <w:tcPr>
+            <w:tcW w:type="dxa" w:w="3150"/>
+            <w:vAlign w:val="center"/>
+            <w:tcMar>
+              <w:top w:w="80" w:type="dxa"/>
+              <w:bottom w:w="80" w:type="dxa"/>
+              <w:start w:w="120" w:type="dxa"/>
+              <w:end w:w="120" w:type="dxa"/>
+            </w:tcMar>
+          </w:tcPr>
+          <w:p>
+            <w:pPr>
+              <w:spacing w:after="0" w:line="276" w:lineRule="auto"/>
+              <w:jc w:val="left"/>
+            </w:pPr>
+            <w:r>
+              <w:rPr>
+                <w:rFonts w:ascii="Calibri" w:hAnsi="Calibri"/>
+                <w:b/>
+                <w:color w:val="0A2540"/>
+                <w:sz w:val="20"/>
+              </w:rPr>
+              <w:t>U.S. Department of Labor Form 5500</w:t>
+            </w:r>
+          </w:p>
+        </w:tc>
+        <w:tc>
+          <w:tcPr>
+            <w:tcW w:type="dxa" w:w="1650"/>
+            <w:vAlign w:val="center"/>
+            <w:tcMar>
+              <w:top w:w="80" w:type="dxa"/>
+              <w:bottom w:w="80" w:type="dxa"/>
+              <w:start w:w="120" w:type="dxa"/>
+              <w:end w:w="120" w:type="dxa"/>
+            </w:tcMar>
+          </w:tcPr>
+          <w:p>
+            <w:pPr>
+              <w:spacing w:after="0" w:line="276" w:lineRule="auto"/>
+              <w:jc w:val="left"/>
+            </w:pPr>
+            <w:r>
+              <w:rPr>
+                <w:rFonts w:ascii="Calibri" w:hAnsi="Calibri"/>
+                <w:b/>
+                <w:color w:val="168F89"/>
+                <w:sz w:val="20"/>
+              </w:rPr>
+              <w:t>LIVE</w:t>
+            </w:r>
+          </w:p>
+        </w:tc>
+        <w:tc>
+          <w:tcPr>
+            <w:tcW w:type="dxa" w:w="4560"/>
+            <w:vAlign w:val="center"/>
+            <w:tcMar>
+              <w:top w:w="80" w:type="dxa"/>
+              <w:bottom w:w="80" w:type="dxa"/>
+              <w:start w:w="120" w:type="dxa"/>
+              <w:end w:w="120" w:type="dxa"/>
+            </w:tcMar>
+          </w:tcPr>
+          <w:p>
+            <w:pPr>
+              <w:spacing w:after="0" w:line="276" w:lineRule="auto"/>
+              <w:jc w:val="left"/>
+            </w:pPr>
+            <w:r>
+              <w:rPr>
+                <w:rFonts w:ascii="Calibri" w:hAnsi="Calibri"/>
+                <w:b w:val="0"/>
+                <w:color w:val="1F2933"/>
+                <w:sz w:val="20"/>
+              </w:rPr>
+              <w:t>Benefit-plan filings and reported plan or policy timing fields.</w:t>
+            </w:r>
+          </w:p>
+        </w:tc>
+      </w:tr>
+      <w:tr>
+        <w:tc>
+          <w:tcPr>
+            <w:tcW w:type="dxa" w:w="3150"/>
+            <w:shd w:fill="F5F8FB" w:val="clear"/>
+            <w:vAlign w:val="center"/>
+            <w:tcMar>
+              <w:top w:w="80" w:type="dxa"/>
+              <w:bottom w:w="80" w:type="dxa"/>
+              <w:start w:w="120" w:type="dxa"/>
+              <w:end w:w="120" w:type="dxa"/>
+            </w:tcMar>
+          </w:tcPr>
+          <w:p>
+            <w:pPr>
+              <w:spacing w:after="0" w:line="276" w:lineRule="auto"/>
+              <w:jc w:val="left"/>
+            </w:pPr>
+            <w:r>
+              <w:rPr>
+                <w:rFonts w:ascii="Calibri" w:hAnsi="Calibri"/>
+                <w:b/>
+                <w:color w:val="0A2540"/>
+                <w:sz w:val="20"/>
+              </w:rPr>
+              <w:t>FMCSA Company Census</w:t>
+            </w:r>
+          </w:p>
+        </w:tc>
+        <w:tc>
+          <w:tcPr>
+            <w:tcW w:type="dxa" w:w="1650"/>
+            <w:shd w:fill="F5F8FB" w:val="clear"/>
+            <w:vAlign w:val="center"/>
+            <w:tcMar>
+              <w:top w:w="80" w:type="dxa"/>
+              <w:bottom w:w="80" w:type="dxa"/>
+              <w:start w:w="120" w:type="dxa"/>
+              <w:end w:w="120" w:type="dxa"/>
+            </w:tcMar>
+          </w:tcPr>
+          <w:p>
+            <w:pPr>
+              <w:spacing w:after="0" w:line="276" w:lineRule="auto"/>
+              <w:jc w:val="left"/>
+            </w:pPr>
+            <w:r>
+              <w:rPr>
+                <w:rFonts w:ascii="Calibri" w:hAnsi="Calibri"/>
+                <w:b/>
+                <w:color w:val="168F89"/>
+                <w:sz w:val="20"/>
+              </w:rPr>
+              <w:t>LIVE</w:t>
+            </w:r>
+          </w:p>
+        </w:tc>
+        <w:tc>
+          <w:tcPr>
+            <w:tcW w:type="dxa" w:w="4560"/>
+            <w:shd w:fill="F5F8FB" w:val="clear"/>
+            <w:vAlign w:val="center"/>
+            <w:tcMar>
+              <w:top w:w="80" w:type="dxa"/>
+              <w:bottom w:w="80" w:type="dxa"/>
+              <w:start w:w="120" w:type="dxa"/>
+              <w:end w:w="120" w:type="dxa"/>
+            </w:tcMar>
+          </w:tcPr>
+          <w:p>
+            <w:pPr>
+              <w:spacing w:after="0" w:line="276" w:lineRule="auto"/>
+              <w:jc w:val="left"/>
+            </w:pPr>
+            <w:r>
+              <w:rPr>
+                <w:rFonts w:ascii="Calibri" w:hAnsi="Calibri"/>
+                <w:b w:val="0"/>
+                <w:color w:val="1F2933"/>
+                <w:sz w:val="20"/>
+              </w:rPr>
+              <w:t>Organization-level carrier registration activity.</w:t>
+            </w:r>
+          </w:p>
+        </w:tc>
+      </w:tr>
+      <w:tr>
+        <w:tc>
+          <w:tcPr>
+            <w:tcW w:type="dxa" w:w="3150"/>
+            <w:vAlign w:val="center"/>
+            <w:tcMar>
+              <w:top w:w="80" w:type="dxa"/>
+              <w:bottom w:w="80" w:type="dxa"/>
+              <w:start w:w="120" w:type="dxa"/>
+              <w:end w:w="120" w:type="dxa"/>
+            </w:tcMar>
+          </w:tcPr>
+          <w:p>
+            <w:pPr>
+              <w:spacing w:after="0" w:line="276" w:lineRule="auto"/>
+              <w:jc w:val="left"/>
+            </w:pPr>
+            <w:r>
+              <w:rPr>
+                <w:rFonts w:ascii="Calibri" w:hAnsi="Calibri"/>
+                <w:b/>
+                <w:color w:val="0A2540"/>
+                <w:sz w:val="20"/>
+              </w:rPr>
+              <w:t>USAspending</w:t>
+            </w:r>
+          </w:p>
+        </w:tc>
+        <w:tc>
+          <w:tcPr>
+            <w:tcW w:type="dxa" w:w="1650"/>
+            <w:vAlign w:val="center"/>
+            <w:tcMar>
+              <w:top w:w="80" w:type="dxa"/>
+              <w:bottom w:w="80" w:type="dxa"/>
+              <w:start w:w="120" w:type="dxa"/>
+              <w:end w:w="120" w:type="dxa"/>
+            </w:tcMar>
+          </w:tcPr>
+          <w:p>
+            <w:pPr>
+              <w:spacing w:after="0" w:line="276" w:lineRule="auto"/>
+              <w:jc w:val="left"/>
+            </w:pPr>
+            <w:r>
+              <w:rPr>
+                <w:rFonts w:ascii="Calibri" w:hAnsi="Calibri"/>
+                <w:b/>
+                <w:color w:val="168F89"/>
+                <w:sz w:val="20"/>
+              </w:rPr>
+              <w:t>LIVE</w:t>
+            </w:r>
+          </w:p>
+        </w:tc>
+        <w:tc>
+          <w:tcPr>
+            <w:tcW w:type="dxa" w:w="4560"/>
+            <w:vAlign w:val="center"/>
+            <w:tcMar>
+              <w:top w:w="80" w:type="dxa"/>
+              <w:bottom w:w="80" w:type="dxa"/>
+              <w:start w:w="120" w:type="dxa"/>
+              <w:end w:w="120" w:type="dxa"/>
+            </w:tcMar>
+          </w:tcPr>
+          <w:p>
+            <w:pPr>
+              <w:spacing w:after="0" w:line="276" w:lineRule="auto"/>
+              <w:jc w:val="left"/>
+            </w:pPr>
+            <w:r>
+              <w:rPr>
+                <w:rFonts w:ascii="Calibri" w:hAnsi="Calibri"/>
+                <w:b w:val="0"/>
+                <w:color w:val="1F2933"/>
+                <w:sz w:val="20"/>
+              </w:rPr>
+              <w:t>Federal contract activity in the current query window.</w:t>
+            </w:r>
+          </w:p>
+        </w:tc>
+      </w:tr>
+      <w:tr>
+        <w:tc>
+          <w:tcPr>
+            <w:tcW w:type="dxa" w:w="3150"/>
+            <w:shd w:fill="F5F8FB" w:val="clear"/>
+            <w:vAlign w:val="center"/>
+            <w:tcMar>
+              <w:top w:w="80" w:type="dxa"/>
+              <w:bottom w:w="80" w:type="dxa"/>
+              <w:start w:w="120" w:type="dxa"/>
+              <w:end w:w="120" w:type="dxa"/>
+            </w:tcMar>
+          </w:tcPr>
+          <w:p>
+            <w:pPr>
+              <w:spacing w:after="0" w:line="276" w:lineRule="auto"/>
+              <w:jc w:val="left"/>
+            </w:pPr>
+            <w:r>
+              <w:rPr>
+                <w:rFonts w:ascii="Calibri" w:hAnsi="Calibri"/>
+                <w:b/>
+                <w:color w:val="0A2540"/>
+                <w:sz w:val="20"/>
+              </w:rPr>
+              <w:t>EPA ECHO</w:t>
+            </w:r>
+          </w:p>
+        </w:tc>
+        <w:tc>
+          <w:tcPr>
+            <w:tcW w:type="dxa" w:w="1650"/>
+            <w:shd w:fill="F5F8FB" w:val="clear"/>
+            <w:vAlign w:val="center"/>
+            <w:tcMar>
+              <w:top w:w="80" w:type="dxa"/>
+              <w:bottom w:w="80" w:type="dxa"/>
+              <w:start w:w="120" w:type="dxa"/>
+              <w:end w:w="120" w:type="dxa"/>
+            </w:tcMar>
+          </w:tcPr>
+          <w:p>
+            <w:pPr>
+              <w:spacing w:after="0" w:line="276" w:lineRule="auto"/>
+              <w:jc w:val="left"/>
+            </w:pPr>
+            <w:r>
+              <w:rPr>
+                <w:rFonts w:ascii="Calibri" w:hAnsi="Calibri"/>
+                <w:b/>
+                <w:color w:val="168F89"/>
+                <w:sz w:val="20"/>
+              </w:rPr>
+              <w:t>LIVE</w:t>
+            </w:r>
+          </w:p>
+        </w:tc>
+        <w:tc>
+          <w:tcPr>
+            <w:tcW w:type="dxa" w:w="4560"/>
+            <w:shd w:fill="F5F8FB" w:val="clear"/>
+            <w:vAlign w:val="center"/>
+            <w:tcMar>
+              <w:top w:w="80" w:type="dxa"/>
+              <w:bottom w:w="80" w:type="dxa"/>
+              <w:start w:w="120" w:type="dxa"/>
+              <w:end w:w="120" w:type="dxa"/>
+            </w:tcMar>
+          </w:tcPr>
+          <w:p>
+            <w:pPr>
+              <w:spacing w:after="0" w:line="276" w:lineRule="auto"/>
+              <w:jc w:val="left"/>
+            </w:pPr>
+            <w:r>
+              <w:rPr>
+                <w:rFonts w:ascii="Calibri" w:hAnsi="Calibri"/>
+                <w:b w:val="0"/>
+                <w:color w:val="1F2933"/>
+                <w:sz w:val="20"/>
+              </w:rPr>
+              <w:t>Organization and facility compliance-monitoring activity.</w:t>
+            </w:r>
+          </w:p>
+        </w:tc>
+      </w:tr>
+      <w:tr>
+        <w:tc>
+          <w:tcPr>
+            <w:tcW w:type="dxa" w:w="3150"/>
+            <w:vAlign w:val="center"/>
+            <w:tcMar>
+              <w:top w:w="80" w:type="dxa"/>
+              <w:bottom w:w="80" w:type="dxa"/>
+              <w:start w:w="120" w:type="dxa"/>
+              <w:end w:w="120" w:type="dxa"/>
+            </w:tcMar>
+          </w:tcPr>
+          <w:p>
+            <w:pPr>
+              <w:spacing w:after="0" w:line="276" w:lineRule="auto"/>
+              <w:jc w:val="left"/>
+            </w:pPr>
+            <w:r>
+              <w:rPr>
+                <w:rFonts w:ascii="Calibri" w:hAnsi="Calibri"/>
+                <w:b/>
+                <w:color w:val="0A2540"/>
+                <w:sz w:val="20"/>
+              </w:rPr>
+              <w:t>FCC ULS</w:t>
+            </w:r>
+          </w:p>
+        </w:tc>
+        <w:tc>
+          <w:tcPr>
+            <w:tcW w:type="dxa" w:w="1650"/>
+            <w:vAlign w:val="center"/>
+            <w:tcMar>
+              <w:top w:w="80" w:type="dxa"/>
+              <w:bottom w:w="80" w:type="dxa"/>
+              <w:start w:w="120" w:type="dxa"/>
+              <w:end w:w="120" w:type="dxa"/>
+            </w:tcMar>
+          </w:tcPr>
+          <w:p>
+            <w:pPr>
+              <w:spacing w:after="0" w:line="276" w:lineRule="auto"/>
+              <w:jc w:val="left"/>
+            </w:pPr>
+            <w:r>
+              <w:rPr>
+                <w:rFonts w:ascii="Calibri" w:hAnsi="Calibri"/>
+                <w:b/>
+                <w:color w:val="B78327"/>
+                <w:sz w:val="20"/>
+              </w:rPr>
+              <w:t>UNAVAILABLE</w:t>
+            </w:r>
+          </w:p>
+        </w:tc>
+        <w:tc>
+          <w:tcPr>
+            <w:tcW w:type="dxa" w:w="4560"/>
+            <w:vAlign w:val="center"/>
+            <w:tcMar>
+              <w:top w:w="80" w:type="dxa"/>
+              <w:bottom w:w="80" w:type="dxa"/>
+              <w:start w:w="120" w:type="dxa"/>
+              <w:end w:w="120" w:type="dxa"/>
+            </w:tcMar>
+          </w:tcPr>
+          <w:p>
+            <w:pPr>
+              <w:spacing w:after="0" w:line="276" w:lineRule="auto"/>
+              <w:jc w:val="left"/>
+            </w:pPr>
+            <w:r>
+              <w:rPr>
+                <w:rFonts w:ascii="Calibri" w:hAnsi="Calibri"/>
+                <w:b w:val="0"/>
+                <w:color w:val="1F2933"/>
+                <w:sz w:val="20"/>
+              </w:rPr>
+              <w:t>Organization wireless-license activity when the source answers.</w:t>
+            </w:r>
+          </w:p>
+        </w:tc>
+      </w:tr>
+      <w:tr>
+        <w:tc>
+          <w:tcPr>
+            <w:tcW w:type="dxa" w:w="3150"/>
+            <w:shd w:fill="F5F8FB" w:val="clear"/>
+            <w:vAlign w:val="center"/>
+            <w:tcMar>
+              <w:top w:w="80" w:type="dxa"/>
+              <w:bottom w:w="80" w:type="dxa"/>
+              <w:start w:w="120" w:type="dxa"/>
+              <w:end w:w="120" w:type="dxa"/>
+            </w:tcMar>
+          </w:tcPr>
+          <w:p>
+            <w:pPr>
+              <w:spacing w:after="0" w:line="276" w:lineRule="auto"/>
+              <w:jc w:val="left"/>
+            </w:pPr>
+            <w:r>
+              <w:rPr>
+                <w:rFonts w:ascii="Calibri" w:hAnsi="Calibri"/>
+                <w:b/>
+                <w:color w:val="0A2540"/>
+                <w:sz w:val="20"/>
+              </w:rPr>
+              <w:t>Chicago business licenses</w:t>
+            </w:r>
+          </w:p>
+        </w:tc>
+        <w:tc>
+          <w:tcPr>
+            <w:tcW w:type="dxa" w:w="1650"/>
+            <w:shd w:fill="F5F8FB" w:val="clear"/>
+            <w:vAlign w:val="center"/>
+            <w:tcMar>
+              <w:top w:w="80" w:type="dxa"/>
+              <w:bottom w:w="80" w:type="dxa"/>
+              <w:start w:w="120" w:type="dxa"/>
+              <w:end w:w="120" w:type="dxa"/>
+            </w:tcMar>
+          </w:tcPr>
+          <w:p>
+            <w:pPr>
+              <w:spacing w:after="0" w:line="276" w:lineRule="auto"/>
+              <w:jc w:val="left"/>
+            </w:pPr>
+            <w:r>
+              <w:rPr>
+                <w:rFonts w:ascii="Calibri" w:hAnsi="Calibri"/>
+                <w:b/>
+                <w:color w:val="B78327"/>
+                <w:sz w:val="20"/>
+              </w:rPr>
+              <w:t>UNAVAILABLE</w:t>
+            </w:r>
+          </w:p>
+        </w:tc>
+        <w:tc>
+          <w:tcPr>
+            <w:tcW w:type="dxa" w:w="4560"/>
+            <w:shd w:fill="F5F8FB" w:val="clear"/>
+            <w:vAlign w:val="center"/>
+            <w:tcMar>
+              <w:top w:w="80" w:type="dxa"/>
+              <w:bottom w:w="80" w:type="dxa"/>
+              <w:start w:w="120" w:type="dxa"/>
+              <w:end w:w="120" w:type="dxa"/>
+            </w:tcMar>
+          </w:tcPr>
+          <w:p>
+            <w:pPr>
+              <w:spacing w:after="0" w:line="276" w:lineRule="auto"/>
+              <w:jc w:val="left"/>
+            </w:pPr>
+            <w:r>
+              <w:rPr>
+                <w:rFonts w:ascii="Calibri" w:hAnsi="Calibri"/>
+                <w:b w:val="0"/>
+                <w:color w:val="1F2933"/>
+                <w:sz w:val="20"/>
+              </w:rPr>
+              <w:t>New active business-license records when applicable.</w:t>
+            </w:r>
+          </w:p>
+        </w:tc>
+      </w:tr>
+      <w:tr>
+        <w:tc>
+          <w:tcPr>
+            <w:tcW w:type="dxa" w:w="3150"/>
+            <w:vAlign w:val="center"/>
+            <w:tcMar>
+              <w:top w:w="80" w:type="dxa"/>
+              <w:bottom w:w="80" w:type="dxa"/>
+              <w:start w:w="120" w:type="dxa"/>
+              <w:end w:w="120" w:type="dxa"/>
+            </w:tcMar>
+          </w:tcPr>
+          <w:p>
+            <w:pPr>
+              <w:spacing w:after="0" w:line="276" w:lineRule="auto"/>
+              <w:jc w:val="left"/>
+            </w:pPr>
+            <w:r>
+              <w:rPr>
+                <w:rFonts w:ascii="Calibri" w:hAnsi="Calibri"/>
+                <w:b/>
+                <w:color w:val="0A2540"/>
+                <w:sz w:val="20"/>
+              </w:rPr>
+              <w:t>SAM.gov entity updates</w:t>
+            </w:r>
+          </w:p>
+        </w:tc>
+        <w:tc>
+          <w:tcPr>
+            <w:tcW w:type="dxa" w:w="1650"/>
+            <w:vAlign w:val="center"/>
+            <w:tcMar>
+              <w:top w:w="80" w:type="dxa"/>
+              <w:bottom w:w="80" w:type="dxa"/>
+              <w:start w:w="120" w:type="dxa"/>
+              <w:end w:w="120" w:type="dxa"/>
+            </w:tcMar>
+          </w:tcPr>
+          <w:p>
+            <w:pPr>
+              <w:spacing w:after="0" w:line="276" w:lineRule="auto"/>
+              <w:jc w:val="left"/>
+            </w:pPr>
+            <w:r>
+              <w:rPr>
+                <w:rFonts w:ascii="Calibri" w:hAnsi="Calibri"/>
+                <w:b/>
+                <w:color w:val="B78327"/>
+                <w:sz w:val="20"/>
+              </w:rPr>
+              <w:t>UNAVAILABLE</w:t>
+            </w:r>
+          </w:p>
+        </w:tc>
+        <w:tc>
+          <w:tcPr>
+            <w:tcW w:type="dxa" w:w="4560"/>
+            <w:vAlign w:val="center"/>
+            <w:tcMar>
+              <w:top w:w="80" w:type="dxa"/>
+              <w:bottom w:w="80" w:type="dxa"/>
+              <w:start w:w="120" w:type="dxa"/>
+              <w:end w:w="120" w:type="dxa"/>
+            </w:tcMar>
+          </w:tcPr>
+          <w:p>
+            <w:pPr>
+              <w:spacing w:after="0" w:line="276" w:lineRule="auto"/>
+              <w:jc w:val="left"/>
+            </w:pPr>
+            <w:r>
+              <w:rPr>
+                <w:rFonts w:ascii="Calibri" w:hAnsi="Calibri"/>
+                <w:b w:val="0"/>
+                <w:color w:val="1F2933"/>
+                <w:sz w:val="20"/>
+              </w:rPr>
+              <w:t>Active entity updates when the source and credential are available.</w:t>
+            </w:r>
+          </w:p>
+        </w:tc>
+      </w:tr>
+    </w:tbl>
+    <w:p>
+      <w:pPr>
+        <w:pStyle w:val="Heading2"/>
+        <w:keepNext/>
+      </w:pPr>
       <w:r>
-        <w:rPr>
-          <w:rFonts w:ascii="Calibri" w:hAnsi="Calibri"/>
-          <w:b w:val="0"/>
-          <w:i w:val="0"/>
-          <w:color w:val="1C2737"/>
-          <w:sz w:val="22"/>
-        </w:rPr>
-        <w:t xml:space="preserve"> Employers whose official Department of Labor filing reports a group-life benefit and a plan or policy anniversary.</w:t>
+        <w:t>What is deliberately excluded</w:t>
       </w:r>
     </w:p>
     <w:p>
       <w:pPr>
-        <w:pStyle w:val="ListBullet"/>
+        <w:numPr>
+          <w:ilvl w:val="0"/>
+          <w:numId w:val="10"/>
+        </w:numPr>
         <w:spacing w:after="80" w:line="300" w:lineRule="auto"/>
-        <w:ind w:left="540" w:hanging="271"/>
       </w:pPr>
       <w:r>
         <w:rPr>
           <w:rFonts w:ascii="Calibri" w:hAnsi="Calibri"/>
-          <w:b/>
-          <w:i w:val="0"/>
-          <w:color w:val="0B2545"/>
-          <w:sz w:val="22"/>
+          <w:color w:val="1F2933"/>
         </w:rPr>
-        <w:t>Growth &amp; awards:</w:t>
-      </w:r>
-      <w:r>
-        <w:rPr>
-          <w:rFonts w:ascii="Calibri" w:hAnsi="Calibri"/>
-          <w:b w:val="0"/>
-          <w:i w:val="0"/>
-          <w:color w:val="1C2737"/>
-          <w:sz w:val="22"/>
-        </w:rPr>
-        <w:t xml:space="preserve"> Current federal contract activity that may justify a business-protection, continuity, or workforce review.</w:t>
+        <w:t>Personal social-media profiles, private contacts, and hidden contact enrichment.</w:t>
       </w:r>
     </w:p>
     <w:p>
       <w:pPr>
-        <w:pStyle w:val="ListBullet"/>
+        <w:numPr>
+          <w:ilvl w:val="0"/>
+          <w:numId w:val="10"/>
+        </w:numPr>
         <w:spacing w:after="80" w:line="300" w:lineRule="auto"/>
-        <w:ind w:left="540" w:hanging="271"/>
       </w:pPr>
       <w:r>
         <w:rPr>
           <w:rFonts w:ascii="Calibri" w:hAnsi="Calibri"/>
-          <w:b/>
-          <w:i w:val="0"/>
-          <w:color w:val="0B2545"/>
-          <w:sz w:val="22"/>
+          <w:color w:val="1F2933"/>
         </w:rPr>
-        <w:t>Operational change:</w:t>
-      </w:r>
-      <w:r>
-        <w:rPr>
-          <w:rFonts w:ascii="Calibri" w:hAnsi="Calibri"/>
-          <w:b w:val="0"/>
-          <w:i w:val="0"/>
-          <w:color w:val="1C2737"/>
-          <w:sz w:val="22"/>
-        </w:rPr>
-        <w:t xml:space="preserve"> Carrier registrations, facility monitoring activity, and other official organization events.</w:t>
+        <w:t>Health, age, race, religion, family status, wealth, or insurability inferences.</w:t>
       </w:r>
     </w:p>
     <w:p>
       <w:pPr>
-        <w:pStyle w:val="ListBullet"/>
+        <w:numPr>
+          <w:ilvl w:val="0"/>
+          <w:numId w:val="10"/>
+        </w:numPr>
         <w:spacing w:after="80" w:line="300" w:lineRule="auto"/>
-        <w:ind w:left="540" w:hanging="271"/>
       </w:pPr>
       <w:r>
         <w:rPr>
           <w:rFonts w:ascii="Calibri" w:hAnsi="Calibri"/>
-          <w:b/>
-          <w:i w:val="0"/>
-          <w:color w:val="0B2545"/>
-          <w:sz w:val="22"/>
+          <w:color w:val="1F2933"/>
         </w:rPr>
-        <w:t>Needs research:</w:t>
-      </w:r>
-      <w:r>
-        <w:rPr>
-          <w:rFonts w:ascii="Calibri" w:hAnsi="Calibri"/>
-          <w:b w:val="0"/>
-          <w:i w:val="0"/>
-          <w:color w:val="1C2737"/>
-          <w:sz w:val="22"/>
-        </w:rPr>
-        <w:t xml:space="preserve"> Every account that still requires source verification, product-fit review, and protected contact clearance.</w:t>
+        <w:t>Named filing signers, administrators, donors, or executives used as personal leads.</w:t>
       </w:r>
     </w:p>
     <w:p>
       <w:pPr>
-        <w:spacing w:before="80" w:after="200" w:line="288" w:lineRule="auto"/>
-        <w:ind w:left="173" w:right="173"/>
-        <w:shd w:fill="E7F5F3"/>
-        <w:pBdr>
-          <w:left w:val="single" w:sz="18" w:space="8" w:color="148984"/>
-        </w:pBdr>
+        <w:numPr>
+          <w:ilvl w:val="0"/>
+          <w:numId w:val="10"/>
+        </w:numPr>
+        <w:spacing w:after="80" w:line="300" w:lineRule="auto"/>
       </w:pPr>
       <w:r>
         <w:rPr>
           <w:rFonts w:ascii="Calibri" w:hAnsi="Calibri"/>
-          <w:b/>
-          <w:i w:val="0"/>
-          <w:color w:val="0B2545"/>
-          <w:sz w:val="22"/>
+          <w:color w:val="1F2933"/>
         </w:rPr>
-        <w:t xml:space="preserve">Timing label: </w:t>
-      </w:r>
-      <w:r>
-        <w:rPr>
-          <w:rFonts w:ascii="Calibri" w:hAnsi="Calibri"/>
-          <w:b w:val="0"/>
-          <w:i w:val="0"/>
-          <w:color w:val="1C2737"/>
-          <w:sz w:val="22"/>
-        </w:rPr>
-        <w:t>A Form 5500 anniversary is a research hypothesis. It is not proof of a renewal, dissatisfaction, buying intent, eligibility, or insurability.</w:t>
+        <w:t>Automatic contact permission, automatic quoting, or an underwriting conclusion.</w:t>
       </w:r>
     </w:p>
     <w:p>
@@ -779,7 +2143,7 @@
         <w:keepNext/>
       </w:pPr>
       <w:r>
-        <w:t>How to read an account</w:t>
+        <w:t>A practical daily routine</w:t>
       </w:r>
     </w:p>
     <w:p>
@@ -788,22 +2152,71 @@
         <w:keepNext/>
       </w:pPr>
       <w:r>
-        <w:t>Verified deal moment</w:t>
+        <w:t>Morning: choose the research queue</w:t>
       </w:r>
     </w:p>
     <w:p>
       <w:pPr>
-        <w:spacing w:before="0" w:after="120" w:line="300" w:lineRule="auto"/>
+        <w:numPr>
+          <w:ilvl w:val="0"/>
+          <w:numId w:val="10"/>
+        </w:numPr>
+        <w:spacing w:after="80" w:line="300" w:lineRule="auto"/>
       </w:pPr>
       <w:r>
         <w:rPr>
           <w:rFonts w:ascii="Calibri" w:hAnsi="Calibri"/>
-          <w:b w:val="0"/>
-          <w:i w:val="0"/>
-          <w:color w:val="1C2737"/>
-          <w:sz w:val="22"/>
+          <w:color w:val="1F2933"/>
         </w:rPr>
-        <w:t>The organization-level fact returned by the official source. Read this before the product idea.</w:t>
+        <w:t>Open the Broker view and check the release stamp.</w:t>
+      </w:r>
+    </w:p>
+    <w:p>
+      <w:pPr>
+        <w:numPr>
+          <w:ilvl w:val="0"/>
+          <w:numId w:val="10"/>
+        </w:numPr>
+        <w:spacing w:after="80" w:line="300" w:lineRule="auto"/>
+      </w:pPr>
+      <w:r>
+        <w:rPr>
+          <w:rFonts w:ascii="Calibri" w:hAnsi="Calibri"/>
+          <w:color w:val="1F2933"/>
+        </w:rPr>
+        <w:t>Choose your state or region; start with one state for depth.</w:t>
+      </w:r>
+    </w:p>
+    <w:p>
+      <w:pPr>
+        <w:numPr>
+          <w:ilvl w:val="0"/>
+          <w:numId w:val="10"/>
+        </w:numPr>
+        <w:spacing w:after="80" w:line="300" w:lineRule="auto"/>
+      </w:pPr>
+      <w:r>
+        <w:rPr>
+          <w:rFonts w:ascii="Calibri" w:hAnsi="Calibri"/>
+          <w:color w:val="1F2933"/>
+        </w:rPr>
+        <w:t>Read the Broker brief and pick five organizations to verify.</w:t>
+      </w:r>
+    </w:p>
+    <w:p>
+      <w:pPr>
+        <w:numPr>
+          <w:ilvl w:val="0"/>
+          <w:numId w:val="10"/>
+        </w:numPr>
+        <w:spacing w:after="80" w:line="300" w:lineRule="auto"/>
+      </w:pPr>
+      <w:r>
+        <w:rPr>
+          <w:rFonts w:ascii="Calibri" w:hAnsi="Calibri"/>
+          <w:color w:val="1F2933"/>
+        </w:rPr>
+        <w:t>Open every official source before writing a note.</w:t>
       </w:r>
     </w:p>
     <w:p>
@@ -812,22 +2225,71 @@
         <w:keepNext/>
       </w:pPr>
       <w:r>
-        <w:t>Timing</w:t>
+        <w:t>Research block: turn records into qualified questions</w:t>
       </w:r>
     </w:p>
     <w:p>
       <w:pPr>
-        <w:spacing w:before="0" w:after="120" w:line="300" w:lineRule="auto"/>
+        <w:numPr>
+          <w:ilvl w:val="0"/>
+          <w:numId w:val="10"/>
+        </w:numPr>
+        <w:spacing w:after="80" w:line="300" w:lineRule="auto"/>
       </w:pPr>
       <w:r>
         <w:rPr>
           <w:rFonts w:ascii="Calibri" w:hAnsi="Calibri"/>
-          <w:b w:val="0"/>
-          <w:i w:val="0"/>
-          <w:color w:val="1C2737"/>
-          <w:sz w:val="22"/>
+          <w:color w:val="1F2933"/>
         </w:rPr>
-        <w:t>The observed date or the next anniversary calculated from a previously reported plan or policy period.</w:t>
+        <w:t>Confirm the organization and event on the official record.</w:t>
+      </w:r>
+    </w:p>
+    <w:p>
+      <w:pPr>
+        <w:numPr>
+          <w:ilvl w:val="0"/>
+          <w:numId w:val="10"/>
+        </w:numPr>
+        <w:spacing w:after="80" w:line="300" w:lineRule="auto"/>
+      </w:pPr>
+      <w:r>
+        <w:rPr>
+          <w:rFonts w:ascii="Calibri" w:hAnsi="Calibri"/>
+          <w:color w:val="1F2933"/>
+        </w:rPr>
+        <w:t>Check the organization's own website for current operations and a business-published channel.</w:t>
+      </w:r>
+    </w:p>
+    <w:p>
+      <w:pPr>
+        <w:numPr>
+          <w:ilvl w:val="0"/>
+          <w:numId w:val="10"/>
+        </w:numPr>
+        <w:spacing w:after="80" w:line="300" w:lineRule="auto"/>
+      </w:pPr>
+      <w:r>
+        <w:rPr>
+          <w:rFonts w:ascii="Calibri" w:hAnsi="Calibri"/>
+          <w:color w:val="1F2933"/>
+        </w:rPr>
+        <w:t>Write down what is known, what is inferred, and what remains unknown.</w:t>
+      </w:r>
+    </w:p>
+    <w:p>
+      <w:pPr>
+        <w:numPr>
+          <w:ilvl w:val="0"/>
+          <w:numId w:val="10"/>
+        </w:numPr>
+        <w:spacing w:after="80" w:line="300" w:lineRule="auto"/>
+      </w:pPr>
+      <w:r>
+        <w:rPr>
+          <w:rFonts w:ascii="Calibri" w:hAnsi="Calibri"/>
+          <w:color w:val="1F2933"/>
+        </w:rPr>
+        <w:t>Do not copy sensitive person-level fields into your notes.</w:t>
       </w:r>
     </w:p>
     <w:p>
@@ -836,160 +2298,176 @@
         <w:keepNext/>
       </w:pPr>
       <w:r>
-        <w:t>Likely fit</w:t>
+        <w:t>Before any outreach</w:t>
       </w:r>
     </w:p>
     <w:p>
       <w:pPr>
-        <w:spacing w:before="0" w:after="120" w:line="300" w:lineRule="auto"/>
-      </w:pPr>
-      <w:r>
-        <w:rPr>
-          <w:rFonts w:ascii="Calibri" w:hAnsi="Calibri"/>
-          <w:b w:val="0"/>
-          <w:i w:val="0"/>
-          <w:color w:val="1C2737"/>
-          <w:sz w:val="22"/>
-        </w:rPr>
-        <w:t>A reason to investigate protection planning. It is not a recommendation, quote, coverage determination, or statement that David is appointed or licensed for every product shown by the source.</w:t>
-      </w:r>
-    </w:p>
-    <w:p>
-      <w:pPr>
-        <w:pStyle w:val="Heading2"/>
-        <w:keepNext/>
-      </w:pPr>
-      <w:r>
-        <w:t>Evidence</w:t>
-      </w:r>
-    </w:p>
-    <w:p>
-      <w:pPr>
-        <w:spacing w:before="0" w:after="120" w:line="300" w:lineRule="auto"/>
-      </w:pPr>
-      <w:r>
-        <w:rPr>
-          <w:rFonts w:ascii="Calibri" w:hAnsi="Calibri"/>
-          <w:b w:val="0"/>
-          <w:i w:val="0"/>
-          <w:color w:val="1C2737"/>
-          <w:sz w:val="22"/>
-        </w:rPr>
-        <w:t>Direct filing or official record shows the evidence class. Source receipt linked means the normalized observation has a checkable proof record.</w:t>
-      </w:r>
-    </w:p>
-    <w:p>
-      <w:pPr>
-        <w:pStyle w:val="Heading2"/>
-        <w:keepNext/>
-      </w:pPr>
-      <w:r>
-        <w:t>Contact state</w:t>
-      </w:r>
-    </w:p>
-    <w:p>
-      <w:pPr>
-        <w:spacing w:before="0" w:after="120" w:line="300" w:lineRule="auto"/>
-      </w:pPr>
-      <w:r>
-        <w:rPr>
-          <w:rFonts w:ascii="Calibri" w:hAnsi="Calibri"/>
-          <w:b w:val="0"/>
-          <w:i w:val="0"/>
-          <w:color w:val="1C2737"/>
-          <w:sz w:val="22"/>
-        </w:rPr>
-        <w:t>Cleared to contact stays at zero in the public view. That is intentional. Public visibility does not create consent.</w:t>
-      </w:r>
-    </w:p>
-    <w:p>
-      <w:pPr>
-        <w:pStyle w:val="Heading1"/>
-        <w:keepNext/>
-      </w:pPr>
-      <w:r>
-        <w:t>The three-step broker action</w:t>
-      </w:r>
-    </w:p>
-    <w:p>
-      <w:pPr>
-        <w:pStyle w:val="ListNumber"/>
-        <w:spacing w:after="120" w:line="300" w:lineRule="auto"/>
-        <w:ind w:left="540" w:hanging="271"/>
+        <w:numPr>
+          <w:ilvl w:val="0"/>
+          <w:numId w:val="10"/>
+        </w:numPr>
+        <w:spacing w:after="80" w:line="300" w:lineRule="auto"/>
       </w:pPr>
       <w:r>
         <w:rPr>
           <w:rFonts w:ascii="Calibri" w:hAnsi="Calibri"/>
           <w:b/>
-          <w:i w:val="0"/>
-          <w:color w:val="0B2545"/>
-          <w:sz w:val="22"/>
+          <w:color w:val="0A2540"/>
         </w:rPr>
-        <w:t xml:space="preserve">Verify the moment. </w:t>
+        <w:t xml:space="preserve">Check: </w:t>
       </w:r>
       <w:r>
         <w:rPr>
           <w:rFonts w:ascii="Calibri" w:hAnsi="Calibri"/>
-          <w:b w:val="0"/>
-          <w:i w:val="0"/>
-          <w:color w:val="1C2737"/>
-          <w:sz w:val="22"/>
+          <w:color w:val="1F2933"/>
         </w:rPr>
-        <w:t>Open the cited source and confirm the organization, reported date, and relevant filing field.</w:t>
+        <w:t>The organization and event were verified.</w:t>
       </w:r>
     </w:p>
     <w:p>
       <w:pPr>
-        <w:pStyle w:val="ListNumber"/>
-        <w:spacing w:after="120" w:line="300" w:lineRule="auto"/>
-        <w:ind w:left="540" w:hanging="271"/>
+        <w:numPr>
+          <w:ilvl w:val="0"/>
+          <w:numId w:val="10"/>
+        </w:numPr>
+        <w:spacing w:after="80" w:line="300" w:lineRule="auto"/>
       </w:pPr>
       <w:r>
         <w:rPr>
           <w:rFonts w:ascii="Calibri" w:hAnsi="Calibri"/>
           <w:b/>
-          <w:i w:val="0"/>
-          <w:color w:val="0B2545"/>
-          <w:sz w:val="22"/>
+          <w:color w:val="0A2540"/>
         </w:rPr>
-        <w:t xml:space="preserve">Qualify the fit. </w:t>
+        <w:t xml:space="preserve">Check: </w:t>
       </w:r>
       <w:r>
         <w:rPr>
           <w:rFonts w:ascii="Calibri" w:hAnsi="Calibri"/>
-          <w:b w:val="0"/>
-          <w:i w:val="0"/>
-          <w:color w:val="1C2737"/>
-          <w:sz w:val="22"/>
+          <w:color w:val="1F2933"/>
         </w:rPr>
-        <w:t>Use the organization’s own website to understand its operations and find a business-published channel.</w:t>
+        <w:t>The channel was published by the business itself.</w:t>
       </w:r>
     </w:p>
     <w:p>
       <w:pPr>
-        <w:pStyle w:val="ListNumber"/>
-        <w:spacing w:after="120" w:line="300" w:lineRule="auto"/>
-        <w:ind w:left="540" w:hanging="271"/>
+        <w:numPr>
+          <w:ilvl w:val="0"/>
+          <w:numId w:val="10"/>
+        </w:numPr>
+        <w:spacing w:after="80" w:line="300" w:lineRule="auto"/>
       </w:pPr>
       <w:r>
         <w:rPr>
           <w:rFonts w:ascii="Calibri" w:hAnsi="Calibri"/>
           <w:b/>
-          <w:i w:val="0"/>
-          <w:color w:val="0B2545"/>
-          <w:sz w:val="22"/>
+          <w:color w:val="0A2540"/>
         </w:rPr>
-        <w:t xml:space="preserve">Clear outreach. </w:t>
+        <w:t xml:space="preserve">Check: </w:t>
       </w:r>
       <w:r>
         <w:rPr>
           <w:rFonts w:ascii="Calibri" w:hAnsi="Calibri"/>
-          <w:b w:val="0"/>
-          <w:i w:val="0"/>
-          <w:color w:val="1C2737"/>
-          <w:sz w:val="22"/>
+          <w:color w:val="1F2933"/>
         </w:rPr>
-        <w:t>In the protected workflow, complete suppression, licensing, state-rule, purpose, and channel checks before any call or email.</w:t>
+        <w:t>Suppression and Do-Not-Contact checks passed.</w:t>
+      </w:r>
+    </w:p>
+    <w:p>
+      <w:pPr>
+        <w:numPr>
+          <w:ilvl w:val="0"/>
+          <w:numId w:val="10"/>
+        </w:numPr>
+        <w:spacing w:after="80" w:line="300" w:lineRule="auto"/>
+      </w:pPr>
+      <w:r>
+        <w:rPr>
+          <w:rFonts w:ascii="Calibri" w:hAnsi="Calibri"/>
+          <w:b/>
+          <w:color w:val="0A2540"/>
+        </w:rPr>
+        <w:t xml:space="preserve">Check: </w:t>
+      </w:r>
+      <w:r>
+        <w:rPr>
+          <w:rFonts w:ascii="Calibri" w:hAnsi="Calibri"/>
+          <w:color w:val="1F2933"/>
+        </w:rPr>
+        <w:t>Licensing and state rules were checked.</w:t>
+      </w:r>
+    </w:p>
+    <w:p>
+      <w:pPr>
+        <w:numPr>
+          <w:ilvl w:val="0"/>
+          <w:numId w:val="10"/>
+        </w:numPr>
+        <w:spacing w:after="80" w:line="300" w:lineRule="auto"/>
+      </w:pPr>
+      <w:r>
+        <w:rPr>
+          <w:rFonts w:ascii="Calibri" w:hAnsi="Calibri"/>
+          <w:b/>
+          <w:color w:val="0A2540"/>
+        </w:rPr>
+        <w:t xml:space="preserve">Check: </w:t>
+      </w:r>
+      <w:r>
+        <w:rPr>
+          <w:rFonts w:ascii="Calibri" w:hAnsi="Calibri"/>
+          <w:color w:val="1F2933"/>
+        </w:rPr>
+        <w:t>The purpose and product discussion are permitted.</w:t>
+      </w:r>
+    </w:p>
+    <w:p>
+      <w:pPr>
+        <w:numPr>
+          <w:ilvl w:val="0"/>
+          <w:numId w:val="10"/>
+        </w:numPr>
+        <w:spacing w:after="80" w:line="300" w:lineRule="auto"/>
+      </w:pPr>
+      <w:r>
+        <w:rPr>
+          <w:rFonts w:ascii="Calibri" w:hAnsi="Calibri"/>
+          <w:b/>
+          <w:color w:val="0A2540"/>
+        </w:rPr>
+        <w:t xml:space="preserve">Check: </w:t>
+      </w:r>
+      <w:r>
+        <w:rPr>
+          <w:rFonts w:ascii="Calibri" w:hAnsi="Calibri"/>
+          <w:color w:val="1F2933"/>
+        </w:rPr>
+        <w:t>The record does not rely on a sample or unavailable source.</w:t>
+      </w:r>
+    </w:p>
+    <w:p>
+      <w:pPr>
+        <w:spacing w:before="80" w:after="200" w:line="288" w:lineRule="auto"/>
+        <w:shd w:fill="FFF7E6" w:val="clear"/>
+        <w:pBdr>
+          <w:left w:val="single" w:sz="18" w:space="8" w:color="168F89"/>
+        </w:pBdr>
+        <w:ind w:left="180" w:right="120"/>
+      </w:pPr>
+      <w:r>
+        <w:rPr>
+          <w:rFonts w:ascii="Calibri" w:hAnsi="Calibri"/>
+          <w:b/>
+          <w:color w:val="0A2540"/>
+        </w:rPr>
+        <w:t xml:space="preserve">If any check is missing: </w:t>
+      </w:r>
+      <w:r>
+        <w:rPr>
+          <w:rFonts w:ascii="Calibri" w:hAnsi="Calibri"/>
+          <w:color w:val="1F2933"/>
+        </w:rPr>
+        <w:t>Do more research or stop. The application is designed to make uncertainty visible, not to push every record into a call list.</w:t>
       </w:r>
     </w:p>
     <w:p>
@@ -1003,92 +2481,244 @@
         <w:keepNext/>
       </w:pPr>
       <w:r>
-        <w:t>What David Leads never assumes</w:t>
+        <w:t>Five-minute meeting walkthrough</w:t>
       </w:r>
     </w:p>
     <w:p>
       <w:pPr>
-        <w:pStyle w:val="ListBullet"/>
-        <w:spacing w:after="80" w:line="300" w:lineRule="auto"/>
-        <w:ind w:left="540" w:hanging="271"/>
+        <w:spacing w:after="120" w:line="300" w:lineRule="auto"/>
       </w:pPr>
       <w:r>
         <w:rPr>
           <w:rFonts w:ascii="Calibri" w:hAnsi="Calibri"/>
-          <w:b w:val="0"/>
-          <w:i w:val="0"/>
-          <w:color w:val="1C2737"/>
-          <w:sz w:val="22"/>
+          <w:i/>
+          <w:color w:val="5A6B7C"/>
         </w:rPr>
-        <w:t>A public record is not consent or permission to contact.</w:t>
+        <w:t>Use this sequence when showing David Leads to a broker, manager, or investor.</w:t>
       </w:r>
     </w:p>
     <w:p>
       <w:pPr>
-        <w:pStyle w:val="ListBullet"/>
+        <w:numPr>
+          <w:ilvl w:val="0"/>
+          <w:numId w:val="11"/>
+        </w:numPr>
         <w:spacing w:after="80" w:line="300" w:lineRule="auto"/>
-        <w:ind w:left="540" w:hanging="271"/>
       </w:pPr>
       <w:r>
         <w:rPr>
           <w:rFonts w:ascii="Calibri" w:hAnsi="Calibri"/>
-          <w:b w:val="0"/>
-          <w:i w:val="0"/>
-          <w:color w:val="1C2737"/>
-          <w:sz w:val="22"/>
+          <w:color w:val="1F2933"/>
         </w:rPr>
-        <w:t>Observed activity is not revenue, intent, insurability, or a deal value.</w:t>
+        <w:t>Open the app and say: 'This is live organization research from official public records, not a contact list.'</w:t>
       </w:r>
     </w:p>
     <w:p>
       <w:pPr>
-        <w:pStyle w:val="ListBullet"/>
+        <w:numPr>
+          <w:ilvl w:val="0"/>
+          <w:numId w:val="11"/>
+        </w:numPr>
         <w:spacing w:after="80" w:line="300" w:lineRule="auto"/>
-        <w:ind w:left="540" w:hanging="271"/>
       </w:pPr>
       <w:r>
         <w:rPr>
           <w:rFonts w:ascii="Calibri" w:hAnsi="Calibri"/>
-          <w:b w:val="0"/>
-          <w:i w:val="0"/>
-          <w:color w:val="1C2737"/>
-          <w:sz w:val="22"/>
+          <w:color w:val="1F2933"/>
         </w:rPr>
-        <w:t>The system does not infer health, age, race, religion, family status, or private wealth.</w:t>
+        <w:t>Show the 27-state territory selector and focus New York.</w:t>
       </w:r>
     </w:p>
     <w:p>
       <w:pPr>
-        <w:pStyle w:val="ListBullet"/>
+        <w:numPr>
+          <w:ilvl w:val="0"/>
+          <w:numId w:val="11"/>
+        </w:numPr>
         <w:spacing w:after="80" w:line="300" w:lineRule="auto"/>
-        <w:ind w:left="540" w:hanging="271"/>
       </w:pPr>
       <w:r>
         <w:rPr>
           <w:rFonts w:ascii="Calibri" w:hAnsi="Calibri"/>
-          <w:b w:val="0"/>
-          <w:i w:val="0"/>
-          <w:color w:val="1C2737"/>
-          <w:sz w:val="22"/>
+          <w:color w:val="1F2933"/>
         </w:rPr>
-        <w:t>The system does not scrape social profiles or use named executives, insiders, signers, or donors as personal wealth leads.</w:t>
+        <w:t>Point to Live organizations, Source coverage, and Needs research. Explain that unavailable sources stay visible.</w:t>
       </w:r>
     </w:p>
     <w:p>
       <w:pPr>
-        <w:pStyle w:val="ListBullet"/>
+        <w:numPr>
+          <w:ilvl w:val="0"/>
+          <w:numId w:val="11"/>
+        </w:numPr>
         <w:spacing w:after="80" w:line="300" w:lineRule="auto"/>
-        <w:ind w:left="540" w:hanging="271"/>
       </w:pPr>
       <w:r>
         <w:rPr>
           <w:rFonts w:ascii="Calibri" w:hAnsi="Calibri"/>
-          <w:b w:val="0"/>
-          <w:i w:val="0"/>
-          <w:color w:val="1C2737"/>
-          <w:sz w:val="22"/>
+          <w:color w:val="1F2933"/>
         </w:rPr>
-        <w:t>The public view never exposes broker notes, saved channels, clearance decisions, outcomes, or exports.</w:t>
+        <w:t>Open one organization. Read the event, why now, official source, and limitations.</w:t>
+      </w:r>
+    </w:p>
+    <w:p>
+      <w:pPr>
+        <w:numPr>
+          <w:ilvl w:val="0"/>
+          <w:numId w:val="11"/>
+        </w:numPr>
+        <w:spacing w:after="80" w:line="300" w:lineRule="auto"/>
+      </w:pPr>
+      <w:r>
+        <w:rPr>
+          <w:rFonts w:ascii="Calibri" w:hAnsi="Calibri"/>
+          <w:color w:val="1F2933"/>
+        </w:rPr>
+        <w:t>Show the receipt or proof link. Explain that the public record can be checked before use.</w:t>
+      </w:r>
+    </w:p>
+    <w:p>
+      <w:pPr>
+        <w:numPr>
+          <w:ilvl w:val="0"/>
+          <w:numId w:val="11"/>
+        </w:numPr>
+        <w:spacing w:after="80" w:line="300" w:lineRule="auto"/>
+      </w:pPr>
+      <w:r>
+        <w:rPr>
+          <w:rFonts w:ascii="Calibri" w:hAnsi="Calibri"/>
+          <w:color w:val="1F2933"/>
+        </w:rPr>
+        <w:t>End with the contact gate: research is public; outreach still requires protected human clearance.</w:t>
+      </w:r>
+    </w:p>
+    <w:p>
+      <w:pPr>
+        <w:pStyle w:val="Heading2"/>
+        <w:keepNext/>
+      </w:pPr>
+      <w:r>
+        <w:t>A simple opening line</w:t>
+      </w:r>
+    </w:p>
+    <w:p>
+      <w:pPr>
+        <w:spacing w:before="80" w:after="200" w:line="288" w:lineRule="auto"/>
+        <w:shd w:fill="E8EEF5" w:val="clear"/>
+        <w:pBdr>
+          <w:left w:val="single" w:sz="18" w:space="8" w:color="168F89"/>
+        </w:pBdr>
+        <w:ind w:left="180" w:right="120"/>
+      </w:pPr>
+      <w:r>
+        <w:rPr>
+          <w:rFonts w:ascii="Calibri" w:hAnsi="Calibri"/>
+          <w:b/>
+          <w:color w:val="0A2540"/>
+        </w:rPr>
+        <w:t xml:space="preserve">Say: </w:t>
+      </w:r>
+      <w:r>
+        <w:rPr>
+          <w:rFonts w:ascii="Calibri" w:hAnsi="Calibri"/>
+          <w:color w:val="1F2933"/>
+        </w:rPr>
+        <w:t>David Leads helps you decide which organizations to research first, why the timing may matter, and exactly which official record to verify before a compliant conversation.</w:t>
+      </w:r>
+    </w:p>
+    <w:p>
+      <w:pPr>
+        <w:pStyle w:val="Heading2"/>
+        <w:keepNext/>
+      </w:pPr>
+      <w:r>
+        <w:t>What not to claim</w:t>
+      </w:r>
+    </w:p>
+    <w:p>
+      <w:pPr>
+        <w:numPr>
+          <w:ilvl w:val="0"/>
+          <w:numId w:val="10"/>
+        </w:numPr>
+        <w:spacing w:after="80" w:line="300" w:lineRule="auto"/>
+      </w:pPr>
+      <w:r>
+        <w:rPr>
+          <w:rFonts w:ascii="Calibri" w:hAnsi="Calibri"/>
+          <w:color w:val="1F2933"/>
+        </w:rPr>
+        <w:t>Do not say every record is a lead ready to call.</w:t>
+      </w:r>
+    </w:p>
+    <w:p>
+      <w:pPr>
+        <w:numPr>
+          <w:ilvl w:val="0"/>
+          <w:numId w:val="10"/>
+        </w:numPr>
+        <w:spacing w:after="80" w:line="300" w:lineRule="auto"/>
+      </w:pPr>
+      <w:r>
+        <w:rPr>
+          <w:rFonts w:ascii="Calibri" w:hAnsi="Calibri"/>
+          <w:color w:val="1F2933"/>
+        </w:rPr>
+        <w:t>Do not say a filing proves need, dissatisfaction, renewal, eligibility, or buying intent.</w:t>
+      </w:r>
+    </w:p>
+    <w:p>
+      <w:pPr>
+        <w:numPr>
+          <w:ilvl w:val="0"/>
+          <w:numId w:val="10"/>
+        </w:numPr>
+        <w:spacing w:after="80" w:line="300" w:lineRule="auto"/>
+      </w:pPr>
+      <w:r>
+        <w:rPr>
+          <w:rFonts w:ascii="Calibri" w:hAnsi="Calibri"/>
+          <w:color w:val="1F2933"/>
+        </w:rPr>
+        <w:t>Do not say a product fit is a recommendation or quote.</w:t>
+      </w:r>
+    </w:p>
+    <w:p>
+      <w:pPr>
+        <w:numPr>
+          <w:ilvl w:val="0"/>
+          <w:numId w:val="10"/>
+        </w:numPr>
+        <w:spacing w:after="80" w:line="300" w:lineRule="auto"/>
+      </w:pPr>
+      <w:r>
+        <w:rPr>
+          <w:rFonts w:ascii="Calibri" w:hAnsi="Calibri"/>
+          <w:color w:val="1F2933"/>
+        </w:rPr>
+        <w:t>Do not say the system uses private profiles or secret contact data.</w:t>
+      </w:r>
+    </w:p>
+    <w:p>
+      <w:pPr>
+        <w:numPr>
+          <w:ilvl w:val="0"/>
+          <w:numId w:val="10"/>
+        </w:numPr>
+        <w:spacing w:after="80" w:line="300" w:lineRule="auto"/>
+      </w:pPr>
+      <w:r>
+        <w:rPr>
+          <w:rFonts w:ascii="Calibri" w:hAnsi="Calibri"/>
+          <w:color w:val="1F2933"/>
+        </w:rPr>
+        <w:t>Do not call a source LIVE if the coverage panel says UNAVAILABLE.</w:t>
+      </w:r>
+    </w:p>
+    <w:p>
+      <w:r>
+        <w:br w:type="page"/>
       </w:r>
     </w:p>
     <w:p>
@@ -1097,266 +2727,470 @@
         <w:keepNext/>
       </w:pPr>
       <w:r>
-        <w:t>Department of Labor privacy boundary</w:t>
+        <w:t>If something looks wrong</w:t>
       </w:r>
     </w:p>
-    <w:p>
-      <w:pPr>
-        <w:spacing w:before="0" w:after="120" w:line="300" w:lineRule="auto"/>
-      </w:pPr>
-      <w:r>
-        <w:rPr>
-          <w:rFonts w:ascii="Calibri" w:hAnsi="Calibri"/>
-          <w:b w:val="0"/>
-          <w:i w:val="0"/>
-          <w:color w:val="1C2737"/>
-          <w:sz w:val="22"/>
-        </w:rPr>
-        <w:t>The life-plan lane keeps only the organization, public location, plan-period dates, participant count, reported carriers, and benefit categories needed for the research card.</w:t>
-      </w:r>
-    </w:p>
-    <w:p>
-      <w:pPr>
-        <w:spacing w:before="80" w:after="200" w:line="288" w:lineRule="auto"/>
-        <w:ind w:left="173" w:right="173"/>
-        <w:shd w:fill="FFF7E5"/>
-        <w:pBdr>
-          <w:left w:val="single" w:sz="18" w:space="8" w:color="B78921"/>
-        </w:pBdr>
-      </w:pPr>
-      <w:r>
-        <w:rPr>
-          <w:rFonts w:ascii="Calibri" w:hAnsi="Calibri"/>
-          <w:b/>
-          <w:i w:val="0"/>
-          <w:color w:val="0B2545"/>
-          <w:sz w:val="22"/>
-        </w:rPr>
-        <w:t xml:space="preserve">Excluded: </w:t>
-      </w:r>
-      <w:r>
-        <w:rPr>
-          <w:rFonts w:ascii="Calibri" w:hAnsi="Calibri"/>
-          <w:b w:val="0"/>
-          <w:i w:val="0"/>
-          <w:color w:val="1C2737"/>
-          <w:sz w:val="22"/>
-        </w:rPr>
-        <w:t>EINs, phone numbers, named administrators and signers, preparers, broker identities, commissions, and person-level addresses are not retained.</w:t>
-      </w:r>
-    </w:p>
+    <w:tbl>
+      <w:tblPr>
+        <w:tblW w:type="dxa" w:w="9360"/>
+        <w:tblLayout w:type="fixed"/>
+        <w:tblLook w:firstColumn="1" w:firstRow="1" w:lastColumn="0" w:lastRow="0" w:noHBand="0" w:noVBand="1" w:val="04A0"/>
+        <w:jc w:val="left"/>
+        <w:tblInd w:w="120" w:type="dxa"/>
+      </w:tblPr>
+      <w:tblGrid>
+        <w:gridCol w:w="3150"/>
+        <w:gridCol w:w="6210"/>
+      </w:tblGrid>
+      <w:tr>
+        <w:trPr>
+          <w:tblHeader w:val="true"/>
+        </w:trPr>
+        <w:tc>
+          <w:tcPr>
+            <w:tcW w:type="dxa" w:w="3150"/>
+            <w:vAlign w:val="center"/>
+            <w:tcMar>
+              <w:top w:w="80" w:type="dxa"/>
+              <w:bottom w:w="80" w:type="dxa"/>
+              <w:start w:w="120" w:type="dxa"/>
+              <w:end w:w="120" w:type="dxa"/>
+            </w:tcMar>
+            <w:shd w:fill="0A2540" w:val="clear"/>
+          </w:tcPr>
+          <w:p>
+            <w:pPr>
+              <w:spacing w:after="0" w:line="276" w:lineRule="auto"/>
+              <w:jc w:val="left"/>
+            </w:pPr>
+            <w:r>
+              <w:rPr>
+                <w:rFonts w:ascii="Calibri" w:hAnsi="Calibri"/>
+                <w:b/>
+                <w:color w:val="FFFFFF"/>
+                <w:sz w:val="21"/>
+              </w:rPr>
+              <w:t>What you see</w:t>
+            </w:r>
+          </w:p>
+        </w:tc>
+        <w:tc>
+          <w:tcPr>
+            <w:tcW w:type="dxa" w:w="6210"/>
+            <w:vAlign w:val="center"/>
+            <w:tcMar>
+              <w:top w:w="80" w:type="dxa"/>
+              <w:bottom w:w="80" w:type="dxa"/>
+              <w:start w:w="120" w:type="dxa"/>
+              <w:end w:w="120" w:type="dxa"/>
+            </w:tcMar>
+            <w:shd w:fill="0A2540" w:val="clear"/>
+          </w:tcPr>
+          <w:p>
+            <w:pPr>
+              <w:spacing w:after="0" w:line="276" w:lineRule="auto"/>
+              <w:jc w:val="left"/>
+            </w:pPr>
+            <w:r>
+              <w:rPr>
+                <w:rFonts w:ascii="Calibri" w:hAnsi="Calibri"/>
+                <w:b/>
+                <w:color w:val="FFFFFF"/>
+                <w:sz w:val="21"/>
+              </w:rPr>
+              <w:t>What to do</w:t>
+            </w:r>
+          </w:p>
+        </w:tc>
+      </w:tr>
+      <w:tr>
+        <w:tc>
+          <w:tcPr>
+            <w:tcW w:type="dxa" w:w="3150"/>
+            <w:vAlign w:val="center"/>
+            <w:tcMar>
+              <w:top w:w="80" w:type="dxa"/>
+              <w:bottom w:w="80" w:type="dxa"/>
+              <w:start w:w="120" w:type="dxa"/>
+              <w:end w:w="120" w:type="dxa"/>
+            </w:tcMar>
+          </w:tcPr>
+          <w:p>
+            <w:pPr>
+              <w:spacing w:after="0" w:line="276" w:lineRule="auto"/>
+              <w:jc w:val="left"/>
+            </w:pPr>
+            <w:r>
+              <w:rPr>
+                <w:rFonts w:ascii="Calibri" w:hAnsi="Calibri"/>
+                <w:b/>
+                <w:color w:val="0A2540"/>
+                <w:sz w:val="21"/>
+              </w:rPr>
+              <w:t>The page is still opening</w:t>
+            </w:r>
+          </w:p>
+        </w:tc>
+        <w:tc>
+          <w:tcPr>
+            <w:tcW w:type="dxa" w:w="6210"/>
+            <w:vAlign w:val="center"/>
+            <w:tcMar>
+              <w:top w:w="80" w:type="dxa"/>
+              <w:bottom w:w="80" w:type="dxa"/>
+              <w:start w:w="120" w:type="dxa"/>
+              <w:end w:w="120" w:type="dxa"/>
+            </w:tcMar>
+          </w:tcPr>
+          <w:p>
+            <w:pPr>
+              <w:spacing w:after="0" w:line="276" w:lineRule="auto"/>
+              <w:jc w:val="left"/>
+            </w:pPr>
+            <w:r>
+              <w:rPr>
+                <w:rFonts w:ascii="Calibri" w:hAnsi="Calibri"/>
+                <w:b w:val="0"/>
+                <w:color w:val="1F2933"/>
+                <w:sz w:val="21"/>
+              </w:rPr>
+              <w:t>Wait for the opening screen to disappear, then refresh once.</w:t>
+            </w:r>
+          </w:p>
+        </w:tc>
+      </w:tr>
+      <w:tr>
+        <w:tc>
+          <w:tcPr>
+            <w:tcW w:type="dxa" w:w="3150"/>
+            <w:shd w:fill="F5F8FB" w:val="clear"/>
+            <w:vAlign w:val="center"/>
+            <w:tcMar>
+              <w:top w:w="80" w:type="dxa"/>
+              <w:bottom w:w="80" w:type="dxa"/>
+              <w:start w:w="120" w:type="dxa"/>
+              <w:end w:w="120" w:type="dxa"/>
+            </w:tcMar>
+          </w:tcPr>
+          <w:p>
+            <w:pPr>
+              <w:spacing w:after="0" w:line="276" w:lineRule="auto"/>
+              <w:jc w:val="left"/>
+            </w:pPr>
+            <w:r>
+              <w:rPr>
+                <w:rFonts w:ascii="Calibri" w:hAnsi="Calibri"/>
+                <w:b/>
+                <w:color w:val="0A2540"/>
+                <w:sz w:val="21"/>
+              </w:rPr>
+              <w:t>A source says UNAVAILABLE</w:t>
+            </w:r>
+          </w:p>
+        </w:tc>
+        <w:tc>
+          <w:tcPr>
+            <w:tcW w:type="dxa" w:w="6210"/>
+            <w:shd w:fill="F5F8FB" w:val="clear"/>
+            <w:vAlign w:val="center"/>
+            <w:tcMar>
+              <w:top w:w="80" w:type="dxa"/>
+              <w:bottom w:w="80" w:type="dxa"/>
+              <w:start w:w="120" w:type="dxa"/>
+              <w:end w:w="120" w:type="dxa"/>
+            </w:tcMar>
+          </w:tcPr>
+          <w:p>
+            <w:pPr>
+              <w:spacing w:after="0" w:line="276" w:lineRule="auto"/>
+              <w:jc w:val="left"/>
+            </w:pPr>
+            <w:r>
+              <w:rPr>
+                <w:rFonts w:ascii="Calibri" w:hAnsi="Calibri"/>
+                <w:b w:val="0"/>
+                <w:color w:val="1F2933"/>
+                <w:sz w:val="21"/>
+              </w:rPr>
+              <w:t>Use another live source or return later. Do not treat the outage as a zero or a live result.</w:t>
+            </w:r>
+          </w:p>
+        </w:tc>
+      </w:tr>
+      <w:tr>
+        <w:tc>
+          <w:tcPr>
+            <w:tcW w:type="dxa" w:w="3150"/>
+            <w:vAlign w:val="center"/>
+            <w:tcMar>
+              <w:top w:w="80" w:type="dxa"/>
+              <w:bottom w:w="80" w:type="dxa"/>
+              <w:start w:w="120" w:type="dxa"/>
+              <w:end w:w="120" w:type="dxa"/>
+            </w:tcMar>
+          </w:tcPr>
+          <w:p>
+            <w:pPr>
+              <w:spacing w:after="0" w:line="276" w:lineRule="auto"/>
+              <w:jc w:val="left"/>
+            </w:pPr>
+            <w:r>
+              <w:rPr>
+                <w:rFonts w:ascii="Calibri" w:hAnsi="Calibri"/>
+                <w:b/>
+                <w:color w:val="0A2540"/>
+                <w:sz w:val="21"/>
+              </w:rPr>
+              <w:t>A state has few records</w:t>
+            </w:r>
+          </w:p>
+        </w:tc>
+        <w:tc>
+          <w:tcPr>
+            <w:tcW w:type="dxa" w:w="6210"/>
+            <w:vAlign w:val="center"/>
+            <w:tcMar>
+              <w:top w:w="80" w:type="dxa"/>
+              <w:bottom w:w="80" w:type="dxa"/>
+              <w:start w:w="120" w:type="dxa"/>
+              <w:end w:w="120" w:type="dxa"/>
+            </w:tcMar>
+          </w:tcPr>
+          <w:p>
+            <w:pPr>
+              <w:spacing w:after="0" w:line="276" w:lineRule="auto"/>
+              <w:jc w:val="left"/>
+            </w:pPr>
+            <w:r>
+              <w:rPr>
+                <w:rFonts w:ascii="Calibri" w:hAnsi="Calibri"/>
+                <w:b w:val="0"/>
+                <w:color w:val="1F2933"/>
+                <w:sz w:val="21"/>
+              </w:rPr>
+              <w:t>Select that one state to run the deeper state-specific pull.</w:t>
+            </w:r>
+          </w:p>
+        </w:tc>
+      </w:tr>
+      <w:tr>
+        <w:tc>
+          <w:tcPr>
+            <w:tcW w:type="dxa" w:w="3150"/>
+            <w:shd w:fill="F5F8FB" w:val="clear"/>
+            <w:vAlign w:val="center"/>
+            <w:tcMar>
+              <w:top w:w="80" w:type="dxa"/>
+              <w:bottom w:w="80" w:type="dxa"/>
+              <w:start w:w="120" w:type="dxa"/>
+              <w:end w:w="120" w:type="dxa"/>
+            </w:tcMar>
+          </w:tcPr>
+          <w:p>
+            <w:pPr>
+              <w:spacing w:after="0" w:line="276" w:lineRule="auto"/>
+              <w:jc w:val="left"/>
+            </w:pPr>
+            <w:r>
+              <w:rPr>
+                <w:rFonts w:ascii="Calibri" w:hAnsi="Calibri"/>
+                <w:b/>
+                <w:color w:val="0A2540"/>
+                <w:sz w:val="21"/>
+              </w:rPr>
+              <w:t>The count changed</w:t>
+            </w:r>
+          </w:p>
+        </w:tc>
+        <w:tc>
+          <w:tcPr>
+            <w:tcW w:type="dxa" w:w="6210"/>
+            <w:shd w:fill="F5F8FB" w:val="clear"/>
+            <w:vAlign w:val="center"/>
+            <w:tcMar>
+              <w:top w:w="80" w:type="dxa"/>
+              <w:bottom w:w="80" w:type="dxa"/>
+              <w:start w:w="120" w:type="dxa"/>
+              <w:end w:w="120" w:type="dxa"/>
+            </w:tcMar>
+          </w:tcPr>
+          <w:p>
+            <w:pPr>
+              <w:spacing w:after="0" w:line="276" w:lineRule="auto"/>
+              <w:jc w:val="left"/>
+            </w:pPr>
+            <w:r>
+              <w:rPr>
+                <w:rFonts w:ascii="Calibri" w:hAnsi="Calibri"/>
+                <w:b w:val="0"/>
+                <w:color w:val="1F2933"/>
+                <w:sz w:val="21"/>
+              </w:rPr>
+              <w:t>That is expected. Counts follow current public-source responses and the chosen territory.</w:t>
+            </w:r>
+          </w:p>
+        </w:tc>
+      </w:tr>
+      <w:tr>
+        <w:tc>
+          <w:tcPr>
+            <w:tcW w:type="dxa" w:w="3150"/>
+            <w:vAlign w:val="center"/>
+            <w:tcMar>
+              <w:top w:w="80" w:type="dxa"/>
+              <w:bottom w:w="80" w:type="dxa"/>
+              <w:start w:w="120" w:type="dxa"/>
+              <w:end w:w="120" w:type="dxa"/>
+            </w:tcMar>
+          </w:tcPr>
+          <w:p>
+            <w:pPr>
+              <w:spacing w:after="0" w:line="276" w:lineRule="auto"/>
+              <w:jc w:val="left"/>
+            </w:pPr>
+            <w:r>
+              <w:rPr>
+                <w:rFonts w:ascii="Calibri" w:hAnsi="Calibri"/>
+                <w:b/>
+                <w:color w:val="0A2540"/>
+                <w:sz w:val="21"/>
+              </w:rPr>
+              <w:t>A record looks surprising</w:t>
+            </w:r>
+          </w:p>
+        </w:tc>
+        <w:tc>
+          <w:tcPr>
+            <w:tcW w:type="dxa" w:w="6210"/>
+            <w:vAlign w:val="center"/>
+            <w:tcMar>
+              <w:top w:w="80" w:type="dxa"/>
+              <w:bottom w:w="80" w:type="dxa"/>
+              <w:start w:w="120" w:type="dxa"/>
+              <w:end w:w="120" w:type="dxa"/>
+            </w:tcMar>
+          </w:tcPr>
+          <w:p>
+            <w:pPr>
+              <w:spacing w:after="0" w:line="276" w:lineRule="auto"/>
+              <w:jc w:val="left"/>
+            </w:pPr>
+            <w:r>
+              <w:rPr>
+                <w:rFonts w:ascii="Calibri" w:hAnsi="Calibri"/>
+                <w:b w:val="0"/>
+                <w:color w:val="1F2933"/>
+                <w:sz w:val="21"/>
+              </w:rPr>
+              <w:t>Open the official source and confirm it. If it cannot be confirmed, do not use it.</w:t>
+            </w:r>
+          </w:p>
+        </w:tc>
+      </w:tr>
+      <w:tr>
+        <w:tc>
+          <w:tcPr>
+            <w:tcW w:type="dxa" w:w="3150"/>
+            <w:shd w:fill="F5F8FB" w:val="clear"/>
+            <w:vAlign w:val="center"/>
+            <w:tcMar>
+              <w:top w:w="80" w:type="dxa"/>
+              <w:bottom w:w="80" w:type="dxa"/>
+              <w:start w:w="120" w:type="dxa"/>
+              <w:end w:w="120" w:type="dxa"/>
+            </w:tcMar>
+          </w:tcPr>
+          <w:p>
+            <w:pPr>
+              <w:spacing w:after="0" w:line="276" w:lineRule="auto"/>
+              <w:jc w:val="left"/>
+            </w:pPr>
+            <w:r>
+              <w:rPr>
+                <w:rFonts w:ascii="Calibri" w:hAnsi="Calibri"/>
+                <w:b/>
+                <w:color w:val="0A2540"/>
+                <w:sz w:val="21"/>
+              </w:rPr>
+              <w:t>You need saved notes or outreach actions</w:t>
+            </w:r>
+          </w:p>
+        </w:tc>
+        <w:tc>
+          <w:tcPr>
+            <w:tcW w:type="dxa" w:w="6210"/>
+            <w:shd w:fill="F5F8FB" w:val="clear"/>
+            <w:vAlign w:val="center"/>
+            <w:tcMar>
+              <w:top w:w="80" w:type="dxa"/>
+              <w:bottom w:w="80" w:type="dxa"/>
+              <w:start w:w="120" w:type="dxa"/>
+              <w:end w:w="120" w:type="dxa"/>
+            </w:tcMar>
+          </w:tcPr>
+          <w:p>
+            <w:pPr>
+              <w:spacing w:after="0" w:line="276" w:lineRule="auto"/>
+              <w:jc w:val="left"/>
+            </w:pPr>
+            <w:r>
+              <w:rPr>
+                <w:rFonts w:ascii="Calibri" w:hAnsi="Calibri"/>
+                <w:b w:val="0"/>
+                <w:color w:val="1F2933"/>
+                <w:sz w:val="21"/>
+              </w:rPr>
+              <w:t>Those functions belong in the protected broker workflow and are not exposed in the public research view.</w:t>
+            </w:r>
+          </w:p>
+        </w:tc>
+      </w:tr>
+    </w:tbl>
     <w:p>
       <w:pPr>
         <w:pStyle w:val="Heading1"/>
         <w:keepNext/>
       </w:pPr>
       <w:r>
-        <w:t>When a source is unavailable</w:t>
+        <w:t>The one rule to remember</w:t>
       </w:r>
     </w:p>
     <w:p>
       <w:pPr>
-        <w:pStyle w:val="ListNumber"/>
-        <w:spacing w:after="120" w:line="300" w:lineRule="auto"/>
-        <w:ind w:left="540" w:hanging="271"/>
+        <w:spacing w:before="80" w:after="200" w:line="288" w:lineRule="auto"/>
+        <w:shd w:fill="E8F6F4" w:val="clear"/>
+        <w:pBdr>
+          <w:left w:val="single" w:sz="18" w:space="8" w:color="168F89"/>
+        </w:pBdr>
+        <w:ind w:left="180" w:right="120"/>
       </w:pPr>
       <w:r>
         <w:rPr>
           <w:rFonts w:ascii="Calibri" w:hAnsi="Calibri"/>
           <w:b/>
-          <w:i w:val="0"/>
-          <w:color w:val="0B2545"/>
-          <w:sz w:val="22"/>
+          <w:color w:val="0A2540"/>
         </w:rPr>
-        <w:t xml:space="preserve">Open Market coverage. </w:t>
+        <w:t xml:space="preserve">Use David Leads to decide what to research first. </w:t>
       </w:r>
       <w:r>
         <w:rPr>
           <w:rFonts w:ascii="Calibri" w:hAnsi="Calibri"/>
-          <w:b w:val="0"/>
-          <w:i w:val="0"/>
-          <w:color w:val="1C2737"/>
-          <w:sz w:val="22"/>
+          <w:color w:val="1F2933"/>
         </w:rPr>
-        <w:t>Each source reports LIVE, UNAVAILABLE, or NOT APPLICABLE.</w:t>
+        <w:t>Use the official record to verify why. Use the protected clearance process to decide whether contact is permitted.</w:t>
       </w:r>
     </w:p>
     <w:p>
       <w:pPr>
-        <w:pStyle w:val="ListNumber"/>
         <w:spacing w:after="120" w:line="300" w:lineRule="auto"/>
-        <w:ind w:left="540" w:hanging="271"/>
       </w:pPr>
       <w:r>
         <w:rPr>
           <w:rFonts w:ascii="Calibri" w:hAnsi="Calibri"/>
-          <w:b/>
-          <w:i w:val="0"/>
-          <w:color w:val="0B2545"/>
-          <w:sz w:val="22"/>
+          <w:i/>
+          <w:color w:val="5A6B7C"/>
         </w:rPr>
-        <w:t xml:space="preserve">Read the reason. </w:t>
-      </w:r>
-      <w:r>
-        <w:rPr>
-          <w:rFonts w:ascii="Calibri" w:hAnsi="Calibri"/>
-          <w:b w:val="0"/>
-          <w:i w:val="0"/>
-          <w:color w:val="1C2737"/>
-          <w:sz w:val="22"/>
-        </w:rPr>
-        <w:t>A missing credential, source outage, or territory mismatch remains visible.</w:t>
-      </w:r>
-    </w:p>
-    <w:p>
-      <w:pPr>
-        <w:pStyle w:val="ListNumber"/>
-        <w:spacing w:after="120" w:line="300" w:lineRule="auto"/>
-        <w:ind w:left="540" w:hanging="271"/>
-      </w:pPr>
-      <w:r>
-        <w:rPr>
-          <w:rFonts w:ascii="Calibri" w:hAnsi="Calibri"/>
-          <w:b/>
-          <w:i w:val="0"/>
-          <w:color w:val="0B2545"/>
-          <w:sz w:val="22"/>
-        </w:rPr>
-        <w:t xml:space="preserve">Do not work around it. </w:t>
-      </w:r>
-      <w:r>
-        <w:rPr>
-          <w:rFonts w:ascii="Calibri" w:hAnsi="Calibri"/>
-          <w:b w:val="0"/>
-          <w:i w:val="0"/>
-          <w:color w:val="1C2737"/>
-          <w:sz w:val="22"/>
-        </w:rPr>
-        <w:t>The application never substitutes a fake lead for an unavailable source.</w:t>
-      </w:r>
-    </w:p>
-    <w:p>
-      <w:pPr>
-        <w:pStyle w:val="Heading1"/>
-        <w:keepNext/>
-      </w:pPr>
-      <w:r>
-        <w:t>Best practice before every outreach decision</w:t>
-      </w:r>
-    </w:p>
-    <w:p>
-      <w:pPr>
-        <w:pStyle w:val="ListBullet"/>
-        <w:spacing w:after="80" w:line="300" w:lineRule="auto"/>
-        <w:ind w:left="540" w:hanging="271"/>
-      </w:pPr>
-      <w:r>
-        <w:rPr>
-          <w:rFonts w:ascii="Calibri" w:hAnsi="Calibri"/>
-          <w:b w:val="0"/>
-          <w:i w:val="0"/>
-          <w:color w:val="1C2737"/>
-          <w:sz w:val="22"/>
-        </w:rPr>
-        <w:t>Confirm the official record is current.</w:t>
-      </w:r>
-    </w:p>
-    <w:p>
-      <w:pPr>
-        <w:pStyle w:val="ListBullet"/>
-        <w:spacing w:after="80" w:line="300" w:lineRule="auto"/>
-        <w:ind w:left="540" w:hanging="271"/>
-      </w:pPr>
-      <w:r>
-        <w:rPr>
-          <w:rFonts w:ascii="Calibri" w:hAnsi="Calibri"/>
-          <w:b w:val="0"/>
-          <w:i w:val="0"/>
-          <w:color w:val="1C2737"/>
-          <w:sz w:val="22"/>
-        </w:rPr>
-        <w:t>Confirm the product and jurisdiction are within David’s approved scope.</w:t>
-      </w:r>
-    </w:p>
-    <w:p>
-      <w:pPr>
-        <w:pStyle w:val="ListBullet"/>
-        <w:spacing w:after="80" w:line="300" w:lineRule="auto"/>
-        <w:ind w:left="540" w:hanging="271"/>
-      </w:pPr>
-      <w:r>
-        <w:rPr>
-          <w:rFonts w:ascii="Calibri" w:hAnsi="Calibri"/>
-          <w:b w:val="0"/>
-          <w:i w:val="0"/>
-          <w:color w:val="1C2737"/>
-          <w:sz w:val="22"/>
-        </w:rPr>
-        <w:t>Use only a business-published channel from the organization’s own website.</w:t>
-      </w:r>
-    </w:p>
-    <w:p>
-      <w:pPr>
-        <w:pStyle w:val="ListBullet"/>
-        <w:spacing w:after="80" w:line="300" w:lineRule="auto"/>
-        <w:ind w:left="540" w:hanging="271"/>
-      </w:pPr>
-      <w:r>
-        <w:rPr>
-          <w:rFonts w:ascii="Calibri" w:hAnsi="Calibri"/>
-          <w:b w:val="0"/>
-          <w:i w:val="0"/>
-          <w:color w:val="1C2737"/>
-          <w:sz w:val="22"/>
-        </w:rPr>
-        <w:t>Complete all suppression, licensing, state-rule, and purpose checks.</w:t>
-      </w:r>
-    </w:p>
-    <w:p>
-      <w:pPr>
-        <w:pStyle w:val="ListBullet"/>
-        <w:spacing w:after="80" w:line="300" w:lineRule="auto"/>
-        <w:ind w:left="540" w:hanging="271"/>
-      </w:pPr>
-      <w:r>
-        <w:rPr>
-          <w:rFonts w:ascii="Calibri" w:hAnsi="Calibri"/>
-          <w:b w:val="0"/>
-          <w:i w:val="0"/>
-          <w:color w:val="1C2737"/>
-          <w:sz w:val="22"/>
-        </w:rPr>
-        <w:t>Record time-limited clearance in the protected workflow.</w:t>
-      </w:r>
-    </w:p>
-    <w:p>
-      <w:pPr>
-        <w:spacing w:before="80" w:after="200" w:line="288" w:lineRule="auto"/>
-        <w:ind w:left="173" w:right="173"/>
-        <w:shd w:fill="E7F5F3"/>
-        <w:pBdr>
-          <w:left w:val="single" w:sz="18" w:space="8" w:color="148984"/>
-        </w:pBdr>
-      </w:pPr>
-      <w:r>
-        <w:rPr>
-          <w:rFonts w:ascii="Calibri" w:hAnsi="Calibri"/>
-          <w:b/>
-          <w:i w:val="0"/>
-          <w:color w:val="0B2545"/>
-          <w:sz w:val="22"/>
-        </w:rPr>
-        <w:t xml:space="preserve">Remember: </w:t>
-      </w:r>
-      <w:r>
-        <w:rPr>
-          <w:rFonts w:ascii="Calibri" w:hAnsi="Calibri"/>
-          <w:b w:val="0"/>
-          <w:i w:val="0"/>
-          <w:color w:val="1C2737"/>
-          <w:sz w:val="22"/>
-        </w:rPr>
-        <w:t>The software helps David focus his research. David’s licensed judgment and the protected clearance process decide whether any next action is appropriate.</w:t>
+        <w:t>Public organization data only. No passwords or access keys are printed in this guide.</w:t>
       </w:r>
     </w:p>
     <w:sectPr>
@@ -1376,22 +3210,24 @@
   <w:p>
     <w:pPr>
       <w:pStyle w:val="Footer"/>
-      <w:spacing w:before="0" w:after="0"/>
       <w:jc w:val="right"/>
     </w:pPr>
     <w:r>
       <w:rPr>
         <w:rFonts w:ascii="Calibri" w:hAnsi="Calibri"/>
-        <w:b w:val="0"/>
-        <w:i w:val="0"/>
-        <w:color w:val="5C697A"/>
+        <w:color w:val="5A6B7C"/>
         <w:sz w:val="17"/>
       </w:rPr>
-      <w:t xml:space="preserve">David Leads | Broker Guide   •   Page </w:t>
+      <w:t xml:space="preserve">Verified operating guide  |  August 2026  |  </w:t>
     </w:r>
     <w:r>
+      <w:rPr>
+        <w:rFonts w:ascii="Calibri" w:hAnsi="Calibri"/>
+        <w:color w:val="5A6B7C"/>
+        <w:sz w:val="18"/>
+      </w:rPr>
       <w:fldChar w:fldCharType="begin"/>
-      <w:instrText xml:space="preserve">PAGE</w:instrText>
+      <w:instrText xml:space="preserve"> PAGE </w:instrText>
       <w:fldChar w:fldCharType="separate"/>
       <w:t>1</w:t>
       <w:fldChar w:fldCharType="end"/>
@@ -1412,21 +3248,10 @@
       <w:rPr>
         <w:rFonts w:ascii="Calibri" w:hAnsi="Calibri"/>
         <w:b/>
-        <w:i w:val="0"/>
-        <w:color w:val="148984"/>
+        <w:color w:val="5A6B7C"/>
         <w:sz w:val="17"/>
       </w:rPr>
-      <w:t>DAVID LEADS</w:t>
-    </w:r>
-    <w:r>
-      <w:rPr>
-        <w:rFonts w:ascii="Calibri" w:hAnsi="Calibri"/>
-        <w:b w:val="0"/>
-        <w:i w:val="0"/>
-        <w:color w:val="5C697A"/>
-        <w:sz w:val="17"/>
-      </w:rPr>
-      <w:t xml:space="preserve">   |   Eastern Market Cockpit</w:t>
+      <w:t>DAVID LEADS  |  BROKER FIELD GUIDE</w:t>
     </w:r>
   </w:p>
 </w:hdr>
@@ -1631,6 +3456,50 @@
   </w:num>
   <w:num w:numId="9">
     <w:abstractNumId w:val="0"/>
+  </w:num>
+  <w:abstractNum w:abstractNumId="9">
+    <w:multiLevelType w:val="singleLevel"/>
+    <w:lvl w:ilvl="0">
+      <w:start w:val="1"/>
+      <w:numFmt w:val="bullet"/>
+      <w:lvlText w:val="•"/>
+      <w:suff w:val="tab"/>
+      <w:pPr>
+        <w:tabs>
+          <w:tab w:val="num" w:pos="540"/>
+        </w:tabs>
+        <w:ind w:left="540" w:hanging="270"/>
+        <w:spacing w:after="80" w:line="300" w:lineRule="auto"/>
+      </w:pPr>
+      <w:rPr>
+        <w:rFonts w:ascii="Calibri" w:hAnsi="Calibri"/>
+      </w:rPr>
+    </w:lvl>
+  </w:abstractNum>
+  <w:num w:numId="10">
+    <w:abstractNumId w:val="9"/>
+  </w:num>
+  <w:abstractNum w:abstractNumId="10">
+    <w:multiLevelType w:val="singleLevel"/>
+    <w:lvl w:ilvl="0">
+      <w:start w:val="1"/>
+      <w:numFmt w:val="decimal"/>
+      <w:lvlText w:val="%1."/>
+      <w:suff w:val="tab"/>
+      <w:pPr>
+        <w:tabs>
+          <w:tab w:val="num" w:pos="540"/>
+        </w:tabs>
+        <w:ind w:left="540" w:hanging="270"/>
+        <w:spacing w:after="80" w:line="300" w:lineRule="auto"/>
+      </w:pPr>
+      <w:rPr>
+        <w:rFonts w:ascii="Calibri" w:hAnsi="Calibri"/>
+      </w:rPr>
+    </w:lvl>
+  </w:abstractNum>
+  <w:num w:numId="11">
+    <w:abstractNumId w:val="10"/>
   </w:num>
 </w:numbering>
 </file>
@@ -1800,7 +3669,7 @@
     </w:pPr>
     <w:rPr>
       <w:rFonts w:ascii="Calibri" w:hAnsi="Calibri"/>
-      <w:color w:val="1C2737"/>
+      <w:color w:val="1F2933"/>
       <w:sz w:val="22"/>
     </w:rPr>
   </w:style>
@@ -1866,7 +3735,7 @@
       <w:rFonts w:asciiTheme="majorHAnsi" w:eastAsiaTheme="majorEastAsia" w:hAnsiTheme="majorHAnsi" w:cstheme="majorBidi" w:ascii="Calibri" w:hAnsi="Calibri"/>
       <w:b/>
       <w:bCs/>
-      <w:color w:val="2E74B5"/>
+      <w:color w:val="0A2540"/>
       <w:sz w:val="32"/>
       <w:szCs w:val="28"/>
     </w:rPr>
@@ -1890,7 +3759,7 @@
       <w:rFonts w:asciiTheme="majorHAnsi" w:eastAsiaTheme="majorEastAsia" w:hAnsiTheme="majorHAnsi" w:cstheme="majorBidi" w:ascii="Calibri" w:hAnsi="Calibri"/>
       <w:b/>
       <w:bCs/>
-      <w:color w:val="2E74B5"/>
+      <w:color w:val="168F89"/>
       <w:sz w:val="26"/>
       <w:szCs w:val="26"/>
     </w:rPr>
@@ -1914,7 +3783,7 @@
       <w:rFonts w:asciiTheme="majorHAnsi" w:eastAsiaTheme="majorEastAsia" w:hAnsiTheme="majorHAnsi" w:cstheme="majorBidi" w:ascii="Calibri" w:hAnsi="Calibri"/>
       <w:b/>
       <w:bCs/>
-      <w:color w:val="1F4D78"/>
+      <w:color w:val="0A2540"/>
       <w:sz w:val="24"/>
     </w:rPr>
   </w:style>
@@ -2149,15 +4018,16 @@
       <w:pBdr>
         <w:bottom w:val="single" w:sz="8" w:space="4" w:color="4F81BD" w:themeColor="accent1"/>
       </w:pBdr>
-      <w:spacing w:after="300" w:line="240" w:lineRule="auto"/>
+      <w:spacing w:after="160" w:line="240" w:lineRule="auto" w:before="0"/>
       <w:contextualSpacing/>
     </w:pPr>
     <w:rPr>
-      <w:rFonts w:asciiTheme="majorHAnsi" w:eastAsiaTheme="majorEastAsia" w:hAnsiTheme="majorHAnsi" w:cstheme="majorBidi"/>
-      <w:color w:val="17365D" w:themeColor="text2" w:themeShade="BF"/>
+      <w:rFonts w:asciiTheme="majorHAnsi" w:eastAsiaTheme="majorEastAsia" w:hAnsiTheme="majorHAnsi" w:cstheme="majorBidi" w:ascii="Calibri" w:hAnsi="Calibri"/>
+      <w:b/>
+      <w:color w:val="0A2540"/>
       <w:spacing w:val="5"/>
       <w:kern w:val="28"/>
-      <w:sz w:val="52"/>
+      <w:sz w:val="56"/>
       <w:szCs w:val="52"/>
     </w:rPr>
   </w:style>
@@ -2188,14 +4058,15 @@
       <w:numPr>
         <w:ilvl w:val="1"/>
       </w:numPr>
+      <w:spacing w:after="360"/>
     </w:pPr>
     <w:rPr>
-      <w:rFonts w:asciiTheme="majorHAnsi" w:eastAsiaTheme="majorEastAsia" w:hAnsiTheme="majorHAnsi" w:cstheme="majorBidi"/>
+      <w:rFonts w:asciiTheme="majorHAnsi" w:eastAsiaTheme="majorEastAsia" w:hAnsiTheme="majorHAnsi" w:cstheme="majorBidi" w:ascii="Calibri" w:hAnsi="Calibri"/>
       <w:i/>
       <w:iCs/>
-      <w:color w:val="4F81BD" w:themeColor="accent1"/>
+      <w:color w:val="5A6B7C"/>
       <w:spacing w:val="15"/>
-      <w:sz w:val="24"/>
+      <w:sz w:val="27"/>
       <w:szCs w:val="24"/>
     </w:rPr>
   </w:style>
@@ -2331,14 +4202,8 @@
       <w:numPr>
         <w:numId w:val="1"/>
       </w:numPr>
-      <w:spacing w:after="80" w:line="300" w:lineRule="auto"/>
-      <w:ind w:left="540" w:hanging="271"/>
       <w:contextualSpacing/>
     </w:pPr>
-    <w:rPr>
-      <w:rFonts w:ascii="Calibri" w:hAnsi="Calibri"/>
-      <w:sz w:val="22"/>
-    </w:rPr>
   </w:style>
   <w:style w:type="paragraph" w:styleId="ListBullet2">
     <w:name w:val="List Bullet 2"/>
@@ -2376,14 +4241,8 @@
       <w:numPr>
         <w:numId w:val="5"/>
       </w:numPr>
-      <w:spacing w:after="80" w:line="300" w:lineRule="auto"/>
-      <w:ind w:left="540" w:hanging="271"/>
       <w:contextualSpacing/>
     </w:pPr>
-    <w:rPr>
-      <w:rFonts w:ascii="Calibri" w:hAnsi="Calibri"/>
-      <w:sz w:val="22"/>
-    </w:rPr>
   </w:style>
   <w:style w:type="paragraph" w:styleId="ListNumber2">
     <w:name w:val="List Number 2"/>

</xml_diff>

<commit_message>
feat: ship evidence-backed investor demo
Signed-off-by: Lutar, Stephen P. <stephenlutar2@gmail.com>
</commit_message>
<xml_diff>
--- a/David_Leads_Broker_Guide.docx
+++ b/David_Leads_Broker_Guide.docx
@@ -4,32 +4,32 @@
   <w:body>
     <w:p>
       <w:pPr>
-        <w:spacing w:after="60"/>
+        <w:spacing w:before="200" w:after="40"/>
       </w:pPr>
       <w:r>
         <w:rPr>
           <w:rFonts w:ascii="Calibri" w:hAnsi="Calibri"/>
           <w:b/>
-          <w:color w:val="B78327"/>
-          <w:sz w:val="19"/>
+          <w:i w:val="0"/>
+          <w:color w:val="148984"/>
+          <w:sz w:val="18"/>
         </w:rPr>
-        <w:t>BROKER ENABLEMENT PACK</w:t>
+        <w:t>BROKER OPERATING GUIDE</w:t>
       </w:r>
     </w:p>
     <w:p>
       <w:pPr>
-        <w:pStyle w:val="Title"/>
+        <w:spacing w:before="0" w:after="120"/>
       </w:pPr>
       <w:r>
+        <w:rPr>
+          <w:rFonts w:ascii="Calibri" w:hAnsi="Calibri"/>
+          <w:b/>
+          <w:i w:val="0"/>
+          <w:color w:val="0B2545"/>
+          <w:sz w:val="60"/>
+        </w:rPr>
         <w:t>David Leads</w:t>
-      </w:r>
-    </w:p>
-    <w:p>
-      <w:pPr>
-        <w:pStyle w:val="Subtitle"/>
-      </w:pPr>
-      <w:r>
-        <w:t>A plain-English field guide for the live Eastern Market Cockpit</w:t>
       </w:r>
     </w:p>
     <w:p>
@@ -39,174 +39,26 @@
       <w:r>
         <w:rPr>
           <w:rFonts w:ascii="Calibri" w:hAnsi="Calibri"/>
-          <w:b/>
-          <w:color w:val="5A6B7C"/>
-          <w:sz w:val="21"/>
+          <w:b w:val="0"/>
+          <w:i w:val="0"/>
+          <w:color w:val="5C697A"/>
+          <w:sz w:val="28"/>
         </w:rPr>
-        <w:t>Prepared for David Abraham  |  Verified August 1, 2026</w:t>
-      </w:r>
-    </w:p>
-    <w:p>
-      <w:pPr>
-        <w:spacing w:before="80" w:after="200" w:line="288" w:lineRule="auto"/>
-        <w:shd w:fill="E8F6F4" w:val="clear"/>
-        <w:pBdr>
-          <w:left w:val="single" w:sz="18" w:space="8" w:color="168F89"/>
-        </w:pBdr>
-        <w:ind w:left="180" w:right="120"/>
-      </w:pPr>
-      <w:r>
-        <w:rPr>
-          <w:rFonts w:ascii="Calibri" w:hAnsi="Calibri"/>
-          <w:b/>
-          <w:color w:val="0A2540"/>
-        </w:rPr>
-        <w:t xml:space="preserve">Start here: </w:t>
-      </w:r>
-      <w:r>
-        <w:rPr>
-          <w:rFonts w:ascii="Calibri" w:hAnsi="Calibri"/>
-          <w:color w:val="1F2933"/>
-        </w:rPr>
-        <w:t>Viewing the live research workspace does not require a username, password, or access key. Open the web address below in Chrome, Edge, Safari, or a phone browser.</w:t>
-      </w:r>
-    </w:p>
-    <w:p>
-      <w:pPr>
-        <w:spacing w:after="320"/>
-      </w:pPr>
-      <w:hyperlink r:id="rId11">
-        <w:r>
-          <w:rPr>
-            <w:color w:val="168F89"/>
-            <w:u w:val="single"/>
-            <w:b/>
-            <w:rFonts w:ascii="Calibri" w:hAnsi="Calibri"/>
-            <w:sz w:val="22"/>
-          </w:rPr>
-          <w:t>Open David Leads</w:t>
-        </w:r>
-      </w:hyperlink>
-    </w:p>
-    <w:p>
-      <w:pPr>
-        <w:pStyle w:val="Heading1"/>
-        <w:keepNext/>
-      </w:pPr>
-      <w:r>
-        <w:t>What David Leads does</w:t>
-      </w:r>
-    </w:p>
-    <w:p>
-      <w:pPr>
-        <w:spacing w:after="120" w:line="300" w:lineRule="auto"/>
-      </w:pPr>
-      <w:r>
-        <w:rPr>
-          <w:rFonts w:ascii="Calibri" w:hAnsi="Calibri"/>
-          <w:i w:val="0"/>
-          <w:color w:val="1F2933"/>
-        </w:rPr>
-        <w:t>It gathers current organization-level records from official public sources, shows the business event that changed, explains why the timing may deserve research, and links back to the source record. It is a research desk, not a purchased contact list.</w:t>
-      </w:r>
-    </w:p>
-    <w:p>
-      <w:pPr>
-        <w:numPr>
-          <w:ilvl w:val="0"/>
-          <w:numId w:val="10"/>
-        </w:numPr>
-        <w:spacing w:after="80" w:line="300" w:lineRule="auto"/>
-      </w:pPr>
-      <w:r>
-        <w:rPr>
-          <w:rFonts w:ascii="Calibri" w:hAnsi="Calibri"/>
-          <w:color w:val="1F2933"/>
-        </w:rPr>
-        <w:t>Choose all 27 Eastern markets, a region, or one state.</w:t>
-      </w:r>
-    </w:p>
-    <w:p>
-      <w:pPr>
-        <w:numPr>
-          <w:ilvl w:val="0"/>
-          <w:numId w:val="10"/>
-        </w:numPr>
-        <w:spacing w:after="80" w:line="300" w:lineRule="auto"/>
-      </w:pPr>
-      <w:r>
-        <w:rPr>
-          <w:rFonts w:ascii="Calibri" w:hAnsi="Calibri"/>
-          <w:color w:val="1F2933"/>
-        </w:rPr>
-        <w:t>See live business and facility records with source links and receipts.</w:t>
-      </w:r>
-    </w:p>
-    <w:p>
-      <w:pPr>
-        <w:numPr>
-          <w:ilvl w:val="0"/>
-          <w:numId w:val="10"/>
-        </w:numPr>
-        <w:spacing w:after="80" w:line="300" w:lineRule="auto"/>
-      </w:pPr>
-      <w:r>
-        <w:rPr>
-          <w:rFonts w:ascii="Calibri" w:hAnsi="Calibri"/>
-          <w:color w:val="1F2933"/>
-        </w:rPr>
-        <w:t>Focus on the strongest timing signals before doing manual research.</w:t>
-      </w:r>
-    </w:p>
-    <w:p>
-      <w:pPr>
-        <w:numPr>
-          <w:ilvl w:val="0"/>
-          <w:numId w:val="10"/>
-        </w:numPr>
-        <w:spacing w:after="80" w:line="300" w:lineRule="auto"/>
-      </w:pPr>
-      <w:r>
-        <w:rPr>
-          <w:rFonts w:ascii="Calibri" w:hAnsi="Calibri"/>
-          <w:color w:val="1F2933"/>
-        </w:rPr>
-        <w:t>Keep every outreach decision behind a human compliance check.</w:t>
-      </w:r>
-    </w:p>
-    <w:p>
-      <w:pPr>
-        <w:pStyle w:val="Heading2"/>
-        <w:keepNext/>
-      </w:pPr>
-      <w:r>
-        <w:t>Verified live check</w:t>
-      </w:r>
-    </w:p>
-    <w:p>
-      <w:pPr>
-        <w:spacing w:after="120" w:line="300" w:lineRule="auto"/>
-      </w:pPr>
-      <w:r>
-        <w:rPr>
-          <w:rFonts w:ascii="Calibri" w:hAnsi="Calibri"/>
-          <w:i/>
-          <w:color w:val="5A6B7C"/>
-        </w:rPr>
-        <w:t>The figures below were observed during the August 1 verification. Counts change as public sources change.</w:t>
+        <w:t>From source-verified business signal to the next lawful broker action</w:t>
       </w:r>
     </w:p>
     <w:tbl>
       <w:tblPr>
+        <w:tblStyle w:val="TableGrid"/>
         <w:tblW w:type="dxa" w:w="9360"/>
+        <w:jc w:val="left"/>
         <w:tblLayout w:type="fixed"/>
         <w:tblLook w:firstColumn="1" w:firstRow="1" w:lastColumn="0" w:lastRow="0" w:noHBand="0" w:noVBand="1" w:val="04A0"/>
-        <w:jc w:val="left"/>
-        <w:tblInd w:w="120" w:type="dxa"/>
+        <w:tblInd w:type="dxa" w:w="120"/>
       </w:tblPr>
       <w:tblGrid>
-        <w:gridCol w:w="2700"/>
-        <w:gridCol w:w="6660"/>
+        <w:gridCol w:w="2200"/>
+        <w:gridCol w:w="7160"/>
       </w:tblGrid>
       <w:tr>
         <w:trPr>
@@ -214,57 +66,57 @@
         </w:trPr>
         <w:tc>
           <w:tcPr>
-            <w:tcW w:type="dxa" w:w="2700"/>
+            <w:tcW w:type="dxa" w:w="2200"/>
             <w:vAlign w:val="center"/>
+            <w:shd w:fill="0B2545"/>
             <w:tcMar>
-              <w:top w:w="80" w:type="dxa"/>
-              <w:bottom w:w="80" w:type="dxa"/>
+              <w:top w:w="130" w:type="dxa"/>
+              <w:bottom w:w="130" w:type="dxa"/>
               <w:start w:w="120" w:type="dxa"/>
               <w:end w:w="120" w:type="dxa"/>
             </w:tcMar>
-            <w:shd w:fill="0A2540" w:val="clear"/>
           </w:tcPr>
           <w:p>
             <w:pPr>
-              <w:spacing w:after="0" w:line="276" w:lineRule="auto"/>
-              <w:jc w:val="left"/>
+              <w:spacing w:after="0"/>
             </w:pPr>
             <w:r>
               <w:rPr>
                 <w:rFonts w:ascii="Calibri" w:hAnsi="Calibri"/>
                 <w:b/>
+                <w:i w:val="0"/>
                 <w:color w:val="FFFFFF"/>
-                <w:sz w:val="21"/>
+                <w:sz w:val="17"/>
               </w:rPr>
-              <w:t>Check</w:t>
+              <w:t>AT A GLANCE</w:t>
             </w:r>
           </w:p>
         </w:tc>
         <w:tc>
           <w:tcPr>
-            <w:tcW w:type="dxa" w:w="6660"/>
+            <w:tcW w:type="dxa" w:w="7160"/>
             <w:vAlign w:val="center"/>
+            <w:shd w:fill="0B2545"/>
             <w:tcMar>
-              <w:top w:w="80" w:type="dxa"/>
-              <w:bottom w:w="80" w:type="dxa"/>
+              <w:top w:w="130" w:type="dxa"/>
+              <w:bottom w:w="130" w:type="dxa"/>
               <w:start w:w="120" w:type="dxa"/>
               <w:end w:w="120" w:type="dxa"/>
             </w:tcMar>
-            <w:shd w:fill="0A2540" w:val="clear"/>
           </w:tcPr>
           <w:p>
             <w:pPr>
-              <w:spacing w:after="0" w:line="276" w:lineRule="auto"/>
-              <w:jc w:val="left"/>
+              <w:spacing w:after="0"/>
             </w:pPr>
             <w:r>
               <w:rPr>
                 <w:rFonts w:ascii="Calibri" w:hAnsi="Calibri"/>
                 <w:b/>
+                <w:i w:val="0"/>
                 <w:color w:val="FFFFFF"/>
-                <w:sz w:val="21"/>
+                <w:sz w:val="17"/>
               </w:rPr>
-              <w:t>Observed result</w:t>
+              <w:t>WHAT IT MEANS</w:t>
             </w:r>
           </w:p>
         </w:tc>
@@ -272,55 +124,57 @@
       <w:tr>
         <w:tc>
           <w:tcPr>
-            <w:tcW w:type="dxa" w:w="2700"/>
+            <w:tcW w:type="dxa" w:w="2200"/>
             <w:vAlign w:val="center"/>
+            <w:shd w:fill="E8EEF5"/>
             <w:tcMar>
-              <w:top w:w="80" w:type="dxa"/>
-              <w:bottom w:w="80" w:type="dxa"/>
+              <w:top w:w="130" w:type="dxa"/>
+              <w:bottom w:w="130" w:type="dxa"/>
               <w:start w:w="120" w:type="dxa"/>
               <w:end w:w="120" w:type="dxa"/>
             </w:tcMar>
           </w:tcPr>
           <w:p>
             <w:pPr>
-              <w:spacing w:after="0" w:line="276" w:lineRule="auto"/>
-              <w:jc w:val="left"/>
+              <w:spacing w:after="40" w:line="264" w:lineRule="auto"/>
             </w:pPr>
             <w:r>
               <w:rPr>
                 <w:rFonts w:ascii="Calibri" w:hAnsi="Calibri"/>
                 <w:b/>
-                <w:color w:val="0A2540"/>
-                <w:sz w:val="21"/>
+                <w:i w:val="0"/>
+                <w:color w:val="148984"/>
+                <w:sz w:val="17"/>
               </w:rPr>
-              <w:t>Access</w:t>
+              <w:t>OPEN</w:t>
             </w:r>
           </w:p>
         </w:tc>
         <w:tc>
           <w:tcPr>
-            <w:tcW w:type="dxa" w:w="6660"/>
+            <w:tcW w:type="dxa" w:w="7160"/>
             <w:vAlign w:val="center"/>
+            <w:shd w:fill="FFFFFF"/>
             <w:tcMar>
-              <w:top w:w="80" w:type="dxa"/>
-              <w:bottom w:w="80" w:type="dxa"/>
+              <w:top w:w="130" w:type="dxa"/>
+              <w:bottom w:w="130" w:type="dxa"/>
               <w:start w:w="120" w:type="dxa"/>
               <w:end w:w="120" w:type="dxa"/>
             </w:tcMar>
           </w:tcPr>
           <w:p>
             <w:pPr>
-              <w:spacing w:after="0" w:line="276" w:lineRule="auto"/>
-              <w:jc w:val="left"/>
+              <w:spacing w:before="0" w:after="0" w:line="276" w:lineRule="auto"/>
             </w:pPr>
             <w:r>
               <w:rPr>
                 <w:rFonts w:ascii="Calibri" w:hAnsi="Calibri"/>
-                <w:b w:val="0"/>
-                <w:color w:val="1F2933"/>
+                <w:b/>
+                <w:i w:val="0"/>
+                <w:color w:val="0B2545"/>
                 <w:sz w:val="21"/>
               </w:rPr>
-              <w:t>Public research opens with no login.</w:t>
+              <w:t>No login for the public research view</w:t>
             </w:r>
           </w:p>
         </w:tc>
@@ -328,57 +182,57 @@
       <w:tr>
         <w:tc>
           <w:tcPr>
-            <w:tcW w:type="dxa" w:w="2700"/>
-            <w:shd w:fill="F5F8FB" w:val="clear"/>
+            <w:tcW w:type="dxa" w:w="2200"/>
             <w:vAlign w:val="center"/>
+            <w:shd w:fill="E8EEF5"/>
             <w:tcMar>
-              <w:top w:w="80" w:type="dxa"/>
-              <w:bottom w:w="80" w:type="dxa"/>
+              <w:top w:w="130" w:type="dxa"/>
+              <w:bottom w:w="130" w:type="dxa"/>
               <w:start w:w="120" w:type="dxa"/>
               <w:end w:w="120" w:type="dxa"/>
             </w:tcMar>
           </w:tcPr>
           <w:p>
             <w:pPr>
-              <w:spacing w:after="0" w:line="276" w:lineRule="auto"/>
-              <w:jc w:val="left"/>
+              <w:spacing w:after="40" w:line="264" w:lineRule="auto"/>
             </w:pPr>
             <w:r>
               <w:rPr>
                 <w:rFonts w:ascii="Calibri" w:hAnsi="Calibri"/>
                 <w:b/>
-                <w:color w:val="0A2540"/>
-                <w:sz w:val="21"/>
+                <w:i w:val="0"/>
+                <w:color w:val="148984"/>
+                <w:sz w:val="17"/>
               </w:rPr>
-              <w:t>Territory</w:t>
+              <w:t>COVERAGE</w:t>
             </w:r>
           </w:p>
         </w:tc>
         <w:tc>
           <w:tcPr>
-            <w:tcW w:type="dxa" w:w="6660"/>
-            <w:shd w:fill="F5F8FB" w:val="clear"/>
+            <w:tcW w:type="dxa" w:w="7160"/>
             <w:vAlign w:val="center"/>
+            <w:shd w:fill="FFFFFF"/>
             <w:tcMar>
-              <w:top w:w="80" w:type="dxa"/>
-              <w:bottom w:w="80" w:type="dxa"/>
+              <w:top w:w="130" w:type="dxa"/>
+              <w:bottom w:w="130" w:type="dxa"/>
               <w:start w:w="120" w:type="dxa"/>
               <w:end w:w="120" w:type="dxa"/>
             </w:tcMar>
           </w:tcPr>
           <w:p>
             <w:pPr>
-              <w:spacing w:after="0" w:line="276" w:lineRule="auto"/>
-              <w:jc w:val="left"/>
+              <w:spacing w:before="0" w:after="0" w:line="276" w:lineRule="auto"/>
             </w:pPr>
             <w:r>
               <w:rPr>
                 <w:rFonts w:ascii="Calibri" w:hAnsi="Calibri"/>
-                <w:b w:val="0"/>
-                <w:color w:val="1F2933"/>
+                <w:b/>
+                <w:i w:val="0"/>
+                <w:color w:val="0B2545"/>
                 <w:sz w:val="21"/>
               </w:rPr>
-              <w:t>27 Eastern states are selectable on desktop and mobile.</w:t>
+              <w:t>27 Eastern U.S. markets</w:t>
             </w:r>
           </w:p>
         </w:tc>
@@ -386,55 +240,57 @@
       <w:tr>
         <w:tc>
           <w:tcPr>
-            <w:tcW w:type="dxa" w:w="2700"/>
+            <w:tcW w:type="dxa" w:w="2200"/>
             <w:vAlign w:val="center"/>
+            <w:shd w:fill="E8EEF5"/>
             <w:tcMar>
-              <w:top w:w="80" w:type="dxa"/>
-              <w:bottom w:w="80" w:type="dxa"/>
+              <w:top w:w="130" w:type="dxa"/>
+              <w:bottom w:w="130" w:type="dxa"/>
               <w:start w:w="120" w:type="dxa"/>
               <w:end w:w="120" w:type="dxa"/>
             </w:tcMar>
           </w:tcPr>
           <w:p>
             <w:pPr>
-              <w:spacing w:after="0" w:line="276" w:lineRule="auto"/>
-              <w:jc w:val="left"/>
+              <w:spacing w:after="40" w:line="264" w:lineRule="auto"/>
             </w:pPr>
             <w:r>
               <w:rPr>
                 <w:rFonts w:ascii="Calibri" w:hAnsi="Calibri"/>
                 <w:b/>
-                <w:color w:val="0A2540"/>
-                <w:sz w:val="21"/>
+                <w:i w:val="0"/>
+                <w:color w:val="148984"/>
+                <w:sz w:val="17"/>
               </w:rPr>
-              <w:t>Live records</w:t>
+              <w:t>PRIMARY USE</w:t>
             </w:r>
           </w:p>
         </w:tc>
         <w:tc>
           <w:tcPr>
-            <w:tcW w:type="dxa" w:w="6660"/>
+            <w:tcW w:type="dxa" w:w="7160"/>
             <w:vAlign w:val="center"/>
+            <w:shd w:fill="FFFFFF"/>
             <w:tcMar>
-              <w:top w:w="80" w:type="dxa"/>
-              <w:bottom w:w="80" w:type="dxa"/>
+              <w:top w:w="130" w:type="dxa"/>
+              <w:bottom w:w="130" w:type="dxa"/>
               <w:start w:w="120" w:type="dxa"/>
               <w:end w:w="120" w:type="dxa"/>
             </w:tcMar>
           </w:tcPr>
           <w:p>
             <w:pPr>
-              <w:spacing w:after="0" w:line="276" w:lineRule="auto"/>
-              <w:jc w:val="left"/>
+              <w:spacing w:before="0" w:after="0" w:line="276" w:lineRule="auto"/>
             </w:pPr>
             <w:r>
               <w:rPr>
                 <w:rFonts w:ascii="Calibri" w:hAnsi="Calibri"/>
-                <w:b w:val="0"/>
-                <w:color w:val="1F2933"/>
+                <w:b/>
+                <w:i w:val="0"/>
+                <w:color w:val="0B2545"/>
                 <w:sz w:val="21"/>
               </w:rPr>
-              <w:t>70 live records across the Eastern view; 53 in a deeper New York pull.</w:t>
+              <w:t>Choose what to research first</w:t>
             </w:r>
           </w:p>
         </w:tc>
@@ -442,121 +298,120 @@
       <w:tr>
         <w:tc>
           <w:tcPr>
-            <w:tcW w:type="dxa" w:w="2700"/>
-            <w:shd w:fill="F5F8FB" w:val="clear"/>
+            <w:tcW w:type="dxa" w:w="2200"/>
             <w:vAlign w:val="center"/>
+            <w:shd w:fill="E8EEF5"/>
             <w:tcMar>
-              <w:top w:w="80" w:type="dxa"/>
-              <w:bottom w:w="80" w:type="dxa"/>
+              <w:top w:w="130" w:type="dxa"/>
+              <w:bottom w:w="130" w:type="dxa"/>
               <w:start w:w="120" w:type="dxa"/>
               <w:end w:w="120" w:type="dxa"/>
             </w:tcMar>
           </w:tcPr>
           <w:p>
             <w:pPr>
-              <w:spacing w:after="0" w:line="276" w:lineRule="auto"/>
-              <w:jc w:val="left"/>
+              <w:spacing w:after="40" w:line="264" w:lineRule="auto"/>
             </w:pPr>
             <w:r>
               <w:rPr>
                 <w:rFonts w:ascii="Calibri" w:hAnsi="Calibri"/>
                 <w:b/>
-                <w:color w:val="0A2540"/>
-                <w:sz w:val="21"/>
+                <w:i w:val="0"/>
+                <w:color w:val="148984"/>
+                <w:sz w:val="17"/>
               </w:rPr>
-              <w:t>Examples</w:t>
+              <w:t>CONTACT</w:t>
             </w:r>
           </w:p>
         </w:tc>
         <w:tc>
           <w:tcPr>
-            <w:tcW w:type="dxa" w:w="6660"/>
-            <w:shd w:fill="F5F8FB" w:val="clear"/>
+            <w:tcW w:type="dxa" w:w="7160"/>
             <w:vAlign w:val="center"/>
+            <w:shd w:fill="FFFFFF"/>
             <w:tcMar>
-              <w:top w:w="80" w:type="dxa"/>
-              <w:bottom w:w="80" w:type="dxa"/>
+              <w:top w:w="130" w:type="dxa"/>
+              <w:bottom w:w="130" w:type="dxa"/>
               <w:start w:w="120" w:type="dxa"/>
               <w:end w:w="120" w:type="dxa"/>
             </w:tcMar>
           </w:tcPr>
           <w:p>
             <w:pPr>
-              <w:spacing w:after="0" w:line="276" w:lineRule="auto"/>
-              <w:jc w:val="left"/>
-            </w:pPr>
-            <w:r>
-              <w:rPr>
-                <w:rFonts w:ascii="Calibri" w:hAnsi="Calibri"/>
-                <w:b w:val="0"/>
-                <w:color w:val="1F2933"/>
-                <w:sz w:val="21"/>
-              </w:rPr>
-              <w:t>0 sample records in the verified live pulls.</w:t>
-            </w:r>
-          </w:p>
-        </w:tc>
-      </w:tr>
-      <w:tr>
-        <w:tc>
-          <w:tcPr>
-            <w:tcW w:type="dxa" w:w="2700"/>
-            <w:vAlign w:val="center"/>
-            <w:tcMar>
-              <w:top w:w="80" w:type="dxa"/>
-              <w:bottom w:w="80" w:type="dxa"/>
-              <w:start w:w="120" w:type="dxa"/>
-              <w:end w:w="120" w:type="dxa"/>
-            </w:tcMar>
-          </w:tcPr>
-          <w:p>
-            <w:pPr>
-              <w:spacing w:after="0" w:line="276" w:lineRule="auto"/>
-              <w:jc w:val="left"/>
+              <w:spacing w:before="0" w:after="0" w:line="276" w:lineRule="auto"/>
             </w:pPr>
             <w:r>
               <w:rPr>
                 <w:rFonts w:ascii="Calibri" w:hAnsi="Calibri"/>
                 <w:b/>
-                <w:color w:val="0A2540"/>
+                <w:i w:val="0"/>
+                <w:color w:val="0B2545"/>
                 <w:sz w:val="21"/>
               </w:rPr>
-              <w:t>Health</w:t>
-            </w:r>
-          </w:p>
-        </w:tc>
-        <w:tc>
-          <w:tcPr>
-            <w:tcW w:type="dxa" w:w="6660"/>
-            <w:vAlign w:val="center"/>
-            <w:tcMar>
-              <w:top w:w="80" w:type="dxa"/>
-              <w:bottom w:w="80" w:type="dxa"/>
-              <w:start w:w="120" w:type="dxa"/>
-              <w:end w:w="120" w:type="dxa"/>
-            </w:tcMar>
-          </w:tcPr>
-          <w:p>
-            <w:pPr>
-              <w:spacing w:after="0" w:line="276" w:lineRule="auto"/>
-              <w:jc w:val="left"/>
-            </w:pPr>
-            <w:r>
-              <w:rPr>
-                <w:rFonts w:ascii="Calibri" w:hAnsi="Calibri"/>
-                <w:b w:val="0"/>
-                <w:color w:val="1F2933"/>
-                <w:sz w:val="21"/>
-              </w:rPr>
-              <w:t>Application, public data, and broker database all reported ready.</w:t>
+              <w:t>Always blocked until protected clearance</w:t>
             </w:r>
           </w:p>
         </w:tc>
       </w:tr>
     </w:tbl>
     <w:p>
+      <w:pPr>
+        <w:spacing w:before="0" w:after="40" w:line="300" w:lineRule="auto"/>
+      </w:pPr>
       <w:r>
-        <w:br w:type="page"/>
+        <w:rPr>
+          <w:rFonts w:ascii="Calibri" w:hAnsi="Calibri"/>
+          <w:b/>
+          <w:i w:val="0"/>
+          <w:color w:val="148984"/>
+          <w:sz w:val="18"/>
+        </w:rPr>
+        <w:t>Open the application</w:t>
+      </w:r>
+    </w:p>
+    <w:p>
+      <w:pPr>
+        <w:spacing w:before="0" w:after="240" w:line="300" w:lineRule="auto"/>
+      </w:pPr>
+      <w:r>
+        <w:rPr>
+          <w:rFonts w:ascii="Calibri" w:hAnsi="Calibri"/>
+          <w:b/>
+          <w:i w:val="0"/>
+          <w:color w:val="2E74B5"/>
+          <w:sz w:val="24"/>
+        </w:rPr>
+        <w:t>https://szlholdings-david-leads.hf.space/</w:t>
+      </w:r>
+    </w:p>
+    <w:p>
+      <w:pPr>
+        <w:spacing w:before="80" w:after="200" w:line="288" w:lineRule="auto"/>
+        <w:ind w:left="173" w:right="173"/>
+        <w:shd w:fill="E7F5F3"/>
+        <w:pBdr>
+          <w:left w:val="single" w:sz="18" w:space="8" w:color="148984"/>
+        </w:pBdr>
+      </w:pPr>
+      <w:r>
+        <w:rPr>
+          <w:rFonts w:ascii="Calibri" w:hAnsi="Calibri"/>
+          <w:b/>
+          <w:i w:val="0"/>
+          <w:color w:val="0B2545"/>
+          <w:sz w:val="22"/>
+        </w:rPr>
+        <w:t xml:space="preserve">The simple rule: </w:t>
+      </w:r>
+      <w:r>
+        <w:rPr>
+          <w:rFonts w:ascii="Calibri" w:hAnsi="Calibri"/>
+          <w:b w:val="0"/>
+          <w:i w:val="0"/>
+          <w:color w:val="1C2737"/>
+          <w:sz w:val="22"/>
+        </w:rPr>
+        <w:t>Use David Leads to decide what to research first. Use the official record to verify why. Use the protected clearance process to decide whether contact is permitted.</w:t>
       </w:r>
     </w:p>
     <w:p>
@@ -565,273 +420,52 @@
         <w:keepNext/>
       </w:pPr>
       <w:r>
-        <w:t>Your first five minutes</w:t>
+        <w:t>What this application does</w:t>
       </w:r>
     </w:p>
     <w:p>
       <w:pPr>
-        <w:numPr>
-          <w:ilvl w:val="0"/>
-          <w:numId w:val="11"/>
-        </w:numPr>
-        <w:spacing w:after="80" w:line="300" w:lineRule="auto"/>
+        <w:spacing w:before="0" w:after="120" w:line="300" w:lineRule="auto"/>
       </w:pPr>
       <w:r>
         <w:rPr>
           <w:rFonts w:ascii="Calibri" w:hAnsi="Calibri"/>
-          <w:color w:val="1F2933"/>
+          <w:b w:val="0"/>
+          <w:i w:val="0"/>
+          <w:color w:val="1C2737"/>
+          <w:sz w:val="22"/>
         </w:rPr>
-        <w:t>Open the link. The research workspace loads without a login.</w:t>
+        <w:t>David Leads organizes official organization-level records into a practical research queue. It shows the company, the observed change, the timing, the likely protection-planning fit, and the evidence behind the item.</w:t>
       </w:r>
     </w:p>
     <w:p>
       <w:pPr>
-        <w:numPr>
-          <w:ilvl w:val="0"/>
-          <w:numId w:val="11"/>
-        </w:numPr>
-        <w:spacing w:after="80" w:line="300" w:lineRule="auto"/>
-      </w:pPr>
-      <w:r>
-        <w:rPr>
-          <w:rFonts w:ascii="Calibri" w:hAnsi="Calibri"/>
-          <w:color w:val="1F2933"/>
-        </w:rPr>
-        <w:t>Choose All East, a region, or one state. One state runs a deeper pull.</w:t>
-      </w:r>
-    </w:p>
-    <w:p>
-      <w:pPr>
-        <w:numPr>
-          <w:ilvl w:val="0"/>
-          <w:numId w:val="11"/>
-        </w:numPr>
-        <w:spacing w:after="80" w:line="300" w:lineRule="auto"/>
-      </w:pPr>
-      <w:r>
-        <w:rPr>
-          <w:rFonts w:ascii="Calibri" w:hAnsi="Calibri"/>
-          <w:color w:val="1F2933"/>
-        </w:rPr>
-        <w:t>Read the Broker brief near the top. It points to the strongest current timing pattern.</w:t>
-      </w:r>
-    </w:p>
-    <w:p>
-      <w:pPr>
-        <w:numPr>
-          <w:ilvl w:val="0"/>
-          <w:numId w:val="11"/>
-        </w:numPr>
-        <w:spacing w:after="80" w:line="300" w:lineRule="auto"/>
-      </w:pPr>
-      <w:r>
-        <w:rPr>
-          <w:rFonts w:ascii="Calibri" w:hAnsi="Calibri"/>
-          <w:color w:val="1F2933"/>
-        </w:rPr>
-        <w:t>Use the deal-moment buttons to narrow the list: life-plan timing, growth and awards, operational change, or needs research.</w:t>
-      </w:r>
-    </w:p>
-    <w:p>
-      <w:pPr>
-        <w:numPr>
-          <w:ilvl w:val="0"/>
-          <w:numId w:val="11"/>
-        </w:numPr>
-        <w:spacing w:after="80" w:line="300" w:lineRule="auto"/>
-      </w:pPr>
-      <w:r>
-        <w:rPr>
-          <w:rFonts w:ascii="Calibri" w:hAnsi="Calibri"/>
-          <w:color w:val="1F2933"/>
-        </w:rPr>
-        <w:t>Open an organization to see the public event, likely fit, evidence, limits, and the next research step.</w:t>
-      </w:r>
-    </w:p>
-    <w:p>
-      <w:pPr>
-        <w:numPr>
-          <w:ilvl w:val="0"/>
-          <w:numId w:val="11"/>
-        </w:numPr>
-        <w:spacing w:after="80" w:line="300" w:lineRule="auto"/>
-      </w:pPr>
-      <w:r>
-        <w:rPr>
-          <w:rFonts w:ascii="Calibri" w:hAnsi="Calibri"/>
-          <w:color w:val="1F2933"/>
-        </w:rPr>
-        <w:t>Open the official source before using any claim in a conversation.</w:t>
-      </w:r>
-    </w:p>
-    <w:p>
-      <w:pPr>
-        <w:pStyle w:val="Heading2"/>
-        <w:keepNext/>
-      </w:pPr>
-      <w:r>
-        <w:t>What the screen is telling you</w:t>
-      </w:r>
-    </w:p>
-    <w:p>
-      <w:pPr>
-        <w:spacing w:after="120" w:line="300" w:lineRule="auto"/>
+        <w:spacing w:before="80" w:after="200" w:line="288" w:lineRule="auto"/>
+        <w:ind w:left="173" w:right="173"/>
+        <w:shd w:fill="FFF7E5"/>
+        <w:pBdr>
+          <w:left w:val="single" w:sz="18" w:space="8" w:color="B78921"/>
+        </w:pBdr>
       </w:pPr>
       <w:r>
         <w:rPr>
           <w:rFonts w:ascii="Calibri" w:hAnsi="Calibri"/>
           <w:b/>
-          <w:color w:val="0A2540"/>
+          <w:i w:val="0"/>
+          <w:color w:val="0B2545"/>
+          <w:sz w:val="22"/>
         </w:rPr>
-        <w:t xml:space="preserve">Live organizations. </w:t>
+        <w:t xml:space="preserve">Important: </w:t>
       </w:r>
       <w:r>
         <w:rPr>
           <w:rFonts w:ascii="Calibri" w:hAnsi="Calibri"/>
+          <w:b w:val="0"/>
           <w:i w:val="0"/>
-          <w:color w:val="1F2933"/>
+          <w:color w:val="1C2737"/>
+          <w:sz w:val="22"/>
         </w:rPr>
-        <w:t>Live organizations</w:t>
-      </w:r>
-    </w:p>
-    <w:p>
-      <w:pPr>
-        <w:spacing w:after="120" w:line="300" w:lineRule="auto"/>
-      </w:pPr>
-      <w:r>
-        <w:rPr>
-          <w:rFonts w:ascii="Calibri" w:hAnsi="Calibri"/>
-          <w:i w:val="0"/>
-          <w:color w:val="1F2933"/>
-        </w:rPr>
-        <w:t>The number of official records in the selected market. The count changes with the territory and source response.</w:t>
-      </w:r>
-    </w:p>
-    <w:p>
-      <w:pPr>
-        <w:spacing w:after="120" w:line="300" w:lineRule="auto"/>
-      </w:pPr>
-      <w:r>
-        <w:rPr>
-          <w:rFonts w:ascii="Calibri" w:hAnsi="Calibri"/>
-          <w:b/>
-          <w:color w:val="0A2540"/>
-        </w:rPr>
-        <w:t xml:space="preserve">Source coverage. </w:t>
-      </w:r>
-      <w:r>
-        <w:rPr>
-          <w:rFonts w:ascii="Calibri" w:hAnsi="Calibri"/>
-          <w:i w:val="0"/>
-          <w:color w:val="1F2933"/>
-        </w:rPr>
-        <w:t>Source coverage</w:t>
-      </w:r>
-    </w:p>
-    <w:p>
-      <w:pPr>
-        <w:spacing w:after="120" w:line="300" w:lineRule="auto"/>
-      </w:pPr>
-      <w:r>
-        <w:rPr>
-          <w:rFonts w:ascii="Calibri" w:hAnsi="Calibri"/>
-          <w:i w:val="0"/>
-          <w:color w:val="1F2933"/>
-        </w:rPr>
-        <w:t>How many source lanes answered live. An unavailable source remains visible; it is never replaced by a fake record.</w:t>
-      </w:r>
-    </w:p>
-    <w:p>
-      <w:pPr>
-        <w:spacing w:after="120" w:line="300" w:lineRule="auto"/>
-      </w:pPr>
-      <w:r>
-        <w:rPr>
-          <w:rFonts w:ascii="Calibri" w:hAnsi="Calibri"/>
-          <w:b/>
-          <w:color w:val="0A2540"/>
-        </w:rPr>
-        <w:t xml:space="preserve">Needs research. </w:t>
-      </w:r>
-      <w:r>
-        <w:rPr>
-          <w:rFonts w:ascii="Calibri" w:hAnsi="Calibri"/>
-          <w:i w:val="0"/>
-          <w:color w:val="1F2933"/>
-        </w:rPr>
-        <w:t>Needs research</w:t>
-      </w:r>
-    </w:p>
-    <w:p>
-      <w:pPr>
-        <w:spacing w:after="120" w:line="300" w:lineRule="auto"/>
-      </w:pPr>
-      <w:r>
-        <w:rPr>
-          <w:rFonts w:ascii="Calibri" w:hAnsi="Calibri"/>
-          <w:i w:val="0"/>
-          <w:color w:val="1F2933"/>
-        </w:rPr>
-        <w:t>Records worth checking. This is not the number of people cleared for contact.</w:t>
-      </w:r>
-    </w:p>
-    <w:p>
-      <w:pPr>
-        <w:spacing w:after="120" w:line="300" w:lineRule="auto"/>
-      </w:pPr>
-      <w:r>
-        <w:rPr>
-          <w:rFonts w:ascii="Calibri" w:hAnsi="Calibri"/>
-          <w:b/>
-          <w:color w:val="0A2540"/>
-        </w:rPr>
-        <w:t xml:space="preserve">Timing window. </w:t>
-      </w:r>
-      <w:r>
-        <w:rPr>
-          <w:rFonts w:ascii="Calibri" w:hAnsi="Calibri"/>
-          <w:i w:val="0"/>
-          <w:color w:val="1F2933"/>
-        </w:rPr>
-        <w:t>Timing window</w:t>
-      </w:r>
-    </w:p>
-    <w:p>
-      <w:pPr>
-        <w:spacing w:after="120" w:line="300" w:lineRule="auto"/>
-      </w:pPr>
-      <w:r>
-        <w:rPr>
-          <w:rFonts w:ascii="Calibri" w:hAnsi="Calibri"/>
-          <w:i w:val="0"/>
-          <w:color w:val="1F2933"/>
-        </w:rPr>
-        <w:t>A date or filing field that may make the organization worth researching now. It is not proof of a sale, renewal, dissatisfaction, or insurance need.</w:t>
-      </w:r>
-    </w:p>
-    <w:p>
-      <w:pPr>
-        <w:spacing w:before="80" w:after="200" w:line="288" w:lineRule="auto"/>
-        <w:shd w:fill="FFF7E6" w:val="clear"/>
-        <w:pBdr>
-          <w:left w:val="single" w:sz="18" w:space="8" w:color="168F89"/>
-        </w:pBdr>
-        <w:ind w:left="180" w:right="120"/>
-      </w:pPr>
-      <w:r>
-        <w:rPr>
-          <w:rFonts w:ascii="Calibri" w:hAnsi="Calibri"/>
-          <w:b/>
-          <w:color w:val="0A2540"/>
-        </w:rPr>
-        <w:t xml:space="preserve">The key distinction: </w:t>
-      </w:r>
-      <w:r>
-        <w:rPr>
-          <w:rFonts w:ascii="Calibri" w:hAnsi="Calibri"/>
-          <w:color w:val="1F2933"/>
-        </w:rPr>
-        <w:t>A visible public record is permission to research the organization. It is not permission to call, text, email, quote, or recommend a product.</w:t>
+        <w:t>It is not a purchased contact list. It never turns a public record into permission to call, email, market, or make an underwriting decision.</w:t>
       </w:r>
     </w:p>
     <w:p>
@@ -845,503 +479,187 @@
         <w:keepNext/>
       </w:pPr>
       <w:r>
-        <w:t>How to use one opportunity</w:t>
-      </w:r>
-    </w:p>
-    <w:p>
-      <w:pPr>
-        <w:pStyle w:val="Heading2"/>
-        <w:keepNext/>
-      </w:pPr>
-      <w:r>
-        <w:t>1. Verify the moment</w:t>
+        <w:t>Start your day in five minutes</w:t>
       </w:r>
     </w:p>
     <w:p>
       <w:pPr>
         <w:spacing w:after="120" w:line="300" w:lineRule="auto"/>
+        <w:ind w:left="540" w:hanging="271"/>
       </w:pPr>
       <w:r>
         <w:rPr>
           <w:rFonts w:ascii="Calibri" w:hAnsi="Calibri"/>
+          <w:b/>
           <w:i w:val="0"/>
-          <w:color w:val="1F2933"/>
+          <w:color w:val="0B2545"/>
+          <w:sz w:val="22"/>
         </w:rPr>
-        <w:t>Open the official source and confirm the organization name, date, location, and the exact event shown. If the record cannot be confirmed, stop and mark it for later research.</w:t>
+        <w:t xml:space="preserve">1. </w:t>
       </w:r>
-    </w:p>
-    <w:p>
-      <w:pPr>
-        <w:pStyle w:val="Heading2"/>
-        <w:keepNext/>
-      </w:pPr>
       <w:r>
-        <w:t>2. Qualify the fit</w:t>
+        <w:rPr>
+          <w:rFonts w:ascii="Calibri" w:hAnsi="Calibri"/>
+          <w:b/>
+          <w:i w:val="0"/>
+          <w:color w:val="0B2545"/>
+          <w:sz w:val="22"/>
+        </w:rPr>
+        <w:t xml:space="preserve">Read the Broker brief. </w:t>
+      </w:r>
+      <w:r>
+        <w:rPr>
+          <w:rFonts w:ascii="Calibri" w:hAnsi="Calibri"/>
+          <w:b w:val="0"/>
+          <w:i w:val="0"/>
+          <w:color w:val="1C2737"/>
+          <w:sz w:val="22"/>
+        </w:rPr>
+        <w:t>It summarizes the strongest timing pattern in the current official-source pull.</w:t>
       </w:r>
     </w:p>
     <w:p>
       <w:pPr>
         <w:spacing w:after="120" w:line="300" w:lineRule="auto"/>
+        <w:ind w:left="540" w:hanging="271"/>
       </w:pPr>
       <w:r>
         <w:rPr>
           <w:rFonts w:ascii="Calibri" w:hAnsi="Calibri"/>
+          <w:b/>
           <w:i w:val="0"/>
-          <w:color w:val="1F2933"/>
+          <w:color w:val="0B2545"/>
+          <w:sz w:val="22"/>
         </w:rPr>
-        <w:t>Visit the organization's own website. Understand what it does, whether the public event appears relevant, and whether a business-published channel exists. Treat the suggested product fit as a question to investigate, not an answer.</w:t>
+        <w:t xml:space="preserve">2. </w:t>
       </w:r>
-    </w:p>
-    <w:p>
-      <w:pPr>
-        <w:pStyle w:val="Heading2"/>
-        <w:keepNext/>
-      </w:pPr>
       <w:r>
-        <w:t>3. Clear outreach</w:t>
+        <w:rPr>
+          <w:rFonts w:ascii="Calibri" w:hAnsi="Calibri"/>
+          <w:b/>
+          <w:i w:val="0"/>
+          <w:color w:val="0B2545"/>
+          <w:sz w:val="22"/>
+        </w:rPr>
+        <w:t xml:space="preserve">Choose a territory. </w:t>
+      </w:r>
+      <w:r>
+        <w:rPr>
+          <w:rFonts w:ascii="Calibri" w:hAnsi="Calibri"/>
+          <w:b w:val="0"/>
+          <w:i w:val="0"/>
+          <w:color w:val="1C2737"/>
+          <w:sz w:val="22"/>
+        </w:rPr>
+        <w:t>Select All East, a region, or one state. One state runs a deeper market-specific search.</w:t>
       </w:r>
     </w:p>
     <w:p>
       <w:pPr>
         <w:spacing w:after="120" w:line="300" w:lineRule="auto"/>
+        <w:ind w:left="540" w:hanging="271"/>
       </w:pPr>
       <w:r>
         <w:rPr>
           <w:rFonts w:ascii="Calibri" w:hAnsi="Calibri"/>
+          <w:b/>
           <w:i w:val="0"/>
-          <w:color w:val="1F2933"/>
+          <w:color w:val="0B2545"/>
+          <w:sz w:val="22"/>
         </w:rPr>
-        <w:t>Before contact, complete the required suppression, licensing, state-rule, purpose, and channel checks in the protected broker workflow. The public workspace intentionally keeps call-ready at zero.</w:t>
+        <w:t xml:space="preserve">3. </w:t>
+      </w:r>
+      <w:r>
+        <w:rPr>
+          <w:rFonts w:ascii="Calibri" w:hAnsi="Calibri"/>
+          <w:b/>
+          <w:i w:val="0"/>
+          <w:color w:val="0B2545"/>
+          <w:sz w:val="22"/>
+        </w:rPr>
+        <w:t xml:space="preserve">Choose a deal moment. </w:t>
+      </w:r>
+      <w:r>
+        <w:rPr>
+          <w:rFonts w:ascii="Calibri" w:hAnsi="Calibri"/>
+          <w:b w:val="0"/>
+          <w:i w:val="0"/>
+          <w:color w:val="1C2737"/>
+          <w:sz w:val="22"/>
+        </w:rPr>
+        <w:t>Use Life-plan timing, Growth &amp; awards, Operational change, or Needs research.</w:t>
       </w:r>
     </w:p>
     <w:p>
       <w:pPr>
-        <w:pStyle w:val="Heading2"/>
-        <w:keepNext/>
+        <w:spacing w:after="120" w:line="300" w:lineRule="auto"/>
+        <w:ind w:left="540" w:hanging="271"/>
       </w:pPr>
       <w:r>
-        <w:t>Read the record correctly</w:t>
+        <w:rPr>
+          <w:rFonts w:ascii="Calibri" w:hAnsi="Calibri"/>
+          <w:b/>
+          <w:i w:val="0"/>
+          <w:color w:val="0B2545"/>
+          <w:sz w:val="22"/>
+        </w:rPr>
+        <w:t xml:space="preserve">4. </w:t>
+      </w:r>
+      <w:r>
+        <w:rPr>
+          <w:rFonts w:ascii="Calibri" w:hAnsi="Calibri"/>
+          <w:b/>
+          <w:i w:val="0"/>
+          <w:color w:val="0B2545"/>
+          <w:sz w:val="22"/>
+        </w:rPr>
+        <w:t xml:space="preserve">Open the strongest account. </w:t>
+      </w:r>
+      <w:r>
+        <w:rPr>
+          <w:rFonts w:ascii="Calibri" w:hAnsi="Calibri"/>
+          <w:b w:val="0"/>
+          <w:i w:val="0"/>
+          <w:color w:val="1C2737"/>
+          <w:sz w:val="22"/>
+        </w:rPr>
+        <w:t>Review the timing, likely fit, evidence, limitations, and three-step broker action.</w:t>
       </w:r>
     </w:p>
-    <w:tbl>
-      <w:tblPr>
-        <w:tblW w:type="dxa" w:w="9360"/>
-        <w:tblLayout w:type="fixed"/>
-        <w:tblLook w:firstColumn="1" w:firstRow="1" w:lastColumn="0" w:lastRow="0" w:noHBand="0" w:noVBand="1" w:val="04A0"/>
-        <w:jc w:val="left"/>
-        <w:tblInd w:w="120" w:type="dxa"/>
-      </w:tblPr>
-      <w:tblGrid>
-        <w:gridCol w:w="2700"/>
-        <w:gridCol w:w="6660"/>
-      </w:tblGrid>
-      <w:tr>
-        <w:trPr>
-          <w:tblHeader w:val="true"/>
-        </w:trPr>
-        <w:tc>
-          <w:tcPr>
-            <w:tcW w:type="dxa" w:w="2700"/>
-            <w:vAlign w:val="center"/>
-            <w:tcMar>
-              <w:top w:w="80" w:type="dxa"/>
-              <w:bottom w:w="80" w:type="dxa"/>
-              <w:start w:w="120" w:type="dxa"/>
-              <w:end w:w="120" w:type="dxa"/>
-            </w:tcMar>
-            <w:shd w:fill="0A2540" w:val="clear"/>
-          </w:tcPr>
-          <w:p>
-            <w:pPr>
-              <w:spacing w:after="0" w:line="276" w:lineRule="auto"/>
-              <w:jc w:val="left"/>
-            </w:pPr>
-            <w:r>
-              <w:rPr>
-                <w:rFonts w:ascii="Calibri" w:hAnsi="Calibri"/>
-                <w:b/>
-                <w:color w:val="FFFFFF"/>
-                <w:sz w:val="21"/>
-              </w:rPr>
-              <w:t>Label</w:t>
-            </w:r>
-          </w:p>
-        </w:tc>
-        <w:tc>
-          <w:tcPr>
-            <w:tcW w:type="dxa" w:w="6660"/>
-            <w:vAlign w:val="center"/>
-            <w:tcMar>
-              <w:top w:w="80" w:type="dxa"/>
-              <w:bottom w:w="80" w:type="dxa"/>
-              <w:start w:w="120" w:type="dxa"/>
-              <w:end w:w="120" w:type="dxa"/>
-            </w:tcMar>
-            <w:shd w:fill="0A2540" w:val="clear"/>
-          </w:tcPr>
-          <w:p>
-            <w:pPr>
-              <w:spacing w:after="0" w:line="276" w:lineRule="auto"/>
-              <w:jc w:val="left"/>
-            </w:pPr>
-            <w:r>
-              <w:rPr>
-                <w:rFonts w:ascii="Calibri" w:hAnsi="Calibri"/>
-                <w:b/>
-                <w:color w:val="FFFFFF"/>
-                <w:sz w:val="21"/>
-              </w:rPr>
-              <w:t>Plain-English meaning</w:t>
-            </w:r>
-          </w:p>
-        </w:tc>
-      </w:tr>
-      <w:tr>
-        <w:tc>
-          <w:tcPr>
-            <w:tcW w:type="dxa" w:w="2700"/>
-            <w:vAlign w:val="center"/>
-            <w:tcMar>
-              <w:top w:w="80" w:type="dxa"/>
-              <w:bottom w:w="80" w:type="dxa"/>
-              <w:start w:w="120" w:type="dxa"/>
-              <w:end w:w="120" w:type="dxa"/>
-            </w:tcMar>
-          </w:tcPr>
-          <w:p>
-            <w:pPr>
-              <w:spacing w:after="0" w:line="276" w:lineRule="auto"/>
-              <w:jc w:val="left"/>
-            </w:pPr>
-            <w:r>
-              <w:rPr>
-                <w:rFonts w:ascii="Calibri" w:hAnsi="Calibri"/>
-                <w:b/>
-                <w:color w:val="0A2540"/>
-                <w:sz w:val="21"/>
-              </w:rPr>
-              <w:t>Verified deal moment</w:t>
-            </w:r>
-          </w:p>
-        </w:tc>
-        <w:tc>
-          <w:tcPr>
-            <w:tcW w:type="dxa" w:w="6660"/>
-            <w:vAlign w:val="center"/>
-            <w:tcMar>
-              <w:top w:w="80" w:type="dxa"/>
-              <w:bottom w:w="80" w:type="dxa"/>
-              <w:start w:w="120" w:type="dxa"/>
-              <w:end w:w="120" w:type="dxa"/>
-            </w:tcMar>
-          </w:tcPr>
-          <w:p>
-            <w:pPr>
-              <w:spacing w:after="0" w:line="276" w:lineRule="auto"/>
-              <w:jc w:val="left"/>
-            </w:pPr>
-            <w:r>
-              <w:rPr>
-                <w:rFonts w:ascii="Calibri" w:hAnsi="Calibri"/>
-                <w:b w:val="0"/>
-                <w:color w:val="1F2933"/>
-                <w:sz w:val="21"/>
-              </w:rPr>
-              <w:t>The fact returned by the official source.</w:t>
-            </w:r>
-          </w:p>
-        </w:tc>
-      </w:tr>
-      <w:tr>
-        <w:tc>
-          <w:tcPr>
-            <w:tcW w:type="dxa" w:w="2700"/>
-            <w:shd w:fill="F5F8FB" w:val="clear"/>
-            <w:vAlign w:val="center"/>
-            <w:tcMar>
-              <w:top w:w="80" w:type="dxa"/>
-              <w:bottom w:w="80" w:type="dxa"/>
-              <w:start w:w="120" w:type="dxa"/>
-              <w:end w:w="120" w:type="dxa"/>
-            </w:tcMar>
-          </w:tcPr>
-          <w:p>
-            <w:pPr>
-              <w:spacing w:after="0" w:line="276" w:lineRule="auto"/>
-              <w:jc w:val="left"/>
-            </w:pPr>
-            <w:r>
-              <w:rPr>
-                <w:rFonts w:ascii="Calibri" w:hAnsi="Calibri"/>
-                <w:b/>
-                <w:color w:val="0A2540"/>
-                <w:sz w:val="21"/>
-              </w:rPr>
-              <w:t>Why now</w:t>
-            </w:r>
-          </w:p>
-        </w:tc>
-        <w:tc>
-          <w:tcPr>
-            <w:tcW w:type="dxa" w:w="6660"/>
-            <w:shd w:fill="F5F8FB" w:val="clear"/>
-            <w:vAlign w:val="center"/>
-            <w:tcMar>
-              <w:top w:w="80" w:type="dxa"/>
-              <w:bottom w:w="80" w:type="dxa"/>
-              <w:start w:w="120" w:type="dxa"/>
-              <w:end w:w="120" w:type="dxa"/>
-            </w:tcMar>
-          </w:tcPr>
-          <w:p>
-            <w:pPr>
-              <w:spacing w:after="0" w:line="276" w:lineRule="auto"/>
-              <w:jc w:val="left"/>
-            </w:pPr>
-            <w:r>
-              <w:rPr>
-                <w:rFonts w:ascii="Calibri" w:hAnsi="Calibri"/>
-                <w:b w:val="0"/>
-                <w:color w:val="1F2933"/>
-                <w:sz w:val="21"/>
-              </w:rPr>
-              <w:t>Why the event may deserve timely research.</w:t>
-            </w:r>
-          </w:p>
-        </w:tc>
-      </w:tr>
-      <w:tr>
-        <w:tc>
-          <w:tcPr>
-            <w:tcW w:type="dxa" w:w="2700"/>
-            <w:vAlign w:val="center"/>
-            <w:tcMar>
-              <w:top w:w="80" w:type="dxa"/>
-              <w:bottom w:w="80" w:type="dxa"/>
-              <w:start w:w="120" w:type="dxa"/>
-              <w:end w:w="120" w:type="dxa"/>
-            </w:tcMar>
-          </w:tcPr>
-          <w:p>
-            <w:pPr>
-              <w:spacing w:after="0" w:line="276" w:lineRule="auto"/>
-              <w:jc w:val="left"/>
-            </w:pPr>
-            <w:r>
-              <w:rPr>
-                <w:rFonts w:ascii="Calibri" w:hAnsi="Calibri"/>
-                <w:b/>
-                <w:color w:val="0A2540"/>
-                <w:sz w:val="21"/>
-              </w:rPr>
-              <w:t>Likely fit</w:t>
-            </w:r>
-          </w:p>
-        </w:tc>
-        <w:tc>
-          <w:tcPr>
-            <w:tcW w:type="dxa" w:w="6660"/>
-            <w:vAlign w:val="center"/>
-            <w:tcMar>
-              <w:top w:w="80" w:type="dxa"/>
-              <w:bottom w:w="80" w:type="dxa"/>
-              <w:start w:w="120" w:type="dxa"/>
-              <w:end w:w="120" w:type="dxa"/>
-            </w:tcMar>
-          </w:tcPr>
-          <w:p>
-            <w:pPr>
-              <w:spacing w:after="0" w:line="276" w:lineRule="auto"/>
-              <w:jc w:val="left"/>
-            </w:pPr>
-            <w:r>
-              <w:rPr>
-                <w:rFonts w:ascii="Calibri" w:hAnsi="Calibri"/>
-                <w:b w:val="0"/>
-                <w:color w:val="1F2933"/>
-                <w:sz w:val="21"/>
-              </w:rPr>
-              <w:t>A business question to investigate, not advice or eligibility.</w:t>
-            </w:r>
-          </w:p>
-        </w:tc>
-      </w:tr>
-      <w:tr>
-        <w:tc>
-          <w:tcPr>
-            <w:tcW w:type="dxa" w:w="2700"/>
-            <w:shd w:fill="F5F8FB" w:val="clear"/>
-            <w:vAlign w:val="center"/>
-            <w:tcMar>
-              <w:top w:w="80" w:type="dxa"/>
-              <w:bottom w:w="80" w:type="dxa"/>
-              <w:start w:w="120" w:type="dxa"/>
-              <w:end w:w="120" w:type="dxa"/>
-            </w:tcMar>
-          </w:tcPr>
-          <w:p>
-            <w:pPr>
-              <w:spacing w:after="0" w:line="276" w:lineRule="auto"/>
-              <w:jc w:val="left"/>
-            </w:pPr>
-            <w:r>
-              <w:rPr>
-                <w:rFonts w:ascii="Calibri" w:hAnsi="Calibri"/>
-                <w:b/>
-                <w:color w:val="0A2540"/>
-                <w:sz w:val="21"/>
-              </w:rPr>
-              <w:t>Evidence</w:t>
-            </w:r>
-          </w:p>
-        </w:tc>
-        <w:tc>
-          <w:tcPr>
-            <w:tcW w:type="dxa" w:w="6660"/>
-            <w:shd w:fill="F5F8FB" w:val="clear"/>
-            <w:vAlign w:val="center"/>
-            <w:tcMar>
-              <w:top w:w="80" w:type="dxa"/>
-              <w:bottom w:w="80" w:type="dxa"/>
-              <w:start w:w="120" w:type="dxa"/>
-              <w:end w:w="120" w:type="dxa"/>
-            </w:tcMar>
-          </w:tcPr>
-          <w:p>
-            <w:pPr>
-              <w:spacing w:after="0" w:line="276" w:lineRule="auto"/>
-              <w:jc w:val="left"/>
-            </w:pPr>
-            <w:r>
-              <w:rPr>
-                <w:rFonts w:ascii="Calibri" w:hAnsi="Calibri"/>
-                <w:b w:val="0"/>
-                <w:color w:val="1F2933"/>
-                <w:sz w:val="21"/>
-              </w:rPr>
-              <w:t>The source link, record ID, and receipt attached to the item.</w:t>
-            </w:r>
-          </w:p>
-        </w:tc>
-      </w:tr>
-      <w:tr>
-        <w:tc>
-          <w:tcPr>
-            <w:tcW w:type="dxa" w:w="2700"/>
-            <w:vAlign w:val="center"/>
-            <w:tcMar>
-              <w:top w:w="80" w:type="dxa"/>
-              <w:bottom w:w="80" w:type="dxa"/>
-              <w:start w:w="120" w:type="dxa"/>
-              <w:end w:w="120" w:type="dxa"/>
-            </w:tcMar>
-          </w:tcPr>
-          <w:p>
-            <w:pPr>
-              <w:spacing w:after="0" w:line="276" w:lineRule="auto"/>
-              <w:jc w:val="left"/>
-            </w:pPr>
-            <w:r>
-              <w:rPr>
-                <w:rFonts w:ascii="Calibri" w:hAnsi="Calibri"/>
-                <w:b/>
-                <w:color w:val="0A2540"/>
-                <w:sz w:val="21"/>
-              </w:rPr>
-              <w:t>Limitations</w:t>
-            </w:r>
-          </w:p>
-        </w:tc>
-        <w:tc>
-          <w:tcPr>
-            <w:tcW w:type="dxa" w:w="6660"/>
-            <w:vAlign w:val="center"/>
-            <w:tcMar>
-              <w:top w:w="80" w:type="dxa"/>
-              <w:bottom w:w="80" w:type="dxa"/>
-              <w:start w:w="120" w:type="dxa"/>
-              <w:end w:w="120" w:type="dxa"/>
-            </w:tcMar>
-          </w:tcPr>
-          <w:p>
-            <w:pPr>
-              <w:spacing w:after="0" w:line="276" w:lineRule="auto"/>
-              <w:jc w:val="left"/>
-            </w:pPr>
-            <w:r>
-              <w:rPr>
-                <w:rFonts w:ascii="Calibri" w:hAnsi="Calibri"/>
-                <w:b w:val="0"/>
-                <w:color w:val="1F2933"/>
-                <w:sz w:val="21"/>
-              </w:rPr>
-              <w:t>What the public record does not prove.</w:t>
-            </w:r>
-          </w:p>
-        </w:tc>
-      </w:tr>
-      <w:tr>
-        <w:tc>
-          <w:tcPr>
-            <w:tcW w:type="dxa" w:w="2700"/>
-            <w:shd w:fill="F5F8FB" w:val="clear"/>
-            <w:vAlign w:val="center"/>
-            <w:tcMar>
-              <w:top w:w="80" w:type="dxa"/>
-              <w:bottom w:w="80" w:type="dxa"/>
-              <w:start w:w="120" w:type="dxa"/>
-              <w:end w:w="120" w:type="dxa"/>
-            </w:tcMar>
-          </w:tcPr>
-          <w:p>
-            <w:pPr>
-              <w:spacing w:after="0" w:line="276" w:lineRule="auto"/>
-              <w:jc w:val="left"/>
-            </w:pPr>
-            <w:r>
-              <w:rPr>
-                <w:rFonts w:ascii="Calibri" w:hAnsi="Calibri"/>
-                <w:b/>
-                <w:color w:val="0A2540"/>
-                <w:sz w:val="21"/>
-              </w:rPr>
-              <w:t>Call ready</w:t>
-            </w:r>
-          </w:p>
-        </w:tc>
-        <w:tc>
-          <w:tcPr>
-            <w:tcW w:type="dxa" w:w="6660"/>
-            <w:shd w:fill="F5F8FB" w:val="clear"/>
-            <w:vAlign w:val="center"/>
-            <w:tcMar>
-              <w:top w:w="80" w:type="dxa"/>
-              <w:bottom w:w="80" w:type="dxa"/>
-              <w:start w:w="120" w:type="dxa"/>
-              <w:end w:w="120" w:type="dxa"/>
-            </w:tcMar>
-          </w:tcPr>
-          <w:p>
-            <w:pPr>
-              <w:spacing w:after="0" w:line="276" w:lineRule="auto"/>
-              <w:jc w:val="left"/>
-            </w:pPr>
-            <w:r>
-              <w:rPr>
-                <w:rFonts w:ascii="Calibri" w:hAnsi="Calibri"/>
-                <w:b w:val="0"/>
-                <w:color w:val="1F2933"/>
-                <w:sz w:val="21"/>
-              </w:rPr>
-              <w:t>Whether outreach checks have passed. Public view stays at zero.</w:t>
-            </w:r>
-          </w:p>
-        </w:tc>
-      </w:tr>
-    </w:tbl>
     <w:p>
+      <w:pPr>
+        <w:spacing w:after="120" w:line="300" w:lineRule="auto"/>
+        <w:ind w:left="540" w:hanging="271"/>
+      </w:pPr>
       <w:r>
-        <w:br w:type="page"/>
+        <w:rPr>
+          <w:rFonts w:ascii="Calibri" w:hAnsi="Calibri"/>
+          <w:b/>
+          <w:i w:val="0"/>
+          <w:color w:val="0B2545"/>
+          <w:sz w:val="22"/>
+        </w:rPr>
+        <w:t xml:space="preserve">5. </w:t>
+      </w:r>
+      <w:r>
+        <w:rPr>
+          <w:rFonts w:ascii="Calibri" w:hAnsi="Calibri"/>
+          <w:b/>
+          <w:i w:val="0"/>
+          <w:color w:val="0B2545"/>
+          <w:sz w:val="22"/>
+        </w:rPr>
+        <w:t xml:space="preserve">Verify before doing anything else. </w:t>
+      </w:r>
+      <w:r>
+        <w:rPr>
+          <w:rFonts w:ascii="Calibri" w:hAnsi="Calibri"/>
+          <w:b w:val="0"/>
+          <w:i w:val="0"/>
+          <w:color w:val="1C2737"/>
+          <w:sz w:val="22"/>
+        </w:rPr>
+        <w:t>Open the cited official record and confirm that the organization and event are current.</w:t>
       </w:r>
     </w:p>
     <w:p>
@@ -1350,786 +668,145 @@
         <w:keepNext/>
       </w:pPr>
       <w:r>
-        <w:t>Where the live records come from</w:t>
+        <w:t>The four deal-moment lanes</w:t>
       </w:r>
     </w:p>
     <w:p>
       <w:pPr>
-        <w:spacing w:after="120" w:line="300" w:lineRule="auto"/>
+        <w:pStyle w:val="ListBullet"/>
+        <w:spacing w:after="80" w:line="300" w:lineRule="auto"/>
+        <w:ind w:left="540" w:hanging="271"/>
       </w:pPr>
       <w:r>
         <w:rPr>
           <w:rFonts w:ascii="Calibri" w:hAnsi="Calibri"/>
+          <w:b/>
           <w:i w:val="0"/>
-          <w:color w:val="1F2933"/>
+          <w:color w:val="0B2545"/>
+          <w:sz w:val="22"/>
         </w:rPr>
-        <w:t>The application checks official public sources independently. Each lane reports LIVE, UNAVAILABLE, or NOT APPLICABLE for the selected market.</w:t>
+        <w:t>Life-plan timing:</w:t>
       </w:r>
-    </w:p>
-    <w:tbl>
-      <w:tblPr>
-        <w:tblW w:type="dxa" w:w="9360"/>
-        <w:tblLayout w:type="fixed"/>
-        <w:tblLook w:firstColumn="1" w:firstRow="1" w:lastColumn="0" w:lastRow="0" w:noHBand="0" w:noVBand="1" w:val="04A0"/>
-        <w:jc w:val="left"/>
-        <w:tblInd w:w="120" w:type="dxa"/>
-      </w:tblPr>
-      <w:tblGrid>
-        <w:gridCol w:w="3150"/>
-        <w:gridCol w:w="1650"/>
-        <w:gridCol w:w="4560"/>
-      </w:tblGrid>
-      <w:tr>
-        <w:trPr>
-          <w:tblHeader w:val="true"/>
-        </w:trPr>
-        <w:tc>
-          <w:tcPr>
-            <w:tcW w:type="dxa" w:w="3150"/>
-            <w:vAlign w:val="center"/>
-            <w:tcMar>
-              <w:top w:w="80" w:type="dxa"/>
-              <w:bottom w:w="80" w:type="dxa"/>
-              <w:start w:w="120" w:type="dxa"/>
-              <w:end w:w="120" w:type="dxa"/>
-            </w:tcMar>
-            <w:shd w:fill="0A2540" w:val="clear"/>
-          </w:tcPr>
-          <w:p>
-            <w:pPr>
-              <w:spacing w:after="0" w:line="276" w:lineRule="auto"/>
-              <w:jc w:val="left"/>
-            </w:pPr>
-            <w:r>
-              <w:rPr>
-                <w:rFonts w:ascii="Calibri" w:hAnsi="Calibri"/>
-                <w:b/>
-                <w:color w:val="FFFFFF"/>
-                <w:sz w:val="20"/>
-              </w:rPr>
-              <w:t>Official source</w:t>
-            </w:r>
-          </w:p>
-        </w:tc>
-        <w:tc>
-          <w:tcPr>
-            <w:tcW w:type="dxa" w:w="1650"/>
-            <w:vAlign w:val="center"/>
-            <w:tcMar>
-              <w:top w:w="80" w:type="dxa"/>
-              <w:bottom w:w="80" w:type="dxa"/>
-              <w:start w:w="120" w:type="dxa"/>
-              <w:end w:w="120" w:type="dxa"/>
-            </w:tcMar>
-            <w:shd w:fill="0A2540" w:val="clear"/>
-          </w:tcPr>
-          <w:p>
-            <w:pPr>
-              <w:spacing w:after="0" w:line="276" w:lineRule="auto"/>
-              <w:jc w:val="left"/>
-            </w:pPr>
-            <w:r>
-              <w:rPr>
-                <w:rFonts w:ascii="Calibri" w:hAnsi="Calibri"/>
-                <w:b/>
-                <w:color w:val="FFFFFF"/>
-                <w:sz w:val="20"/>
-              </w:rPr>
-              <w:t>Verified state</w:t>
-            </w:r>
-          </w:p>
-        </w:tc>
-        <w:tc>
-          <w:tcPr>
-            <w:tcW w:type="dxa" w:w="4560"/>
-            <w:vAlign w:val="center"/>
-            <w:tcMar>
-              <w:top w:w="80" w:type="dxa"/>
-              <w:bottom w:w="80" w:type="dxa"/>
-              <w:start w:w="120" w:type="dxa"/>
-              <w:end w:w="120" w:type="dxa"/>
-            </w:tcMar>
-            <w:shd w:fill="0A2540" w:val="clear"/>
-          </w:tcPr>
-          <w:p>
-            <w:pPr>
-              <w:spacing w:after="0" w:line="276" w:lineRule="auto"/>
-              <w:jc w:val="left"/>
-            </w:pPr>
-            <w:r>
-              <w:rPr>
-                <w:rFonts w:ascii="Calibri" w:hAnsi="Calibri"/>
-                <w:b/>
-                <w:color w:val="FFFFFF"/>
-                <w:sz w:val="20"/>
-              </w:rPr>
-              <w:t>What it can show</w:t>
-            </w:r>
-          </w:p>
-        </w:tc>
-      </w:tr>
-      <w:tr>
-        <w:tc>
-          <w:tcPr>
-            <w:tcW w:type="dxa" w:w="3150"/>
-            <w:vAlign w:val="center"/>
-            <w:tcMar>
-              <w:top w:w="80" w:type="dxa"/>
-              <w:bottom w:w="80" w:type="dxa"/>
-              <w:start w:w="120" w:type="dxa"/>
-              <w:end w:w="120" w:type="dxa"/>
-            </w:tcMar>
-          </w:tcPr>
-          <w:p>
-            <w:pPr>
-              <w:spacing w:after="0" w:line="276" w:lineRule="auto"/>
-              <w:jc w:val="left"/>
-            </w:pPr>
-            <w:r>
-              <w:rPr>
-                <w:rFonts w:ascii="Calibri" w:hAnsi="Calibri"/>
-                <w:b/>
-                <w:color w:val="0A2540"/>
-                <w:sz w:val="20"/>
-              </w:rPr>
-              <w:t>U.S. Department of Labor Form 5500</w:t>
-            </w:r>
-          </w:p>
-        </w:tc>
-        <w:tc>
-          <w:tcPr>
-            <w:tcW w:type="dxa" w:w="1650"/>
-            <w:vAlign w:val="center"/>
-            <w:tcMar>
-              <w:top w:w="80" w:type="dxa"/>
-              <w:bottom w:w="80" w:type="dxa"/>
-              <w:start w:w="120" w:type="dxa"/>
-              <w:end w:w="120" w:type="dxa"/>
-            </w:tcMar>
-          </w:tcPr>
-          <w:p>
-            <w:pPr>
-              <w:spacing w:after="0" w:line="276" w:lineRule="auto"/>
-              <w:jc w:val="left"/>
-            </w:pPr>
-            <w:r>
-              <w:rPr>
-                <w:rFonts w:ascii="Calibri" w:hAnsi="Calibri"/>
-                <w:b/>
-                <w:color w:val="168F89"/>
-                <w:sz w:val="20"/>
-              </w:rPr>
-              <w:t>LIVE</w:t>
-            </w:r>
-          </w:p>
-        </w:tc>
-        <w:tc>
-          <w:tcPr>
-            <w:tcW w:type="dxa" w:w="4560"/>
-            <w:vAlign w:val="center"/>
-            <w:tcMar>
-              <w:top w:w="80" w:type="dxa"/>
-              <w:bottom w:w="80" w:type="dxa"/>
-              <w:start w:w="120" w:type="dxa"/>
-              <w:end w:w="120" w:type="dxa"/>
-            </w:tcMar>
-          </w:tcPr>
-          <w:p>
-            <w:pPr>
-              <w:spacing w:after="0" w:line="276" w:lineRule="auto"/>
-              <w:jc w:val="left"/>
-            </w:pPr>
-            <w:r>
-              <w:rPr>
-                <w:rFonts w:ascii="Calibri" w:hAnsi="Calibri"/>
-                <w:b w:val="0"/>
-                <w:color w:val="1F2933"/>
-                <w:sz w:val="20"/>
-              </w:rPr>
-              <w:t>Benefit-plan filings and reported plan or policy timing fields.</w:t>
-            </w:r>
-          </w:p>
-        </w:tc>
-      </w:tr>
-      <w:tr>
-        <w:tc>
-          <w:tcPr>
-            <w:tcW w:type="dxa" w:w="3150"/>
-            <w:shd w:fill="F5F8FB" w:val="clear"/>
-            <w:vAlign w:val="center"/>
-            <w:tcMar>
-              <w:top w:w="80" w:type="dxa"/>
-              <w:bottom w:w="80" w:type="dxa"/>
-              <w:start w:w="120" w:type="dxa"/>
-              <w:end w:w="120" w:type="dxa"/>
-            </w:tcMar>
-          </w:tcPr>
-          <w:p>
-            <w:pPr>
-              <w:spacing w:after="0" w:line="276" w:lineRule="auto"/>
-              <w:jc w:val="left"/>
-            </w:pPr>
-            <w:r>
-              <w:rPr>
-                <w:rFonts w:ascii="Calibri" w:hAnsi="Calibri"/>
-                <w:b/>
-                <w:color w:val="0A2540"/>
-                <w:sz w:val="20"/>
-              </w:rPr>
-              <w:t>FMCSA Company Census</w:t>
-            </w:r>
-          </w:p>
-        </w:tc>
-        <w:tc>
-          <w:tcPr>
-            <w:tcW w:type="dxa" w:w="1650"/>
-            <w:shd w:fill="F5F8FB" w:val="clear"/>
-            <w:vAlign w:val="center"/>
-            <w:tcMar>
-              <w:top w:w="80" w:type="dxa"/>
-              <w:bottom w:w="80" w:type="dxa"/>
-              <w:start w:w="120" w:type="dxa"/>
-              <w:end w:w="120" w:type="dxa"/>
-            </w:tcMar>
-          </w:tcPr>
-          <w:p>
-            <w:pPr>
-              <w:spacing w:after="0" w:line="276" w:lineRule="auto"/>
-              <w:jc w:val="left"/>
-            </w:pPr>
-            <w:r>
-              <w:rPr>
-                <w:rFonts w:ascii="Calibri" w:hAnsi="Calibri"/>
-                <w:b/>
-                <w:color w:val="168F89"/>
-                <w:sz w:val="20"/>
-              </w:rPr>
-              <w:t>LIVE</w:t>
-            </w:r>
-          </w:p>
-        </w:tc>
-        <w:tc>
-          <w:tcPr>
-            <w:tcW w:type="dxa" w:w="4560"/>
-            <w:shd w:fill="F5F8FB" w:val="clear"/>
-            <w:vAlign w:val="center"/>
-            <w:tcMar>
-              <w:top w:w="80" w:type="dxa"/>
-              <w:bottom w:w="80" w:type="dxa"/>
-              <w:start w:w="120" w:type="dxa"/>
-              <w:end w:w="120" w:type="dxa"/>
-            </w:tcMar>
-          </w:tcPr>
-          <w:p>
-            <w:pPr>
-              <w:spacing w:after="0" w:line="276" w:lineRule="auto"/>
-              <w:jc w:val="left"/>
-            </w:pPr>
-            <w:r>
-              <w:rPr>
-                <w:rFonts w:ascii="Calibri" w:hAnsi="Calibri"/>
-                <w:b w:val="0"/>
-                <w:color w:val="1F2933"/>
-                <w:sz w:val="20"/>
-              </w:rPr>
-              <w:t>Organization-level carrier registration activity.</w:t>
-            </w:r>
-          </w:p>
-        </w:tc>
-      </w:tr>
-      <w:tr>
-        <w:tc>
-          <w:tcPr>
-            <w:tcW w:type="dxa" w:w="3150"/>
-            <w:vAlign w:val="center"/>
-            <w:tcMar>
-              <w:top w:w="80" w:type="dxa"/>
-              <w:bottom w:w="80" w:type="dxa"/>
-              <w:start w:w="120" w:type="dxa"/>
-              <w:end w:w="120" w:type="dxa"/>
-            </w:tcMar>
-          </w:tcPr>
-          <w:p>
-            <w:pPr>
-              <w:spacing w:after="0" w:line="276" w:lineRule="auto"/>
-              <w:jc w:val="left"/>
-            </w:pPr>
-            <w:r>
-              <w:rPr>
-                <w:rFonts w:ascii="Calibri" w:hAnsi="Calibri"/>
-                <w:b/>
-                <w:color w:val="0A2540"/>
-                <w:sz w:val="20"/>
-              </w:rPr>
-              <w:t>USAspending</w:t>
-            </w:r>
-          </w:p>
-        </w:tc>
-        <w:tc>
-          <w:tcPr>
-            <w:tcW w:type="dxa" w:w="1650"/>
-            <w:vAlign w:val="center"/>
-            <w:tcMar>
-              <w:top w:w="80" w:type="dxa"/>
-              <w:bottom w:w="80" w:type="dxa"/>
-              <w:start w:w="120" w:type="dxa"/>
-              <w:end w:w="120" w:type="dxa"/>
-            </w:tcMar>
-          </w:tcPr>
-          <w:p>
-            <w:pPr>
-              <w:spacing w:after="0" w:line="276" w:lineRule="auto"/>
-              <w:jc w:val="left"/>
-            </w:pPr>
-            <w:r>
-              <w:rPr>
-                <w:rFonts w:ascii="Calibri" w:hAnsi="Calibri"/>
-                <w:b/>
-                <w:color w:val="168F89"/>
-                <w:sz w:val="20"/>
-              </w:rPr>
-              <w:t>LIVE</w:t>
-            </w:r>
-          </w:p>
-        </w:tc>
-        <w:tc>
-          <w:tcPr>
-            <w:tcW w:type="dxa" w:w="4560"/>
-            <w:vAlign w:val="center"/>
-            <w:tcMar>
-              <w:top w:w="80" w:type="dxa"/>
-              <w:bottom w:w="80" w:type="dxa"/>
-              <w:start w:w="120" w:type="dxa"/>
-              <w:end w:w="120" w:type="dxa"/>
-            </w:tcMar>
-          </w:tcPr>
-          <w:p>
-            <w:pPr>
-              <w:spacing w:after="0" w:line="276" w:lineRule="auto"/>
-              <w:jc w:val="left"/>
-            </w:pPr>
-            <w:r>
-              <w:rPr>
-                <w:rFonts w:ascii="Calibri" w:hAnsi="Calibri"/>
-                <w:b w:val="0"/>
-                <w:color w:val="1F2933"/>
-                <w:sz w:val="20"/>
-              </w:rPr>
-              <w:t>Federal contract activity in the current query window.</w:t>
-            </w:r>
-          </w:p>
-        </w:tc>
-      </w:tr>
-      <w:tr>
-        <w:tc>
-          <w:tcPr>
-            <w:tcW w:type="dxa" w:w="3150"/>
-            <w:shd w:fill="F5F8FB" w:val="clear"/>
-            <w:vAlign w:val="center"/>
-            <w:tcMar>
-              <w:top w:w="80" w:type="dxa"/>
-              <w:bottom w:w="80" w:type="dxa"/>
-              <w:start w:w="120" w:type="dxa"/>
-              <w:end w:w="120" w:type="dxa"/>
-            </w:tcMar>
-          </w:tcPr>
-          <w:p>
-            <w:pPr>
-              <w:spacing w:after="0" w:line="276" w:lineRule="auto"/>
-              <w:jc w:val="left"/>
-            </w:pPr>
-            <w:r>
-              <w:rPr>
-                <w:rFonts w:ascii="Calibri" w:hAnsi="Calibri"/>
-                <w:b/>
-                <w:color w:val="0A2540"/>
-                <w:sz w:val="20"/>
-              </w:rPr>
-              <w:t>EPA ECHO</w:t>
-            </w:r>
-          </w:p>
-        </w:tc>
-        <w:tc>
-          <w:tcPr>
-            <w:tcW w:type="dxa" w:w="1650"/>
-            <w:shd w:fill="F5F8FB" w:val="clear"/>
-            <w:vAlign w:val="center"/>
-            <w:tcMar>
-              <w:top w:w="80" w:type="dxa"/>
-              <w:bottom w:w="80" w:type="dxa"/>
-              <w:start w:w="120" w:type="dxa"/>
-              <w:end w:w="120" w:type="dxa"/>
-            </w:tcMar>
-          </w:tcPr>
-          <w:p>
-            <w:pPr>
-              <w:spacing w:after="0" w:line="276" w:lineRule="auto"/>
-              <w:jc w:val="left"/>
-            </w:pPr>
-            <w:r>
-              <w:rPr>
-                <w:rFonts w:ascii="Calibri" w:hAnsi="Calibri"/>
-                <w:b/>
-                <w:color w:val="168F89"/>
-                <w:sz w:val="20"/>
-              </w:rPr>
-              <w:t>LIVE</w:t>
-            </w:r>
-          </w:p>
-        </w:tc>
-        <w:tc>
-          <w:tcPr>
-            <w:tcW w:type="dxa" w:w="4560"/>
-            <w:shd w:fill="F5F8FB" w:val="clear"/>
-            <w:vAlign w:val="center"/>
-            <w:tcMar>
-              <w:top w:w="80" w:type="dxa"/>
-              <w:bottom w:w="80" w:type="dxa"/>
-              <w:start w:w="120" w:type="dxa"/>
-              <w:end w:w="120" w:type="dxa"/>
-            </w:tcMar>
-          </w:tcPr>
-          <w:p>
-            <w:pPr>
-              <w:spacing w:after="0" w:line="276" w:lineRule="auto"/>
-              <w:jc w:val="left"/>
-            </w:pPr>
-            <w:r>
-              <w:rPr>
-                <w:rFonts w:ascii="Calibri" w:hAnsi="Calibri"/>
-                <w:b w:val="0"/>
-                <w:color w:val="1F2933"/>
-                <w:sz w:val="20"/>
-              </w:rPr>
-              <w:t>Organization and facility compliance-monitoring activity.</w:t>
-            </w:r>
-          </w:p>
-        </w:tc>
-      </w:tr>
-      <w:tr>
-        <w:tc>
-          <w:tcPr>
-            <w:tcW w:type="dxa" w:w="3150"/>
-            <w:vAlign w:val="center"/>
-            <w:tcMar>
-              <w:top w:w="80" w:type="dxa"/>
-              <w:bottom w:w="80" w:type="dxa"/>
-              <w:start w:w="120" w:type="dxa"/>
-              <w:end w:w="120" w:type="dxa"/>
-            </w:tcMar>
-          </w:tcPr>
-          <w:p>
-            <w:pPr>
-              <w:spacing w:after="0" w:line="276" w:lineRule="auto"/>
-              <w:jc w:val="left"/>
-            </w:pPr>
-            <w:r>
-              <w:rPr>
-                <w:rFonts w:ascii="Calibri" w:hAnsi="Calibri"/>
-                <w:b/>
-                <w:color w:val="0A2540"/>
-                <w:sz w:val="20"/>
-              </w:rPr>
-              <w:t>FCC ULS</w:t>
-            </w:r>
-          </w:p>
-        </w:tc>
-        <w:tc>
-          <w:tcPr>
-            <w:tcW w:type="dxa" w:w="1650"/>
-            <w:vAlign w:val="center"/>
-            <w:tcMar>
-              <w:top w:w="80" w:type="dxa"/>
-              <w:bottom w:w="80" w:type="dxa"/>
-              <w:start w:w="120" w:type="dxa"/>
-              <w:end w:w="120" w:type="dxa"/>
-            </w:tcMar>
-          </w:tcPr>
-          <w:p>
-            <w:pPr>
-              <w:spacing w:after="0" w:line="276" w:lineRule="auto"/>
-              <w:jc w:val="left"/>
-            </w:pPr>
-            <w:r>
-              <w:rPr>
-                <w:rFonts w:ascii="Calibri" w:hAnsi="Calibri"/>
-                <w:b/>
-                <w:color w:val="B78327"/>
-                <w:sz w:val="20"/>
-              </w:rPr>
-              <w:t>UNAVAILABLE</w:t>
-            </w:r>
-          </w:p>
-        </w:tc>
-        <w:tc>
-          <w:tcPr>
-            <w:tcW w:type="dxa" w:w="4560"/>
-            <w:vAlign w:val="center"/>
-            <w:tcMar>
-              <w:top w:w="80" w:type="dxa"/>
-              <w:bottom w:w="80" w:type="dxa"/>
-              <w:start w:w="120" w:type="dxa"/>
-              <w:end w:w="120" w:type="dxa"/>
-            </w:tcMar>
-          </w:tcPr>
-          <w:p>
-            <w:pPr>
-              <w:spacing w:after="0" w:line="276" w:lineRule="auto"/>
-              <w:jc w:val="left"/>
-            </w:pPr>
-            <w:r>
-              <w:rPr>
-                <w:rFonts w:ascii="Calibri" w:hAnsi="Calibri"/>
-                <w:b w:val="0"/>
-                <w:color w:val="1F2933"/>
-                <w:sz w:val="20"/>
-              </w:rPr>
-              <w:t>Organization wireless-license activity when the source answers.</w:t>
-            </w:r>
-          </w:p>
-        </w:tc>
-      </w:tr>
-      <w:tr>
-        <w:tc>
-          <w:tcPr>
-            <w:tcW w:type="dxa" w:w="3150"/>
-            <w:shd w:fill="F5F8FB" w:val="clear"/>
-            <w:vAlign w:val="center"/>
-            <w:tcMar>
-              <w:top w:w="80" w:type="dxa"/>
-              <w:bottom w:w="80" w:type="dxa"/>
-              <w:start w:w="120" w:type="dxa"/>
-              <w:end w:w="120" w:type="dxa"/>
-            </w:tcMar>
-          </w:tcPr>
-          <w:p>
-            <w:pPr>
-              <w:spacing w:after="0" w:line="276" w:lineRule="auto"/>
-              <w:jc w:val="left"/>
-            </w:pPr>
-            <w:r>
-              <w:rPr>
-                <w:rFonts w:ascii="Calibri" w:hAnsi="Calibri"/>
-                <w:b/>
-                <w:color w:val="0A2540"/>
-                <w:sz w:val="20"/>
-              </w:rPr>
-              <w:t>Chicago business licenses</w:t>
-            </w:r>
-          </w:p>
-        </w:tc>
-        <w:tc>
-          <w:tcPr>
-            <w:tcW w:type="dxa" w:w="1650"/>
-            <w:shd w:fill="F5F8FB" w:val="clear"/>
-            <w:vAlign w:val="center"/>
-            <w:tcMar>
-              <w:top w:w="80" w:type="dxa"/>
-              <w:bottom w:w="80" w:type="dxa"/>
-              <w:start w:w="120" w:type="dxa"/>
-              <w:end w:w="120" w:type="dxa"/>
-            </w:tcMar>
-          </w:tcPr>
-          <w:p>
-            <w:pPr>
-              <w:spacing w:after="0" w:line="276" w:lineRule="auto"/>
-              <w:jc w:val="left"/>
-            </w:pPr>
-            <w:r>
-              <w:rPr>
-                <w:rFonts w:ascii="Calibri" w:hAnsi="Calibri"/>
-                <w:b/>
-                <w:color w:val="B78327"/>
-                <w:sz w:val="20"/>
-              </w:rPr>
-              <w:t>UNAVAILABLE</w:t>
-            </w:r>
-          </w:p>
-        </w:tc>
-        <w:tc>
-          <w:tcPr>
-            <w:tcW w:type="dxa" w:w="4560"/>
-            <w:shd w:fill="F5F8FB" w:val="clear"/>
-            <w:vAlign w:val="center"/>
-            <w:tcMar>
-              <w:top w:w="80" w:type="dxa"/>
-              <w:bottom w:w="80" w:type="dxa"/>
-              <w:start w:w="120" w:type="dxa"/>
-              <w:end w:w="120" w:type="dxa"/>
-            </w:tcMar>
-          </w:tcPr>
-          <w:p>
-            <w:pPr>
-              <w:spacing w:after="0" w:line="276" w:lineRule="auto"/>
-              <w:jc w:val="left"/>
-            </w:pPr>
-            <w:r>
-              <w:rPr>
-                <w:rFonts w:ascii="Calibri" w:hAnsi="Calibri"/>
-                <w:b w:val="0"/>
-                <w:color w:val="1F2933"/>
-                <w:sz w:val="20"/>
-              </w:rPr>
-              <w:t>New active business-license records when applicable.</w:t>
-            </w:r>
-          </w:p>
-        </w:tc>
-      </w:tr>
-      <w:tr>
-        <w:tc>
-          <w:tcPr>
-            <w:tcW w:type="dxa" w:w="3150"/>
-            <w:vAlign w:val="center"/>
-            <w:tcMar>
-              <w:top w:w="80" w:type="dxa"/>
-              <w:bottom w:w="80" w:type="dxa"/>
-              <w:start w:w="120" w:type="dxa"/>
-              <w:end w:w="120" w:type="dxa"/>
-            </w:tcMar>
-          </w:tcPr>
-          <w:p>
-            <w:pPr>
-              <w:spacing w:after="0" w:line="276" w:lineRule="auto"/>
-              <w:jc w:val="left"/>
-            </w:pPr>
-            <w:r>
-              <w:rPr>
-                <w:rFonts w:ascii="Calibri" w:hAnsi="Calibri"/>
-                <w:b/>
-                <w:color w:val="0A2540"/>
-                <w:sz w:val="20"/>
-              </w:rPr>
-              <w:t>SAM.gov entity updates</w:t>
-            </w:r>
-          </w:p>
-        </w:tc>
-        <w:tc>
-          <w:tcPr>
-            <w:tcW w:type="dxa" w:w="1650"/>
-            <w:vAlign w:val="center"/>
-            <w:tcMar>
-              <w:top w:w="80" w:type="dxa"/>
-              <w:bottom w:w="80" w:type="dxa"/>
-              <w:start w:w="120" w:type="dxa"/>
-              <w:end w:w="120" w:type="dxa"/>
-            </w:tcMar>
-          </w:tcPr>
-          <w:p>
-            <w:pPr>
-              <w:spacing w:after="0" w:line="276" w:lineRule="auto"/>
-              <w:jc w:val="left"/>
-            </w:pPr>
-            <w:r>
-              <w:rPr>
-                <w:rFonts w:ascii="Calibri" w:hAnsi="Calibri"/>
-                <w:b/>
-                <w:color w:val="B78327"/>
-                <w:sz w:val="20"/>
-              </w:rPr>
-              <w:t>UNAVAILABLE</w:t>
-            </w:r>
-          </w:p>
-        </w:tc>
-        <w:tc>
-          <w:tcPr>
-            <w:tcW w:type="dxa" w:w="4560"/>
-            <w:vAlign w:val="center"/>
-            <w:tcMar>
-              <w:top w:w="80" w:type="dxa"/>
-              <w:bottom w:w="80" w:type="dxa"/>
-              <w:start w:w="120" w:type="dxa"/>
-              <w:end w:w="120" w:type="dxa"/>
-            </w:tcMar>
-          </w:tcPr>
-          <w:p>
-            <w:pPr>
-              <w:spacing w:after="0" w:line="276" w:lineRule="auto"/>
-              <w:jc w:val="left"/>
-            </w:pPr>
-            <w:r>
-              <w:rPr>
-                <w:rFonts w:ascii="Calibri" w:hAnsi="Calibri"/>
-                <w:b w:val="0"/>
-                <w:color w:val="1F2933"/>
-                <w:sz w:val="20"/>
-              </w:rPr>
-              <w:t>Active entity updates when the source and credential are available.</w:t>
-            </w:r>
-          </w:p>
-        </w:tc>
-      </w:tr>
-    </w:tbl>
-    <w:p>
-      <w:pPr>
-        <w:pStyle w:val="Heading2"/>
-        <w:keepNext/>
-      </w:pPr>
       <w:r>
-        <w:t>What is deliberately excluded</w:t>
+        <w:rPr>
+          <w:rFonts w:ascii="Calibri" w:hAnsi="Calibri"/>
+          <w:b w:val="0"/>
+          <w:i w:val="0"/>
+          <w:color w:val="1C2737"/>
+          <w:sz w:val="22"/>
+        </w:rPr>
+        <w:t xml:space="preserve"> Employers whose official Department of Labor filing reports a group-life benefit and a plan or policy anniversary.</w:t>
       </w:r>
     </w:p>
     <w:p>
       <w:pPr>
-        <w:numPr>
-          <w:ilvl w:val="0"/>
-          <w:numId w:val="10"/>
-        </w:numPr>
+        <w:pStyle w:val="ListBullet"/>
         <w:spacing w:after="80" w:line="300" w:lineRule="auto"/>
+        <w:ind w:left="540" w:hanging="271"/>
       </w:pPr>
       <w:r>
         <w:rPr>
           <w:rFonts w:ascii="Calibri" w:hAnsi="Calibri"/>
-          <w:color w:val="1F2933"/>
+          <w:b/>
+          <w:i w:val="0"/>
+          <w:color w:val="0B2545"/>
+          <w:sz w:val="22"/>
         </w:rPr>
-        <w:t>Personal social-media profiles, private contacts, and hidden contact enrichment.</w:t>
+        <w:t>Growth &amp; awards:</w:t>
+      </w:r>
+      <w:r>
+        <w:rPr>
+          <w:rFonts w:ascii="Calibri" w:hAnsi="Calibri"/>
+          <w:b w:val="0"/>
+          <w:i w:val="0"/>
+          <w:color w:val="1C2737"/>
+          <w:sz w:val="22"/>
+        </w:rPr>
+        <w:t xml:space="preserve"> Current federal contract activity that may justify a business-protection, continuity, or workforce review.</w:t>
       </w:r>
     </w:p>
     <w:p>
       <w:pPr>
-        <w:numPr>
-          <w:ilvl w:val="0"/>
-          <w:numId w:val="10"/>
-        </w:numPr>
+        <w:pStyle w:val="ListBullet"/>
         <w:spacing w:after="80" w:line="300" w:lineRule="auto"/>
+        <w:ind w:left="540" w:hanging="271"/>
       </w:pPr>
       <w:r>
         <w:rPr>
           <w:rFonts w:ascii="Calibri" w:hAnsi="Calibri"/>
-          <w:color w:val="1F2933"/>
+          <w:b/>
+          <w:i w:val="0"/>
+          <w:color w:val="0B2545"/>
+          <w:sz w:val="22"/>
         </w:rPr>
-        <w:t>Health, age, race, religion, family status, wealth, or insurability inferences.</w:t>
+        <w:t>Operational change:</w:t>
+      </w:r>
+      <w:r>
+        <w:rPr>
+          <w:rFonts w:ascii="Calibri" w:hAnsi="Calibri"/>
+          <w:b w:val="0"/>
+          <w:i w:val="0"/>
+          <w:color w:val="1C2737"/>
+          <w:sz w:val="22"/>
+        </w:rPr>
+        <w:t xml:space="preserve"> Carrier registrations, facility monitoring activity, and other official organization events.</w:t>
       </w:r>
     </w:p>
     <w:p>
       <w:pPr>
-        <w:numPr>
-          <w:ilvl w:val="0"/>
-          <w:numId w:val="10"/>
-        </w:numPr>
+        <w:pStyle w:val="ListBullet"/>
         <w:spacing w:after="80" w:line="300" w:lineRule="auto"/>
+        <w:ind w:left="540" w:hanging="271"/>
       </w:pPr>
       <w:r>
         <w:rPr>
           <w:rFonts w:ascii="Calibri" w:hAnsi="Calibri"/>
-          <w:color w:val="1F2933"/>
+          <w:b/>
+          <w:i w:val="0"/>
+          <w:color w:val="0B2545"/>
+          <w:sz w:val="22"/>
         </w:rPr>
-        <w:t>Named filing signers, administrators, donors, or executives used as personal leads.</w:t>
+        <w:t>Needs research:</w:t>
+      </w:r>
+      <w:r>
+        <w:rPr>
+          <w:rFonts w:ascii="Calibri" w:hAnsi="Calibri"/>
+          <w:b w:val="0"/>
+          <w:i w:val="0"/>
+          <w:color w:val="1C2737"/>
+          <w:sz w:val="22"/>
+        </w:rPr>
+        <w:t xml:space="preserve"> Every account that still requires source verification, product-fit review, and protected contact clearance.</w:t>
       </w:r>
     </w:p>
     <w:p>
       <w:pPr>
-        <w:numPr>
-          <w:ilvl w:val="0"/>
-          <w:numId w:val="10"/>
-        </w:numPr>
-        <w:spacing w:after="80" w:line="300" w:lineRule="auto"/>
+        <w:spacing w:before="80" w:after="200" w:line="288" w:lineRule="auto"/>
+        <w:ind w:left="173" w:right="173"/>
+        <w:shd w:fill="E7F5F3"/>
+        <w:pBdr>
+          <w:left w:val="single" w:sz="18" w:space="8" w:color="148984"/>
+        </w:pBdr>
       </w:pPr>
       <w:r>
         <w:rPr>
           <w:rFonts w:ascii="Calibri" w:hAnsi="Calibri"/>
-          <w:color w:val="1F2933"/>
+          <w:b/>
+          <w:i w:val="0"/>
+          <w:color w:val="0B2545"/>
+          <w:sz w:val="22"/>
         </w:rPr>
-        <w:t>Automatic contact permission, automatic quoting, or an underwriting conclusion.</w:t>
+        <w:t xml:space="preserve">Timing label: </w:t>
+      </w:r>
+      <w:r>
+        <w:rPr>
+          <w:rFonts w:ascii="Calibri" w:hAnsi="Calibri"/>
+          <w:b w:val="0"/>
+          <w:i w:val="0"/>
+          <w:color w:val="1C2737"/>
+          <w:sz w:val="22"/>
+        </w:rPr>
+        <w:t>A Form 5500 anniversary is a research hypothesis. It is not proof of a renewal, dissatisfaction, buying intent, eligibility, or insurability.</w:t>
       </w:r>
     </w:p>
     <w:p>
@@ -2143,7 +820,7 @@
         <w:keepNext/>
       </w:pPr>
       <w:r>
-        <w:t>A practical daily routine</w:t>
+        <w:t>How to read an account</w:t>
       </w:r>
     </w:p>
     <w:p>
@@ -2152,71 +829,22 @@
         <w:keepNext/>
       </w:pPr>
       <w:r>
-        <w:t>Morning: choose the research queue</w:t>
+        <w:t>Source-verified business moment</w:t>
       </w:r>
     </w:p>
     <w:p>
       <w:pPr>
-        <w:numPr>
-          <w:ilvl w:val="0"/>
-          <w:numId w:val="10"/>
-        </w:numPr>
-        <w:spacing w:after="80" w:line="300" w:lineRule="auto"/>
+        <w:spacing w:before="0" w:after="120" w:line="300" w:lineRule="auto"/>
       </w:pPr>
       <w:r>
         <w:rPr>
           <w:rFonts w:ascii="Calibri" w:hAnsi="Calibri"/>
-          <w:color w:val="1F2933"/>
+          <w:b w:val="0"/>
+          <w:i w:val="0"/>
+          <w:color w:val="1C2737"/>
+          <w:sz w:val="22"/>
         </w:rPr>
-        <w:t>Open the Broker view and check the release stamp.</w:t>
-      </w:r>
-    </w:p>
-    <w:p>
-      <w:pPr>
-        <w:numPr>
-          <w:ilvl w:val="0"/>
-          <w:numId w:val="10"/>
-        </w:numPr>
-        <w:spacing w:after="80" w:line="300" w:lineRule="auto"/>
-      </w:pPr>
-      <w:r>
-        <w:rPr>
-          <w:rFonts w:ascii="Calibri" w:hAnsi="Calibri"/>
-          <w:color w:val="1F2933"/>
-        </w:rPr>
-        <w:t>Choose your state or region; start with one state for depth.</w:t>
-      </w:r>
-    </w:p>
-    <w:p>
-      <w:pPr>
-        <w:numPr>
-          <w:ilvl w:val="0"/>
-          <w:numId w:val="10"/>
-        </w:numPr>
-        <w:spacing w:after="80" w:line="300" w:lineRule="auto"/>
-      </w:pPr>
-      <w:r>
-        <w:rPr>
-          <w:rFonts w:ascii="Calibri" w:hAnsi="Calibri"/>
-          <w:color w:val="1F2933"/>
-        </w:rPr>
-        <w:t>Read the Broker brief and pick five organizations to verify.</w:t>
-      </w:r>
-    </w:p>
-    <w:p>
-      <w:pPr>
-        <w:numPr>
-          <w:ilvl w:val="0"/>
-          <w:numId w:val="10"/>
-        </w:numPr>
-        <w:spacing w:after="80" w:line="300" w:lineRule="auto"/>
-      </w:pPr>
-      <w:r>
-        <w:rPr>
-          <w:rFonts w:ascii="Calibri" w:hAnsi="Calibri"/>
-          <w:color w:val="1F2933"/>
-        </w:rPr>
-        <w:t>Open every official source before writing a note.</w:t>
+        <w:t>The organization-level fact returned by the official source. Read this before the product idea.</w:t>
       </w:r>
     </w:p>
     <w:p>
@@ -2225,71 +853,22 @@
         <w:keepNext/>
       </w:pPr>
       <w:r>
-        <w:t>Research block: turn records into qualified questions</w:t>
+        <w:t>Timing</w:t>
       </w:r>
     </w:p>
     <w:p>
       <w:pPr>
-        <w:numPr>
-          <w:ilvl w:val="0"/>
-          <w:numId w:val="10"/>
-        </w:numPr>
-        <w:spacing w:after="80" w:line="300" w:lineRule="auto"/>
+        <w:spacing w:before="0" w:after="120" w:line="300" w:lineRule="auto"/>
       </w:pPr>
       <w:r>
         <w:rPr>
           <w:rFonts w:ascii="Calibri" w:hAnsi="Calibri"/>
-          <w:color w:val="1F2933"/>
+          <w:b w:val="0"/>
+          <w:i w:val="0"/>
+          <w:color w:val="1C2737"/>
+          <w:sz w:val="22"/>
         </w:rPr>
-        <w:t>Confirm the organization and event on the official record.</w:t>
-      </w:r>
-    </w:p>
-    <w:p>
-      <w:pPr>
-        <w:numPr>
-          <w:ilvl w:val="0"/>
-          <w:numId w:val="10"/>
-        </w:numPr>
-        <w:spacing w:after="80" w:line="300" w:lineRule="auto"/>
-      </w:pPr>
-      <w:r>
-        <w:rPr>
-          <w:rFonts w:ascii="Calibri" w:hAnsi="Calibri"/>
-          <w:color w:val="1F2933"/>
-        </w:rPr>
-        <w:t>Check the organization's own website for current operations and a business-published channel.</w:t>
-      </w:r>
-    </w:p>
-    <w:p>
-      <w:pPr>
-        <w:numPr>
-          <w:ilvl w:val="0"/>
-          <w:numId w:val="10"/>
-        </w:numPr>
-        <w:spacing w:after="80" w:line="300" w:lineRule="auto"/>
-      </w:pPr>
-      <w:r>
-        <w:rPr>
-          <w:rFonts w:ascii="Calibri" w:hAnsi="Calibri"/>
-          <w:color w:val="1F2933"/>
-        </w:rPr>
-        <w:t>Write down what is known, what is inferred, and what remains unknown.</w:t>
-      </w:r>
-    </w:p>
-    <w:p>
-      <w:pPr>
-        <w:numPr>
-          <w:ilvl w:val="0"/>
-          <w:numId w:val="10"/>
-        </w:numPr>
-        <w:spacing w:after="80" w:line="300" w:lineRule="auto"/>
-      </w:pPr>
-      <w:r>
-        <w:rPr>
-          <w:rFonts w:ascii="Calibri" w:hAnsi="Calibri"/>
-          <w:color w:val="1F2933"/>
-        </w:rPr>
-        <w:t>Do not copy sensitive person-level fields into your notes.</w:t>
+        <w:t>The observed date or the next anniversary calculated from a previously reported plan or policy period.</w:t>
       </w:r>
     </w:p>
     <w:p>
@@ -2298,176 +877,187 @@
         <w:keepNext/>
       </w:pPr>
       <w:r>
-        <w:t>Before any outreach</w:t>
+        <w:t>Likely fit</w:t>
       </w:r>
     </w:p>
     <w:p>
       <w:pPr>
-        <w:numPr>
-          <w:ilvl w:val="0"/>
-          <w:numId w:val="10"/>
-        </w:numPr>
-        <w:spacing w:after="80" w:line="300" w:lineRule="auto"/>
+        <w:spacing w:before="0" w:after="120" w:line="300" w:lineRule="auto"/>
+      </w:pPr>
+      <w:r>
+        <w:rPr>
+          <w:rFonts w:ascii="Calibri" w:hAnsi="Calibri"/>
+          <w:b w:val="0"/>
+          <w:i w:val="0"/>
+          <w:color w:val="1C2737"/>
+          <w:sz w:val="22"/>
+        </w:rPr>
+        <w:t>A reason to investigate protection planning. It is not a recommendation, quote, coverage determination, or statement that David is appointed or licensed for every product shown by the source.</w:t>
+      </w:r>
+    </w:p>
+    <w:p>
+      <w:pPr>
+        <w:pStyle w:val="Heading2"/>
+        <w:keepNext/>
+      </w:pPr>
+      <w:r>
+        <w:t>Evidence</w:t>
+      </w:r>
+    </w:p>
+    <w:p>
+      <w:pPr>
+        <w:spacing w:before="0" w:after="120" w:line="300" w:lineRule="auto"/>
+      </w:pPr>
+      <w:r>
+        <w:rPr>
+          <w:rFonts w:ascii="Calibri" w:hAnsi="Calibri"/>
+          <w:b w:val="0"/>
+          <w:i w:val="0"/>
+          <w:color w:val="1C2737"/>
+          <w:sz w:val="22"/>
+        </w:rPr>
+        <w:t>A direct filing or official record shows the evidence class. A session-verifiable source reference binds the normalized source record to its receipt. Identity resolution, proof grade, clock, counter-evidence, and durable history remain outside that receipt and must be evaluated separately.</w:t>
+      </w:r>
+    </w:p>
+    <w:p>
+      <w:pPr>
+        <w:pStyle w:val="Heading2"/>
+        <w:keepNext/>
+      </w:pPr>
+      <w:r>
+        <w:t>Contact state</w:t>
+      </w:r>
+    </w:p>
+    <w:p>
+      <w:pPr>
+        <w:spacing w:before="0" w:after="120" w:line="300" w:lineRule="auto"/>
+      </w:pPr>
+      <w:r>
+        <w:rPr>
+          <w:rFonts w:ascii="Calibri" w:hAnsi="Calibri"/>
+          <w:b w:val="0"/>
+          <w:i w:val="0"/>
+          <w:color w:val="1C2737"/>
+          <w:sz w:val="22"/>
+        </w:rPr>
+        <w:t>Cleared to contact stays at zero in the public view. That is intentional. Public visibility does not create consent.</w:t>
+      </w:r>
+    </w:p>
+    <w:p>
+      <w:pPr>
+        <w:pStyle w:val="Heading1"/>
+        <w:keepNext/>
+      </w:pPr>
+      <w:r>
+        <w:t>The three-step broker action</w:t>
+      </w:r>
+    </w:p>
+    <w:p>
+      <w:pPr>
+        <w:spacing w:after="120" w:line="300" w:lineRule="auto"/>
+        <w:ind w:left="540" w:hanging="271"/>
       </w:pPr>
       <w:r>
         <w:rPr>
           <w:rFonts w:ascii="Calibri" w:hAnsi="Calibri"/>
           <w:b/>
-          <w:color w:val="0A2540"/>
+          <w:i w:val="0"/>
+          <w:color w:val="0B2545"/>
+          <w:sz w:val="22"/>
         </w:rPr>
-        <w:t xml:space="preserve">Check: </w:t>
+        <w:t xml:space="preserve">1. </w:t>
       </w:r>
       <w:r>
         <w:rPr>
           <w:rFonts w:ascii="Calibri" w:hAnsi="Calibri"/>
-          <w:color w:val="1F2933"/>
+          <w:b/>
+          <w:i w:val="0"/>
+          <w:color w:val="0B2545"/>
+          <w:sz w:val="22"/>
         </w:rPr>
-        <w:t>The organization and event were verified.</w:t>
+        <w:t xml:space="preserve">Verify the moment. </w:t>
+      </w:r>
+      <w:r>
+        <w:rPr>
+          <w:rFonts w:ascii="Calibri" w:hAnsi="Calibri"/>
+          <w:b w:val="0"/>
+          <w:i w:val="0"/>
+          <w:color w:val="1C2737"/>
+          <w:sz w:val="22"/>
+        </w:rPr>
+        <w:t>Open the cited source and confirm the organization, reported date, and relevant filing field.</w:t>
       </w:r>
     </w:p>
     <w:p>
       <w:pPr>
-        <w:numPr>
-          <w:ilvl w:val="0"/>
-          <w:numId w:val="10"/>
-        </w:numPr>
-        <w:spacing w:after="80" w:line="300" w:lineRule="auto"/>
+        <w:spacing w:after="120" w:line="300" w:lineRule="auto"/>
+        <w:ind w:left="540" w:hanging="271"/>
       </w:pPr>
       <w:r>
         <w:rPr>
           <w:rFonts w:ascii="Calibri" w:hAnsi="Calibri"/>
           <w:b/>
-          <w:color w:val="0A2540"/>
+          <w:i w:val="0"/>
+          <w:color w:val="0B2545"/>
+          <w:sz w:val="22"/>
         </w:rPr>
-        <w:t xml:space="preserve">Check: </w:t>
+        <w:t xml:space="preserve">2. </w:t>
       </w:r>
       <w:r>
         <w:rPr>
           <w:rFonts w:ascii="Calibri" w:hAnsi="Calibri"/>
-          <w:color w:val="1F2933"/>
+          <w:b/>
+          <w:i w:val="0"/>
+          <w:color w:val="0B2545"/>
+          <w:sz w:val="22"/>
         </w:rPr>
-        <w:t>The channel was published by the business itself.</w:t>
+        <w:t xml:space="preserve">Qualify the fit. </w:t>
+      </w:r>
+      <w:r>
+        <w:rPr>
+          <w:rFonts w:ascii="Calibri" w:hAnsi="Calibri"/>
+          <w:b w:val="0"/>
+          <w:i w:val="0"/>
+          <w:color w:val="1C2737"/>
+          <w:sz w:val="22"/>
+        </w:rPr>
+        <w:t>Use the organization’s own website to understand its operations and find a business-published channel.</w:t>
       </w:r>
     </w:p>
     <w:p>
       <w:pPr>
-        <w:numPr>
-          <w:ilvl w:val="0"/>
-          <w:numId w:val="10"/>
-        </w:numPr>
-        <w:spacing w:after="80" w:line="300" w:lineRule="auto"/>
+        <w:spacing w:after="120" w:line="300" w:lineRule="auto"/>
+        <w:ind w:left="540" w:hanging="271"/>
       </w:pPr>
       <w:r>
         <w:rPr>
           <w:rFonts w:ascii="Calibri" w:hAnsi="Calibri"/>
           <w:b/>
-          <w:color w:val="0A2540"/>
+          <w:i w:val="0"/>
+          <w:color w:val="0B2545"/>
+          <w:sz w:val="22"/>
         </w:rPr>
-        <w:t xml:space="preserve">Check: </w:t>
+        <w:t xml:space="preserve">3. </w:t>
       </w:r>
       <w:r>
         <w:rPr>
           <w:rFonts w:ascii="Calibri" w:hAnsi="Calibri"/>
-          <w:color w:val="1F2933"/>
+          <w:b/>
+          <w:i w:val="0"/>
+          <w:color w:val="0B2545"/>
+          <w:sz w:val="22"/>
         </w:rPr>
-        <w:t>Suppression and Do-Not-Contact checks passed.</w:t>
-      </w:r>
-    </w:p>
-    <w:p>
-      <w:pPr>
-        <w:numPr>
-          <w:ilvl w:val="0"/>
-          <w:numId w:val="10"/>
-        </w:numPr>
-        <w:spacing w:after="80" w:line="300" w:lineRule="auto"/>
-      </w:pPr>
-      <w:r>
-        <w:rPr>
-          <w:rFonts w:ascii="Calibri" w:hAnsi="Calibri"/>
-          <w:b/>
-          <w:color w:val="0A2540"/>
-        </w:rPr>
-        <w:t xml:space="preserve">Check: </w:t>
+        <w:t xml:space="preserve">Clear outreach. </w:t>
       </w:r>
       <w:r>
         <w:rPr>
           <w:rFonts w:ascii="Calibri" w:hAnsi="Calibri"/>
-          <w:color w:val="1F2933"/>
+          <w:b w:val="0"/>
+          <w:i w:val="0"/>
+          <w:color w:val="1C2737"/>
+          <w:sz w:val="22"/>
         </w:rPr>
-        <w:t>Licensing and state rules were checked.</w:t>
-      </w:r>
-    </w:p>
-    <w:p>
-      <w:pPr>
-        <w:numPr>
-          <w:ilvl w:val="0"/>
-          <w:numId w:val="10"/>
-        </w:numPr>
-        <w:spacing w:after="80" w:line="300" w:lineRule="auto"/>
-      </w:pPr>
-      <w:r>
-        <w:rPr>
-          <w:rFonts w:ascii="Calibri" w:hAnsi="Calibri"/>
-          <w:b/>
-          <w:color w:val="0A2540"/>
-        </w:rPr>
-        <w:t xml:space="preserve">Check: </w:t>
-      </w:r>
-      <w:r>
-        <w:rPr>
-          <w:rFonts w:ascii="Calibri" w:hAnsi="Calibri"/>
-          <w:color w:val="1F2933"/>
-        </w:rPr>
-        <w:t>The purpose and product discussion are permitted.</w:t>
-      </w:r>
-    </w:p>
-    <w:p>
-      <w:pPr>
-        <w:numPr>
-          <w:ilvl w:val="0"/>
-          <w:numId w:val="10"/>
-        </w:numPr>
-        <w:spacing w:after="80" w:line="300" w:lineRule="auto"/>
-      </w:pPr>
-      <w:r>
-        <w:rPr>
-          <w:rFonts w:ascii="Calibri" w:hAnsi="Calibri"/>
-          <w:b/>
-          <w:color w:val="0A2540"/>
-        </w:rPr>
-        <w:t xml:space="preserve">Check: </w:t>
-      </w:r>
-      <w:r>
-        <w:rPr>
-          <w:rFonts w:ascii="Calibri" w:hAnsi="Calibri"/>
-          <w:color w:val="1F2933"/>
-        </w:rPr>
-        <w:t>The record does not rely on a sample or unavailable source.</w:t>
-      </w:r>
-    </w:p>
-    <w:p>
-      <w:pPr>
-        <w:spacing w:before="80" w:after="200" w:line="288" w:lineRule="auto"/>
-        <w:shd w:fill="FFF7E6" w:val="clear"/>
-        <w:pBdr>
-          <w:left w:val="single" w:sz="18" w:space="8" w:color="168F89"/>
-        </w:pBdr>
-        <w:ind w:left="180" w:right="120"/>
-      </w:pPr>
-      <w:r>
-        <w:rPr>
-          <w:rFonts w:ascii="Calibri" w:hAnsi="Calibri"/>
-          <w:b/>
-          <w:color w:val="0A2540"/>
-        </w:rPr>
-        <w:t xml:space="preserve">If any check is missing: </w:t>
-      </w:r>
-      <w:r>
-        <w:rPr>
-          <w:rFonts w:ascii="Calibri" w:hAnsi="Calibri"/>
-          <w:color w:val="1F2933"/>
-        </w:rPr>
-        <w:t>Do more research or stop. The application is designed to make uncertainty visible, not to push every record into a call list.</w:t>
+        <w:t>In the protected workflow, complete suppression, licensing, state-rule, purpose, and channel checks before any call or email.</w:t>
       </w:r>
     </w:p>
     <w:p>
@@ -2481,244 +1071,92 @@
         <w:keepNext/>
       </w:pPr>
       <w:r>
-        <w:t>Five-minute meeting walkthrough</w:t>
+        <w:t>What David Leads never assumes</w:t>
       </w:r>
     </w:p>
     <w:p>
       <w:pPr>
-        <w:spacing w:after="120" w:line="300" w:lineRule="auto"/>
+        <w:pStyle w:val="ListBullet"/>
+        <w:spacing w:after="80" w:line="300" w:lineRule="auto"/>
+        <w:ind w:left="540" w:hanging="271"/>
       </w:pPr>
       <w:r>
         <w:rPr>
           <w:rFonts w:ascii="Calibri" w:hAnsi="Calibri"/>
-          <w:i/>
-          <w:color w:val="5A6B7C"/>
+          <w:b w:val="0"/>
+          <w:i w:val="0"/>
+          <w:color w:val="1C2737"/>
+          <w:sz w:val="22"/>
         </w:rPr>
-        <w:t>Use this sequence when showing David Leads to a broker, manager, or investor.</w:t>
+        <w:t>A public record is not consent or permission to contact.</w:t>
       </w:r>
     </w:p>
     <w:p>
       <w:pPr>
-        <w:numPr>
-          <w:ilvl w:val="0"/>
-          <w:numId w:val="11"/>
-        </w:numPr>
+        <w:pStyle w:val="ListBullet"/>
         <w:spacing w:after="80" w:line="300" w:lineRule="auto"/>
+        <w:ind w:left="540" w:hanging="271"/>
       </w:pPr>
       <w:r>
         <w:rPr>
           <w:rFonts w:ascii="Calibri" w:hAnsi="Calibri"/>
-          <w:color w:val="1F2933"/>
+          <w:b w:val="0"/>
+          <w:i w:val="0"/>
+          <w:color w:val="1C2737"/>
+          <w:sz w:val="22"/>
         </w:rPr>
-        <w:t>Open the app and say: 'This is live organization research from official public records, not a contact list.'</w:t>
+        <w:t>Observed activity is not revenue, intent, insurability, or a deal value.</w:t>
       </w:r>
     </w:p>
     <w:p>
       <w:pPr>
-        <w:numPr>
-          <w:ilvl w:val="0"/>
-          <w:numId w:val="11"/>
-        </w:numPr>
+        <w:pStyle w:val="ListBullet"/>
         <w:spacing w:after="80" w:line="300" w:lineRule="auto"/>
+        <w:ind w:left="540" w:hanging="271"/>
       </w:pPr>
       <w:r>
         <w:rPr>
           <w:rFonts w:ascii="Calibri" w:hAnsi="Calibri"/>
-          <w:color w:val="1F2933"/>
+          <w:b w:val="0"/>
+          <w:i w:val="0"/>
+          <w:color w:val="1C2737"/>
+          <w:sz w:val="22"/>
         </w:rPr>
-        <w:t>Show the 27-state territory selector and focus New York.</w:t>
+        <w:t>The system does not infer health, age, race, religion, family status, or private wealth.</w:t>
       </w:r>
     </w:p>
     <w:p>
       <w:pPr>
-        <w:numPr>
-          <w:ilvl w:val="0"/>
-          <w:numId w:val="11"/>
-        </w:numPr>
+        <w:pStyle w:val="ListBullet"/>
         <w:spacing w:after="80" w:line="300" w:lineRule="auto"/>
+        <w:ind w:left="540" w:hanging="271"/>
       </w:pPr>
       <w:r>
         <w:rPr>
           <w:rFonts w:ascii="Calibri" w:hAnsi="Calibri"/>
-          <w:color w:val="1F2933"/>
+          <w:b w:val="0"/>
+          <w:i w:val="0"/>
+          <w:color w:val="1C2737"/>
+          <w:sz w:val="22"/>
         </w:rPr>
-        <w:t>Point to Live organizations, Source coverage, and Needs research. Explain that unavailable sources stay visible.</w:t>
+        <w:t>The system does not scrape social profiles or use named executives, insiders, signers, or donors as personal wealth leads.</w:t>
       </w:r>
     </w:p>
     <w:p>
       <w:pPr>
-        <w:numPr>
-          <w:ilvl w:val="0"/>
-          <w:numId w:val="11"/>
-        </w:numPr>
+        <w:pStyle w:val="ListBullet"/>
         <w:spacing w:after="80" w:line="300" w:lineRule="auto"/>
+        <w:ind w:left="540" w:hanging="271"/>
       </w:pPr>
       <w:r>
         <w:rPr>
           <w:rFonts w:ascii="Calibri" w:hAnsi="Calibri"/>
-          <w:color w:val="1F2933"/>
+          <w:b w:val="0"/>
+          <w:i w:val="0"/>
+          <w:color w:val="1C2737"/>
+          <w:sz w:val="22"/>
         </w:rPr>
-        <w:t>Open one organization. Read the event, why now, official source, and limitations.</w:t>
-      </w:r>
-    </w:p>
-    <w:p>
-      <w:pPr>
-        <w:numPr>
-          <w:ilvl w:val="0"/>
-          <w:numId w:val="11"/>
-        </w:numPr>
-        <w:spacing w:after="80" w:line="300" w:lineRule="auto"/>
-      </w:pPr>
-      <w:r>
-        <w:rPr>
-          <w:rFonts w:ascii="Calibri" w:hAnsi="Calibri"/>
-          <w:color w:val="1F2933"/>
-        </w:rPr>
-        <w:t>Show the receipt or proof link. Explain that the public record can be checked before use.</w:t>
-      </w:r>
-    </w:p>
-    <w:p>
-      <w:pPr>
-        <w:numPr>
-          <w:ilvl w:val="0"/>
-          <w:numId w:val="11"/>
-        </w:numPr>
-        <w:spacing w:after="80" w:line="300" w:lineRule="auto"/>
-      </w:pPr>
-      <w:r>
-        <w:rPr>
-          <w:rFonts w:ascii="Calibri" w:hAnsi="Calibri"/>
-          <w:color w:val="1F2933"/>
-        </w:rPr>
-        <w:t>End with the contact gate: research is public; outreach still requires protected human clearance.</w:t>
-      </w:r>
-    </w:p>
-    <w:p>
-      <w:pPr>
-        <w:pStyle w:val="Heading2"/>
-        <w:keepNext/>
-      </w:pPr>
-      <w:r>
-        <w:t>A simple opening line</w:t>
-      </w:r>
-    </w:p>
-    <w:p>
-      <w:pPr>
-        <w:spacing w:before="80" w:after="200" w:line="288" w:lineRule="auto"/>
-        <w:shd w:fill="E8EEF5" w:val="clear"/>
-        <w:pBdr>
-          <w:left w:val="single" w:sz="18" w:space="8" w:color="168F89"/>
-        </w:pBdr>
-        <w:ind w:left="180" w:right="120"/>
-      </w:pPr>
-      <w:r>
-        <w:rPr>
-          <w:rFonts w:ascii="Calibri" w:hAnsi="Calibri"/>
-          <w:b/>
-          <w:color w:val="0A2540"/>
-        </w:rPr>
-        <w:t xml:space="preserve">Say: </w:t>
-      </w:r>
-      <w:r>
-        <w:rPr>
-          <w:rFonts w:ascii="Calibri" w:hAnsi="Calibri"/>
-          <w:color w:val="1F2933"/>
-        </w:rPr>
-        <w:t>David Leads helps you decide which organizations to research first, why the timing may matter, and exactly which official record to verify before a compliant conversation.</w:t>
-      </w:r>
-    </w:p>
-    <w:p>
-      <w:pPr>
-        <w:pStyle w:val="Heading2"/>
-        <w:keepNext/>
-      </w:pPr>
-      <w:r>
-        <w:t>What not to claim</w:t>
-      </w:r>
-    </w:p>
-    <w:p>
-      <w:pPr>
-        <w:numPr>
-          <w:ilvl w:val="0"/>
-          <w:numId w:val="10"/>
-        </w:numPr>
-        <w:spacing w:after="80" w:line="300" w:lineRule="auto"/>
-      </w:pPr>
-      <w:r>
-        <w:rPr>
-          <w:rFonts w:ascii="Calibri" w:hAnsi="Calibri"/>
-          <w:color w:val="1F2933"/>
-        </w:rPr>
-        <w:t>Do not say every record is a lead ready to call.</w:t>
-      </w:r>
-    </w:p>
-    <w:p>
-      <w:pPr>
-        <w:numPr>
-          <w:ilvl w:val="0"/>
-          <w:numId w:val="10"/>
-        </w:numPr>
-        <w:spacing w:after="80" w:line="300" w:lineRule="auto"/>
-      </w:pPr>
-      <w:r>
-        <w:rPr>
-          <w:rFonts w:ascii="Calibri" w:hAnsi="Calibri"/>
-          <w:color w:val="1F2933"/>
-        </w:rPr>
-        <w:t>Do not say a filing proves need, dissatisfaction, renewal, eligibility, or buying intent.</w:t>
-      </w:r>
-    </w:p>
-    <w:p>
-      <w:pPr>
-        <w:numPr>
-          <w:ilvl w:val="0"/>
-          <w:numId w:val="10"/>
-        </w:numPr>
-        <w:spacing w:after="80" w:line="300" w:lineRule="auto"/>
-      </w:pPr>
-      <w:r>
-        <w:rPr>
-          <w:rFonts w:ascii="Calibri" w:hAnsi="Calibri"/>
-          <w:color w:val="1F2933"/>
-        </w:rPr>
-        <w:t>Do not say a product fit is a recommendation or quote.</w:t>
-      </w:r>
-    </w:p>
-    <w:p>
-      <w:pPr>
-        <w:numPr>
-          <w:ilvl w:val="0"/>
-          <w:numId w:val="10"/>
-        </w:numPr>
-        <w:spacing w:after="80" w:line="300" w:lineRule="auto"/>
-      </w:pPr>
-      <w:r>
-        <w:rPr>
-          <w:rFonts w:ascii="Calibri" w:hAnsi="Calibri"/>
-          <w:color w:val="1F2933"/>
-        </w:rPr>
-        <w:t>Do not say the system uses private profiles or secret contact data.</w:t>
-      </w:r>
-    </w:p>
-    <w:p>
-      <w:pPr>
-        <w:numPr>
-          <w:ilvl w:val="0"/>
-          <w:numId w:val="10"/>
-        </w:numPr>
-        <w:spacing w:after="80" w:line="300" w:lineRule="auto"/>
-      </w:pPr>
-      <w:r>
-        <w:rPr>
-          <w:rFonts w:ascii="Calibri" w:hAnsi="Calibri"/>
-          <w:color w:val="1F2933"/>
-        </w:rPr>
-        <w:t>Do not call a source LIVE if the coverage panel says UNAVAILABLE.</w:t>
-      </w:r>
-    </w:p>
-    <w:p>
-      <w:r>
-        <w:br w:type="page"/>
+        <w:t>The public view never exposes broker notes, saved channels, clearance decisions, outcomes, or exports.</w:t>
       </w:r>
     </w:p>
     <w:p>
@@ -2727,470 +1165,293 @@
         <w:keepNext/>
       </w:pPr>
       <w:r>
-        <w:t>If something looks wrong</w:t>
+        <w:t>Department of Labor privacy boundary</w:t>
       </w:r>
     </w:p>
-    <w:tbl>
-      <w:tblPr>
-        <w:tblW w:type="dxa" w:w="9360"/>
-        <w:tblLayout w:type="fixed"/>
-        <w:tblLook w:firstColumn="1" w:firstRow="1" w:lastColumn="0" w:lastRow="0" w:noHBand="0" w:noVBand="1" w:val="04A0"/>
-        <w:jc w:val="left"/>
-        <w:tblInd w:w="120" w:type="dxa"/>
-      </w:tblPr>
-      <w:tblGrid>
-        <w:gridCol w:w="3150"/>
-        <w:gridCol w:w="6210"/>
-      </w:tblGrid>
-      <w:tr>
-        <w:trPr>
-          <w:tblHeader w:val="true"/>
-        </w:trPr>
-        <w:tc>
-          <w:tcPr>
-            <w:tcW w:type="dxa" w:w="3150"/>
-            <w:vAlign w:val="center"/>
-            <w:tcMar>
-              <w:top w:w="80" w:type="dxa"/>
-              <w:bottom w:w="80" w:type="dxa"/>
-              <w:start w:w="120" w:type="dxa"/>
-              <w:end w:w="120" w:type="dxa"/>
-            </w:tcMar>
-            <w:shd w:fill="0A2540" w:val="clear"/>
-          </w:tcPr>
-          <w:p>
-            <w:pPr>
-              <w:spacing w:after="0" w:line="276" w:lineRule="auto"/>
-              <w:jc w:val="left"/>
-            </w:pPr>
-            <w:r>
-              <w:rPr>
-                <w:rFonts w:ascii="Calibri" w:hAnsi="Calibri"/>
-                <w:b/>
-                <w:color w:val="FFFFFF"/>
-                <w:sz w:val="21"/>
-              </w:rPr>
-              <w:t>What you see</w:t>
-            </w:r>
-          </w:p>
-        </w:tc>
-        <w:tc>
-          <w:tcPr>
-            <w:tcW w:type="dxa" w:w="6210"/>
-            <w:vAlign w:val="center"/>
-            <w:tcMar>
-              <w:top w:w="80" w:type="dxa"/>
-              <w:bottom w:w="80" w:type="dxa"/>
-              <w:start w:w="120" w:type="dxa"/>
-              <w:end w:w="120" w:type="dxa"/>
-            </w:tcMar>
-            <w:shd w:fill="0A2540" w:val="clear"/>
-          </w:tcPr>
-          <w:p>
-            <w:pPr>
-              <w:spacing w:after="0" w:line="276" w:lineRule="auto"/>
-              <w:jc w:val="left"/>
-            </w:pPr>
-            <w:r>
-              <w:rPr>
-                <w:rFonts w:ascii="Calibri" w:hAnsi="Calibri"/>
-                <w:b/>
-                <w:color w:val="FFFFFF"/>
-                <w:sz w:val="21"/>
-              </w:rPr>
-              <w:t>What to do</w:t>
-            </w:r>
-          </w:p>
-        </w:tc>
-      </w:tr>
-      <w:tr>
-        <w:tc>
-          <w:tcPr>
-            <w:tcW w:type="dxa" w:w="3150"/>
-            <w:vAlign w:val="center"/>
-            <w:tcMar>
-              <w:top w:w="80" w:type="dxa"/>
-              <w:bottom w:w="80" w:type="dxa"/>
-              <w:start w:w="120" w:type="dxa"/>
-              <w:end w:w="120" w:type="dxa"/>
-            </w:tcMar>
-          </w:tcPr>
-          <w:p>
-            <w:pPr>
-              <w:spacing w:after="0" w:line="276" w:lineRule="auto"/>
-              <w:jc w:val="left"/>
-            </w:pPr>
-            <w:r>
-              <w:rPr>
-                <w:rFonts w:ascii="Calibri" w:hAnsi="Calibri"/>
-                <w:b/>
-                <w:color w:val="0A2540"/>
-                <w:sz w:val="21"/>
-              </w:rPr>
-              <w:t>The page is still opening</w:t>
-            </w:r>
-          </w:p>
-        </w:tc>
-        <w:tc>
-          <w:tcPr>
-            <w:tcW w:type="dxa" w:w="6210"/>
-            <w:vAlign w:val="center"/>
-            <w:tcMar>
-              <w:top w:w="80" w:type="dxa"/>
-              <w:bottom w:w="80" w:type="dxa"/>
-              <w:start w:w="120" w:type="dxa"/>
-              <w:end w:w="120" w:type="dxa"/>
-            </w:tcMar>
-          </w:tcPr>
-          <w:p>
-            <w:pPr>
-              <w:spacing w:after="0" w:line="276" w:lineRule="auto"/>
-              <w:jc w:val="left"/>
-            </w:pPr>
-            <w:r>
-              <w:rPr>
-                <w:rFonts w:ascii="Calibri" w:hAnsi="Calibri"/>
-                <w:b w:val="0"/>
-                <w:color w:val="1F2933"/>
-                <w:sz w:val="21"/>
-              </w:rPr>
-              <w:t>Wait for the opening screen to disappear, then refresh once.</w:t>
-            </w:r>
-          </w:p>
-        </w:tc>
-      </w:tr>
-      <w:tr>
-        <w:tc>
-          <w:tcPr>
-            <w:tcW w:type="dxa" w:w="3150"/>
-            <w:shd w:fill="F5F8FB" w:val="clear"/>
-            <w:vAlign w:val="center"/>
-            <w:tcMar>
-              <w:top w:w="80" w:type="dxa"/>
-              <w:bottom w:w="80" w:type="dxa"/>
-              <w:start w:w="120" w:type="dxa"/>
-              <w:end w:w="120" w:type="dxa"/>
-            </w:tcMar>
-          </w:tcPr>
-          <w:p>
-            <w:pPr>
-              <w:spacing w:after="0" w:line="276" w:lineRule="auto"/>
-              <w:jc w:val="left"/>
-            </w:pPr>
-            <w:r>
-              <w:rPr>
-                <w:rFonts w:ascii="Calibri" w:hAnsi="Calibri"/>
-                <w:b/>
-                <w:color w:val="0A2540"/>
-                <w:sz w:val="21"/>
-              </w:rPr>
-              <w:t>A source says UNAVAILABLE</w:t>
-            </w:r>
-          </w:p>
-        </w:tc>
-        <w:tc>
-          <w:tcPr>
-            <w:tcW w:type="dxa" w:w="6210"/>
-            <w:shd w:fill="F5F8FB" w:val="clear"/>
-            <w:vAlign w:val="center"/>
-            <w:tcMar>
-              <w:top w:w="80" w:type="dxa"/>
-              <w:bottom w:w="80" w:type="dxa"/>
-              <w:start w:w="120" w:type="dxa"/>
-              <w:end w:w="120" w:type="dxa"/>
-            </w:tcMar>
-          </w:tcPr>
-          <w:p>
-            <w:pPr>
-              <w:spacing w:after="0" w:line="276" w:lineRule="auto"/>
-              <w:jc w:val="left"/>
-            </w:pPr>
-            <w:r>
-              <w:rPr>
-                <w:rFonts w:ascii="Calibri" w:hAnsi="Calibri"/>
-                <w:b w:val="0"/>
-                <w:color w:val="1F2933"/>
-                <w:sz w:val="21"/>
-              </w:rPr>
-              <w:t>Use another live source or return later. Do not treat the outage as a zero or a live result.</w:t>
-            </w:r>
-          </w:p>
-        </w:tc>
-      </w:tr>
-      <w:tr>
-        <w:tc>
-          <w:tcPr>
-            <w:tcW w:type="dxa" w:w="3150"/>
-            <w:vAlign w:val="center"/>
-            <w:tcMar>
-              <w:top w:w="80" w:type="dxa"/>
-              <w:bottom w:w="80" w:type="dxa"/>
-              <w:start w:w="120" w:type="dxa"/>
-              <w:end w:w="120" w:type="dxa"/>
-            </w:tcMar>
-          </w:tcPr>
-          <w:p>
-            <w:pPr>
-              <w:spacing w:after="0" w:line="276" w:lineRule="auto"/>
-              <w:jc w:val="left"/>
-            </w:pPr>
-            <w:r>
-              <w:rPr>
-                <w:rFonts w:ascii="Calibri" w:hAnsi="Calibri"/>
-                <w:b/>
-                <w:color w:val="0A2540"/>
-                <w:sz w:val="21"/>
-              </w:rPr>
-              <w:t>A state has few records</w:t>
-            </w:r>
-          </w:p>
-        </w:tc>
-        <w:tc>
-          <w:tcPr>
-            <w:tcW w:type="dxa" w:w="6210"/>
-            <w:vAlign w:val="center"/>
-            <w:tcMar>
-              <w:top w:w="80" w:type="dxa"/>
-              <w:bottom w:w="80" w:type="dxa"/>
-              <w:start w:w="120" w:type="dxa"/>
-              <w:end w:w="120" w:type="dxa"/>
-            </w:tcMar>
-          </w:tcPr>
-          <w:p>
-            <w:pPr>
-              <w:spacing w:after="0" w:line="276" w:lineRule="auto"/>
-              <w:jc w:val="left"/>
-            </w:pPr>
-            <w:r>
-              <w:rPr>
-                <w:rFonts w:ascii="Calibri" w:hAnsi="Calibri"/>
-                <w:b w:val="0"/>
-                <w:color w:val="1F2933"/>
-                <w:sz w:val="21"/>
-              </w:rPr>
-              <w:t>Select that one state to run the deeper state-specific pull.</w:t>
-            </w:r>
-          </w:p>
-        </w:tc>
-      </w:tr>
-      <w:tr>
-        <w:tc>
-          <w:tcPr>
-            <w:tcW w:type="dxa" w:w="3150"/>
-            <w:shd w:fill="F5F8FB" w:val="clear"/>
-            <w:vAlign w:val="center"/>
-            <w:tcMar>
-              <w:top w:w="80" w:type="dxa"/>
-              <w:bottom w:w="80" w:type="dxa"/>
-              <w:start w:w="120" w:type="dxa"/>
-              <w:end w:w="120" w:type="dxa"/>
-            </w:tcMar>
-          </w:tcPr>
-          <w:p>
-            <w:pPr>
-              <w:spacing w:after="0" w:line="276" w:lineRule="auto"/>
-              <w:jc w:val="left"/>
-            </w:pPr>
-            <w:r>
-              <w:rPr>
-                <w:rFonts w:ascii="Calibri" w:hAnsi="Calibri"/>
-                <w:b/>
-                <w:color w:val="0A2540"/>
-                <w:sz w:val="21"/>
-              </w:rPr>
-              <w:t>The count changed</w:t>
-            </w:r>
-          </w:p>
-        </w:tc>
-        <w:tc>
-          <w:tcPr>
-            <w:tcW w:type="dxa" w:w="6210"/>
-            <w:shd w:fill="F5F8FB" w:val="clear"/>
-            <w:vAlign w:val="center"/>
-            <w:tcMar>
-              <w:top w:w="80" w:type="dxa"/>
-              <w:bottom w:w="80" w:type="dxa"/>
-              <w:start w:w="120" w:type="dxa"/>
-              <w:end w:w="120" w:type="dxa"/>
-            </w:tcMar>
-          </w:tcPr>
-          <w:p>
-            <w:pPr>
-              <w:spacing w:after="0" w:line="276" w:lineRule="auto"/>
-              <w:jc w:val="left"/>
-            </w:pPr>
-            <w:r>
-              <w:rPr>
-                <w:rFonts w:ascii="Calibri" w:hAnsi="Calibri"/>
-                <w:b w:val="0"/>
-                <w:color w:val="1F2933"/>
-                <w:sz w:val="21"/>
-              </w:rPr>
-              <w:t>That is expected. Counts follow current public-source responses and the chosen territory.</w:t>
-            </w:r>
-          </w:p>
-        </w:tc>
-      </w:tr>
-      <w:tr>
-        <w:tc>
-          <w:tcPr>
-            <w:tcW w:type="dxa" w:w="3150"/>
-            <w:vAlign w:val="center"/>
-            <w:tcMar>
-              <w:top w:w="80" w:type="dxa"/>
-              <w:bottom w:w="80" w:type="dxa"/>
-              <w:start w:w="120" w:type="dxa"/>
-              <w:end w:w="120" w:type="dxa"/>
-            </w:tcMar>
-          </w:tcPr>
-          <w:p>
-            <w:pPr>
-              <w:spacing w:after="0" w:line="276" w:lineRule="auto"/>
-              <w:jc w:val="left"/>
-            </w:pPr>
-            <w:r>
-              <w:rPr>
-                <w:rFonts w:ascii="Calibri" w:hAnsi="Calibri"/>
-                <w:b/>
-                <w:color w:val="0A2540"/>
-                <w:sz w:val="21"/>
-              </w:rPr>
-              <w:t>A record looks surprising</w:t>
-            </w:r>
-          </w:p>
-        </w:tc>
-        <w:tc>
-          <w:tcPr>
-            <w:tcW w:type="dxa" w:w="6210"/>
-            <w:vAlign w:val="center"/>
-            <w:tcMar>
-              <w:top w:w="80" w:type="dxa"/>
-              <w:bottom w:w="80" w:type="dxa"/>
-              <w:start w:w="120" w:type="dxa"/>
-              <w:end w:w="120" w:type="dxa"/>
-            </w:tcMar>
-          </w:tcPr>
-          <w:p>
-            <w:pPr>
-              <w:spacing w:after="0" w:line="276" w:lineRule="auto"/>
-              <w:jc w:val="left"/>
-            </w:pPr>
-            <w:r>
-              <w:rPr>
-                <w:rFonts w:ascii="Calibri" w:hAnsi="Calibri"/>
-                <w:b w:val="0"/>
-                <w:color w:val="1F2933"/>
-                <w:sz w:val="21"/>
-              </w:rPr>
-              <w:t>Open the official source and confirm it. If it cannot be confirmed, do not use it.</w:t>
-            </w:r>
-          </w:p>
-        </w:tc>
-      </w:tr>
-      <w:tr>
-        <w:tc>
-          <w:tcPr>
-            <w:tcW w:type="dxa" w:w="3150"/>
-            <w:shd w:fill="F5F8FB" w:val="clear"/>
-            <w:vAlign w:val="center"/>
-            <w:tcMar>
-              <w:top w:w="80" w:type="dxa"/>
-              <w:bottom w:w="80" w:type="dxa"/>
-              <w:start w:w="120" w:type="dxa"/>
-              <w:end w:w="120" w:type="dxa"/>
-            </w:tcMar>
-          </w:tcPr>
-          <w:p>
-            <w:pPr>
-              <w:spacing w:after="0" w:line="276" w:lineRule="auto"/>
-              <w:jc w:val="left"/>
-            </w:pPr>
-            <w:r>
-              <w:rPr>
-                <w:rFonts w:ascii="Calibri" w:hAnsi="Calibri"/>
-                <w:b/>
-                <w:color w:val="0A2540"/>
-                <w:sz w:val="21"/>
-              </w:rPr>
-              <w:t>You need saved notes or outreach actions</w:t>
-            </w:r>
-          </w:p>
-        </w:tc>
-        <w:tc>
-          <w:tcPr>
-            <w:tcW w:type="dxa" w:w="6210"/>
-            <w:shd w:fill="F5F8FB" w:val="clear"/>
-            <w:vAlign w:val="center"/>
-            <w:tcMar>
-              <w:top w:w="80" w:type="dxa"/>
-              <w:bottom w:w="80" w:type="dxa"/>
-              <w:start w:w="120" w:type="dxa"/>
-              <w:end w:w="120" w:type="dxa"/>
-            </w:tcMar>
-          </w:tcPr>
-          <w:p>
-            <w:pPr>
-              <w:spacing w:after="0" w:line="276" w:lineRule="auto"/>
-              <w:jc w:val="left"/>
-            </w:pPr>
-            <w:r>
-              <w:rPr>
-                <w:rFonts w:ascii="Calibri" w:hAnsi="Calibri"/>
-                <w:b w:val="0"/>
-                <w:color w:val="1F2933"/>
-                <w:sz w:val="21"/>
-              </w:rPr>
-              <w:t>Those functions belong in the protected broker workflow and are not exposed in the public research view.</w:t>
-            </w:r>
-          </w:p>
-        </w:tc>
-      </w:tr>
-    </w:tbl>
+    <w:p>
+      <w:pPr>
+        <w:spacing w:before="0" w:after="120" w:line="300" w:lineRule="auto"/>
+      </w:pPr>
+      <w:r>
+        <w:rPr>
+          <w:rFonts w:ascii="Calibri" w:hAnsi="Calibri"/>
+          <w:b w:val="0"/>
+          <w:i w:val="0"/>
+          <w:color w:val="1C2737"/>
+          <w:sz w:val="22"/>
+        </w:rPr>
+        <w:t>The life-plan lane keeps only the organization, public location, plan-period dates, participant count, reported carriers, and benefit categories needed for the research card.</w:t>
+      </w:r>
+    </w:p>
+    <w:p>
+      <w:pPr>
+        <w:spacing w:before="80" w:after="200" w:line="288" w:lineRule="auto"/>
+        <w:ind w:left="173" w:right="173"/>
+        <w:shd w:fill="FFF7E5"/>
+        <w:pBdr>
+          <w:left w:val="single" w:sz="18" w:space="8" w:color="B78921"/>
+        </w:pBdr>
+      </w:pPr>
+      <w:r>
+        <w:rPr>
+          <w:rFonts w:ascii="Calibri" w:hAnsi="Calibri"/>
+          <w:b/>
+          <w:i w:val="0"/>
+          <w:color w:val="0B2545"/>
+          <w:sz w:val="22"/>
+        </w:rPr>
+        <w:t xml:space="preserve">Excluded: </w:t>
+      </w:r>
+      <w:r>
+        <w:rPr>
+          <w:rFonts w:ascii="Calibri" w:hAnsi="Calibri"/>
+          <w:b w:val="0"/>
+          <w:i w:val="0"/>
+          <w:color w:val="1C2737"/>
+          <w:sz w:val="22"/>
+        </w:rPr>
+        <w:t>EINs, phone numbers, named administrators and signers, preparers, broker identities, commissions, and person-level addresses are not retained.</w:t>
+      </w:r>
+    </w:p>
     <w:p>
       <w:pPr>
         <w:pStyle w:val="Heading1"/>
         <w:keepNext/>
       </w:pPr>
       <w:r>
-        <w:t>The one rule to remember</w:t>
+        <w:t>When a source is unavailable</w:t>
+      </w:r>
+    </w:p>
+    <w:p>
+      <w:pPr>
+        <w:spacing w:after="120" w:line="300" w:lineRule="auto"/>
+        <w:ind w:left="540" w:hanging="271"/>
+      </w:pPr>
+      <w:r>
+        <w:rPr>
+          <w:rFonts w:ascii="Calibri" w:hAnsi="Calibri"/>
+          <w:b/>
+          <w:i w:val="0"/>
+          <w:color w:val="0B2545"/>
+          <w:sz w:val="22"/>
+        </w:rPr>
+        <w:t xml:space="preserve">1. </w:t>
+      </w:r>
+      <w:r>
+        <w:rPr>
+          <w:rFonts w:ascii="Calibri" w:hAnsi="Calibri"/>
+          <w:b/>
+          <w:i w:val="0"/>
+          <w:color w:val="0B2545"/>
+          <w:sz w:val="22"/>
+        </w:rPr>
+        <w:t xml:space="preserve">Open Market coverage. </w:t>
+      </w:r>
+      <w:r>
+        <w:rPr>
+          <w:rFonts w:ascii="Calibri" w:hAnsi="Calibri"/>
+          <w:b w:val="0"/>
+          <w:i w:val="0"/>
+          <w:color w:val="1C2737"/>
+          <w:sz w:val="22"/>
+        </w:rPr>
+        <w:t>Each source reports LIVE, UNAVAILABLE, or NOT APPLICABLE.</w:t>
+      </w:r>
+    </w:p>
+    <w:p>
+      <w:pPr>
+        <w:spacing w:after="120" w:line="300" w:lineRule="auto"/>
+        <w:ind w:left="540" w:hanging="271"/>
+      </w:pPr>
+      <w:r>
+        <w:rPr>
+          <w:rFonts w:ascii="Calibri" w:hAnsi="Calibri"/>
+          <w:b/>
+          <w:i w:val="0"/>
+          <w:color w:val="0B2545"/>
+          <w:sz w:val="22"/>
+        </w:rPr>
+        <w:t xml:space="preserve">2. </w:t>
+      </w:r>
+      <w:r>
+        <w:rPr>
+          <w:rFonts w:ascii="Calibri" w:hAnsi="Calibri"/>
+          <w:b/>
+          <w:i w:val="0"/>
+          <w:color w:val="0B2545"/>
+          <w:sz w:val="22"/>
+        </w:rPr>
+        <w:t xml:space="preserve">Read the reason. </w:t>
+      </w:r>
+      <w:r>
+        <w:rPr>
+          <w:rFonts w:ascii="Calibri" w:hAnsi="Calibri"/>
+          <w:b w:val="0"/>
+          <w:i w:val="0"/>
+          <w:color w:val="1C2737"/>
+          <w:sz w:val="22"/>
+        </w:rPr>
+        <w:t>A missing credential, source outage, or territory mismatch remains visible.</w:t>
+      </w:r>
+    </w:p>
+    <w:p>
+      <w:pPr>
+        <w:spacing w:after="120" w:line="300" w:lineRule="auto"/>
+        <w:ind w:left="540" w:hanging="271"/>
+      </w:pPr>
+      <w:r>
+        <w:rPr>
+          <w:rFonts w:ascii="Calibri" w:hAnsi="Calibri"/>
+          <w:b/>
+          <w:i w:val="0"/>
+          <w:color w:val="0B2545"/>
+          <w:sz w:val="22"/>
+        </w:rPr>
+        <w:t xml:space="preserve">3. </w:t>
+      </w:r>
+      <w:r>
+        <w:rPr>
+          <w:rFonts w:ascii="Calibri" w:hAnsi="Calibri"/>
+          <w:b/>
+          <w:i w:val="0"/>
+          <w:color w:val="0B2545"/>
+          <w:sz w:val="22"/>
+        </w:rPr>
+        <w:t xml:space="preserve">Do not work around it. </w:t>
+      </w:r>
+      <w:r>
+        <w:rPr>
+          <w:rFonts w:ascii="Calibri" w:hAnsi="Calibri"/>
+          <w:b w:val="0"/>
+          <w:i w:val="0"/>
+          <w:color w:val="1C2737"/>
+          <w:sz w:val="22"/>
+        </w:rPr>
+        <w:t>The application never substitutes a fake lead for an unavailable source.</w:t>
+      </w:r>
+    </w:p>
+    <w:p>
+      <w:pPr>
+        <w:pStyle w:val="Heading1"/>
+        <w:keepNext/>
+      </w:pPr>
+      <w:r>
+        <w:t>Best practice before every outreach decision</w:t>
+      </w:r>
+    </w:p>
+    <w:p>
+      <w:pPr>
+        <w:pStyle w:val="ListBullet"/>
+        <w:spacing w:after="80" w:line="300" w:lineRule="auto"/>
+        <w:ind w:left="540" w:hanging="271"/>
+      </w:pPr>
+      <w:r>
+        <w:rPr>
+          <w:rFonts w:ascii="Calibri" w:hAnsi="Calibri"/>
+          <w:b w:val="0"/>
+          <w:i w:val="0"/>
+          <w:color w:val="1C2737"/>
+          <w:sz w:val="22"/>
+        </w:rPr>
+        <w:t>Confirm the official record is current.</w:t>
+      </w:r>
+    </w:p>
+    <w:p>
+      <w:pPr>
+        <w:pStyle w:val="ListBullet"/>
+        <w:spacing w:after="80" w:line="300" w:lineRule="auto"/>
+        <w:ind w:left="540" w:hanging="271"/>
+      </w:pPr>
+      <w:r>
+        <w:rPr>
+          <w:rFonts w:ascii="Calibri" w:hAnsi="Calibri"/>
+          <w:b w:val="0"/>
+          <w:i w:val="0"/>
+          <w:color w:val="1C2737"/>
+          <w:sz w:val="22"/>
+        </w:rPr>
+        <w:t>Confirm the product and jurisdiction are within David’s approved scope.</w:t>
+      </w:r>
+    </w:p>
+    <w:p>
+      <w:pPr>
+        <w:pStyle w:val="ListBullet"/>
+        <w:spacing w:after="80" w:line="300" w:lineRule="auto"/>
+        <w:ind w:left="540" w:hanging="271"/>
+      </w:pPr>
+      <w:r>
+        <w:rPr>
+          <w:rFonts w:ascii="Calibri" w:hAnsi="Calibri"/>
+          <w:b w:val="0"/>
+          <w:i w:val="0"/>
+          <w:color w:val="1C2737"/>
+          <w:sz w:val="22"/>
+        </w:rPr>
+        <w:t>Use only a business-published channel from the organization’s own website.</w:t>
+      </w:r>
+    </w:p>
+    <w:p>
+      <w:pPr>
+        <w:pStyle w:val="ListBullet"/>
+        <w:spacing w:after="80" w:line="300" w:lineRule="auto"/>
+        <w:ind w:left="540" w:hanging="271"/>
+      </w:pPr>
+      <w:r>
+        <w:rPr>
+          <w:rFonts w:ascii="Calibri" w:hAnsi="Calibri"/>
+          <w:b w:val="0"/>
+          <w:i w:val="0"/>
+          <w:color w:val="1C2737"/>
+          <w:sz w:val="22"/>
+        </w:rPr>
+        <w:t>Complete all suppression, licensing, state-rule, and purpose checks.</w:t>
+      </w:r>
+    </w:p>
+    <w:p>
+      <w:pPr>
+        <w:pStyle w:val="ListBullet"/>
+        <w:spacing w:after="80" w:line="300" w:lineRule="auto"/>
+        <w:ind w:left="540" w:hanging="271"/>
+      </w:pPr>
+      <w:r>
+        <w:rPr>
+          <w:rFonts w:ascii="Calibri" w:hAnsi="Calibri"/>
+          <w:b w:val="0"/>
+          <w:i w:val="0"/>
+          <w:color w:val="1C2737"/>
+          <w:sz w:val="22"/>
+        </w:rPr>
+        <w:t>Record time-limited clearance in the protected workflow.</w:t>
       </w:r>
     </w:p>
     <w:p>
       <w:pPr>
         <w:spacing w:before="80" w:after="200" w:line="288" w:lineRule="auto"/>
-        <w:shd w:fill="E8F6F4" w:val="clear"/>
+        <w:ind w:left="173" w:right="173"/>
+        <w:shd w:fill="E7F5F3"/>
         <w:pBdr>
-          <w:left w:val="single" w:sz="18" w:space="8" w:color="168F89"/>
+          <w:left w:val="single" w:sz="18" w:space="8" w:color="148984"/>
         </w:pBdr>
-        <w:ind w:left="180" w:right="120"/>
       </w:pPr>
       <w:r>
         <w:rPr>
           <w:rFonts w:ascii="Calibri" w:hAnsi="Calibri"/>
           <w:b/>
-          <w:color w:val="0A2540"/>
+          <w:i w:val="0"/>
+          <w:color w:val="0B2545"/>
+          <w:sz w:val="22"/>
         </w:rPr>
-        <w:t xml:space="preserve">Use David Leads to decide what to research first. </w:t>
+        <w:t xml:space="preserve">Remember: </w:t>
       </w:r>
       <w:r>
         <w:rPr>
           <w:rFonts w:ascii="Calibri" w:hAnsi="Calibri"/>
-          <w:color w:val="1F2933"/>
+          <w:b w:val="0"/>
+          <w:i w:val="0"/>
+          <w:color w:val="1C2737"/>
+          <w:sz w:val="22"/>
         </w:rPr>
-        <w:t>Use the official record to verify why. Use the protected clearance process to decide whether contact is permitted.</w:t>
-      </w:r>
-    </w:p>
-    <w:p>
-      <w:pPr>
-        <w:spacing w:after="120" w:line="300" w:lineRule="auto"/>
-      </w:pPr>
-      <w:r>
-        <w:rPr>
-          <w:rFonts w:ascii="Calibri" w:hAnsi="Calibri"/>
-          <w:i/>
-          <w:color w:val="5A6B7C"/>
-        </w:rPr>
-        <w:t>Public organization data only. No passwords or access keys are printed in this guide.</w:t>
+        <w:t>The software helps David focus his research. David’s licensed judgment and the protected clearance process decide whether any next action is appropriate.</w:t>
       </w:r>
     </w:p>
     <w:sectPr>
@@ -3210,24 +1471,22 @@
   <w:p>
     <w:pPr>
       <w:pStyle w:val="Footer"/>
+      <w:spacing w:before="0" w:after="0"/>
       <w:jc w:val="right"/>
     </w:pPr>
     <w:r>
       <w:rPr>
         <w:rFonts w:ascii="Calibri" w:hAnsi="Calibri"/>
-        <w:color w:val="5A6B7C"/>
+        <w:b w:val="0"/>
+        <w:i w:val="0"/>
+        <w:color w:val="5C697A"/>
         <w:sz w:val="17"/>
       </w:rPr>
-      <w:t xml:space="preserve">Verified operating guide  |  August 2026  |  </w:t>
+      <w:t xml:space="preserve">David Leads | Broker Guide   •   Page </w:t>
     </w:r>
     <w:r>
-      <w:rPr>
-        <w:rFonts w:ascii="Calibri" w:hAnsi="Calibri"/>
-        <w:color w:val="5A6B7C"/>
-        <w:sz w:val="18"/>
-      </w:rPr>
       <w:fldChar w:fldCharType="begin"/>
-      <w:instrText xml:space="preserve"> PAGE </w:instrText>
+      <w:instrText xml:space="preserve">PAGE</w:instrText>
       <w:fldChar w:fldCharType="separate"/>
       <w:t>1</w:t>
       <w:fldChar w:fldCharType="end"/>
@@ -3248,10 +1507,21 @@
       <w:rPr>
         <w:rFonts w:ascii="Calibri" w:hAnsi="Calibri"/>
         <w:b/>
-        <w:color w:val="5A6B7C"/>
+        <w:i w:val="0"/>
+        <w:color w:val="148984"/>
         <w:sz w:val="17"/>
       </w:rPr>
-      <w:t>DAVID LEADS  |  BROKER FIELD GUIDE</w:t>
+      <w:t>DAVID LEADS</w:t>
+    </w:r>
+    <w:r>
+      <w:rPr>
+        <w:rFonts w:ascii="Calibri" w:hAnsi="Calibri"/>
+        <w:b w:val="0"/>
+        <w:i w:val="0"/>
+        <w:color w:val="5C697A"/>
+        <w:sz w:val="17"/>
+      </w:rPr>
+      <w:t xml:space="preserve">   |   Evidence-Backed Broker Research</w:t>
     </w:r>
   </w:p>
 </w:hdr>
@@ -3456,50 +1726,6 @@
   </w:num>
   <w:num w:numId="9">
     <w:abstractNumId w:val="0"/>
-  </w:num>
-  <w:abstractNum w:abstractNumId="9">
-    <w:multiLevelType w:val="singleLevel"/>
-    <w:lvl w:ilvl="0">
-      <w:start w:val="1"/>
-      <w:numFmt w:val="bullet"/>
-      <w:lvlText w:val="•"/>
-      <w:suff w:val="tab"/>
-      <w:pPr>
-        <w:tabs>
-          <w:tab w:val="num" w:pos="540"/>
-        </w:tabs>
-        <w:ind w:left="540" w:hanging="270"/>
-        <w:spacing w:after="80" w:line="300" w:lineRule="auto"/>
-      </w:pPr>
-      <w:rPr>
-        <w:rFonts w:ascii="Calibri" w:hAnsi="Calibri"/>
-      </w:rPr>
-    </w:lvl>
-  </w:abstractNum>
-  <w:num w:numId="10">
-    <w:abstractNumId w:val="9"/>
-  </w:num>
-  <w:abstractNum w:abstractNumId="10">
-    <w:multiLevelType w:val="singleLevel"/>
-    <w:lvl w:ilvl="0">
-      <w:start w:val="1"/>
-      <w:numFmt w:val="decimal"/>
-      <w:lvlText w:val="%1."/>
-      <w:suff w:val="tab"/>
-      <w:pPr>
-        <w:tabs>
-          <w:tab w:val="num" w:pos="540"/>
-        </w:tabs>
-        <w:ind w:left="540" w:hanging="270"/>
-        <w:spacing w:after="80" w:line="300" w:lineRule="auto"/>
-      </w:pPr>
-      <w:rPr>
-        <w:rFonts w:ascii="Calibri" w:hAnsi="Calibri"/>
-      </w:rPr>
-    </w:lvl>
-  </w:abstractNum>
-  <w:num w:numId="11">
-    <w:abstractNumId w:val="10"/>
   </w:num>
 </w:numbering>
 </file>
@@ -3669,7 +1895,7 @@
     </w:pPr>
     <w:rPr>
       <w:rFonts w:ascii="Calibri" w:hAnsi="Calibri"/>
-      <w:color w:val="1F2933"/>
+      <w:color w:val="1C2737"/>
       <w:sz w:val="22"/>
     </w:rPr>
   </w:style>
@@ -3735,7 +1961,7 @@
       <w:rFonts w:asciiTheme="majorHAnsi" w:eastAsiaTheme="majorEastAsia" w:hAnsiTheme="majorHAnsi" w:cstheme="majorBidi" w:ascii="Calibri" w:hAnsi="Calibri"/>
       <w:b/>
       <w:bCs/>
-      <w:color w:val="0A2540"/>
+      <w:color w:val="2E74B5"/>
       <w:sz w:val="32"/>
       <w:szCs w:val="28"/>
     </w:rPr>
@@ -3759,7 +1985,7 @@
       <w:rFonts w:asciiTheme="majorHAnsi" w:eastAsiaTheme="majorEastAsia" w:hAnsiTheme="majorHAnsi" w:cstheme="majorBidi" w:ascii="Calibri" w:hAnsi="Calibri"/>
       <w:b/>
       <w:bCs/>
-      <w:color w:val="168F89"/>
+      <w:color w:val="2E74B5"/>
       <w:sz w:val="26"/>
       <w:szCs w:val="26"/>
     </w:rPr>
@@ -3783,7 +2009,7 @@
       <w:rFonts w:asciiTheme="majorHAnsi" w:eastAsiaTheme="majorEastAsia" w:hAnsiTheme="majorHAnsi" w:cstheme="majorBidi" w:ascii="Calibri" w:hAnsi="Calibri"/>
       <w:b/>
       <w:bCs/>
-      <w:color w:val="0A2540"/>
+      <w:color w:val="1F4D78"/>
       <w:sz w:val="24"/>
     </w:rPr>
   </w:style>
@@ -4018,16 +2244,15 @@
       <w:pBdr>
         <w:bottom w:val="single" w:sz="8" w:space="4" w:color="4F81BD" w:themeColor="accent1"/>
       </w:pBdr>
-      <w:spacing w:after="160" w:line="240" w:lineRule="auto" w:before="0"/>
+      <w:spacing w:after="300" w:line="240" w:lineRule="auto"/>
       <w:contextualSpacing/>
     </w:pPr>
     <w:rPr>
-      <w:rFonts w:asciiTheme="majorHAnsi" w:eastAsiaTheme="majorEastAsia" w:hAnsiTheme="majorHAnsi" w:cstheme="majorBidi" w:ascii="Calibri" w:hAnsi="Calibri"/>
-      <w:b/>
-      <w:color w:val="0A2540"/>
+      <w:rFonts w:asciiTheme="majorHAnsi" w:eastAsiaTheme="majorEastAsia" w:hAnsiTheme="majorHAnsi" w:cstheme="majorBidi"/>
+      <w:color w:val="17365D" w:themeColor="text2" w:themeShade="BF"/>
       <w:spacing w:val="5"/>
       <w:kern w:val="28"/>
-      <w:sz w:val="56"/>
+      <w:sz w:val="52"/>
       <w:szCs w:val="52"/>
     </w:rPr>
   </w:style>
@@ -4058,15 +2283,14 @@
       <w:numPr>
         <w:ilvl w:val="1"/>
       </w:numPr>
-      <w:spacing w:after="360"/>
     </w:pPr>
     <w:rPr>
-      <w:rFonts w:asciiTheme="majorHAnsi" w:eastAsiaTheme="majorEastAsia" w:hAnsiTheme="majorHAnsi" w:cstheme="majorBidi" w:ascii="Calibri" w:hAnsi="Calibri"/>
+      <w:rFonts w:asciiTheme="majorHAnsi" w:eastAsiaTheme="majorEastAsia" w:hAnsiTheme="majorHAnsi" w:cstheme="majorBidi"/>
       <w:i/>
       <w:iCs/>
-      <w:color w:val="5A6B7C"/>
+      <w:color w:val="4F81BD" w:themeColor="accent1"/>
       <w:spacing w:val="15"/>
-      <w:sz w:val="27"/>
+      <w:sz w:val="24"/>
       <w:szCs w:val="24"/>
     </w:rPr>
   </w:style>
@@ -4202,8 +2426,14 @@
       <w:numPr>
         <w:numId w:val="1"/>
       </w:numPr>
+      <w:spacing w:after="80" w:line="300" w:lineRule="auto"/>
+      <w:ind w:left="540" w:hanging="271"/>
       <w:contextualSpacing/>
     </w:pPr>
+    <w:rPr>
+      <w:rFonts w:ascii="Calibri" w:hAnsi="Calibri"/>
+      <w:sz w:val="22"/>
+    </w:rPr>
   </w:style>
   <w:style w:type="paragraph" w:styleId="ListBullet2">
     <w:name w:val="List Bullet 2"/>
@@ -4241,8 +2471,14 @@
       <w:numPr>
         <w:numId w:val="5"/>
       </w:numPr>
+      <w:spacing w:after="80" w:line="300" w:lineRule="auto"/>
+      <w:ind w:left="540" w:hanging="271"/>
       <w:contextualSpacing/>
     </w:pPr>
+    <w:rPr>
+      <w:rFonts w:ascii="Calibri" w:hAnsi="Calibri"/>
+      <w:sz w:val="22"/>
+    </w:rPr>
   </w:style>
   <w:style w:type="paragraph" w:styleId="ListNumber2">
     <w:name w:val="List Number 2"/>

</xml_diff>

<commit_message>
feat: ship evidence-backed investor demo (#85)
Publish the evidence-backed broker research product, fail-closed source and privacy contracts, investor-facing proof surfaces, and bounded retry handling for concurrent public refreshes.

Signed-off-by: Lutar, Stephen P. <stephenlutar2@gmail.com>
</commit_message>
<xml_diff>
--- a/David_Leads_Broker_Guide.docx
+++ b/David_Leads_Broker_Guide.docx
@@ -4,32 +4,32 @@
   <w:body>
     <w:p>
       <w:pPr>
-        <w:spacing w:after="60"/>
+        <w:spacing w:before="200" w:after="40"/>
       </w:pPr>
       <w:r>
         <w:rPr>
           <w:rFonts w:ascii="Calibri" w:hAnsi="Calibri"/>
           <w:b/>
-          <w:color w:val="B78327"/>
-          <w:sz w:val="19"/>
+          <w:i w:val="0"/>
+          <w:color w:val="148984"/>
+          <w:sz w:val="18"/>
         </w:rPr>
-        <w:t>BROKER ENABLEMENT PACK</w:t>
+        <w:t>BROKER OPERATING GUIDE</w:t>
       </w:r>
     </w:p>
     <w:p>
       <w:pPr>
-        <w:pStyle w:val="Title"/>
+        <w:spacing w:before="0" w:after="120"/>
       </w:pPr>
       <w:r>
+        <w:rPr>
+          <w:rFonts w:ascii="Calibri" w:hAnsi="Calibri"/>
+          <w:b/>
+          <w:i w:val="0"/>
+          <w:color w:val="0B2545"/>
+          <w:sz w:val="60"/>
+        </w:rPr>
         <w:t>David Leads</w:t>
-      </w:r>
-    </w:p>
-    <w:p>
-      <w:pPr>
-        <w:pStyle w:val="Subtitle"/>
-      </w:pPr>
-      <w:r>
-        <w:t>A plain-English field guide for the live Eastern Market Cockpit</w:t>
       </w:r>
     </w:p>
     <w:p>
@@ -39,174 +39,26 @@
       <w:r>
         <w:rPr>
           <w:rFonts w:ascii="Calibri" w:hAnsi="Calibri"/>
-          <w:b/>
-          <w:color w:val="5A6B7C"/>
-          <w:sz w:val="21"/>
+          <w:b w:val="0"/>
+          <w:i w:val="0"/>
+          <w:color w:val="5C697A"/>
+          <w:sz w:val="28"/>
         </w:rPr>
-        <w:t>Prepared for David Abraham  |  Verified August 1, 2026</w:t>
-      </w:r>
-    </w:p>
-    <w:p>
-      <w:pPr>
-        <w:spacing w:before="80" w:after="200" w:line="288" w:lineRule="auto"/>
-        <w:shd w:fill="E8F6F4" w:val="clear"/>
-        <w:pBdr>
-          <w:left w:val="single" w:sz="18" w:space="8" w:color="168F89"/>
-        </w:pBdr>
-        <w:ind w:left="180" w:right="120"/>
-      </w:pPr>
-      <w:r>
-        <w:rPr>
-          <w:rFonts w:ascii="Calibri" w:hAnsi="Calibri"/>
-          <w:b/>
-          <w:color w:val="0A2540"/>
-        </w:rPr>
-        <w:t xml:space="preserve">Start here: </w:t>
-      </w:r>
-      <w:r>
-        <w:rPr>
-          <w:rFonts w:ascii="Calibri" w:hAnsi="Calibri"/>
-          <w:color w:val="1F2933"/>
-        </w:rPr>
-        <w:t>Viewing the live research workspace does not require a username, password, or access key. Open the web address below in Chrome, Edge, Safari, or a phone browser.</w:t>
-      </w:r>
-    </w:p>
-    <w:p>
-      <w:pPr>
-        <w:spacing w:after="320"/>
-      </w:pPr>
-      <w:hyperlink r:id="rId11">
-        <w:r>
-          <w:rPr>
-            <w:color w:val="168F89"/>
-            <w:u w:val="single"/>
-            <w:b/>
-            <w:rFonts w:ascii="Calibri" w:hAnsi="Calibri"/>
-            <w:sz w:val="22"/>
-          </w:rPr>
-          <w:t>Open David Leads</w:t>
-        </w:r>
-      </w:hyperlink>
-    </w:p>
-    <w:p>
-      <w:pPr>
-        <w:pStyle w:val="Heading1"/>
-        <w:keepNext/>
-      </w:pPr>
-      <w:r>
-        <w:t>What David Leads does</w:t>
-      </w:r>
-    </w:p>
-    <w:p>
-      <w:pPr>
-        <w:spacing w:after="120" w:line="300" w:lineRule="auto"/>
-      </w:pPr>
-      <w:r>
-        <w:rPr>
-          <w:rFonts w:ascii="Calibri" w:hAnsi="Calibri"/>
-          <w:i w:val="0"/>
-          <w:color w:val="1F2933"/>
-        </w:rPr>
-        <w:t>It gathers current organization-level records from official public sources, shows the business event that changed, explains why the timing may deserve research, and links back to the source record. It is a research desk, not a purchased contact list.</w:t>
-      </w:r>
-    </w:p>
-    <w:p>
-      <w:pPr>
-        <w:numPr>
-          <w:ilvl w:val="0"/>
-          <w:numId w:val="10"/>
-        </w:numPr>
-        <w:spacing w:after="80" w:line="300" w:lineRule="auto"/>
-      </w:pPr>
-      <w:r>
-        <w:rPr>
-          <w:rFonts w:ascii="Calibri" w:hAnsi="Calibri"/>
-          <w:color w:val="1F2933"/>
-        </w:rPr>
-        <w:t>Choose all 27 Eastern markets, a region, or one state.</w:t>
-      </w:r>
-    </w:p>
-    <w:p>
-      <w:pPr>
-        <w:numPr>
-          <w:ilvl w:val="0"/>
-          <w:numId w:val="10"/>
-        </w:numPr>
-        <w:spacing w:after="80" w:line="300" w:lineRule="auto"/>
-      </w:pPr>
-      <w:r>
-        <w:rPr>
-          <w:rFonts w:ascii="Calibri" w:hAnsi="Calibri"/>
-          <w:color w:val="1F2933"/>
-        </w:rPr>
-        <w:t>See live business and facility records with source links and receipts.</w:t>
-      </w:r>
-    </w:p>
-    <w:p>
-      <w:pPr>
-        <w:numPr>
-          <w:ilvl w:val="0"/>
-          <w:numId w:val="10"/>
-        </w:numPr>
-        <w:spacing w:after="80" w:line="300" w:lineRule="auto"/>
-      </w:pPr>
-      <w:r>
-        <w:rPr>
-          <w:rFonts w:ascii="Calibri" w:hAnsi="Calibri"/>
-          <w:color w:val="1F2933"/>
-        </w:rPr>
-        <w:t>Focus on the strongest timing signals before doing manual research.</w:t>
-      </w:r>
-    </w:p>
-    <w:p>
-      <w:pPr>
-        <w:numPr>
-          <w:ilvl w:val="0"/>
-          <w:numId w:val="10"/>
-        </w:numPr>
-        <w:spacing w:after="80" w:line="300" w:lineRule="auto"/>
-      </w:pPr>
-      <w:r>
-        <w:rPr>
-          <w:rFonts w:ascii="Calibri" w:hAnsi="Calibri"/>
-          <w:color w:val="1F2933"/>
-        </w:rPr>
-        <w:t>Keep every outreach decision behind a human compliance check.</w:t>
-      </w:r>
-    </w:p>
-    <w:p>
-      <w:pPr>
-        <w:pStyle w:val="Heading2"/>
-        <w:keepNext/>
-      </w:pPr>
-      <w:r>
-        <w:t>Verified live check</w:t>
-      </w:r>
-    </w:p>
-    <w:p>
-      <w:pPr>
-        <w:spacing w:after="120" w:line="300" w:lineRule="auto"/>
-      </w:pPr>
-      <w:r>
-        <w:rPr>
-          <w:rFonts w:ascii="Calibri" w:hAnsi="Calibri"/>
-          <w:i/>
-          <w:color w:val="5A6B7C"/>
-        </w:rPr>
-        <w:t>The figures below were observed during the August 1 verification. Counts change as public sources change.</w:t>
+        <w:t>From source-verified business signal to the next lawful broker action</w:t>
       </w:r>
     </w:p>
     <w:tbl>
       <w:tblPr>
+        <w:tblStyle w:val="TableGrid"/>
         <w:tblW w:type="dxa" w:w="9360"/>
+        <w:jc w:val="left"/>
         <w:tblLayout w:type="fixed"/>
         <w:tblLook w:firstColumn="1" w:firstRow="1" w:lastColumn="0" w:lastRow="0" w:noHBand="0" w:noVBand="1" w:val="04A0"/>
-        <w:jc w:val="left"/>
-        <w:tblInd w:w="120" w:type="dxa"/>
+        <w:tblInd w:type="dxa" w:w="120"/>
       </w:tblPr>
       <w:tblGrid>
-        <w:gridCol w:w="2700"/>
-        <w:gridCol w:w="6660"/>
+        <w:gridCol w:w="2200"/>
+        <w:gridCol w:w="7160"/>
       </w:tblGrid>
       <w:tr>
         <w:trPr>
@@ -214,57 +66,57 @@
         </w:trPr>
         <w:tc>
           <w:tcPr>
-            <w:tcW w:type="dxa" w:w="2700"/>
+            <w:tcW w:type="dxa" w:w="2200"/>
             <w:vAlign w:val="center"/>
+            <w:shd w:fill="0B2545"/>
             <w:tcMar>
-              <w:top w:w="80" w:type="dxa"/>
-              <w:bottom w:w="80" w:type="dxa"/>
+              <w:top w:w="130" w:type="dxa"/>
+              <w:bottom w:w="130" w:type="dxa"/>
               <w:start w:w="120" w:type="dxa"/>
               <w:end w:w="120" w:type="dxa"/>
             </w:tcMar>
-            <w:shd w:fill="0A2540" w:val="clear"/>
           </w:tcPr>
           <w:p>
             <w:pPr>
-              <w:spacing w:after="0" w:line="276" w:lineRule="auto"/>
-              <w:jc w:val="left"/>
+              <w:spacing w:after="0"/>
             </w:pPr>
             <w:r>
               <w:rPr>
                 <w:rFonts w:ascii="Calibri" w:hAnsi="Calibri"/>
                 <w:b/>
+                <w:i w:val="0"/>
                 <w:color w:val="FFFFFF"/>
-                <w:sz w:val="21"/>
+                <w:sz w:val="17"/>
               </w:rPr>
-              <w:t>Check</w:t>
+              <w:t>AT A GLANCE</w:t>
             </w:r>
           </w:p>
         </w:tc>
         <w:tc>
           <w:tcPr>
-            <w:tcW w:type="dxa" w:w="6660"/>
+            <w:tcW w:type="dxa" w:w="7160"/>
             <w:vAlign w:val="center"/>
+            <w:shd w:fill="0B2545"/>
             <w:tcMar>
-              <w:top w:w="80" w:type="dxa"/>
-              <w:bottom w:w="80" w:type="dxa"/>
+              <w:top w:w="130" w:type="dxa"/>
+              <w:bottom w:w="130" w:type="dxa"/>
               <w:start w:w="120" w:type="dxa"/>
               <w:end w:w="120" w:type="dxa"/>
             </w:tcMar>
-            <w:shd w:fill="0A2540" w:val="clear"/>
           </w:tcPr>
           <w:p>
             <w:pPr>
-              <w:spacing w:after="0" w:line="276" w:lineRule="auto"/>
-              <w:jc w:val="left"/>
+              <w:spacing w:after="0"/>
             </w:pPr>
             <w:r>
               <w:rPr>
                 <w:rFonts w:ascii="Calibri" w:hAnsi="Calibri"/>
                 <w:b/>
+                <w:i w:val="0"/>
                 <w:color w:val="FFFFFF"/>
-                <w:sz w:val="21"/>
+                <w:sz w:val="17"/>
               </w:rPr>
-              <w:t>Observed result</w:t>
+              <w:t>WHAT IT MEANS</w:t>
             </w:r>
           </w:p>
         </w:tc>
@@ -272,55 +124,57 @@
       <w:tr>
         <w:tc>
           <w:tcPr>
-            <w:tcW w:type="dxa" w:w="2700"/>
+            <w:tcW w:type="dxa" w:w="2200"/>
             <w:vAlign w:val="center"/>
+            <w:shd w:fill="E8EEF5"/>
             <w:tcMar>
-              <w:top w:w="80" w:type="dxa"/>
-              <w:bottom w:w="80" w:type="dxa"/>
+              <w:top w:w="130" w:type="dxa"/>
+              <w:bottom w:w="130" w:type="dxa"/>
               <w:start w:w="120" w:type="dxa"/>
               <w:end w:w="120" w:type="dxa"/>
             </w:tcMar>
           </w:tcPr>
           <w:p>
             <w:pPr>
-              <w:spacing w:after="0" w:line="276" w:lineRule="auto"/>
-              <w:jc w:val="left"/>
+              <w:spacing w:after="40" w:line="264" w:lineRule="auto"/>
             </w:pPr>
             <w:r>
               <w:rPr>
                 <w:rFonts w:ascii="Calibri" w:hAnsi="Calibri"/>
                 <w:b/>
-                <w:color w:val="0A2540"/>
-                <w:sz w:val="21"/>
+                <w:i w:val="0"/>
+                <w:color w:val="148984"/>
+                <w:sz w:val="17"/>
               </w:rPr>
-              <w:t>Access</w:t>
+              <w:t>OPEN</w:t>
             </w:r>
           </w:p>
         </w:tc>
         <w:tc>
           <w:tcPr>
-            <w:tcW w:type="dxa" w:w="6660"/>
+            <w:tcW w:type="dxa" w:w="7160"/>
             <w:vAlign w:val="center"/>
+            <w:shd w:fill="FFFFFF"/>
             <w:tcMar>
-              <w:top w:w="80" w:type="dxa"/>
-              <w:bottom w:w="80" w:type="dxa"/>
+              <w:top w:w="130" w:type="dxa"/>
+              <w:bottom w:w="130" w:type="dxa"/>
               <w:start w:w="120" w:type="dxa"/>
               <w:end w:w="120" w:type="dxa"/>
             </w:tcMar>
           </w:tcPr>
           <w:p>
             <w:pPr>
-              <w:spacing w:after="0" w:line="276" w:lineRule="auto"/>
-              <w:jc w:val="left"/>
+              <w:spacing w:before="0" w:after="0" w:line="276" w:lineRule="auto"/>
             </w:pPr>
             <w:r>
               <w:rPr>
                 <w:rFonts w:ascii="Calibri" w:hAnsi="Calibri"/>
-                <w:b w:val="0"/>
-                <w:color w:val="1F2933"/>
+                <w:b/>
+                <w:i w:val="0"/>
+                <w:color w:val="0B2545"/>
                 <w:sz w:val="21"/>
               </w:rPr>
-              <w:t>Public research opens with no login.</w:t>
+              <w:t>No login for the public research view</w:t>
             </w:r>
           </w:p>
         </w:tc>
@@ -328,57 +182,57 @@
       <w:tr>
         <w:tc>
           <w:tcPr>
-            <w:tcW w:type="dxa" w:w="2700"/>
-            <w:shd w:fill="F5F8FB" w:val="clear"/>
+            <w:tcW w:type="dxa" w:w="2200"/>
             <w:vAlign w:val="center"/>
+            <w:shd w:fill="E8EEF5"/>
             <w:tcMar>
-              <w:top w:w="80" w:type="dxa"/>
-              <w:bottom w:w="80" w:type="dxa"/>
+              <w:top w:w="130" w:type="dxa"/>
+              <w:bottom w:w="130" w:type="dxa"/>
               <w:start w:w="120" w:type="dxa"/>
               <w:end w:w="120" w:type="dxa"/>
             </w:tcMar>
           </w:tcPr>
           <w:p>
             <w:pPr>
-              <w:spacing w:after="0" w:line="276" w:lineRule="auto"/>
-              <w:jc w:val="left"/>
+              <w:spacing w:after="40" w:line="264" w:lineRule="auto"/>
             </w:pPr>
             <w:r>
               <w:rPr>
                 <w:rFonts w:ascii="Calibri" w:hAnsi="Calibri"/>
                 <w:b/>
-                <w:color w:val="0A2540"/>
-                <w:sz w:val="21"/>
+                <w:i w:val="0"/>
+                <w:color w:val="148984"/>
+                <w:sz w:val="17"/>
               </w:rPr>
-              <w:t>Territory</w:t>
+              <w:t>COVERAGE</w:t>
             </w:r>
           </w:p>
         </w:tc>
         <w:tc>
           <w:tcPr>
-            <w:tcW w:type="dxa" w:w="6660"/>
-            <w:shd w:fill="F5F8FB" w:val="clear"/>
+            <w:tcW w:type="dxa" w:w="7160"/>
             <w:vAlign w:val="center"/>
+            <w:shd w:fill="FFFFFF"/>
             <w:tcMar>
-              <w:top w:w="80" w:type="dxa"/>
-              <w:bottom w:w="80" w:type="dxa"/>
+              <w:top w:w="130" w:type="dxa"/>
+              <w:bottom w:w="130" w:type="dxa"/>
               <w:start w:w="120" w:type="dxa"/>
               <w:end w:w="120" w:type="dxa"/>
             </w:tcMar>
           </w:tcPr>
           <w:p>
             <w:pPr>
-              <w:spacing w:after="0" w:line="276" w:lineRule="auto"/>
-              <w:jc w:val="left"/>
+              <w:spacing w:before="0" w:after="0" w:line="276" w:lineRule="auto"/>
             </w:pPr>
             <w:r>
               <w:rPr>
                 <w:rFonts w:ascii="Calibri" w:hAnsi="Calibri"/>
-                <w:b w:val="0"/>
-                <w:color w:val="1F2933"/>
+                <w:b/>
+                <w:i w:val="0"/>
+                <w:color w:val="0B2545"/>
                 <w:sz w:val="21"/>
               </w:rPr>
-              <w:t>27 Eastern states are selectable on desktop and mobile.</w:t>
+              <w:t>27 Eastern U.S. markets</w:t>
             </w:r>
           </w:p>
         </w:tc>
@@ -386,55 +240,57 @@
       <w:tr>
         <w:tc>
           <w:tcPr>
-            <w:tcW w:type="dxa" w:w="2700"/>
+            <w:tcW w:type="dxa" w:w="2200"/>
             <w:vAlign w:val="center"/>
+            <w:shd w:fill="E8EEF5"/>
             <w:tcMar>
-              <w:top w:w="80" w:type="dxa"/>
-              <w:bottom w:w="80" w:type="dxa"/>
+              <w:top w:w="130" w:type="dxa"/>
+              <w:bottom w:w="130" w:type="dxa"/>
               <w:start w:w="120" w:type="dxa"/>
               <w:end w:w="120" w:type="dxa"/>
             </w:tcMar>
           </w:tcPr>
           <w:p>
             <w:pPr>
-              <w:spacing w:after="0" w:line="276" w:lineRule="auto"/>
-              <w:jc w:val="left"/>
+              <w:spacing w:after="40" w:line="264" w:lineRule="auto"/>
             </w:pPr>
             <w:r>
               <w:rPr>
                 <w:rFonts w:ascii="Calibri" w:hAnsi="Calibri"/>
                 <w:b/>
-                <w:color w:val="0A2540"/>
-                <w:sz w:val="21"/>
+                <w:i w:val="0"/>
+                <w:color w:val="148984"/>
+                <w:sz w:val="17"/>
               </w:rPr>
-              <w:t>Live records</w:t>
+              <w:t>PRIMARY USE</w:t>
             </w:r>
           </w:p>
         </w:tc>
         <w:tc>
           <w:tcPr>
-            <w:tcW w:type="dxa" w:w="6660"/>
+            <w:tcW w:type="dxa" w:w="7160"/>
             <w:vAlign w:val="center"/>
+            <w:shd w:fill="FFFFFF"/>
             <w:tcMar>
-              <w:top w:w="80" w:type="dxa"/>
-              <w:bottom w:w="80" w:type="dxa"/>
+              <w:top w:w="130" w:type="dxa"/>
+              <w:bottom w:w="130" w:type="dxa"/>
               <w:start w:w="120" w:type="dxa"/>
               <w:end w:w="120" w:type="dxa"/>
             </w:tcMar>
           </w:tcPr>
           <w:p>
             <w:pPr>
-              <w:spacing w:after="0" w:line="276" w:lineRule="auto"/>
-              <w:jc w:val="left"/>
+              <w:spacing w:before="0" w:after="0" w:line="276" w:lineRule="auto"/>
             </w:pPr>
             <w:r>
               <w:rPr>
                 <w:rFonts w:ascii="Calibri" w:hAnsi="Calibri"/>
-                <w:b w:val="0"/>
-                <w:color w:val="1F2933"/>
+                <w:b/>
+                <w:i w:val="0"/>
+                <w:color w:val="0B2545"/>
                 <w:sz w:val="21"/>
               </w:rPr>
-              <w:t>70 live records across the Eastern view; 53 in a deeper New York pull.</w:t>
+              <w:t>Choose what to research first</w:t>
             </w:r>
           </w:p>
         </w:tc>
@@ -442,121 +298,120 @@
       <w:tr>
         <w:tc>
           <w:tcPr>
-            <w:tcW w:type="dxa" w:w="2700"/>
-            <w:shd w:fill="F5F8FB" w:val="clear"/>
+            <w:tcW w:type="dxa" w:w="2200"/>
             <w:vAlign w:val="center"/>
+            <w:shd w:fill="E8EEF5"/>
             <w:tcMar>
-              <w:top w:w="80" w:type="dxa"/>
-              <w:bottom w:w="80" w:type="dxa"/>
+              <w:top w:w="130" w:type="dxa"/>
+              <w:bottom w:w="130" w:type="dxa"/>
               <w:start w:w="120" w:type="dxa"/>
               <w:end w:w="120" w:type="dxa"/>
             </w:tcMar>
           </w:tcPr>
           <w:p>
             <w:pPr>
-              <w:spacing w:after="0" w:line="276" w:lineRule="auto"/>
-              <w:jc w:val="left"/>
+              <w:spacing w:after="40" w:line="264" w:lineRule="auto"/>
             </w:pPr>
             <w:r>
               <w:rPr>
                 <w:rFonts w:ascii="Calibri" w:hAnsi="Calibri"/>
                 <w:b/>
-                <w:color w:val="0A2540"/>
-                <w:sz w:val="21"/>
+                <w:i w:val="0"/>
+                <w:color w:val="148984"/>
+                <w:sz w:val="17"/>
               </w:rPr>
-              <w:t>Examples</w:t>
+              <w:t>CONTACT</w:t>
             </w:r>
           </w:p>
         </w:tc>
         <w:tc>
           <w:tcPr>
-            <w:tcW w:type="dxa" w:w="6660"/>
-            <w:shd w:fill="F5F8FB" w:val="clear"/>
+            <w:tcW w:type="dxa" w:w="7160"/>
             <w:vAlign w:val="center"/>
+            <w:shd w:fill="FFFFFF"/>
             <w:tcMar>
-              <w:top w:w="80" w:type="dxa"/>
-              <w:bottom w:w="80" w:type="dxa"/>
+              <w:top w:w="130" w:type="dxa"/>
+              <w:bottom w:w="130" w:type="dxa"/>
               <w:start w:w="120" w:type="dxa"/>
               <w:end w:w="120" w:type="dxa"/>
             </w:tcMar>
           </w:tcPr>
           <w:p>
             <w:pPr>
-              <w:spacing w:after="0" w:line="276" w:lineRule="auto"/>
-              <w:jc w:val="left"/>
-            </w:pPr>
-            <w:r>
-              <w:rPr>
-                <w:rFonts w:ascii="Calibri" w:hAnsi="Calibri"/>
-                <w:b w:val="0"/>
-                <w:color w:val="1F2933"/>
-                <w:sz w:val="21"/>
-              </w:rPr>
-              <w:t>0 sample records in the verified live pulls.</w:t>
-            </w:r>
-          </w:p>
-        </w:tc>
-      </w:tr>
-      <w:tr>
-        <w:tc>
-          <w:tcPr>
-            <w:tcW w:type="dxa" w:w="2700"/>
-            <w:vAlign w:val="center"/>
-            <w:tcMar>
-              <w:top w:w="80" w:type="dxa"/>
-              <w:bottom w:w="80" w:type="dxa"/>
-              <w:start w:w="120" w:type="dxa"/>
-              <w:end w:w="120" w:type="dxa"/>
-            </w:tcMar>
-          </w:tcPr>
-          <w:p>
-            <w:pPr>
-              <w:spacing w:after="0" w:line="276" w:lineRule="auto"/>
-              <w:jc w:val="left"/>
+              <w:spacing w:before="0" w:after="0" w:line="276" w:lineRule="auto"/>
             </w:pPr>
             <w:r>
               <w:rPr>
                 <w:rFonts w:ascii="Calibri" w:hAnsi="Calibri"/>
                 <w:b/>
-                <w:color w:val="0A2540"/>
+                <w:i w:val="0"/>
+                <w:color w:val="0B2545"/>
                 <w:sz w:val="21"/>
               </w:rPr>
-              <w:t>Health</w:t>
-            </w:r>
-          </w:p>
-        </w:tc>
-        <w:tc>
-          <w:tcPr>
-            <w:tcW w:type="dxa" w:w="6660"/>
-            <w:vAlign w:val="center"/>
-            <w:tcMar>
-              <w:top w:w="80" w:type="dxa"/>
-              <w:bottom w:w="80" w:type="dxa"/>
-              <w:start w:w="120" w:type="dxa"/>
-              <w:end w:w="120" w:type="dxa"/>
-            </w:tcMar>
-          </w:tcPr>
-          <w:p>
-            <w:pPr>
-              <w:spacing w:after="0" w:line="276" w:lineRule="auto"/>
-              <w:jc w:val="left"/>
-            </w:pPr>
-            <w:r>
-              <w:rPr>
-                <w:rFonts w:ascii="Calibri" w:hAnsi="Calibri"/>
-                <w:b w:val="0"/>
-                <w:color w:val="1F2933"/>
-                <w:sz w:val="21"/>
-              </w:rPr>
-              <w:t>Application, public data, and broker database all reported ready.</w:t>
+              <w:t>Always blocked until protected clearance</w:t>
             </w:r>
           </w:p>
         </w:tc>
       </w:tr>
     </w:tbl>
     <w:p>
+      <w:pPr>
+        <w:spacing w:before="0" w:after="40" w:line="300" w:lineRule="auto"/>
+      </w:pPr>
       <w:r>
-        <w:br w:type="page"/>
+        <w:rPr>
+          <w:rFonts w:ascii="Calibri" w:hAnsi="Calibri"/>
+          <w:b/>
+          <w:i w:val="0"/>
+          <w:color w:val="148984"/>
+          <w:sz w:val="18"/>
+        </w:rPr>
+        <w:t>Open the application</w:t>
+      </w:r>
+    </w:p>
+    <w:p>
+      <w:pPr>
+        <w:spacing w:before="0" w:after="240" w:line="300" w:lineRule="auto"/>
+      </w:pPr>
+      <w:r>
+        <w:rPr>
+          <w:rFonts w:ascii="Calibri" w:hAnsi="Calibri"/>
+          <w:b/>
+          <w:i w:val="0"/>
+          <w:color w:val="2E74B5"/>
+          <w:sz w:val="24"/>
+        </w:rPr>
+        <w:t>https://szlholdings-david-leads.hf.space/</w:t>
+      </w:r>
+    </w:p>
+    <w:p>
+      <w:pPr>
+        <w:spacing w:before="80" w:after="200" w:line="288" w:lineRule="auto"/>
+        <w:ind w:left="173" w:right="173"/>
+        <w:shd w:fill="E7F5F3"/>
+        <w:pBdr>
+          <w:left w:val="single" w:sz="18" w:space="8" w:color="148984"/>
+        </w:pBdr>
+      </w:pPr>
+      <w:r>
+        <w:rPr>
+          <w:rFonts w:ascii="Calibri" w:hAnsi="Calibri"/>
+          <w:b/>
+          <w:i w:val="0"/>
+          <w:color w:val="0B2545"/>
+          <w:sz w:val="22"/>
+        </w:rPr>
+        <w:t xml:space="preserve">The simple rule: </w:t>
+      </w:r>
+      <w:r>
+        <w:rPr>
+          <w:rFonts w:ascii="Calibri" w:hAnsi="Calibri"/>
+          <w:b w:val="0"/>
+          <w:i w:val="0"/>
+          <w:color w:val="1C2737"/>
+          <w:sz w:val="22"/>
+        </w:rPr>
+        <w:t>Use David Leads to decide what to research first. Use the official record to verify why. Use the protected clearance process to decide whether contact is permitted.</w:t>
       </w:r>
     </w:p>
     <w:p>
@@ -565,273 +420,52 @@
         <w:keepNext/>
       </w:pPr>
       <w:r>
-        <w:t>Your first five minutes</w:t>
+        <w:t>What this application does</w:t>
       </w:r>
     </w:p>
     <w:p>
       <w:pPr>
-        <w:numPr>
-          <w:ilvl w:val="0"/>
-          <w:numId w:val="11"/>
-        </w:numPr>
-        <w:spacing w:after="80" w:line="300" w:lineRule="auto"/>
+        <w:spacing w:before="0" w:after="120" w:line="300" w:lineRule="auto"/>
       </w:pPr>
       <w:r>
         <w:rPr>
           <w:rFonts w:ascii="Calibri" w:hAnsi="Calibri"/>
-          <w:color w:val="1F2933"/>
+          <w:b w:val="0"/>
+          <w:i w:val="0"/>
+          <w:color w:val="1C2737"/>
+          <w:sz w:val="22"/>
         </w:rPr>
-        <w:t>Open the link. The research workspace loads without a login.</w:t>
+        <w:t>David Leads organizes official organization-level records into a practical research queue. It shows the company, the observed change, the timing, the likely protection-planning fit, and the evidence behind the item.</w:t>
       </w:r>
     </w:p>
     <w:p>
       <w:pPr>
-        <w:numPr>
-          <w:ilvl w:val="0"/>
-          <w:numId w:val="11"/>
-        </w:numPr>
-        <w:spacing w:after="80" w:line="300" w:lineRule="auto"/>
-      </w:pPr>
-      <w:r>
-        <w:rPr>
-          <w:rFonts w:ascii="Calibri" w:hAnsi="Calibri"/>
-          <w:color w:val="1F2933"/>
-        </w:rPr>
-        <w:t>Choose All East, a region, or one state. One state runs a deeper pull.</w:t>
-      </w:r>
-    </w:p>
-    <w:p>
-      <w:pPr>
-        <w:numPr>
-          <w:ilvl w:val="0"/>
-          <w:numId w:val="11"/>
-        </w:numPr>
-        <w:spacing w:after="80" w:line="300" w:lineRule="auto"/>
-      </w:pPr>
-      <w:r>
-        <w:rPr>
-          <w:rFonts w:ascii="Calibri" w:hAnsi="Calibri"/>
-          <w:color w:val="1F2933"/>
-        </w:rPr>
-        <w:t>Read the Broker brief near the top. It points to the strongest current timing pattern.</w:t>
-      </w:r>
-    </w:p>
-    <w:p>
-      <w:pPr>
-        <w:numPr>
-          <w:ilvl w:val="0"/>
-          <w:numId w:val="11"/>
-        </w:numPr>
-        <w:spacing w:after="80" w:line="300" w:lineRule="auto"/>
-      </w:pPr>
-      <w:r>
-        <w:rPr>
-          <w:rFonts w:ascii="Calibri" w:hAnsi="Calibri"/>
-          <w:color w:val="1F2933"/>
-        </w:rPr>
-        <w:t>Use the deal-moment buttons to narrow the list: life-plan timing, growth and awards, operational change, or needs research.</w:t>
-      </w:r>
-    </w:p>
-    <w:p>
-      <w:pPr>
-        <w:numPr>
-          <w:ilvl w:val="0"/>
-          <w:numId w:val="11"/>
-        </w:numPr>
-        <w:spacing w:after="80" w:line="300" w:lineRule="auto"/>
-      </w:pPr>
-      <w:r>
-        <w:rPr>
-          <w:rFonts w:ascii="Calibri" w:hAnsi="Calibri"/>
-          <w:color w:val="1F2933"/>
-        </w:rPr>
-        <w:t>Open an organization to see the public event, likely fit, evidence, limits, and the next research step.</w:t>
-      </w:r>
-    </w:p>
-    <w:p>
-      <w:pPr>
-        <w:numPr>
-          <w:ilvl w:val="0"/>
-          <w:numId w:val="11"/>
-        </w:numPr>
-        <w:spacing w:after="80" w:line="300" w:lineRule="auto"/>
-      </w:pPr>
-      <w:r>
-        <w:rPr>
-          <w:rFonts w:ascii="Calibri" w:hAnsi="Calibri"/>
-          <w:color w:val="1F2933"/>
-        </w:rPr>
-        <w:t>Open the official source before using any claim in a conversation.</w:t>
-      </w:r>
-    </w:p>
-    <w:p>
-      <w:pPr>
-        <w:pStyle w:val="Heading2"/>
-        <w:keepNext/>
-      </w:pPr>
-      <w:r>
-        <w:t>What the screen is telling you</w:t>
-      </w:r>
-    </w:p>
-    <w:p>
-      <w:pPr>
-        <w:spacing w:after="120" w:line="300" w:lineRule="auto"/>
+        <w:spacing w:before="80" w:after="200" w:line="288" w:lineRule="auto"/>
+        <w:ind w:left="173" w:right="173"/>
+        <w:shd w:fill="FFF7E5"/>
+        <w:pBdr>
+          <w:left w:val="single" w:sz="18" w:space="8" w:color="B78921"/>
+        </w:pBdr>
       </w:pPr>
       <w:r>
         <w:rPr>
           <w:rFonts w:ascii="Calibri" w:hAnsi="Calibri"/>
           <w:b/>
-          <w:color w:val="0A2540"/>
+          <w:i w:val="0"/>
+          <w:color w:val="0B2545"/>
+          <w:sz w:val="22"/>
         </w:rPr>
-        <w:t xml:space="preserve">Live organizations. </w:t>
+        <w:t xml:space="preserve">Important: </w:t>
       </w:r>
       <w:r>
         <w:rPr>
           <w:rFonts w:ascii="Calibri" w:hAnsi="Calibri"/>
+          <w:b w:val="0"/>
           <w:i w:val="0"/>
-          <w:color w:val="1F2933"/>
+          <w:color w:val="1C2737"/>
+          <w:sz w:val="22"/>
         </w:rPr>
-        <w:t>Live organizations</w:t>
-      </w:r>
-    </w:p>
-    <w:p>
-      <w:pPr>
-        <w:spacing w:after="120" w:line="300" w:lineRule="auto"/>
-      </w:pPr>
-      <w:r>
-        <w:rPr>
-          <w:rFonts w:ascii="Calibri" w:hAnsi="Calibri"/>
-          <w:i w:val="0"/>
-          <w:color w:val="1F2933"/>
-        </w:rPr>
-        <w:t>The number of official records in the selected market. The count changes with the territory and source response.</w:t>
-      </w:r>
-    </w:p>
-    <w:p>
-      <w:pPr>
-        <w:spacing w:after="120" w:line="300" w:lineRule="auto"/>
-      </w:pPr>
-      <w:r>
-        <w:rPr>
-          <w:rFonts w:ascii="Calibri" w:hAnsi="Calibri"/>
-          <w:b/>
-          <w:color w:val="0A2540"/>
-        </w:rPr>
-        <w:t xml:space="preserve">Source coverage. </w:t>
-      </w:r>
-      <w:r>
-        <w:rPr>
-          <w:rFonts w:ascii="Calibri" w:hAnsi="Calibri"/>
-          <w:i w:val="0"/>
-          <w:color w:val="1F2933"/>
-        </w:rPr>
-        <w:t>Source coverage</w:t>
-      </w:r>
-    </w:p>
-    <w:p>
-      <w:pPr>
-        <w:spacing w:after="120" w:line="300" w:lineRule="auto"/>
-      </w:pPr>
-      <w:r>
-        <w:rPr>
-          <w:rFonts w:ascii="Calibri" w:hAnsi="Calibri"/>
-          <w:i w:val="0"/>
-          <w:color w:val="1F2933"/>
-        </w:rPr>
-        <w:t>How many source lanes answered live. An unavailable source remains visible; it is never replaced by a fake record.</w:t>
-      </w:r>
-    </w:p>
-    <w:p>
-      <w:pPr>
-        <w:spacing w:after="120" w:line="300" w:lineRule="auto"/>
-      </w:pPr>
-      <w:r>
-        <w:rPr>
-          <w:rFonts w:ascii="Calibri" w:hAnsi="Calibri"/>
-          <w:b/>
-          <w:color w:val="0A2540"/>
-        </w:rPr>
-        <w:t xml:space="preserve">Needs research. </w:t>
-      </w:r>
-      <w:r>
-        <w:rPr>
-          <w:rFonts w:ascii="Calibri" w:hAnsi="Calibri"/>
-          <w:i w:val="0"/>
-          <w:color w:val="1F2933"/>
-        </w:rPr>
-        <w:t>Needs research</w:t>
-      </w:r>
-    </w:p>
-    <w:p>
-      <w:pPr>
-        <w:spacing w:after="120" w:line="300" w:lineRule="auto"/>
-      </w:pPr>
-      <w:r>
-        <w:rPr>
-          <w:rFonts w:ascii="Calibri" w:hAnsi="Calibri"/>
-          <w:i w:val="0"/>
-          <w:color w:val="1F2933"/>
-        </w:rPr>
-        <w:t>Records worth checking. This is not the number of people cleared for contact.</w:t>
-      </w:r>
-    </w:p>
-    <w:p>
-      <w:pPr>
-        <w:spacing w:after="120" w:line="300" w:lineRule="auto"/>
-      </w:pPr>
-      <w:r>
-        <w:rPr>
-          <w:rFonts w:ascii="Calibri" w:hAnsi="Calibri"/>
-          <w:b/>
-          <w:color w:val="0A2540"/>
-        </w:rPr>
-        <w:t xml:space="preserve">Timing window. </w:t>
-      </w:r>
-      <w:r>
-        <w:rPr>
-          <w:rFonts w:ascii="Calibri" w:hAnsi="Calibri"/>
-          <w:i w:val="0"/>
-          <w:color w:val="1F2933"/>
-        </w:rPr>
-        <w:t>Timing window</w:t>
-      </w:r>
-    </w:p>
-    <w:p>
-      <w:pPr>
-        <w:spacing w:after="120" w:line="300" w:lineRule="auto"/>
-      </w:pPr>
-      <w:r>
-        <w:rPr>
-          <w:rFonts w:ascii="Calibri" w:hAnsi="Calibri"/>
-          <w:i w:val="0"/>
-          <w:color w:val="1F2933"/>
-        </w:rPr>
-        <w:t>A date or filing field that may make the organization worth researching now. It is not proof of a sale, renewal, dissatisfaction, or insurance need.</w:t>
-      </w:r>
-    </w:p>
-    <w:p>
-      <w:pPr>
-        <w:spacing w:before="80" w:after="200" w:line="288" w:lineRule="auto"/>
-        <w:shd w:fill="FFF7E6" w:val="clear"/>
-        <w:pBdr>
-          <w:left w:val="single" w:sz="18" w:space="8" w:color="168F89"/>
-        </w:pBdr>
-        <w:ind w:left="180" w:right="120"/>
-      </w:pPr>
-      <w:r>
-        <w:rPr>
-          <w:rFonts w:ascii="Calibri" w:hAnsi="Calibri"/>
-          <w:b/>
-          <w:color w:val="0A2540"/>
-        </w:rPr>
-        <w:t xml:space="preserve">The key distinction: </w:t>
-      </w:r>
-      <w:r>
-        <w:rPr>
-          <w:rFonts w:ascii="Calibri" w:hAnsi="Calibri"/>
-          <w:color w:val="1F2933"/>
-        </w:rPr>
-        <w:t>A visible public record is permission to research the organization. It is not permission to call, text, email, quote, or recommend a product.</w:t>
+        <w:t>It is not a purchased contact list. It never turns a public record into permission to call, email, market, or make an underwriting decision.</w:t>
       </w:r>
     </w:p>
     <w:p>
@@ -845,503 +479,187 @@
         <w:keepNext/>
       </w:pPr>
       <w:r>
-        <w:t>How to use one opportunity</w:t>
-      </w:r>
-    </w:p>
-    <w:p>
-      <w:pPr>
-        <w:pStyle w:val="Heading2"/>
-        <w:keepNext/>
-      </w:pPr>
-      <w:r>
-        <w:t>1. Verify the moment</w:t>
+        <w:t>Start your day in five minutes</w:t>
       </w:r>
     </w:p>
     <w:p>
       <w:pPr>
         <w:spacing w:after="120" w:line="300" w:lineRule="auto"/>
+        <w:ind w:left="540" w:hanging="271"/>
       </w:pPr>
       <w:r>
         <w:rPr>
           <w:rFonts w:ascii="Calibri" w:hAnsi="Calibri"/>
+          <w:b/>
           <w:i w:val="0"/>
-          <w:color w:val="1F2933"/>
+          <w:color w:val="0B2545"/>
+          <w:sz w:val="22"/>
         </w:rPr>
-        <w:t>Open the official source and confirm the organization name, date, location, and the exact event shown. If the record cannot be confirmed, stop and mark it for later research.</w:t>
+        <w:t xml:space="preserve">1. </w:t>
       </w:r>
-    </w:p>
-    <w:p>
-      <w:pPr>
-        <w:pStyle w:val="Heading2"/>
-        <w:keepNext/>
-      </w:pPr>
       <w:r>
-        <w:t>2. Qualify the fit</w:t>
+        <w:rPr>
+          <w:rFonts w:ascii="Calibri" w:hAnsi="Calibri"/>
+          <w:b/>
+          <w:i w:val="0"/>
+          <w:color w:val="0B2545"/>
+          <w:sz w:val="22"/>
+        </w:rPr>
+        <w:t xml:space="preserve">Read the Broker brief. </w:t>
+      </w:r>
+      <w:r>
+        <w:rPr>
+          <w:rFonts w:ascii="Calibri" w:hAnsi="Calibri"/>
+          <w:b w:val="0"/>
+          <w:i w:val="0"/>
+          <w:color w:val="1C2737"/>
+          <w:sz w:val="22"/>
+        </w:rPr>
+        <w:t>It summarizes the strongest timing pattern in the current official-source pull.</w:t>
       </w:r>
     </w:p>
     <w:p>
       <w:pPr>
         <w:spacing w:after="120" w:line="300" w:lineRule="auto"/>
+        <w:ind w:left="540" w:hanging="271"/>
       </w:pPr>
       <w:r>
         <w:rPr>
           <w:rFonts w:ascii="Calibri" w:hAnsi="Calibri"/>
+          <w:b/>
           <w:i w:val="0"/>
-          <w:color w:val="1F2933"/>
+          <w:color w:val="0B2545"/>
+          <w:sz w:val="22"/>
         </w:rPr>
-        <w:t>Visit the organization's own website. Understand what it does, whether the public event appears relevant, and whether a business-published channel exists. Treat the suggested product fit as a question to investigate, not an answer.</w:t>
+        <w:t xml:space="preserve">2. </w:t>
       </w:r>
-    </w:p>
-    <w:p>
-      <w:pPr>
-        <w:pStyle w:val="Heading2"/>
-        <w:keepNext/>
-      </w:pPr>
       <w:r>
-        <w:t>3. Clear outreach</w:t>
+        <w:rPr>
+          <w:rFonts w:ascii="Calibri" w:hAnsi="Calibri"/>
+          <w:b/>
+          <w:i w:val="0"/>
+          <w:color w:val="0B2545"/>
+          <w:sz w:val="22"/>
+        </w:rPr>
+        <w:t xml:space="preserve">Choose a territory. </w:t>
+      </w:r>
+      <w:r>
+        <w:rPr>
+          <w:rFonts w:ascii="Calibri" w:hAnsi="Calibri"/>
+          <w:b w:val="0"/>
+          <w:i w:val="0"/>
+          <w:color w:val="1C2737"/>
+          <w:sz w:val="22"/>
+        </w:rPr>
+        <w:t>Select All East, a region, or one state. One state runs a deeper market-specific search.</w:t>
       </w:r>
     </w:p>
     <w:p>
       <w:pPr>
         <w:spacing w:after="120" w:line="300" w:lineRule="auto"/>
+        <w:ind w:left="540" w:hanging="271"/>
       </w:pPr>
       <w:r>
         <w:rPr>
           <w:rFonts w:ascii="Calibri" w:hAnsi="Calibri"/>
+          <w:b/>
           <w:i w:val="0"/>
-          <w:color w:val="1F2933"/>
+          <w:color w:val="0B2545"/>
+          <w:sz w:val="22"/>
         </w:rPr>
-        <w:t>Before contact, complete the required suppression, licensing, state-rule, purpose, and channel checks in the protected broker workflow. The public workspace intentionally keeps call-ready at zero.</w:t>
+        <w:t xml:space="preserve">3. </w:t>
+      </w:r>
+      <w:r>
+        <w:rPr>
+          <w:rFonts w:ascii="Calibri" w:hAnsi="Calibri"/>
+          <w:b/>
+          <w:i w:val="0"/>
+          <w:color w:val="0B2545"/>
+          <w:sz w:val="22"/>
+        </w:rPr>
+        <w:t xml:space="preserve">Choose a deal moment. </w:t>
+      </w:r>
+      <w:r>
+        <w:rPr>
+          <w:rFonts w:ascii="Calibri" w:hAnsi="Calibri"/>
+          <w:b w:val="0"/>
+          <w:i w:val="0"/>
+          <w:color w:val="1C2737"/>
+          <w:sz w:val="22"/>
+        </w:rPr>
+        <w:t>Use Life-plan timing, Growth &amp; awards, Operational change, or Needs research.</w:t>
       </w:r>
     </w:p>
     <w:p>
       <w:pPr>
-        <w:pStyle w:val="Heading2"/>
-        <w:keepNext/>
+        <w:spacing w:after="120" w:line="300" w:lineRule="auto"/>
+        <w:ind w:left="540" w:hanging="271"/>
       </w:pPr>
       <w:r>
-        <w:t>Read the record correctly</w:t>
+        <w:rPr>
+          <w:rFonts w:ascii="Calibri" w:hAnsi="Calibri"/>
+          <w:b/>
+          <w:i w:val="0"/>
+          <w:color w:val="0B2545"/>
+          <w:sz w:val="22"/>
+        </w:rPr>
+        <w:t xml:space="preserve">4. </w:t>
+      </w:r>
+      <w:r>
+        <w:rPr>
+          <w:rFonts w:ascii="Calibri" w:hAnsi="Calibri"/>
+          <w:b/>
+          <w:i w:val="0"/>
+          <w:color w:val="0B2545"/>
+          <w:sz w:val="22"/>
+        </w:rPr>
+        <w:t xml:space="preserve">Open the strongest account. </w:t>
+      </w:r>
+      <w:r>
+        <w:rPr>
+          <w:rFonts w:ascii="Calibri" w:hAnsi="Calibri"/>
+          <w:b w:val="0"/>
+          <w:i w:val="0"/>
+          <w:color w:val="1C2737"/>
+          <w:sz w:val="22"/>
+        </w:rPr>
+        <w:t>Review the timing, likely fit, evidence, limitations, and three-step broker action.</w:t>
       </w:r>
     </w:p>
-    <w:tbl>
-      <w:tblPr>
-        <w:tblW w:type="dxa" w:w="9360"/>
-        <w:tblLayout w:type="fixed"/>
-        <w:tblLook w:firstColumn="1" w:firstRow="1" w:lastColumn="0" w:lastRow="0" w:noHBand="0" w:noVBand="1" w:val="04A0"/>
-        <w:jc w:val="left"/>
-        <w:tblInd w:w="120" w:type="dxa"/>
-      </w:tblPr>
-      <w:tblGrid>
-        <w:gridCol w:w="2700"/>
-        <w:gridCol w:w="6660"/>
-      </w:tblGrid>
-      <w:tr>
-        <w:trPr>
-          <w:tblHeader w:val="true"/>
-        </w:trPr>
-        <w:tc>
-          <w:tcPr>
-            <w:tcW w:type="dxa" w:w="2700"/>
-            <w:vAlign w:val="center"/>
-            <w:tcMar>
-              <w:top w:w="80" w:type="dxa"/>
-              <w:bottom w:w="80" w:type="dxa"/>
-              <w:start w:w="120" w:type="dxa"/>
-              <w:end w:w="120" w:type="dxa"/>
-            </w:tcMar>
-            <w:shd w:fill="0A2540" w:val="clear"/>
-          </w:tcPr>
-          <w:p>
-            <w:pPr>
-              <w:spacing w:after="0" w:line="276" w:lineRule="auto"/>
-              <w:jc w:val="left"/>
-            </w:pPr>
-            <w:r>
-              <w:rPr>
-                <w:rFonts w:ascii="Calibri" w:hAnsi="Calibri"/>
-                <w:b/>
-                <w:color w:val="FFFFFF"/>
-                <w:sz w:val="21"/>
-              </w:rPr>
-              <w:t>Label</w:t>
-            </w:r>
-          </w:p>
-        </w:tc>
-        <w:tc>
-          <w:tcPr>
-            <w:tcW w:type="dxa" w:w="6660"/>
-            <w:vAlign w:val="center"/>
-            <w:tcMar>
-              <w:top w:w="80" w:type="dxa"/>
-              <w:bottom w:w="80" w:type="dxa"/>
-              <w:start w:w="120" w:type="dxa"/>
-              <w:end w:w="120" w:type="dxa"/>
-            </w:tcMar>
-            <w:shd w:fill="0A2540" w:val="clear"/>
-          </w:tcPr>
-          <w:p>
-            <w:pPr>
-              <w:spacing w:after="0" w:line="276" w:lineRule="auto"/>
-              <w:jc w:val="left"/>
-            </w:pPr>
-            <w:r>
-              <w:rPr>
-                <w:rFonts w:ascii="Calibri" w:hAnsi="Calibri"/>
-                <w:b/>
-                <w:color w:val="FFFFFF"/>
-                <w:sz w:val="21"/>
-              </w:rPr>
-              <w:t>Plain-English meaning</w:t>
-            </w:r>
-          </w:p>
-        </w:tc>
-      </w:tr>
-      <w:tr>
-        <w:tc>
-          <w:tcPr>
-            <w:tcW w:type="dxa" w:w="2700"/>
-            <w:vAlign w:val="center"/>
-            <w:tcMar>
-              <w:top w:w="80" w:type="dxa"/>
-              <w:bottom w:w="80" w:type="dxa"/>
-              <w:start w:w="120" w:type="dxa"/>
-              <w:end w:w="120" w:type="dxa"/>
-            </w:tcMar>
-          </w:tcPr>
-          <w:p>
-            <w:pPr>
-              <w:spacing w:after="0" w:line="276" w:lineRule="auto"/>
-              <w:jc w:val="left"/>
-            </w:pPr>
-            <w:r>
-              <w:rPr>
-                <w:rFonts w:ascii="Calibri" w:hAnsi="Calibri"/>
-                <w:b/>
-                <w:color w:val="0A2540"/>
-                <w:sz w:val="21"/>
-              </w:rPr>
-              <w:t>Verified deal moment</w:t>
-            </w:r>
-          </w:p>
-        </w:tc>
-        <w:tc>
-          <w:tcPr>
-            <w:tcW w:type="dxa" w:w="6660"/>
-            <w:vAlign w:val="center"/>
-            <w:tcMar>
-              <w:top w:w="80" w:type="dxa"/>
-              <w:bottom w:w="80" w:type="dxa"/>
-              <w:start w:w="120" w:type="dxa"/>
-              <w:end w:w="120" w:type="dxa"/>
-            </w:tcMar>
-          </w:tcPr>
-          <w:p>
-            <w:pPr>
-              <w:spacing w:after="0" w:line="276" w:lineRule="auto"/>
-              <w:jc w:val="left"/>
-            </w:pPr>
-            <w:r>
-              <w:rPr>
-                <w:rFonts w:ascii="Calibri" w:hAnsi="Calibri"/>
-                <w:b w:val="0"/>
-                <w:color w:val="1F2933"/>
-                <w:sz w:val="21"/>
-              </w:rPr>
-              <w:t>The fact returned by the official source.</w:t>
-            </w:r>
-          </w:p>
-        </w:tc>
-      </w:tr>
-      <w:tr>
-        <w:tc>
-          <w:tcPr>
-            <w:tcW w:type="dxa" w:w="2700"/>
-            <w:shd w:fill="F5F8FB" w:val="clear"/>
-            <w:vAlign w:val="center"/>
-            <w:tcMar>
-              <w:top w:w="80" w:type="dxa"/>
-              <w:bottom w:w="80" w:type="dxa"/>
-              <w:start w:w="120" w:type="dxa"/>
-              <w:end w:w="120" w:type="dxa"/>
-            </w:tcMar>
-          </w:tcPr>
-          <w:p>
-            <w:pPr>
-              <w:spacing w:after="0" w:line="276" w:lineRule="auto"/>
-              <w:jc w:val="left"/>
-            </w:pPr>
-            <w:r>
-              <w:rPr>
-                <w:rFonts w:ascii="Calibri" w:hAnsi="Calibri"/>
-                <w:b/>
-                <w:color w:val="0A2540"/>
-                <w:sz w:val="21"/>
-              </w:rPr>
-              <w:t>Why now</w:t>
-            </w:r>
-          </w:p>
-        </w:tc>
-        <w:tc>
-          <w:tcPr>
-            <w:tcW w:type="dxa" w:w="6660"/>
-            <w:shd w:fill="F5F8FB" w:val="clear"/>
-            <w:vAlign w:val="center"/>
-            <w:tcMar>
-              <w:top w:w="80" w:type="dxa"/>
-              <w:bottom w:w="80" w:type="dxa"/>
-              <w:start w:w="120" w:type="dxa"/>
-              <w:end w:w="120" w:type="dxa"/>
-            </w:tcMar>
-          </w:tcPr>
-          <w:p>
-            <w:pPr>
-              <w:spacing w:after="0" w:line="276" w:lineRule="auto"/>
-              <w:jc w:val="left"/>
-            </w:pPr>
-            <w:r>
-              <w:rPr>
-                <w:rFonts w:ascii="Calibri" w:hAnsi="Calibri"/>
-                <w:b w:val="0"/>
-                <w:color w:val="1F2933"/>
-                <w:sz w:val="21"/>
-              </w:rPr>
-              <w:t>Why the event may deserve timely research.</w:t>
-            </w:r>
-          </w:p>
-        </w:tc>
-      </w:tr>
-      <w:tr>
-        <w:tc>
-          <w:tcPr>
-            <w:tcW w:type="dxa" w:w="2700"/>
-            <w:vAlign w:val="center"/>
-            <w:tcMar>
-              <w:top w:w="80" w:type="dxa"/>
-              <w:bottom w:w="80" w:type="dxa"/>
-              <w:start w:w="120" w:type="dxa"/>
-              <w:end w:w="120" w:type="dxa"/>
-            </w:tcMar>
-          </w:tcPr>
-          <w:p>
-            <w:pPr>
-              <w:spacing w:after="0" w:line="276" w:lineRule="auto"/>
-              <w:jc w:val="left"/>
-            </w:pPr>
-            <w:r>
-              <w:rPr>
-                <w:rFonts w:ascii="Calibri" w:hAnsi="Calibri"/>
-                <w:b/>
-                <w:color w:val="0A2540"/>
-                <w:sz w:val="21"/>
-              </w:rPr>
-              <w:t>Likely fit</w:t>
-            </w:r>
-          </w:p>
-        </w:tc>
-        <w:tc>
-          <w:tcPr>
-            <w:tcW w:type="dxa" w:w="6660"/>
-            <w:vAlign w:val="center"/>
-            <w:tcMar>
-              <w:top w:w="80" w:type="dxa"/>
-              <w:bottom w:w="80" w:type="dxa"/>
-              <w:start w:w="120" w:type="dxa"/>
-              <w:end w:w="120" w:type="dxa"/>
-            </w:tcMar>
-          </w:tcPr>
-          <w:p>
-            <w:pPr>
-              <w:spacing w:after="0" w:line="276" w:lineRule="auto"/>
-              <w:jc w:val="left"/>
-            </w:pPr>
-            <w:r>
-              <w:rPr>
-                <w:rFonts w:ascii="Calibri" w:hAnsi="Calibri"/>
-                <w:b w:val="0"/>
-                <w:color w:val="1F2933"/>
-                <w:sz w:val="21"/>
-              </w:rPr>
-              <w:t>A business question to investigate, not advice or eligibility.</w:t>
-            </w:r>
-          </w:p>
-        </w:tc>
-      </w:tr>
-      <w:tr>
-        <w:tc>
-          <w:tcPr>
-            <w:tcW w:type="dxa" w:w="2700"/>
-            <w:shd w:fill="F5F8FB" w:val="clear"/>
-            <w:vAlign w:val="center"/>
-            <w:tcMar>
-              <w:top w:w="80" w:type="dxa"/>
-              <w:bottom w:w="80" w:type="dxa"/>
-              <w:start w:w="120" w:type="dxa"/>
-              <w:end w:w="120" w:type="dxa"/>
-            </w:tcMar>
-          </w:tcPr>
-          <w:p>
-            <w:pPr>
-              <w:spacing w:after="0" w:line="276" w:lineRule="auto"/>
-              <w:jc w:val="left"/>
-            </w:pPr>
-            <w:r>
-              <w:rPr>
-                <w:rFonts w:ascii="Calibri" w:hAnsi="Calibri"/>
-                <w:b/>
-                <w:color w:val="0A2540"/>
-                <w:sz w:val="21"/>
-              </w:rPr>
-              <w:t>Evidence</w:t>
-            </w:r>
-          </w:p>
-        </w:tc>
-        <w:tc>
-          <w:tcPr>
-            <w:tcW w:type="dxa" w:w="6660"/>
-            <w:shd w:fill="F5F8FB" w:val="clear"/>
-            <w:vAlign w:val="center"/>
-            <w:tcMar>
-              <w:top w:w="80" w:type="dxa"/>
-              <w:bottom w:w="80" w:type="dxa"/>
-              <w:start w:w="120" w:type="dxa"/>
-              <w:end w:w="120" w:type="dxa"/>
-            </w:tcMar>
-          </w:tcPr>
-          <w:p>
-            <w:pPr>
-              <w:spacing w:after="0" w:line="276" w:lineRule="auto"/>
-              <w:jc w:val="left"/>
-            </w:pPr>
-            <w:r>
-              <w:rPr>
-                <w:rFonts w:ascii="Calibri" w:hAnsi="Calibri"/>
-                <w:b w:val="0"/>
-                <w:color w:val="1F2933"/>
-                <w:sz w:val="21"/>
-              </w:rPr>
-              <w:t>The source link, record ID, and receipt attached to the item.</w:t>
-            </w:r>
-          </w:p>
-        </w:tc>
-      </w:tr>
-      <w:tr>
-        <w:tc>
-          <w:tcPr>
-            <w:tcW w:type="dxa" w:w="2700"/>
-            <w:vAlign w:val="center"/>
-            <w:tcMar>
-              <w:top w:w="80" w:type="dxa"/>
-              <w:bottom w:w="80" w:type="dxa"/>
-              <w:start w:w="120" w:type="dxa"/>
-              <w:end w:w="120" w:type="dxa"/>
-            </w:tcMar>
-          </w:tcPr>
-          <w:p>
-            <w:pPr>
-              <w:spacing w:after="0" w:line="276" w:lineRule="auto"/>
-              <w:jc w:val="left"/>
-            </w:pPr>
-            <w:r>
-              <w:rPr>
-                <w:rFonts w:ascii="Calibri" w:hAnsi="Calibri"/>
-                <w:b/>
-                <w:color w:val="0A2540"/>
-                <w:sz w:val="21"/>
-              </w:rPr>
-              <w:t>Limitations</w:t>
-            </w:r>
-          </w:p>
-        </w:tc>
-        <w:tc>
-          <w:tcPr>
-            <w:tcW w:type="dxa" w:w="6660"/>
-            <w:vAlign w:val="center"/>
-            <w:tcMar>
-              <w:top w:w="80" w:type="dxa"/>
-              <w:bottom w:w="80" w:type="dxa"/>
-              <w:start w:w="120" w:type="dxa"/>
-              <w:end w:w="120" w:type="dxa"/>
-            </w:tcMar>
-          </w:tcPr>
-          <w:p>
-            <w:pPr>
-              <w:spacing w:after="0" w:line="276" w:lineRule="auto"/>
-              <w:jc w:val="left"/>
-            </w:pPr>
-            <w:r>
-              <w:rPr>
-                <w:rFonts w:ascii="Calibri" w:hAnsi="Calibri"/>
-                <w:b w:val="0"/>
-                <w:color w:val="1F2933"/>
-                <w:sz w:val="21"/>
-              </w:rPr>
-              <w:t>What the public record does not prove.</w:t>
-            </w:r>
-          </w:p>
-        </w:tc>
-      </w:tr>
-      <w:tr>
-        <w:tc>
-          <w:tcPr>
-            <w:tcW w:type="dxa" w:w="2700"/>
-            <w:shd w:fill="F5F8FB" w:val="clear"/>
-            <w:vAlign w:val="center"/>
-            <w:tcMar>
-              <w:top w:w="80" w:type="dxa"/>
-              <w:bottom w:w="80" w:type="dxa"/>
-              <w:start w:w="120" w:type="dxa"/>
-              <w:end w:w="120" w:type="dxa"/>
-            </w:tcMar>
-          </w:tcPr>
-          <w:p>
-            <w:pPr>
-              <w:spacing w:after="0" w:line="276" w:lineRule="auto"/>
-              <w:jc w:val="left"/>
-            </w:pPr>
-            <w:r>
-              <w:rPr>
-                <w:rFonts w:ascii="Calibri" w:hAnsi="Calibri"/>
-                <w:b/>
-                <w:color w:val="0A2540"/>
-                <w:sz w:val="21"/>
-              </w:rPr>
-              <w:t>Call ready</w:t>
-            </w:r>
-          </w:p>
-        </w:tc>
-        <w:tc>
-          <w:tcPr>
-            <w:tcW w:type="dxa" w:w="6660"/>
-            <w:shd w:fill="F5F8FB" w:val="clear"/>
-            <w:vAlign w:val="center"/>
-            <w:tcMar>
-              <w:top w:w="80" w:type="dxa"/>
-              <w:bottom w:w="80" w:type="dxa"/>
-              <w:start w:w="120" w:type="dxa"/>
-              <w:end w:w="120" w:type="dxa"/>
-            </w:tcMar>
-          </w:tcPr>
-          <w:p>
-            <w:pPr>
-              <w:spacing w:after="0" w:line="276" w:lineRule="auto"/>
-              <w:jc w:val="left"/>
-            </w:pPr>
-            <w:r>
-              <w:rPr>
-                <w:rFonts w:ascii="Calibri" w:hAnsi="Calibri"/>
-                <w:b w:val="0"/>
-                <w:color w:val="1F2933"/>
-                <w:sz w:val="21"/>
-              </w:rPr>
-              <w:t>Whether outreach checks have passed. Public view stays at zero.</w:t>
-            </w:r>
-          </w:p>
-        </w:tc>
-      </w:tr>
-    </w:tbl>
     <w:p>
+      <w:pPr>
+        <w:spacing w:after="120" w:line="300" w:lineRule="auto"/>
+        <w:ind w:left="540" w:hanging="271"/>
+      </w:pPr>
       <w:r>
-        <w:br w:type="page"/>
+        <w:rPr>
+          <w:rFonts w:ascii="Calibri" w:hAnsi="Calibri"/>
+          <w:b/>
+          <w:i w:val="0"/>
+          <w:color w:val="0B2545"/>
+          <w:sz w:val="22"/>
+        </w:rPr>
+        <w:t xml:space="preserve">5. </w:t>
+      </w:r>
+      <w:r>
+        <w:rPr>
+          <w:rFonts w:ascii="Calibri" w:hAnsi="Calibri"/>
+          <w:b/>
+          <w:i w:val="0"/>
+          <w:color w:val="0B2545"/>
+          <w:sz w:val="22"/>
+        </w:rPr>
+        <w:t xml:space="preserve">Verify before doing anything else. </w:t>
+      </w:r>
+      <w:r>
+        <w:rPr>
+          <w:rFonts w:ascii="Calibri" w:hAnsi="Calibri"/>
+          <w:b w:val="0"/>
+          <w:i w:val="0"/>
+          <w:color w:val="1C2737"/>
+          <w:sz w:val="22"/>
+        </w:rPr>
+        <w:t>Open the cited official record and confirm that the organization and event are current.</w:t>
       </w:r>
     </w:p>
     <w:p>
@@ -1350,786 +668,145 @@
         <w:keepNext/>
       </w:pPr>
       <w:r>
-        <w:t>Where the live records come from</w:t>
+        <w:t>The four deal-moment lanes</w:t>
       </w:r>
     </w:p>
     <w:p>
       <w:pPr>
-        <w:spacing w:after="120" w:line="300" w:lineRule="auto"/>
+        <w:pStyle w:val="ListBullet"/>
+        <w:spacing w:after="80" w:line="300" w:lineRule="auto"/>
+        <w:ind w:left="540" w:hanging="271"/>
       </w:pPr>
       <w:r>
         <w:rPr>
           <w:rFonts w:ascii="Calibri" w:hAnsi="Calibri"/>
+          <w:b/>
           <w:i w:val="0"/>
-          <w:color w:val="1F2933"/>
+          <w:color w:val="0B2545"/>
+          <w:sz w:val="22"/>
         </w:rPr>
-        <w:t>The application checks official public sources independently. Each lane reports LIVE, UNAVAILABLE, or NOT APPLICABLE for the selected market.</w:t>
+        <w:t>Life-plan timing:</w:t>
       </w:r>
-    </w:p>
-    <w:tbl>
-      <w:tblPr>
-        <w:tblW w:type="dxa" w:w="9360"/>
-        <w:tblLayout w:type="fixed"/>
-        <w:tblLook w:firstColumn="1" w:firstRow="1" w:lastColumn="0" w:lastRow="0" w:noHBand="0" w:noVBand="1" w:val="04A0"/>
-        <w:jc w:val="left"/>
-        <w:tblInd w:w="120" w:type="dxa"/>
-      </w:tblPr>
-      <w:tblGrid>
-        <w:gridCol w:w="3150"/>
-        <w:gridCol w:w="1650"/>
-        <w:gridCol w:w="4560"/>
-      </w:tblGrid>
-      <w:tr>
-        <w:trPr>
-          <w:tblHeader w:val="true"/>
-        </w:trPr>
-        <w:tc>
-          <w:tcPr>
-            <w:tcW w:type="dxa" w:w="3150"/>
-            <w:vAlign w:val="center"/>
-            <w:tcMar>
-              <w:top w:w="80" w:type="dxa"/>
-              <w:bottom w:w="80" w:type="dxa"/>
-              <w:start w:w="120" w:type="dxa"/>
-              <w:end w:w="120" w:type="dxa"/>
-            </w:tcMar>
-            <w:shd w:fill="0A2540" w:val="clear"/>
-          </w:tcPr>
-          <w:p>
-            <w:pPr>
-              <w:spacing w:after="0" w:line="276" w:lineRule="auto"/>
-              <w:jc w:val="left"/>
-            </w:pPr>
-            <w:r>
-              <w:rPr>
-                <w:rFonts w:ascii="Calibri" w:hAnsi="Calibri"/>
-                <w:b/>
-                <w:color w:val="FFFFFF"/>
-                <w:sz w:val="20"/>
-              </w:rPr>
-              <w:t>Official source</w:t>
-            </w:r>
-          </w:p>
-        </w:tc>
-        <w:tc>
-          <w:tcPr>
-            <w:tcW w:type="dxa" w:w="1650"/>
-            <w:vAlign w:val="center"/>
-            <w:tcMar>
-              <w:top w:w="80" w:type="dxa"/>
-              <w:bottom w:w="80" w:type="dxa"/>
-              <w:start w:w="120" w:type="dxa"/>
-              <w:end w:w="120" w:type="dxa"/>
-            </w:tcMar>
-            <w:shd w:fill="0A2540" w:val="clear"/>
-          </w:tcPr>
-          <w:p>
-            <w:pPr>
-              <w:spacing w:after="0" w:line="276" w:lineRule="auto"/>
-              <w:jc w:val="left"/>
-            </w:pPr>
-            <w:r>
-              <w:rPr>
-                <w:rFonts w:ascii="Calibri" w:hAnsi="Calibri"/>
-                <w:b/>
-                <w:color w:val="FFFFFF"/>
-                <w:sz w:val="20"/>
-              </w:rPr>
-              <w:t>Verified state</w:t>
-            </w:r>
-          </w:p>
-        </w:tc>
-        <w:tc>
-          <w:tcPr>
-            <w:tcW w:type="dxa" w:w="4560"/>
-            <w:vAlign w:val="center"/>
-            <w:tcMar>
-              <w:top w:w="80" w:type="dxa"/>
-              <w:bottom w:w="80" w:type="dxa"/>
-              <w:start w:w="120" w:type="dxa"/>
-              <w:end w:w="120" w:type="dxa"/>
-            </w:tcMar>
-            <w:shd w:fill="0A2540" w:val="clear"/>
-          </w:tcPr>
-          <w:p>
-            <w:pPr>
-              <w:spacing w:after="0" w:line="276" w:lineRule="auto"/>
-              <w:jc w:val="left"/>
-            </w:pPr>
-            <w:r>
-              <w:rPr>
-                <w:rFonts w:ascii="Calibri" w:hAnsi="Calibri"/>
-                <w:b/>
-                <w:color w:val="FFFFFF"/>
-                <w:sz w:val="20"/>
-              </w:rPr>
-              <w:t>What it can show</w:t>
-            </w:r>
-          </w:p>
-        </w:tc>
-      </w:tr>
-      <w:tr>
-        <w:tc>
-          <w:tcPr>
-            <w:tcW w:type="dxa" w:w="3150"/>
-            <w:vAlign w:val="center"/>
-            <w:tcMar>
-              <w:top w:w="80" w:type="dxa"/>
-              <w:bottom w:w="80" w:type="dxa"/>
-              <w:start w:w="120" w:type="dxa"/>
-              <w:end w:w="120" w:type="dxa"/>
-            </w:tcMar>
-          </w:tcPr>
-          <w:p>
-            <w:pPr>
-              <w:spacing w:after="0" w:line="276" w:lineRule="auto"/>
-              <w:jc w:val="left"/>
-            </w:pPr>
-            <w:r>
-              <w:rPr>
-                <w:rFonts w:ascii="Calibri" w:hAnsi="Calibri"/>
-                <w:b/>
-                <w:color w:val="0A2540"/>
-                <w:sz w:val="20"/>
-              </w:rPr>
-              <w:t>U.S. Department of Labor Form 5500</w:t>
-            </w:r>
-          </w:p>
-        </w:tc>
-        <w:tc>
-          <w:tcPr>
-            <w:tcW w:type="dxa" w:w="1650"/>
-            <w:vAlign w:val="center"/>
-            <w:tcMar>
-              <w:top w:w="80" w:type="dxa"/>
-              <w:bottom w:w="80" w:type="dxa"/>
-              <w:start w:w="120" w:type="dxa"/>
-              <w:end w:w="120" w:type="dxa"/>
-            </w:tcMar>
-          </w:tcPr>
-          <w:p>
-            <w:pPr>
-              <w:spacing w:after="0" w:line="276" w:lineRule="auto"/>
-              <w:jc w:val="left"/>
-            </w:pPr>
-            <w:r>
-              <w:rPr>
-                <w:rFonts w:ascii="Calibri" w:hAnsi="Calibri"/>
-                <w:b/>
-                <w:color w:val="168F89"/>
-                <w:sz w:val="20"/>
-              </w:rPr>
-              <w:t>LIVE</w:t>
-            </w:r>
-          </w:p>
-        </w:tc>
-        <w:tc>
-          <w:tcPr>
-            <w:tcW w:type="dxa" w:w="4560"/>
-            <w:vAlign w:val="center"/>
-            <w:tcMar>
-              <w:top w:w="80" w:type="dxa"/>
-              <w:bottom w:w="80" w:type="dxa"/>
-              <w:start w:w="120" w:type="dxa"/>
-              <w:end w:w="120" w:type="dxa"/>
-            </w:tcMar>
-          </w:tcPr>
-          <w:p>
-            <w:pPr>
-              <w:spacing w:after="0" w:line="276" w:lineRule="auto"/>
-              <w:jc w:val="left"/>
-            </w:pPr>
-            <w:r>
-              <w:rPr>
-                <w:rFonts w:ascii="Calibri" w:hAnsi="Calibri"/>
-                <w:b w:val="0"/>
-                <w:color w:val="1F2933"/>
-                <w:sz w:val="20"/>
-              </w:rPr>
-              <w:t>Benefit-plan filings and reported plan or policy timing fields.</w:t>
-            </w:r>
-          </w:p>
-        </w:tc>
-      </w:tr>
-      <w:tr>
-        <w:tc>
-          <w:tcPr>
-            <w:tcW w:type="dxa" w:w="3150"/>
-            <w:shd w:fill="F5F8FB" w:val="clear"/>
-            <w:vAlign w:val="center"/>
-            <w:tcMar>
-              <w:top w:w="80" w:type="dxa"/>
-              <w:bottom w:w="80" w:type="dxa"/>
-              <w:start w:w="120" w:type="dxa"/>
-              <w:end w:w="120" w:type="dxa"/>
-            </w:tcMar>
-          </w:tcPr>
-          <w:p>
-            <w:pPr>
-              <w:spacing w:after="0" w:line="276" w:lineRule="auto"/>
-              <w:jc w:val="left"/>
-            </w:pPr>
-            <w:r>
-              <w:rPr>
-                <w:rFonts w:ascii="Calibri" w:hAnsi="Calibri"/>
-                <w:b/>
-                <w:color w:val="0A2540"/>
-                <w:sz w:val="20"/>
-              </w:rPr>
-              <w:t>FMCSA Company Census</w:t>
-            </w:r>
-          </w:p>
-        </w:tc>
-        <w:tc>
-          <w:tcPr>
-            <w:tcW w:type="dxa" w:w="1650"/>
-            <w:shd w:fill="F5F8FB" w:val="clear"/>
-            <w:vAlign w:val="center"/>
-            <w:tcMar>
-              <w:top w:w="80" w:type="dxa"/>
-              <w:bottom w:w="80" w:type="dxa"/>
-              <w:start w:w="120" w:type="dxa"/>
-              <w:end w:w="120" w:type="dxa"/>
-            </w:tcMar>
-          </w:tcPr>
-          <w:p>
-            <w:pPr>
-              <w:spacing w:after="0" w:line="276" w:lineRule="auto"/>
-              <w:jc w:val="left"/>
-            </w:pPr>
-            <w:r>
-              <w:rPr>
-                <w:rFonts w:ascii="Calibri" w:hAnsi="Calibri"/>
-                <w:b/>
-                <w:color w:val="168F89"/>
-                <w:sz w:val="20"/>
-              </w:rPr>
-              <w:t>LIVE</w:t>
-            </w:r>
-          </w:p>
-        </w:tc>
-        <w:tc>
-          <w:tcPr>
-            <w:tcW w:type="dxa" w:w="4560"/>
-            <w:shd w:fill="F5F8FB" w:val="clear"/>
-            <w:vAlign w:val="center"/>
-            <w:tcMar>
-              <w:top w:w="80" w:type="dxa"/>
-              <w:bottom w:w="80" w:type="dxa"/>
-              <w:start w:w="120" w:type="dxa"/>
-              <w:end w:w="120" w:type="dxa"/>
-            </w:tcMar>
-          </w:tcPr>
-          <w:p>
-            <w:pPr>
-              <w:spacing w:after="0" w:line="276" w:lineRule="auto"/>
-              <w:jc w:val="left"/>
-            </w:pPr>
-            <w:r>
-              <w:rPr>
-                <w:rFonts w:ascii="Calibri" w:hAnsi="Calibri"/>
-                <w:b w:val="0"/>
-                <w:color w:val="1F2933"/>
-                <w:sz w:val="20"/>
-              </w:rPr>
-              <w:t>Organization-level carrier registration activity.</w:t>
-            </w:r>
-          </w:p>
-        </w:tc>
-      </w:tr>
-      <w:tr>
-        <w:tc>
-          <w:tcPr>
-            <w:tcW w:type="dxa" w:w="3150"/>
-            <w:vAlign w:val="center"/>
-            <w:tcMar>
-              <w:top w:w="80" w:type="dxa"/>
-              <w:bottom w:w="80" w:type="dxa"/>
-              <w:start w:w="120" w:type="dxa"/>
-              <w:end w:w="120" w:type="dxa"/>
-            </w:tcMar>
-          </w:tcPr>
-          <w:p>
-            <w:pPr>
-              <w:spacing w:after="0" w:line="276" w:lineRule="auto"/>
-              <w:jc w:val="left"/>
-            </w:pPr>
-            <w:r>
-              <w:rPr>
-                <w:rFonts w:ascii="Calibri" w:hAnsi="Calibri"/>
-                <w:b/>
-                <w:color w:val="0A2540"/>
-                <w:sz w:val="20"/>
-              </w:rPr>
-              <w:t>USAspending</w:t>
-            </w:r>
-          </w:p>
-        </w:tc>
-        <w:tc>
-          <w:tcPr>
-            <w:tcW w:type="dxa" w:w="1650"/>
-            <w:vAlign w:val="center"/>
-            <w:tcMar>
-              <w:top w:w="80" w:type="dxa"/>
-              <w:bottom w:w="80" w:type="dxa"/>
-              <w:start w:w="120" w:type="dxa"/>
-              <w:end w:w="120" w:type="dxa"/>
-            </w:tcMar>
-          </w:tcPr>
-          <w:p>
-            <w:pPr>
-              <w:spacing w:after="0" w:line="276" w:lineRule="auto"/>
-              <w:jc w:val="left"/>
-            </w:pPr>
-            <w:r>
-              <w:rPr>
-                <w:rFonts w:ascii="Calibri" w:hAnsi="Calibri"/>
-                <w:b/>
-                <w:color w:val="168F89"/>
-                <w:sz w:val="20"/>
-              </w:rPr>
-              <w:t>LIVE</w:t>
-            </w:r>
-          </w:p>
-        </w:tc>
-        <w:tc>
-          <w:tcPr>
-            <w:tcW w:type="dxa" w:w="4560"/>
-            <w:vAlign w:val="center"/>
-            <w:tcMar>
-              <w:top w:w="80" w:type="dxa"/>
-              <w:bottom w:w="80" w:type="dxa"/>
-              <w:start w:w="120" w:type="dxa"/>
-              <w:end w:w="120" w:type="dxa"/>
-            </w:tcMar>
-          </w:tcPr>
-          <w:p>
-            <w:pPr>
-              <w:spacing w:after="0" w:line="276" w:lineRule="auto"/>
-              <w:jc w:val="left"/>
-            </w:pPr>
-            <w:r>
-              <w:rPr>
-                <w:rFonts w:ascii="Calibri" w:hAnsi="Calibri"/>
-                <w:b w:val="0"/>
-                <w:color w:val="1F2933"/>
-                <w:sz w:val="20"/>
-              </w:rPr>
-              <w:t>Federal contract activity in the current query window.</w:t>
-            </w:r>
-          </w:p>
-        </w:tc>
-      </w:tr>
-      <w:tr>
-        <w:tc>
-          <w:tcPr>
-            <w:tcW w:type="dxa" w:w="3150"/>
-            <w:shd w:fill="F5F8FB" w:val="clear"/>
-            <w:vAlign w:val="center"/>
-            <w:tcMar>
-              <w:top w:w="80" w:type="dxa"/>
-              <w:bottom w:w="80" w:type="dxa"/>
-              <w:start w:w="120" w:type="dxa"/>
-              <w:end w:w="120" w:type="dxa"/>
-            </w:tcMar>
-          </w:tcPr>
-          <w:p>
-            <w:pPr>
-              <w:spacing w:after="0" w:line="276" w:lineRule="auto"/>
-              <w:jc w:val="left"/>
-            </w:pPr>
-            <w:r>
-              <w:rPr>
-                <w:rFonts w:ascii="Calibri" w:hAnsi="Calibri"/>
-                <w:b/>
-                <w:color w:val="0A2540"/>
-                <w:sz w:val="20"/>
-              </w:rPr>
-              <w:t>EPA ECHO</w:t>
-            </w:r>
-          </w:p>
-        </w:tc>
-        <w:tc>
-          <w:tcPr>
-            <w:tcW w:type="dxa" w:w="1650"/>
-            <w:shd w:fill="F5F8FB" w:val="clear"/>
-            <w:vAlign w:val="center"/>
-            <w:tcMar>
-              <w:top w:w="80" w:type="dxa"/>
-              <w:bottom w:w="80" w:type="dxa"/>
-              <w:start w:w="120" w:type="dxa"/>
-              <w:end w:w="120" w:type="dxa"/>
-            </w:tcMar>
-          </w:tcPr>
-          <w:p>
-            <w:pPr>
-              <w:spacing w:after="0" w:line="276" w:lineRule="auto"/>
-              <w:jc w:val="left"/>
-            </w:pPr>
-            <w:r>
-              <w:rPr>
-                <w:rFonts w:ascii="Calibri" w:hAnsi="Calibri"/>
-                <w:b/>
-                <w:color w:val="168F89"/>
-                <w:sz w:val="20"/>
-              </w:rPr>
-              <w:t>LIVE</w:t>
-            </w:r>
-          </w:p>
-        </w:tc>
-        <w:tc>
-          <w:tcPr>
-            <w:tcW w:type="dxa" w:w="4560"/>
-            <w:shd w:fill="F5F8FB" w:val="clear"/>
-            <w:vAlign w:val="center"/>
-            <w:tcMar>
-              <w:top w:w="80" w:type="dxa"/>
-              <w:bottom w:w="80" w:type="dxa"/>
-              <w:start w:w="120" w:type="dxa"/>
-              <w:end w:w="120" w:type="dxa"/>
-            </w:tcMar>
-          </w:tcPr>
-          <w:p>
-            <w:pPr>
-              <w:spacing w:after="0" w:line="276" w:lineRule="auto"/>
-              <w:jc w:val="left"/>
-            </w:pPr>
-            <w:r>
-              <w:rPr>
-                <w:rFonts w:ascii="Calibri" w:hAnsi="Calibri"/>
-                <w:b w:val="0"/>
-                <w:color w:val="1F2933"/>
-                <w:sz w:val="20"/>
-              </w:rPr>
-              <w:t>Organization and facility compliance-monitoring activity.</w:t>
-            </w:r>
-          </w:p>
-        </w:tc>
-      </w:tr>
-      <w:tr>
-        <w:tc>
-          <w:tcPr>
-            <w:tcW w:type="dxa" w:w="3150"/>
-            <w:vAlign w:val="center"/>
-            <w:tcMar>
-              <w:top w:w="80" w:type="dxa"/>
-              <w:bottom w:w="80" w:type="dxa"/>
-              <w:start w:w="120" w:type="dxa"/>
-              <w:end w:w="120" w:type="dxa"/>
-            </w:tcMar>
-          </w:tcPr>
-          <w:p>
-            <w:pPr>
-              <w:spacing w:after="0" w:line="276" w:lineRule="auto"/>
-              <w:jc w:val="left"/>
-            </w:pPr>
-            <w:r>
-              <w:rPr>
-                <w:rFonts w:ascii="Calibri" w:hAnsi="Calibri"/>
-                <w:b/>
-                <w:color w:val="0A2540"/>
-                <w:sz w:val="20"/>
-              </w:rPr>
-              <w:t>FCC ULS</w:t>
-            </w:r>
-          </w:p>
-        </w:tc>
-        <w:tc>
-          <w:tcPr>
-            <w:tcW w:type="dxa" w:w="1650"/>
-            <w:vAlign w:val="center"/>
-            <w:tcMar>
-              <w:top w:w="80" w:type="dxa"/>
-              <w:bottom w:w="80" w:type="dxa"/>
-              <w:start w:w="120" w:type="dxa"/>
-              <w:end w:w="120" w:type="dxa"/>
-            </w:tcMar>
-          </w:tcPr>
-          <w:p>
-            <w:pPr>
-              <w:spacing w:after="0" w:line="276" w:lineRule="auto"/>
-              <w:jc w:val="left"/>
-            </w:pPr>
-            <w:r>
-              <w:rPr>
-                <w:rFonts w:ascii="Calibri" w:hAnsi="Calibri"/>
-                <w:b/>
-                <w:color w:val="B78327"/>
-                <w:sz w:val="20"/>
-              </w:rPr>
-              <w:t>UNAVAILABLE</w:t>
-            </w:r>
-          </w:p>
-        </w:tc>
-        <w:tc>
-          <w:tcPr>
-            <w:tcW w:type="dxa" w:w="4560"/>
-            <w:vAlign w:val="center"/>
-            <w:tcMar>
-              <w:top w:w="80" w:type="dxa"/>
-              <w:bottom w:w="80" w:type="dxa"/>
-              <w:start w:w="120" w:type="dxa"/>
-              <w:end w:w="120" w:type="dxa"/>
-            </w:tcMar>
-          </w:tcPr>
-          <w:p>
-            <w:pPr>
-              <w:spacing w:after="0" w:line="276" w:lineRule="auto"/>
-              <w:jc w:val="left"/>
-            </w:pPr>
-            <w:r>
-              <w:rPr>
-                <w:rFonts w:ascii="Calibri" w:hAnsi="Calibri"/>
-                <w:b w:val="0"/>
-                <w:color w:val="1F2933"/>
-                <w:sz w:val="20"/>
-              </w:rPr>
-              <w:t>Organization wireless-license activity when the source answers.</w:t>
-            </w:r>
-          </w:p>
-        </w:tc>
-      </w:tr>
-      <w:tr>
-        <w:tc>
-          <w:tcPr>
-            <w:tcW w:type="dxa" w:w="3150"/>
-            <w:shd w:fill="F5F8FB" w:val="clear"/>
-            <w:vAlign w:val="center"/>
-            <w:tcMar>
-              <w:top w:w="80" w:type="dxa"/>
-              <w:bottom w:w="80" w:type="dxa"/>
-              <w:start w:w="120" w:type="dxa"/>
-              <w:end w:w="120" w:type="dxa"/>
-            </w:tcMar>
-          </w:tcPr>
-          <w:p>
-            <w:pPr>
-              <w:spacing w:after="0" w:line="276" w:lineRule="auto"/>
-              <w:jc w:val="left"/>
-            </w:pPr>
-            <w:r>
-              <w:rPr>
-                <w:rFonts w:ascii="Calibri" w:hAnsi="Calibri"/>
-                <w:b/>
-                <w:color w:val="0A2540"/>
-                <w:sz w:val="20"/>
-              </w:rPr>
-              <w:t>Chicago business licenses</w:t>
-            </w:r>
-          </w:p>
-        </w:tc>
-        <w:tc>
-          <w:tcPr>
-            <w:tcW w:type="dxa" w:w="1650"/>
-            <w:shd w:fill="F5F8FB" w:val="clear"/>
-            <w:vAlign w:val="center"/>
-            <w:tcMar>
-              <w:top w:w="80" w:type="dxa"/>
-              <w:bottom w:w="80" w:type="dxa"/>
-              <w:start w:w="120" w:type="dxa"/>
-              <w:end w:w="120" w:type="dxa"/>
-            </w:tcMar>
-          </w:tcPr>
-          <w:p>
-            <w:pPr>
-              <w:spacing w:after="0" w:line="276" w:lineRule="auto"/>
-              <w:jc w:val="left"/>
-            </w:pPr>
-            <w:r>
-              <w:rPr>
-                <w:rFonts w:ascii="Calibri" w:hAnsi="Calibri"/>
-                <w:b/>
-                <w:color w:val="B78327"/>
-                <w:sz w:val="20"/>
-              </w:rPr>
-              <w:t>UNAVAILABLE</w:t>
-            </w:r>
-          </w:p>
-        </w:tc>
-        <w:tc>
-          <w:tcPr>
-            <w:tcW w:type="dxa" w:w="4560"/>
-            <w:shd w:fill="F5F8FB" w:val="clear"/>
-            <w:vAlign w:val="center"/>
-            <w:tcMar>
-              <w:top w:w="80" w:type="dxa"/>
-              <w:bottom w:w="80" w:type="dxa"/>
-              <w:start w:w="120" w:type="dxa"/>
-              <w:end w:w="120" w:type="dxa"/>
-            </w:tcMar>
-          </w:tcPr>
-          <w:p>
-            <w:pPr>
-              <w:spacing w:after="0" w:line="276" w:lineRule="auto"/>
-              <w:jc w:val="left"/>
-            </w:pPr>
-            <w:r>
-              <w:rPr>
-                <w:rFonts w:ascii="Calibri" w:hAnsi="Calibri"/>
-                <w:b w:val="0"/>
-                <w:color w:val="1F2933"/>
-                <w:sz w:val="20"/>
-              </w:rPr>
-              <w:t>New active business-license records when applicable.</w:t>
-            </w:r>
-          </w:p>
-        </w:tc>
-      </w:tr>
-      <w:tr>
-        <w:tc>
-          <w:tcPr>
-            <w:tcW w:type="dxa" w:w="3150"/>
-            <w:vAlign w:val="center"/>
-            <w:tcMar>
-              <w:top w:w="80" w:type="dxa"/>
-              <w:bottom w:w="80" w:type="dxa"/>
-              <w:start w:w="120" w:type="dxa"/>
-              <w:end w:w="120" w:type="dxa"/>
-            </w:tcMar>
-          </w:tcPr>
-          <w:p>
-            <w:pPr>
-              <w:spacing w:after="0" w:line="276" w:lineRule="auto"/>
-              <w:jc w:val="left"/>
-            </w:pPr>
-            <w:r>
-              <w:rPr>
-                <w:rFonts w:ascii="Calibri" w:hAnsi="Calibri"/>
-                <w:b/>
-                <w:color w:val="0A2540"/>
-                <w:sz w:val="20"/>
-              </w:rPr>
-              <w:t>SAM.gov entity updates</w:t>
-            </w:r>
-          </w:p>
-        </w:tc>
-        <w:tc>
-          <w:tcPr>
-            <w:tcW w:type="dxa" w:w="1650"/>
-            <w:vAlign w:val="center"/>
-            <w:tcMar>
-              <w:top w:w="80" w:type="dxa"/>
-              <w:bottom w:w="80" w:type="dxa"/>
-              <w:start w:w="120" w:type="dxa"/>
-              <w:end w:w="120" w:type="dxa"/>
-            </w:tcMar>
-          </w:tcPr>
-          <w:p>
-            <w:pPr>
-              <w:spacing w:after="0" w:line="276" w:lineRule="auto"/>
-              <w:jc w:val="left"/>
-            </w:pPr>
-            <w:r>
-              <w:rPr>
-                <w:rFonts w:ascii="Calibri" w:hAnsi="Calibri"/>
-                <w:b/>
-                <w:color w:val="B78327"/>
-                <w:sz w:val="20"/>
-              </w:rPr>
-              <w:t>UNAVAILABLE</w:t>
-            </w:r>
-          </w:p>
-        </w:tc>
-        <w:tc>
-          <w:tcPr>
-            <w:tcW w:type="dxa" w:w="4560"/>
-            <w:vAlign w:val="center"/>
-            <w:tcMar>
-              <w:top w:w="80" w:type="dxa"/>
-              <w:bottom w:w="80" w:type="dxa"/>
-              <w:start w:w="120" w:type="dxa"/>
-              <w:end w:w="120" w:type="dxa"/>
-            </w:tcMar>
-          </w:tcPr>
-          <w:p>
-            <w:pPr>
-              <w:spacing w:after="0" w:line="276" w:lineRule="auto"/>
-              <w:jc w:val="left"/>
-            </w:pPr>
-            <w:r>
-              <w:rPr>
-                <w:rFonts w:ascii="Calibri" w:hAnsi="Calibri"/>
-                <w:b w:val="0"/>
-                <w:color w:val="1F2933"/>
-                <w:sz w:val="20"/>
-              </w:rPr>
-              <w:t>Active entity updates when the source and credential are available.</w:t>
-            </w:r>
-          </w:p>
-        </w:tc>
-      </w:tr>
-    </w:tbl>
-    <w:p>
-      <w:pPr>
-        <w:pStyle w:val="Heading2"/>
-        <w:keepNext/>
-      </w:pPr>
       <w:r>
-        <w:t>What is deliberately excluded</w:t>
+        <w:rPr>
+          <w:rFonts w:ascii="Calibri" w:hAnsi="Calibri"/>
+          <w:b w:val="0"/>
+          <w:i w:val="0"/>
+          <w:color w:val="1C2737"/>
+          <w:sz w:val="22"/>
+        </w:rPr>
+        <w:t xml:space="preserve"> Employers whose official Department of Labor filing reports a group-life benefit and a plan or policy anniversary.</w:t>
       </w:r>
     </w:p>
     <w:p>
       <w:pPr>
-        <w:numPr>
-          <w:ilvl w:val="0"/>
-          <w:numId w:val="10"/>
-        </w:numPr>
+        <w:pStyle w:val="ListBullet"/>
         <w:spacing w:after="80" w:line="300" w:lineRule="auto"/>
+        <w:ind w:left="540" w:hanging="271"/>
       </w:pPr>
       <w:r>
         <w:rPr>
           <w:rFonts w:ascii="Calibri" w:hAnsi="Calibri"/>
-          <w:color w:val="1F2933"/>
+          <w:b/>
+          <w:i w:val="0"/>
+          <w:color w:val="0B2545"/>
+          <w:sz w:val="22"/>
         </w:rPr>
-        <w:t>Personal social-media profiles, private contacts, and hidden contact enrichment.</w:t>
+        <w:t>Growth &amp; awards:</w:t>
+      </w:r>
+      <w:r>
+        <w:rPr>
+          <w:rFonts w:ascii="Calibri" w:hAnsi="Calibri"/>
+          <w:b w:val="0"/>
+          <w:i w:val="0"/>
+          <w:color w:val="1C2737"/>
+          <w:sz w:val="22"/>
+        </w:rPr>
+        <w:t xml:space="preserve"> Current federal contract activity that may justify a business-protection, continuity, or workforce review.</w:t>
       </w:r>
     </w:p>
     <w:p>
       <w:pPr>
-        <w:numPr>
-          <w:ilvl w:val="0"/>
-          <w:numId w:val="10"/>
-        </w:numPr>
+        <w:pStyle w:val="ListBullet"/>
         <w:spacing w:after="80" w:line="300" w:lineRule="auto"/>
+        <w:ind w:left="540" w:hanging="271"/>
       </w:pPr>
       <w:r>
         <w:rPr>
           <w:rFonts w:ascii="Calibri" w:hAnsi="Calibri"/>
-          <w:color w:val="1F2933"/>
+          <w:b/>
+          <w:i w:val="0"/>
+          <w:color w:val="0B2545"/>
+          <w:sz w:val="22"/>
         </w:rPr>
-        <w:t>Health, age, race, religion, family status, wealth, or insurability inferences.</w:t>
+        <w:t>Operational change:</w:t>
+      </w:r>
+      <w:r>
+        <w:rPr>
+          <w:rFonts w:ascii="Calibri" w:hAnsi="Calibri"/>
+          <w:b w:val="0"/>
+          <w:i w:val="0"/>
+          <w:color w:val="1C2737"/>
+          <w:sz w:val="22"/>
+        </w:rPr>
+        <w:t xml:space="preserve"> Carrier registrations, facility monitoring activity, and other official organization events.</w:t>
       </w:r>
     </w:p>
     <w:p>
       <w:pPr>
-        <w:numPr>
-          <w:ilvl w:val="0"/>
-          <w:numId w:val="10"/>
-        </w:numPr>
+        <w:pStyle w:val="ListBullet"/>
         <w:spacing w:after="80" w:line="300" w:lineRule="auto"/>
+        <w:ind w:left="540" w:hanging="271"/>
       </w:pPr>
       <w:r>
         <w:rPr>
           <w:rFonts w:ascii="Calibri" w:hAnsi="Calibri"/>
-          <w:color w:val="1F2933"/>
+          <w:b/>
+          <w:i w:val="0"/>
+          <w:color w:val="0B2545"/>
+          <w:sz w:val="22"/>
         </w:rPr>
-        <w:t>Named filing signers, administrators, donors, or executives used as personal leads.</w:t>
+        <w:t>Needs research:</w:t>
+      </w:r>
+      <w:r>
+        <w:rPr>
+          <w:rFonts w:ascii="Calibri" w:hAnsi="Calibri"/>
+          <w:b w:val="0"/>
+          <w:i w:val="0"/>
+          <w:color w:val="1C2737"/>
+          <w:sz w:val="22"/>
+        </w:rPr>
+        <w:t xml:space="preserve"> Every account that still requires source verification, product-fit review, and protected contact clearance.</w:t>
       </w:r>
     </w:p>
     <w:p>
       <w:pPr>
-        <w:numPr>
-          <w:ilvl w:val="0"/>
-          <w:numId w:val="10"/>
-        </w:numPr>
-        <w:spacing w:after="80" w:line="300" w:lineRule="auto"/>
+        <w:spacing w:before="80" w:after="200" w:line="288" w:lineRule="auto"/>
+        <w:ind w:left="173" w:right="173"/>
+        <w:shd w:fill="E7F5F3"/>
+        <w:pBdr>
+          <w:left w:val="single" w:sz="18" w:space="8" w:color="148984"/>
+        </w:pBdr>
       </w:pPr>
       <w:r>
         <w:rPr>
           <w:rFonts w:ascii="Calibri" w:hAnsi="Calibri"/>
-          <w:color w:val="1F2933"/>
+          <w:b/>
+          <w:i w:val="0"/>
+          <w:color w:val="0B2545"/>
+          <w:sz w:val="22"/>
         </w:rPr>
-        <w:t>Automatic contact permission, automatic quoting, or an underwriting conclusion.</w:t>
+        <w:t xml:space="preserve">Timing label: </w:t>
+      </w:r>
+      <w:r>
+        <w:rPr>
+          <w:rFonts w:ascii="Calibri" w:hAnsi="Calibri"/>
+          <w:b w:val="0"/>
+          <w:i w:val="0"/>
+          <w:color w:val="1C2737"/>
+          <w:sz w:val="22"/>
+        </w:rPr>
+        <w:t>A Form 5500 anniversary is a research hypothesis. It is not proof of a renewal, dissatisfaction, buying intent, eligibility, or insurability.</w:t>
       </w:r>
     </w:p>
     <w:p>
@@ -2143,7 +820,7 @@
         <w:keepNext/>
       </w:pPr>
       <w:r>
-        <w:t>A practical daily routine</w:t>
+        <w:t>How to read an account</w:t>
       </w:r>
     </w:p>
     <w:p>
@@ -2152,71 +829,22 @@
         <w:keepNext/>
       </w:pPr>
       <w:r>
-        <w:t>Morning: choose the research queue</w:t>
+        <w:t>Source-verified business moment</w:t>
       </w:r>
     </w:p>
     <w:p>
       <w:pPr>
-        <w:numPr>
-          <w:ilvl w:val="0"/>
-          <w:numId w:val="10"/>
-        </w:numPr>
-        <w:spacing w:after="80" w:line="300" w:lineRule="auto"/>
+        <w:spacing w:before="0" w:after="120" w:line="300" w:lineRule="auto"/>
       </w:pPr>
       <w:r>
         <w:rPr>
           <w:rFonts w:ascii="Calibri" w:hAnsi="Calibri"/>
-          <w:color w:val="1F2933"/>
+          <w:b w:val="0"/>
+          <w:i w:val="0"/>
+          <w:color w:val="1C2737"/>
+          <w:sz w:val="22"/>
         </w:rPr>
-        <w:t>Open the Broker view and check the release stamp.</w:t>
-      </w:r>
-    </w:p>
-    <w:p>
-      <w:pPr>
-        <w:numPr>
-          <w:ilvl w:val="0"/>
-          <w:numId w:val="10"/>
-        </w:numPr>
-        <w:spacing w:after="80" w:line="300" w:lineRule="auto"/>
-      </w:pPr>
-      <w:r>
-        <w:rPr>
-          <w:rFonts w:ascii="Calibri" w:hAnsi="Calibri"/>
-          <w:color w:val="1F2933"/>
-        </w:rPr>
-        <w:t>Choose your state or region; start with one state for depth.</w:t>
-      </w:r>
-    </w:p>
-    <w:p>
-      <w:pPr>
-        <w:numPr>
-          <w:ilvl w:val="0"/>
-          <w:numId w:val="10"/>
-        </w:numPr>
-        <w:spacing w:after="80" w:line="300" w:lineRule="auto"/>
-      </w:pPr>
-      <w:r>
-        <w:rPr>
-          <w:rFonts w:ascii="Calibri" w:hAnsi="Calibri"/>
-          <w:color w:val="1F2933"/>
-        </w:rPr>
-        <w:t>Read the Broker brief and pick five organizations to verify.</w:t>
-      </w:r>
-    </w:p>
-    <w:p>
-      <w:pPr>
-        <w:numPr>
-          <w:ilvl w:val="0"/>
-          <w:numId w:val="10"/>
-        </w:numPr>
-        <w:spacing w:after="80" w:line="300" w:lineRule="auto"/>
-      </w:pPr>
-      <w:r>
-        <w:rPr>
-          <w:rFonts w:ascii="Calibri" w:hAnsi="Calibri"/>
-          <w:color w:val="1F2933"/>
-        </w:rPr>
-        <w:t>Open every official source before writing a note.</w:t>
+        <w:t>The organization-level fact returned by the official source. Read this before the product idea.</w:t>
       </w:r>
     </w:p>
     <w:p>
@@ -2225,71 +853,22 @@
         <w:keepNext/>
       </w:pPr>
       <w:r>
-        <w:t>Research block: turn records into qualified questions</w:t>
+        <w:t>Timing</w:t>
       </w:r>
     </w:p>
     <w:p>
       <w:pPr>
-        <w:numPr>
-          <w:ilvl w:val="0"/>
-          <w:numId w:val="10"/>
-        </w:numPr>
-        <w:spacing w:after="80" w:line="300" w:lineRule="auto"/>
+        <w:spacing w:before="0" w:after="120" w:line="300" w:lineRule="auto"/>
       </w:pPr>
       <w:r>
         <w:rPr>
           <w:rFonts w:ascii="Calibri" w:hAnsi="Calibri"/>
-          <w:color w:val="1F2933"/>
+          <w:b w:val="0"/>
+          <w:i w:val="0"/>
+          <w:color w:val="1C2737"/>
+          <w:sz w:val="22"/>
         </w:rPr>
-        <w:t>Confirm the organization and event on the official record.</w:t>
-      </w:r>
-    </w:p>
-    <w:p>
-      <w:pPr>
-        <w:numPr>
-          <w:ilvl w:val="0"/>
-          <w:numId w:val="10"/>
-        </w:numPr>
-        <w:spacing w:after="80" w:line="300" w:lineRule="auto"/>
-      </w:pPr>
-      <w:r>
-        <w:rPr>
-          <w:rFonts w:ascii="Calibri" w:hAnsi="Calibri"/>
-          <w:color w:val="1F2933"/>
-        </w:rPr>
-        <w:t>Check the organization's own website for current operations and a business-published channel.</w:t>
-      </w:r>
-    </w:p>
-    <w:p>
-      <w:pPr>
-        <w:numPr>
-          <w:ilvl w:val="0"/>
-          <w:numId w:val="10"/>
-        </w:numPr>
-        <w:spacing w:after="80" w:line="300" w:lineRule="auto"/>
-      </w:pPr>
-      <w:r>
-        <w:rPr>
-          <w:rFonts w:ascii="Calibri" w:hAnsi="Calibri"/>
-          <w:color w:val="1F2933"/>
-        </w:rPr>
-        <w:t>Write down what is known, what is inferred, and what remains unknown.</w:t>
-      </w:r>
-    </w:p>
-    <w:p>
-      <w:pPr>
-        <w:numPr>
-          <w:ilvl w:val="0"/>
-          <w:numId w:val="10"/>
-        </w:numPr>
-        <w:spacing w:after="80" w:line="300" w:lineRule="auto"/>
-      </w:pPr>
-      <w:r>
-        <w:rPr>
-          <w:rFonts w:ascii="Calibri" w:hAnsi="Calibri"/>
-          <w:color w:val="1F2933"/>
-        </w:rPr>
-        <w:t>Do not copy sensitive person-level fields into your notes.</w:t>
+        <w:t>The observed date or the next anniversary calculated from a previously reported plan or policy period.</w:t>
       </w:r>
     </w:p>
     <w:p>
@@ -2298,176 +877,187 @@
         <w:keepNext/>
       </w:pPr>
       <w:r>
-        <w:t>Before any outreach</w:t>
+        <w:t>Likely fit</w:t>
       </w:r>
     </w:p>
     <w:p>
       <w:pPr>
-        <w:numPr>
-          <w:ilvl w:val="0"/>
-          <w:numId w:val="10"/>
-        </w:numPr>
-        <w:spacing w:after="80" w:line="300" w:lineRule="auto"/>
+        <w:spacing w:before="0" w:after="120" w:line="300" w:lineRule="auto"/>
+      </w:pPr>
+      <w:r>
+        <w:rPr>
+          <w:rFonts w:ascii="Calibri" w:hAnsi="Calibri"/>
+          <w:b w:val="0"/>
+          <w:i w:val="0"/>
+          <w:color w:val="1C2737"/>
+          <w:sz w:val="22"/>
+        </w:rPr>
+        <w:t>A reason to investigate protection planning. It is not a recommendation, quote, coverage determination, or statement that David is appointed or licensed for every product shown by the source.</w:t>
+      </w:r>
+    </w:p>
+    <w:p>
+      <w:pPr>
+        <w:pStyle w:val="Heading2"/>
+        <w:keepNext/>
+      </w:pPr>
+      <w:r>
+        <w:t>Evidence</w:t>
+      </w:r>
+    </w:p>
+    <w:p>
+      <w:pPr>
+        <w:spacing w:before="0" w:after="120" w:line="300" w:lineRule="auto"/>
+      </w:pPr>
+      <w:r>
+        <w:rPr>
+          <w:rFonts w:ascii="Calibri" w:hAnsi="Calibri"/>
+          <w:b w:val="0"/>
+          <w:i w:val="0"/>
+          <w:color w:val="1C2737"/>
+          <w:sz w:val="22"/>
+        </w:rPr>
+        <w:t>A direct filing or official record shows the evidence class. A session-verifiable source reference binds the normalized source record to its receipt. Identity resolution, proof grade, clock, counter-evidence, and durable history remain outside that receipt and must be evaluated separately.</w:t>
+      </w:r>
+    </w:p>
+    <w:p>
+      <w:pPr>
+        <w:pStyle w:val="Heading2"/>
+        <w:keepNext/>
+      </w:pPr>
+      <w:r>
+        <w:t>Contact state</w:t>
+      </w:r>
+    </w:p>
+    <w:p>
+      <w:pPr>
+        <w:spacing w:before="0" w:after="120" w:line="300" w:lineRule="auto"/>
+      </w:pPr>
+      <w:r>
+        <w:rPr>
+          <w:rFonts w:ascii="Calibri" w:hAnsi="Calibri"/>
+          <w:b w:val="0"/>
+          <w:i w:val="0"/>
+          <w:color w:val="1C2737"/>
+          <w:sz w:val="22"/>
+        </w:rPr>
+        <w:t>Cleared to contact stays at zero in the public view. That is intentional. Public visibility does not create consent.</w:t>
+      </w:r>
+    </w:p>
+    <w:p>
+      <w:pPr>
+        <w:pStyle w:val="Heading1"/>
+        <w:keepNext/>
+      </w:pPr>
+      <w:r>
+        <w:t>The three-step broker action</w:t>
+      </w:r>
+    </w:p>
+    <w:p>
+      <w:pPr>
+        <w:spacing w:after="120" w:line="300" w:lineRule="auto"/>
+        <w:ind w:left="540" w:hanging="271"/>
       </w:pPr>
       <w:r>
         <w:rPr>
           <w:rFonts w:ascii="Calibri" w:hAnsi="Calibri"/>
           <w:b/>
-          <w:color w:val="0A2540"/>
+          <w:i w:val="0"/>
+          <w:color w:val="0B2545"/>
+          <w:sz w:val="22"/>
         </w:rPr>
-        <w:t xml:space="preserve">Check: </w:t>
+        <w:t xml:space="preserve">1. </w:t>
       </w:r>
       <w:r>
         <w:rPr>
           <w:rFonts w:ascii="Calibri" w:hAnsi="Calibri"/>
-          <w:color w:val="1F2933"/>
+          <w:b/>
+          <w:i w:val="0"/>
+          <w:color w:val="0B2545"/>
+          <w:sz w:val="22"/>
         </w:rPr>
-        <w:t>The organization and event were verified.</w:t>
+        <w:t xml:space="preserve">Verify the moment. </w:t>
+      </w:r>
+      <w:r>
+        <w:rPr>
+          <w:rFonts w:ascii="Calibri" w:hAnsi="Calibri"/>
+          <w:b w:val="0"/>
+          <w:i w:val="0"/>
+          <w:color w:val="1C2737"/>
+          <w:sz w:val="22"/>
+        </w:rPr>
+        <w:t>Open the cited source and confirm the organization, reported date, and relevant filing field.</w:t>
       </w:r>
     </w:p>
     <w:p>
       <w:pPr>
-        <w:numPr>
-          <w:ilvl w:val="0"/>
-          <w:numId w:val="10"/>
-        </w:numPr>
-        <w:spacing w:after="80" w:line="300" w:lineRule="auto"/>
+        <w:spacing w:after="120" w:line="300" w:lineRule="auto"/>
+        <w:ind w:left="540" w:hanging="271"/>
       </w:pPr>
       <w:r>
         <w:rPr>
           <w:rFonts w:ascii="Calibri" w:hAnsi="Calibri"/>
           <w:b/>
-          <w:color w:val="0A2540"/>
+          <w:i w:val="0"/>
+          <w:color w:val="0B2545"/>
+          <w:sz w:val="22"/>
         </w:rPr>
-        <w:t xml:space="preserve">Check: </w:t>
+        <w:t xml:space="preserve">2. </w:t>
       </w:r>
       <w:r>
         <w:rPr>
           <w:rFonts w:ascii="Calibri" w:hAnsi="Calibri"/>
-          <w:color w:val="1F2933"/>
+          <w:b/>
+          <w:i w:val="0"/>
+          <w:color w:val="0B2545"/>
+          <w:sz w:val="22"/>
         </w:rPr>
-        <w:t>The channel was published by the business itself.</w:t>
+        <w:t xml:space="preserve">Qualify the fit. </w:t>
+      </w:r>
+      <w:r>
+        <w:rPr>
+          <w:rFonts w:ascii="Calibri" w:hAnsi="Calibri"/>
+          <w:b w:val="0"/>
+          <w:i w:val="0"/>
+          <w:color w:val="1C2737"/>
+          <w:sz w:val="22"/>
+        </w:rPr>
+        <w:t>Use the organization’s own website to understand its operations and find a business-published channel.</w:t>
       </w:r>
     </w:p>
     <w:p>
       <w:pPr>
-        <w:numPr>
-          <w:ilvl w:val="0"/>
-          <w:numId w:val="10"/>
-        </w:numPr>
-        <w:spacing w:after="80" w:line="300" w:lineRule="auto"/>
+        <w:spacing w:after="120" w:line="300" w:lineRule="auto"/>
+        <w:ind w:left="540" w:hanging="271"/>
       </w:pPr>
       <w:r>
         <w:rPr>
           <w:rFonts w:ascii="Calibri" w:hAnsi="Calibri"/>
           <w:b/>
-          <w:color w:val="0A2540"/>
+          <w:i w:val="0"/>
+          <w:color w:val="0B2545"/>
+          <w:sz w:val="22"/>
         </w:rPr>
-        <w:t xml:space="preserve">Check: </w:t>
+        <w:t xml:space="preserve">3. </w:t>
       </w:r>
       <w:r>
         <w:rPr>
           <w:rFonts w:ascii="Calibri" w:hAnsi="Calibri"/>
-          <w:color w:val="1F2933"/>
+          <w:b/>
+          <w:i w:val="0"/>
+          <w:color w:val="0B2545"/>
+          <w:sz w:val="22"/>
         </w:rPr>
-        <w:t>Suppression and Do-Not-Contact checks passed.</w:t>
-      </w:r>
-    </w:p>
-    <w:p>
-      <w:pPr>
-        <w:numPr>
-          <w:ilvl w:val="0"/>
-          <w:numId w:val="10"/>
-        </w:numPr>
-        <w:spacing w:after="80" w:line="300" w:lineRule="auto"/>
-      </w:pPr>
-      <w:r>
-        <w:rPr>
-          <w:rFonts w:ascii="Calibri" w:hAnsi="Calibri"/>
-          <w:b/>
-          <w:color w:val="0A2540"/>
-        </w:rPr>
-        <w:t xml:space="preserve">Check: </w:t>
+        <w:t xml:space="preserve">Clear outreach. </w:t>
       </w:r>
       <w:r>
         <w:rPr>
           <w:rFonts w:ascii="Calibri" w:hAnsi="Calibri"/>
-          <w:color w:val="1F2933"/>
+          <w:b w:val="0"/>
+          <w:i w:val="0"/>
+          <w:color w:val="1C2737"/>
+          <w:sz w:val="22"/>
         </w:rPr>
-        <w:t>Licensing and state rules were checked.</w:t>
-      </w:r>
-    </w:p>
-    <w:p>
-      <w:pPr>
-        <w:numPr>
-          <w:ilvl w:val="0"/>
-          <w:numId w:val="10"/>
-        </w:numPr>
-        <w:spacing w:after="80" w:line="300" w:lineRule="auto"/>
-      </w:pPr>
-      <w:r>
-        <w:rPr>
-          <w:rFonts w:ascii="Calibri" w:hAnsi="Calibri"/>
-          <w:b/>
-          <w:color w:val="0A2540"/>
-        </w:rPr>
-        <w:t xml:space="preserve">Check: </w:t>
-      </w:r>
-      <w:r>
-        <w:rPr>
-          <w:rFonts w:ascii="Calibri" w:hAnsi="Calibri"/>
-          <w:color w:val="1F2933"/>
-        </w:rPr>
-        <w:t>The purpose and product discussion are permitted.</w:t>
-      </w:r>
-    </w:p>
-    <w:p>
-      <w:pPr>
-        <w:numPr>
-          <w:ilvl w:val="0"/>
-          <w:numId w:val="10"/>
-        </w:numPr>
-        <w:spacing w:after="80" w:line="300" w:lineRule="auto"/>
-      </w:pPr>
-      <w:r>
-        <w:rPr>
-          <w:rFonts w:ascii="Calibri" w:hAnsi="Calibri"/>
-          <w:b/>
-          <w:color w:val="0A2540"/>
-        </w:rPr>
-        <w:t xml:space="preserve">Check: </w:t>
-      </w:r>
-      <w:r>
-        <w:rPr>
-          <w:rFonts w:ascii="Calibri" w:hAnsi="Calibri"/>
-          <w:color w:val="1F2933"/>
-        </w:rPr>
-        <w:t>The record does not rely on a sample or unavailable source.</w:t>
-      </w:r>
-    </w:p>
-    <w:p>
-      <w:pPr>
-        <w:spacing w:before="80" w:after="200" w:line="288" w:lineRule="auto"/>
-        <w:shd w:fill="FFF7E6" w:val="clear"/>
-        <w:pBdr>
-          <w:left w:val="single" w:sz="18" w:space="8" w:color="168F89"/>
-        </w:pBdr>
-        <w:ind w:left="180" w:right="120"/>
-      </w:pPr>
-      <w:r>
-        <w:rPr>
-          <w:rFonts w:ascii="Calibri" w:hAnsi="Calibri"/>
-          <w:b/>
-          <w:color w:val="0A2540"/>
-        </w:rPr>
-        <w:t xml:space="preserve">If any check is missing: </w:t>
-      </w:r>
-      <w:r>
-        <w:rPr>
-          <w:rFonts w:ascii="Calibri" w:hAnsi="Calibri"/>
-          <w:color w:val="1F2933"/>
-        </w:rPr>
-        <w:t>Do more research or stop. The application is designed to make uncertainty visible, not to push every record into a call list.</w:t>
+        <w:t>In the protected workflow, complete suppression, licensing, state-rule, purpose, and channel checks before any call or email.</w:t>
       </w:r>
     </w:p>
     <w:p>
@@ -2481,244 +1071,92 @@
         <w:keepNext/>
       </w:pPr>
       <w:r>
-        <w:t>Five-minute meeting walkthrough</w:t>
+        <w:t>What David Leads never assumes</w:t>
       </w:r>
     </w:p>
     <w:p>
       <w:pPr>
-        <w:spacing w:after="120" w:line="300" w:lineRule="auto"/>
+        <w:pStyle w:val="ListBullet"/>
+        <w:spacing w:after="80" w:line="300" w:lineRule="auto"/>
+        <w:ind w:left="540" w:hanging="271"/>
       </w:pPr>
       <w:r>
         <w:rPr>
           <w:rFonts w:ascii="Calibri" w:hAnsi="Calibri"/>
-          <w:i/>
-          <w:color w:val="5A6B7C"/>
+          <w:b w:val="0"/>
+          <w:i w:val="0"/>
+          <w:color w:val="1C2737"/>
+          <w:sz w:val="22"/>
         </w:rPr>
-        <w:t>Use this sequence when showing David Leads to a broker, manager, or investor.</w:t>
+        <w:t>A public record is not consent or permission to contact.</w:t>
       </w:r>
     </w:p>
     <w:p>
       <w:pPr>
-        <w:numPr>
-          <w:ilvl w:val="0"/>
-          <w:numId w:val="11"/>
-        </w:numPr>
+        <w:pStyle w:val="ListBullet"/>
         <w:spacing w:after="80" w:line="300" w:lineRule="auto"/>
+        <w:ind w:left="540" w:hanging="271"/>
       </w:pPr>
       <w:r>
         <w:rPr>
           <w:rFonts w:ascii="Calibri" w:hAnsi="Calibri"/>
-          <w:color w:val="1F2933"/>
+          <w:b w:val="0"/>
+          <w:i w:val="0"/>
+          <w:color w:val="1C2737"/>
+          <w:sz w:val="22"/>
         </w:rPr>
-        <w:t>Open the app and say: 'This is live organization research from official public records, not a contact list.'</w:t>
+        <w:t>Observed activity is not revenue, intent, insurability, or a deal value.</w:t>
       </w:r>
     </w:p>
     <w:p>
       <w:pPr>
-        <w:numPr>
-          <w:ilvl w:val="0"/>
-          <w:numId w:val="11"/>
-        </w:numPr>
+        <w:pStyle w:val="ListBullet"/>
         <w:spacing w:after="80" w:line="300" w:lineRule="auto"/>
+        <w:ind w:left="540" w:hanging="271"/>
       </w:pPr>
       <w:r>
         <w:rPr>
           <w:rFonts w:ascii="Calibri" w:hAnsi="Calibri"/>
-          <w:color w:val="1F2933"/>
+          <w:b w:val="0"/>
+          <w:i w:val="0"/>
+          <w:color w:val="1C2737"/>
+          <w:sz w:val="22"/>
         </w:rPr>
-        <w:t>Show the 27-state territory selector and focus New York.</w:t>
+        <w:t>The system does not infer health, age, race, religion, family status, or private wealth.</w:t>
       </w:r>
     </w:p>
     <w:p>
       <w:pPr>
-        <w:numPr>
-          <w:ilvl w:val="0"/>
-          <w:numId w:val="11"/>
-        </w:numPr>
+        <w:pStyle w:val="ListBullet"/>
         <w:spacing w:after="80" w:line="300" w:lineRule="auto"/>
+        <w:ind w:left="540" w:hanging="271"/>
       </w:pPr>
       <w:r>
         <w:rPr>
           <w:rFonts w:ascii="Calibri" w:hAnsi="Calibri"/>
-          <w:color w:val="1F2933"/>
+          <w:b w:val="0"/>
+          <w:i w:val="0"/>
+          <w:color w:val="1C2737"/>
+          <w:sz w:val="22"/>
         </w:rPr>
-        <w:t>Point to Live organizations, Source coverage, and Needs research. Explain that unavailable sources stay visible.</w:t>
+        <w:t>The system does not scrape social profiles or use named executives, insiders, signers, or donors as personal wealth leads.</w:t>
       </w:r>
     </w:p>
     <w:p>
       <w:pPr>
-        <w:numPr>
-          <w:ilvl w:val="0"/>
-          <w:numId w:val="11"/>
-        </w:numPr>
+        <w:pStyle w:val="ListBullet"/>
         <w:spacing w:after="80" w:line="300" w:lineRule="auto"/>
+        <w:ind w:left="540" w:hanging="271"/>
       </w:pPr>
       <w:r>
         <w:rPr>
           <w:rFonts w:ascii="Calibri" w:hAnsi="Calibri"/>
-          <w:color w:val="1F2933"/>
+          <w:b w:val="0"/>
+          <w:i w:val="0"/>
+          <w:color w:val="1C2737"/>
+          <w:sz w:val="22"/>
         </w:rPr>
-        <w:t>Open one organization. Read the event, why now, official source, and limitations.</w:t>
-      </w:r>
-    </w:p>
-    <w:p>
-      <w:pPr>
-        <w:numPr>
-          <w:ilvl w:val="0"/>
-          <w:numId w:val="11"/>
-        </w:numPr>
-        <w:spacing w:after="80" w:line="300" w:lineRule="auto"/>
-      </w:pPr>
-      <w:r>
-        <w:rPr>
-          <w:rFonts w:ascii="Calibri" w:hAnsi="Calibri"/>
-          <w:color w:val="1F2933"/>
-        </w:rPr>
-        <w:t>Show the receipt or proof link. Explain that the public record can be checked before use.</w:t>
-      </w:r>
-    </w:p>
-    <w:p>
-      <w:pPr>
-        <w:numPr>
-          <w:ilvl w:val="0"/>
-          <w:numId w:val="11"/>
-        </w:numPr>
-        <w:spacing w:after="80" w:line="300" w:lineRule="auto"/>
-      </w:pPr>
-      <w:r>
-        <w:rPr>
-          <w:rFonts w:ascii="Calibri" w:hAnsi="Calibri"/>
-          <w:color w:val="1F2933"/>
-        </w:rPr>
-        <w:t>End with the contact gate: research is public; outreach still requires protected human clearance.</w:t>
-      </w:r>
-    </w:p>
-    <w:p>
-      <w:pPr>
-        <w:pStyle w:val="Heading2"/>
-        <w:keepNext/>
-      </w:pPr>
-      <w:r>
-        <w:t>A simple opening line</w:t>
-      </w:r>
-    </w:p>
-    <w:p>
-      <w:pPr>
-        <w:spacing w:before="80" w:after="200" w:line="288" w:lineRule="auto"/>
-        <w:shd w:fill="E8EEF5" w:val="clear"/>
-        <w:pBdr>
-          <w:left w:val="single" w:sz="18" w:space="8" w:color="168F89"/>
-        </w:pBdr>
-        <w:ind w:left="180" w:right="120"/>
-      </w:pPr>
-      <w:r>
-        <w:rPr>
-          <w:rFonts w:ascii="Calibri" w:hAnsi="Calibri"/>
-          <w:b/>
-          <w:color w:val="0A2540"/>
-        </w:rPr>
-        <w:t xml:space="preserve">Say: </w:t>
-      </w:r>
-      <w:r>
-        <w:rPr>
-          <w:rFonts w:ascii="Calibri" w:hAnsi="Calibri"/>
-          <w:color w:val="1F2933"/>
-        </w:rPr>
-        <w:t>David Leads helps you decide which organizations to research first, why the timing may matter, and exactly which official record to verify before a compliant conversation.</w:t>
-      </w:r>
-    </w:p>
-    <w:p>
-      <w:pPr>
-        <w:pStyle w:val="Heading2"/>
-        <w:keepNext/>
-      </w:pPr>
-      <w:r>
-        <w:t>What not to claim</w:t>
-      </w:r>
-    </w:p>
-    <w:p>
-      <w:pPr>
-        <w:numPr>
-          <w:ilvl w:val="0"/>
-          <w:numId w:val="10"/>
-        </w:numPr>
-        <w:spacing w:after="80" w:line="300" w:lineRule="auto"/>
-      </w:pPr>
-      <w:r>
-        <w:rPr>
-          <w:rFonts w:ascii="Calibri" w:hAnsi="Calibri"/>
-          <w:color w:val="1F2933"/>
-        </w:rPr>
-        <w:t>Do not say every record is a lead ready to call.</w:t>
-      </w:r>
-    </w:p>
-    <w:p>
-      <w:pPr>
-        <w:numPr>
-          <w:ilvl w:val="0"/>
-          <w:numId w:val="10"/>
-        </w:numPr>
-        <w:spacing w:after="80" w:line="300" w:lineRule="auto"/>
-      </w:pPr>
-      <w:r>
-        <w:rPr>
-          <w:rFonts w:ascii="Calibri" w:hAnsi="Calibri"/>
-          <w:color w:val="1F2933"/>
-        </w:rPr>
-        <w:t>Do not say a filing proves need, dissatisfaction, renewal, eligibility, or buying intent.</w:t>
-      </w:r>
-    </w:p>
-    <w:p>
-      <w:pPr>
-        <w:numPr>
-          <w:ilvl w:val="0"/>
-          <w:numId w:val="10"/>
-        </w:numPr>
-        <w:spacing w:after="80" w:line="300" w:lineRule="auto"/>
-      </w:pPr>
-      <w:r>
-        <w:rPr>
-          <w:rFonts w:ascii="Calibri" w:hAnsi="Calibri"/>
-          <w:color w:val="1F2933"/>
-        </w:rPr>
-        <w:t>Do not say a product fit is a recommendation or quote.</w:t>
-      </w:r>
-    </w:p>
-    <w:p>
-      <w:pPr>
-        <w:numPr>
-          <w:ilvl w:val="0"/>
-          <w:numId w:val="10"/>
-        </w:numPr>
-        <w:spacing w:after="80" w:line="300" w:lineRule="auto"/>
-      </w:pPr>
-      <w:r>
-        <w:rPr>
-          <w:rFonts w:ascii="Calibri" w:hAnsi="Calibri"/>
-          <w:color w:val="1F2933"/>
-        </w:rPr>
-        <w:t>Do not say the system uses private profiles or secret contact data.</w:t>
-      </w:r>
-    </w:p>
-    <w:p>
-      <w:pPr>
-        <w:numPr>
-          <w:ilvl w:val="0"/>
-          <w:numId w:val="10"/>
-        </w:numPr>
-        <w:spacing w:after="80" w:line="300" w:lineRule="auto"/>
-      </w:pPr>
-      <w:r>
-        <w:rPr>
-          <w:rFonts w:ascii="Calibri" w:hAnsi="Calibri"/>
-          <w:color w:val="1F2933"/>
-        </w:rPr>
-        <w:t>Do not call a source LIVE if the coverage panel says UNAVAILABLE.</w:t>
-      </w:r>
-    </w:p>
-    <w:p>
-      <w:r>
-        <w:br w:type="page"/>
+        <w:t>The public view never exposes broker notes, saved channels, clearance decisions, outcomes, or exports.</w:t>
       </w:r>
     </w:p>
     <w:p>
@@ -2727,470 +1165,293 @@
         <w:keepNext/>
       </w:pPr>
       <w:r>
-        <w:t>If something looks wrong</w:t>
+        <w:t>Department of Labor privacy boundary</w:t>
       </w:r>
     </w:p>
-    <w:tbl>
-      <w:tblPr>
-        <w:tblW w:type="dxa" w:w="9360"/>
-        <w:tblLayout w:type="fixed"/>
-        <w:tblLook w:firstColumn="1" w:firstRow="1" w:lastColumn="0" w:lastRow="0" w:noHBand="0" w:noVBand="1" w:val="04A0"/>
-        <w:jc w:val="left"/>
-        <w:tblInd w:w="120" w:type="dxa"/>
-      </w:tblPr>
-      <w:tblGrid>
-        <w:gridCol w:w="3150"/>
-        <w:gridCol w:w="6210"/>
-      </w:tblGrid>
-      <w:tr>
-        <w:trPr>
-          <w:tblHeader w:val="true"/>
-        </w:trPr>
-        <w:tc>
-          <w:tcPr>
-            <w:tcW w:type="dxa" w:w="3150"/>
-            <w:vAlign w:val="center"/>
-            <w:tcMar>
-              <w:top w:w="80" w:type="dxa"/>
-              <w:bottom w:w="80" w:type="dxa"/>
-              <w:start w:w="120" w:type="dxa"/>
-              <w:end w:w="120" w:type="dxa"/>
-            </w:tcMar>
-            <w:shd w:fill="0A2540" w:val="clear"/>
-          </w:tcPr>
-          <w:p>
-            <w:pPr>
-              <w:spacing w:after="0" w:line="276" w:lineRule="auto"/>
-              <w:jc w:val="left"/>
-            </w:pPr>
-            <w:r>
-              <w:rPr>
-                <w:rFonts w:ascii="Calibri" w:hAnsi="Calibri"/>
-                <w:b/>
-                <w:color w:val="FFFFFF"/>
-                <w:sz w:val="21"/>
-              </w:rPr>
-              <w:t>What you see</w:t>
-            </w:r>
-          </w:p>
-        </w:tc>
-        <w:tc>
-          <w:tcPr>
-            <w:tcW w:type="dxa" w:w="6210"/>
-            <w:vAlign w:val="center"/>
-            <w:tcMar>
-              <w:top w:w="80" w:type="dxa"/>
-              <w:bottom w:w="80" w:type="dxa"/>
-              <w:start w:w="120" w:type="dxa"/>
-              <w:end w:w="120" w:type="dxa"/>
-            </w:tcMar>
-            <w:shd w:fill="0A2540" w:val="clear"/>
-          </w:tcPr>
-          <w:p>
-            <w:pPr>
-              <w:spacing w:after="0" w:line="276" w:lineRule="auto"/>
-              <w:jc w:val="left"/>
-            </w:pPr>
-            <w:r>
-              <w:rPr>
-                <w:rFonts w:ascii="Calibri" w:hAnsi="Calibri"/>
-                <w:b/>
-                <w:color w:val="FFFFFF"/>
-                <w:sz w:val="21"/>
-              </w:rPr>
-              <w:t>What to do</w:t>
-            </w:r>
-          </w:p>
-        </w:tc>
-      </w:tr>
-      <w:tr>
-        <w:tc>
-          <w:tcPr>
-            <w:tcW w:type="dxa" w:w="3150"/>
-            <w:vAlign w:val="center"/>
-            <w:tcMar>
-              <w:top w:w="80" w:type="dxa"/>
-              <w:bottom w:w="80" w:type="dxa"/>
-              <w:start w:w="120" w:type="dxa"/>
-              <w:end w:w="120" w:type="dxa"/>
-            </w:tcMar>
-          </w:tcPr>
-          <w:p>
-            <w:pPr>
-              <w:spacing w:after="0" w:line="276" w:lineRule="auto"/>
-              <w:jc w:val="left"/>
-            </w:pPr>
-            <w:r>
-              <w:rPr>
-                <w:rFonts w:ascii="Calibri" w:hAnsi="Calibri"/>
-                <w:b/>
-                <w:color w:val="0A2540"/>
-                <w:sz w:val="21"/>
-              </w:rPr>
-              <w:t>The page is still opening</w:t>
-            </w:r>
-          </w:p>
-        </w:tc>
-        <w:tc>
-          <w:tcPr>
-            <w:tcW w:type="dxa" w:w="6210"/>
-            <w:vAlign w:val="center"/>
-            <w:tcMar>
-              <w:top w:w="80" w:type="dxa"/>
-              <w:bottom w:w="80" w:type="dxa"/>
-              <w:start w:w="120" w:type="dxa"/>
-              <w:end w:w="120" w:type="dxa"/>
-            </w:tcMar>
-          </w:tcPr>
-          <w:p>
-            <w:pPr>
-              <w:spacing w:after="0" w:line="276" w:lineRule="auto"/>
-              <w:jc w:val="left"/>
-            </w:pPr>
-            <w:r>
-              <w:rPr>
-                <w:rFonts w:ascii="Calibri" w:hAnsi="Calibri"/>
-                <w:b w:val="0"/>
-                <w:color w:val="1F2933"/>
-                <w:sz w:val="21"/>
-              </w:rPr>
-              <w:t>Wait for the opening screen to disappear, then refresh once.</w:t>
-            </w:r>
-          </w:p>
-        </w:tc>
-      </w:tr>
-      <w:tr>
-        <w:tc>
-          <w:tcPr>
-            <w:tcW w:type="dxa" w:w="3150"/>
-            <w:shd w:fill="F5F8FB" w:val="clear"/>
-            <w:vAlign w:val="center"/>
-            <w:tcMar>
-              <w:top w:w="80" w:type="dxa"/>
-              <w:bottom w:w="80" w:type="dxa"/>
-              <w:start w:w="120" w:type="dxa"/>
-              <w:end w:w="120" w:type="dxa"/>
-            </w:tcMar>
-          </w:tcPr>
-          <w:p>
-            <w:pPr>
-              <w:spacing w:after="0" w:line="276" w:lineRule="auto"/>
-              <w:jc w:val="left"/>
-            </w:pPr>
-            <w:r>
-              <w:rPr>
-                <w:rFonts w:ascii="Calibri" w:hAnsi="Calibri"/>
-                <w:b/>
-                <w:color w:val="0A2540"/>
-                <w:sz w:val="21"/>
-              </w:rPr>
-              <w:t>A source says UNAVAILABLE</w:t>
-            </w:r>
-          </w:p>
-        </w:tc>
-        <w:tc>
-          <w:tcPr>
-            <w:tcW w:type="dxa" w:w="6210"/>
-            <w:shd w:fill="F5F8FB" w:val="clear"/>
-            <w:vAlign w:val="center"/>
-            <w:tcMar>
-              <w:top w:w="80" w:type="dxa"/>
-              <w:bottom w:w="80" w:type="dxa"/>
-              <w:start w:w="120" w:type="dxa"/>
-              <w:end w:w="120" w:type="dxa"/>
-            </w:tcMar>
-          </w:tcPr>
-          <w:p>
-            <w:pPr>
-              <w:spacing w:after="0" w:line="276" w:lineRule="auto"/>
-              <w:jc w:val="left"/>
-            </w:pPr>
-            <w:r>
-              <w:rPr>
-                <w:rFonts w:ascii="Calibri" w:hAnsi="Calibri"/>
-                <w:b w:val="0"/>
-                <w:color w:val="1F2933"/>
-                <w:sz w:val="21"/>
-              </w:rPr>
-              <w:t>Use another live source or return later. Do not treat the outage as a zero or a live result.</w:t>
-            </w:r>
-          </w:p>
-        </w:tc>
-      </w:tr>
-      <w:tr>
-        <w:tc>
-          <w:tcPr>
-            <w:tcW w:type="dxa" w:w="3150"/>
-            <w:vAlign w:val="center"/>
-            <w:tcMar>
-              <w:top w:w="80" w:type="dxa"/>
-              <w:bottom w:w="80" w:type="dxa"/>
-              <w:start w:w="120" w:type="dxa"/>
-              <w:end w:w="120" w:type="dxa"/>
-            </w:tcMar>
-          </w:tcPr>
-          <w:p>
-            <w:pPr>
-              <w:spacing w:after="0" w:line="276" w:lineRule="auto"/>
-              <w:jc w:val="left"/>
-            </w:pPr>
-            <w:r>
-              <w:rPr>
-                <w:rFonts w:ascii="Calibri" w:hAnsi="Calibri"/>
-                <w:b/>
-                <w:color w:val="0A2540"/>
-                <w:sz w:val="21"/>
-              </w:rPr>
-              <w:t>A state has few records</w:t>
-            </w:r>
-          </w:p>
-        </w:tc>
-        <w:tc>
-          <w:tcPr>
-            <w:tcW w:type="dxa" w:w="6210"/>
-            <w:vAlign w:val="center"/>
-            <w:tcMar>
-              <w:top w:w="80" w:type="dxa"/>
-              <w:bottom w:w="80" w:type="dxa"/>
-              <w:start w:w="120" w:type="dxa"/>
-              <w:end w:w="120" w:type="dxa"/>
-            </w:tcMar>
-          </w:tcPr>
-          <w:p>
-            <w:pPr>
-              <w:spacing w:after="0" w:line="276" w:lineRule="auto"/>
-              <w:jc w:val="left"/>
-            </w:pPr>
-            <w:r>
-              <w:rPr>
-                <w:rFonts w:ascii="Calibri" w:hAnsi="Calibri"/>
-                <w:b w:val="0"/>
-                <w:color w:val="1F2933"/>
-                <w:sz w:val="21"/>
-              </w:rPr>
-              <w:t>Select that one state to run the deeper state-specific pull.</w:t>
-            </w:r>
-          </w:p>
-        </w:tc>
-      </w:tr>
-      <w:tr>
-        <w:tc>
-          <w:tcPr>
-            <w:tcW w:type="dxa" w:w="3150"/>
-            <w:shd w:fill="F5F8FB" w:val="clear"/>
-            <w:vAlign w:val="center"/>
-            <w:tcMar>
-              <w:top w:w="80" w:type="dxa"/>
-              <w:bottom w:w="80" w:type="dxa"/>
-              <w:start w:w="120" w:type="dxa"/>
-              <w:end w:w="120" w:type="dxa"/>
-            </w:tcMar>
-          </w:tcPr>
-          <w:p>
-            <w:pPr>
-              <w:spacing w:after="0" w:line="276" w:lineRule="auto"/>
-              <w:jc w:val="left"/>
-            </w:pPr>
-            <w:r>
-              <w:rPr>
-                <w:rFonts w:ascii="Calibri" w:hAnsi="Calibri"/>
-                <w:b/>
-                <w:color w:val="0A2540"/>
-                <w:sz w:val="21"/>
-              </w:rPr>
-              <w:t>The count changed</w:t>
-            </w:r>
-          </w:p>
-        </w:tc>
-        <w:tc>
-          <w:tcPr>
-            <w:tcW w:type="dxa" w:w="6210"/>
-            <w:shd w:fill="F5F8FB" w:val="clear"/>
-            <w:vAlign w:val="center"/>
-            <w:tcMar>
-              <w:top w:w="80" w:type="dxa"/>
-              <w:bottom w:w="80" w:type="dxa"/>
-              <w:start w:w="120" w:type="dxa"/>
-              <w:end w:w="120" w:type="dxa"/>
-            </w:tcMar>
-          </w:tcPr>
-          <w:p>
-            <w:pPr>
-              <w:spacing w:after="0" w:line="276" w:lineRule="auto"/>
-              <w:jc w:val="left"/>
-            </w:pPr>
-            <w:r>
-              <w:rPr>
-                <w:rFonts w:ascii="Calibri" w:hAnsi="Calibri"/>
-                <w:b w:val="0"/>
-                <w:color w:val="1F2933"/>
-                <w:sz w:val="21"/>
-              </w:rPr>
-              <w:t>That is expected. Counts follow current public-source responses and the chosen territory.</w:t>
-            </w:r>
-          </w:p>
-        </w:tc>
-      </w:tr>
-      <w:tr>
-        <w:tc>
-          <w:tcPr>
-            <w:tcW w:type="dxa" w:w="3150"/>
-            <w:vAlign w:val="center"/>
-            <w:tcMar>
-              <w:top w:w="80" w:type="dxa"/>
-              <w:bottom w:w="80" w:type="dxa"/>
-              <w:start w:w="120" w:type="dxa"/>
-              <w:end w:w="120" w:type="dxa"/>
-            </w:tcMar>
-          </w:tcPr>
-          <w:p>
-            <w:pPr>
-              <w:spacing w:after="0" w:line="276" w:lineRule="auto"/>
-              <w:jc w:val="left"/>
-            </w:pPr>
-            <w:r>
-              <w:rPr>
-                <w:rFonts w:ascii="Calibri" w:hAnsi="Calibri"/>
-                <w:b/>
-                <w:color w:val="0A2540"/>
-                <w:sz w:val="21"/>
-              </w:rPr>
-              <w:t>A record looks surprising</w:t>
-            </w:r>
-          </w:p>
-        </w:tc>
-        <w:tc>
-          <w:tcPr>
-            <w:tcW w:type="dxa" w:w="6210"/>
-            <w:vAlign w:val="center"/>
-            <w:tcMar>
-              <w:top w:w="80" w:type="dxa"/>
-              <w:bottom w:w="80" w:type="dxa"/>
-              <w:start w:w="120" w:type="dxa"/>
-              <w:end w:w="120" w:type="dxa"/>
-            </w:tcMar>
-          </w:tcPr>
-          <w:p>
-            <w:pPr>
-              <w:spacing w:after="0" w:line="276" w:lineRule="auto"/>
-              <w:jc w:val="left"/>
-            </w:pPr>
-            <w:r>
-              <w:rPr>
-                <w:rFonts w:ascii="Calibri" w:hAnsi="Calibri"/>
-                <w:b w:val="0"/>
-                <w:color w:val="1F2933"/>
-                <w:sz w:val="21"/>
-              </w:rPr>
-              <w:t>Open the official source and confirm it. If it cannot be confirmed, do not use it.</w:t>
-            </w:r>
-          </w:p>
-        </w:tc>
-      </w:tr>
-      <w:tr>
-        <w:tc>
-          <w:tcPr>
-            <w:tcW w:type="dxa" w:w="3150"/>
-            <w:shd w:fill="F5F8FB" w:val="clear"/>
-            <w:vAlign w:val="center"/>
-            <w:tcMar>
-              <w:top w:w="80" w:type="dxa"/>
-              <w:bottom w:w="80" w:type="dxa"/>
-              <w:start w:w="120" w:type="dxa"/>
-              <w:end w:w="120" w:type="dxa"/>
-            </w:tcMar>
-          </w:tcPr>
-          <w:p>
-            <w:pPr>
-              <w:spacing w:after="0" w:line="276" w:lineRule="auto"/>
-              <w:jc w:val="left"/>
-            </w:pPr>
-            <w:r>
-              <w:rPr>
-                <w:rFonts w:ascii="Calibri" w:hAnsi="Calibri"/>
-                <w:b/>
-                <w:color w:val="0A2540"/>
-                <w:sz w:val="21"/>
-              </w:rPr>
-              <w:t>You need saved notes or outreach actions</w:t>
-            </w:r>
-          </w:p>
-        </w:tc>
-        <w:tc>
-          <w:tcPr>
-            <w:tcW w:type="dxa" w:w="6210"/>
-            <w:shd w:fill="F5F8FB" w:val="clear"/>
-            <w:vAlign w:val="center"/>
-            <w:tcMar>
-              <w:top w:w="80" w:type="dxa"/>
-              <w:bottom w:w="80" w:type="dxa"/>
-              <w:start w:w="120" w:type="dxa"/>
-              <w:end w:w="120" w:type="dxa"/>
-            </w:tcMar>
-          </w:tcPr>
-          <w:p>
-            <w:pPr>
-              <w:spacing w:after="0" w:line="276" w:lineRule="auto"/>
-              <w:jc w:val="left"/>
-            </w:pPr>
-            <w:r>
-              <w:rPr>
-                <w:rFonts w:ascii="Calibri" w:hAnsi="Calibri"/>
-                <w:b w:val="0"/>
-                <w:color w:val="1F2933"/>
-                <w:sz w:val="21"/>
-              </w:rPr>
-              <w:t>Those functions belong in the protected broker workflow and are not exposed in the public research view.</w:t>
-            </w:r>
-          </w:p>
-        </w:tc>
-      </w:tr>
-    </w:tbl>
+    <w:p>
+      <w:pPr>
+        <w:spacing w:before="0" w:after="120" w:line="300" w:lineRule="auto"/>
+      </w:pPr>
+      <w:r>
+        <w:rPr>
+          <w:rFonts w:ascii="Calibri" w:hAnsi="Calibri"/>
+          <w:b w:val="0"/>
+          <w:i w:val="0"/>
+          <w:color w:val="1C2737"/>
+          <w:sz w:val="22"/>
+        </w:rPr>
+        <w:t>The life-plan lane keeps only the organization, public location, plan-period dates, participant count, reported carriers, and benefit categories needed for the research card.</w:t>
+      </w:r>
+    </w:p>
+    <w:p>
+      <w:pPr>
+        <w:spacing w:before="80" w:after="200" w:line="288" w:lineRule="auto"/>
+        <w:ind w:left="173" w:right="173"/>
+        <w:shd w:fill="FFF7E5"/>
+        <w:pBdr>
+          <w:left w:val="single" w:sz="18" w:space="8" w:color="B78921"/>
+        </w:pBdr>
+      </w:pPr>
+      <w:r>
+        <w:rPr>
+          <w:rFonts w:ascii="Calibri" w:hAnsi="Calibri"/>
+          <w:b/>
+          <w:i w:val="0"/>
+          <w:color w:val="0B2545"/>
+          <w:sz w:val="22"/>
+        </w:rPr>
+        <w:t xml:space="preserve">Excluded: </w:t>
+      </w:r>
+      <w:r>
+        <w:rPr>
+          <w:rFonts w:ascii="Calibri" w:hAnsi="Calibri"/>
+          <w:b w:val="0"/>
+          <w:i w:val="0"/>
+          <w:color w:val="1C2737"/>
+          <w:sz w:val="22"/>
+        </w:rPr>
+        <w:t>EINs, phone numbers, named administrators and signers, preparers, broker identities, commissions, and person-level addresses are not retained.</w:t>
+      </w:r>
+    </w:p>
     <w:p>
       <w:pPr>
         <w:pStyle w:val="Heading1"/>
         <w:keepNext/>
       </w:pPr>
       <w:r>
-        <w:t>The one rule to remember</w:t>
+        <w:t>When a source is unavailable</w:t>
+      </w:r>
+    </w:p>
+    <w:p>
+      <w:pPr>
+        <w:spacing w:after="120" w:line="300" w:lineRule="auto"/>
+        <w:ind w:left="540" w:hanging="271"/>
+      </w:pPr>
+      <w:r>
+        <w:rPr>
+          <w:rFonts w:ascii="Calibri" w:hAnsi="Calibri"/>
+          <w:b/>
+          <w:i w:val="0"/>
+          <w:color w:val="0B2545"/>
+          <w:sz w:val="22"/>
+        </w:rPr>
+        <w:t xml:space="preserve">1. </w:t>
+      </w:r>
+      <w:r>
+        <w:rPr>
+          <w:rFonts w:ascii="Calibri" w:hAnsi="Calibri"/>
+          <w:b/>
+          <w:i w:val="0"/>
+          <w:color w:val="0B2545"/>
+          <w:sz w:val="22"/>
+        </w:rPr>
+        <w:t xml:space="preserve">Open Market coverage. </w:t>
+      </w:r>
+      <w:r>
+        <w:rPr>
+          <w:rFonts w:ascii="Calibri" w:hAnsi="Calibri"/>
+          <w:b w:val="0"/>
+          <w:i w:val="0"/>
+          <w:color w:val="1C2737"/>
+          <w:sz w:val="22"/>
+        </w:rPr>
+        <w:t>Each source reports LIVE, UNAVAILABLE, or NOT APPLICABLE.</w:t>
+      </w:r>
+    </w:p>
+    <w:p>
+      <w:pPr>
+        <w:spacing w:after="120" w:line="300" w:lineRule="auto"/>
+        <w:ind w:left="540" w:hanging="271"/>
+      </w:pPr>
+      <w:r>
+        <w:rPr>
+          <w:rFonts w:ascii="Calibri" w:hAnsi="Calibri"/>
+          <w:b/>
+          <w:i w:val="0"/>
+          <w:color w:val="0B2545"/>
+          <w:sz w:val="22"/>
+        </w:rPr>
+        <w:t xml:space="preserve">2. </w:t>
+      </w:r>
+      <w:r>
+        <w:rPr>
+          <w:rFonts w:ascii="Calibri" w:hAnsi="Calibri"/>
+          <w:b/>
+          <w:i w:val="0"/>
+          <w:color w:val="0B2545"/>
+          <w:sz w:val="22"/>
+        </w:rPr>
+        <w:t xml:space="preserve">Read the reason. </w:t>
+      </w:r>
+      <w:r>
+        <w:rPr>
+          <w:rFonts w:ascii="Calibri" w:hAnsi="Calibri"/>
+          <w:b w:val="0"/>
+          <w:i w:val="0"/>
+          <w:color w:val="1C2737"/>
+          <w:sz w:val="22"/>
+        </w:rPr>
+        <w:t>A missing credential, source outage, or territory mismatch remains visible.</w:t>
+      </w:r>
+    </w:p>
+    <w:p>
+      <w:pPr>
+        <w:spacing w:after="120" w:line="300" w:lineRule="auto"/>
+        <w:ind w:left="540" w:hanging="271"/>
+      </w:pPr>
+      <w:r>
+        <w:rPr>
+          <w:rFonts w:ascii="Calibri" w:hAnsi="Calibri"/>
+          <w:b/>
+          <w:i w:val="0"/>
+          <w:color w:val="0B2545"/>
+          <w:sz w:val="22"/>
+        </w:rPr>
+        <w:t xml:space="preserve">3. </w:t>
+      </w:r>
+      <w:r>
+        <w:rPr>
+          <w:rFonts w:ascii="Calibri" w:hAnsi="Calibri"/>
+          <w:b/>
+          <w:i w:val="0"/>
+          <w:color w:val="0B2545"/>
+          <w:sz w:val="22"/>
+        </w:rPr>
+        <w:t xml:space="preserve">Do not work around it. </w:t>
+      </w:r>
+      <w:r>
+        <w:rPr>
+          <w:rFonts w:ascii="Calibri" w:hAnsi="Calibri"/>
+          <w:b w:val="0"/>
+          <w:i w:val="0"/>
+          <w:color w:val="1C2737"/>
+          <w:sz w:val="22"/>
+        </w:rPr>
+        <w:t>The application never substitutes a fake lead for an unavailable source.</w:t>
+      </w:r>
+    </w:p>
+    <w:p>
+      <w:pPr>
+        <w:pStyle w:val="Heading1"/>
+        <w:keepNext/>
+      </w:pPr>
+      <w:r>
+        <w:t>Best practice before every outreach decision</w:t>
+      </w:r>
+    </w:p>
+    <w:p>
+      <w:pPr>
+        <w:pStyle w:val="ListBullet"/>
+        <w:spacing w:after="80" w:line="300" w:lineRule="auto"/>
+        <w:ind w:left="540" w:hanging="271"/>
+      </w:pPr>
+      <w:r>
+        <w:rPr>
+          <w:rFonts w:ascii="Calibri" w:hAnsi="Calibri"/>
+          <w:b w:val="0"/>
+          <w:i w:val="0"/>
+          <w:color w:val="1C2737"/>
+          <w:sz w:val="22"/>
+        </w:rPr>
+        <w:t>Confirm the official record is current.</w:t>
+      </w:r>
+    </w:p>
+    <w:p>
+      <w:pPr>
+        <w:pStyle w:val="ListBullet"/>
+        <w:spacing w:after="80" w:line="300" w:lineRule="auto"/>
+        <w:ind w:left="540" w:hanging="271"/>
+      </w:pPr>
+      <w:r>
+        <w:rPr>
+          <w:rFonts w:ascii="Calibri" w:hAnsi="Calibri"/>
+          <w:b w:val="0"/>
+          <w:i w:val="0"/>
+          <w:color w:val="1C2737"/>
+          <w:sz w:val="22"/>
+        </w:rPr>
+        <w:t>Confirm the product and jurisdiction are within David’s approved scope.</w:t>
+      </w:r>
+    </w:p>
+    <w:p>
+      <w:pPr>
+        <w:pStyle w:val="ListBullet"/>
+        <w:spacing w:after="80" w:line="300" w:lineRule="auto"/>
+        <w:ind w:left="540" w:hanging="271"/>
+      </w:pPr>
+      <w:r>
+        <w:rPr>
+          <w:rFonts w:ascii="Calibri" w:hAnsi="Calibri"/>
+          <w:b w:val="0"/>
+          <w:i w:val="0"/>
+          <w:color w:val="1C2737"/>
+          <w:sz w:val="22"/>
+        </w:rPr>
+        <w:t>Use only a business-published channel from the organization’s own website.</w:t>
+      </w:r>
+    </w:p>
+    <w:p>
+      <w:pPr>
+        <w:pStyle w:val="ListBullet"/>
+        <w:spacing w:after="80" w:line="300" w:lineRule="auto"/>
+        <w:ind w:left="540" w:hanging="271"/>
+      </w:pPr>
+      <w:r>
+        <w:rPr>
+          <w:rFonts w:ascii="Calibri" w:hAnsi="Calibri"/>
+          <w:b w:val="0"/>
+          <w:i w:val="0"/>
+          <w:color w:val="1C2737"/>
+          <w:sz w:val="22"/>
+        </w:rPr>
+        <w:t>Complete all suppression, licensing, state-rule, and purpose checks.</w:t>
+      </w:r>
+    </w:p>
+    <w:p>
+      <w:pPr>
+        <w:pStyle w:val="ListBullet"/>
+        <w:spacing w:after="80" w:line="300" w:lineRule="auto"/>
+        <w:ind w:left="540" w:hanging="271"/>
+      </w:pPr>
+      <w:r>
+        <w:rPr>
+          <w:rFonts w:ascii="Calibri" w:hAnsi="Calibri"/>
+          <w:b w:val="0"/>
+          <w:i w:val="0"/>
+          <w:color w:val="1C2737"/>
+          <w:sz w:val="22"/>
+        </w:rPr>
+        <w:t>Record time-limited clearance in the protected workflow.</w:t>
       </w:r>
     </w:p>
     <w:p>
       <w:pPr>
         <w:spacing w:before="80" w:after="200" w:line="288" w:lineRule="auto"/>
-        <w:shd w:fill="E8F6F4" w:val="clear"/>
+        <w:ind w:left="173" w:right="173"/>
+        <w:shd w:fill="E7F5F3"/>
         <w:pBdr>
-          <w:left w:val="single" w:sz="18" w:space="8" w:color="168F89"/>
+          <w:left w:val="single" w:sz="18" w:space="8" w:color="148984"/>
         </w:pBdr>
-        <w:ind w:left="180" w:right="120"/>
       </w:pPr>
       <w:r>
         <w:rPr>
           <w:rFonts w:ascii="Calibri" w:hAnsi="Calibri"/>
           <w:b/>
-          <w:color w:val="0A2540"/>
+          <w:i w:val="0"/>
+          <w:color w:val="0B2545"/>
+          <w:sz w:val="22"/>
         </w:rPr>
-        <w:t xml:space="preserve">Use David Leads to decide what to research first. </w:t>
+        <w:t xml:space="preserve">Remember: </w:t>
       </w:r>
       <w:r>
         <w:rPr>
           <w:rFonts w:ascii="Calibri" w:hAnsi="Calibri"/>
-          <w:color w:val="1F2933"/>
+          <w:b w:val="0"/>
+          <w:i w:val="0"/>
+          <w:color w:val="1C2737"/>
+          <w:sz w:val="22"/>
         </w:rPr>
-        <w:t>Use the official record to verify why. Use the protected clearance process to decide whether contact is permitted.</w:t>
-      </w:r>
-    </w:p>
-    <w:p>
-      <w:pPr>
-        <w:spacing w:after="120" w:line="300" w:lineRule="auto"/>
-      </w:pPr>
-      <w:r>
-        <w:rPr>
-          <w:rFonts w:ascii="Calibri" w:hAnsi="Calibri"/>
-          <w:i/>
-          <w:color w:val="5A6B7C"/>
-        </w:rPr>
-        <w:t>Public organization data only. No passwords or access keys are printed in this guide.</w:t>
+        <w:t>The software helps David focus his research. David’s licensed judgment and the protected clearance process decide whether any next action is appropriate.</w:t>
       </w:r>
     </w:p>
     <w:sectPr>
@@ -3210,24 +1471,22 @@
   <w:p>
     <w:pPr>
       <w:pStyle w:val="Footer"/>
+      <w:spacing w:before="0" w:after="0"/>
       <w:jc w:val="right"/>
     </w:pPr>
     <w:r>
       <w:rPr>
         <w:rFonts w:ascii="Calibri" w:hAnsi="Calibri"/>
-        <w:color w:val="5A6B7C"/>
+        <w:b w:val="0"/>
+        <w:i w:val="0"/>
+        <w:color w:val="5C697A"/>
         <w:sz w:val="17"/>
       </w:rPr>
-      <w:t xml:space="preserve">Verified operating guide  |  August 2026  |  </w:t>
+      <w:t xml:space="preserve">David Leads | Broker Guide   •   Page </w:t>
     </w:r>
     <w:r>
-      <w:rPr>
-        <w:rFonts w:ascii="Calibri" w:hAnsi="Calibri"/>
-        <w:color w:val="5A6B7C"/>
-        <w:sz w:val="18"/>
-      </w:rPr>
       <w:fldChar w:fldCharType="begin"/>
-      <w:instrText xml:space="preserve"> PAGE </w:instrText>
+      <w:instrText xml:space="preserve">PAGE</w:instrText>
       <w:fldChar w:fldCharType="separate"/>
       <w:t>1</w:t>
       <w:fldChar w:fldCharType="end"/>
@@ -3248,10 +1507,21 @@
       <w:rPr>
         <w:rFonts w:ascii="Calibri" w:hAnsi="Calibri"/>
         <w:b/>
-        <w:color w:val="5A6B7C"/>
+        <w:i w:val="0"/>
+        <w:color w:val="148984"/>
         <w:sz w:val="17"/>
       </w:rPr>
-      <w:t>DAVID LEADS  |  BROKER FIELD GUIDE</w:t>
+      <w:t>DAVID LEADS</w:t>
+    </w:r>
+    <w:r>
+      <w:rPr>
+        <w:rFonts w:ascii="Calibri" w:hAnsi="Calibri"/>
+        <w:b w:val="0"/>
+        <w:i w:val="0"/>
+        <w:color w:val="5C697A"/>
+        <w:sz w:val="17"/>
+      </w:rPr>
+      <w:t xml:space="preserve">   |   Evidence-Backed Broker Research</w:t>
     </w:r>
   </w:p>
 </w:hdr>
@@ -3456,50 +1726,6 @@
   </w:num>
   <w:num w:numId="9">
     <w:abstractNumId w:val="0"/>
-  </w:num>
-  <w:abstractNum w:abstractNumId="9">
-    <w:multiLevelType w:val="singleLevel"/>
-    <w:lvl w:ilvl="0">
-      <w:start w:val="1"/>
-      <w:numFmt w:val="bullet"/>
-      <w:lvlText w:val="•"/>
-      <w:suff w:val="tab"/>
-      <w:pPr>
-        <w:tabs>
-          <w:tab w:val="num" w:pos="540"/>
-        </w:tabs>
-        <w:ind w:left="540" w:hanging="270"/>
-        <w:spacing w:after="80" w:line="300" w:lineRule="auto"/>
-      </w:pPr>
-      <w:rPr>
-        <w:rFonts w:ascii="Calibri" w:hAnsi="Calibri"/>
-      </w:rPr>
-    </w:lvl>
-  </w:abstractNum>
-  <w:num w:numId="10">
-    <w:abstractNumId w:val="9"/>
-  </w:num>
-  <w:abstractNum w:abstractNumId="10">
-    <w:multiLevelType w:val="singleLevel"/>
-    <w:lvl w:ilvl="0">
-      <w:start w:val="1"/>
-      <w:numFmt w:val="decimal"/>
-      <w:lvlText w:val="%1."/>
-      <w:suff w:val="tab"/>
-      <w:pPr>
-        <w:tabs>
-          <w:tab w:val="num" w:pos="540"/>
-        </w:tabs>
-        <w:ind w:left="540" w:hanging="270"/>
-        <w:spacing w:after="80" w:line="300" w:lineRule="auto"/>
-      </w:pPr>
-      <w:rPr>
-        <w:rFonts w:ascii="Calibri" w:hAnsi="Calibri"/>
-      </w:rPr>
-    </w:lvl>
-  </w:abstractNum>
-  <w:num w:numId="11">
-    <w:abstractNumId w:val="10"/>
   </w:num>
 </w:numbering>
 </file>
@@ -3669,7 +1895,7 @@
     </w:pPr>
     <w:rPr>
       <w:rFonts w:ascii="Calibri" w:hAnsi="Calibri"/>
-      <w:color w:val="1F2933"/>
+      <w:color w:val="1C2737"/>
       <w:sz w:val="22"/>
     </w:rPr>
   </w:style>
@@ -3735,7 +1961,7 @@
       <w:rFonts w:asciiTheme="majorHAnsi" w:eastAsiaTheme="majorEastAsia" w:hAnsiTheme="majorHAnsi" w:cstheme="majorBidi" w:ascii="Calibri" w:hAnsi="Calibri"/>
       <w:b/>
       <w:bCs/>
-      <w:color w:val="0A2540"/>
+      <w:color w:val="2E74B5"/>
       <w:sz w:val="32"/>
       <w:szCs w:val="28"/>
     </w:rPr>
@@ -3759,7 +1985,7 @@
       <w:rFonts w:asciiTheme="majorHAnsi" w:eastAsiaTheme="majorEastAsia" w:hAnsiTheme="majorHAnsi" w:cstheme="majorBidi" w:ascii="Calibri" w:hAnsi="Calibri"/>
       <w:b/>
       <w:bCs/>
-      <w:color w:val="168F89"/>
+      <w:color w:val="2E74B5"/>
       <w:sz w:val="26"/>
       <w:szCs w:val="26"/>
     </w:rPr>
@@ -3783,7 +2009,7 @@
       <w:rFonts w:asciiTheme="majorHAnsi" w:eastAsiaTheme="majorEastAsia" w:hAnsiTheme="majorHAnsi" w:cstheme="majorBidi" w:ascii="Calibri" w:hAnsi="Calibri"/>
       <w:b/>
       <w:bCs/>
-      <w:color w:val="0A2540"/>
+      <w:color w:val="1F4D78"/>
       <w:sz w:val="24"/>
     </w:rPr>
   </w:style>
@@ -4018,16 +2244,15 @@
       <w:pBdr>
         <w:bottom w:val="single" w:sz="8" w:space="4" w:color="4F81BD" w:themeColor="accent1"/>
       </w:pBdr>
-      <w:spacing w:after="160" w:line="240" w:lineRule="auto" w:before="0"/>
+      <w:spacing w:after="300" w:line="240" w:lineRule="auto"/>
       <w:contextualSpacing/>
     </w:pPr>
     <w:rPr>
-      <w:rFonts w:asciiTheme="majorHAnsi" w:eastAsiaTheme="majorEastAsia" w:hAnsiTheme="majorHAnsi" w:cstheme="majorBidi" w:ascii="Calibri" w:hAnsi="Calibri"/>
-      <w:b/>
-      <w:color w:val="0A2540"/>
+      <w:rFonts w:asciiTheme="majorHAnsi" w:eastAsiaTheme="majorEastAsia" w:hAnsiTheme="majorHAnsi" w:cstheme="majorBidi"/>
+      <w:color w:val="17365D" w:themeColor="text2" w:themeShade="BF"/>
       <w:spacing w:val="5"/>
       <w:kern w:val="28"/>
-      <w:sz w:val="56"/>
+      <w:sz w:val="52"/>
       <w:szCs w:val="52"/>
     </w:rPr>
   </w:style>
@@ -4058,15 +2283,14 @@
       <w:numPr>
         <w:ilvl w:val="1"/>
       </w:numPr>
-      <w:spacing w:after="360"/>
     </w:pPr>
     <w:rPr>
-      <w:rFonts w:asciiTheme="majorHAnsi" w:eastAsiaTheme="majorEastAsia" w:hAnsiTheme="majorHAnsi" w:cstheme="majorBidi" w:ascii="Calibri" w:hAnsi="Calibri"/>
+      <w:rFonts w:asciiTheme="majorHAnsi" w:eastAsiaTheme="majorEastAsia" w:hAnsiTheme="majorHAnsi" w:cstheme="majorBidi"/>
       <w:i/>
       <w:iCs/>
-      <w:color w:val="5A6B7C"/>
+      <w:color w:val="4F81BD" w:themeColor="accent1"/>
       <w:spacing w:val="15"/>
-      <w:sz w:val="27"/>
+      <w:sz w:val="24"/>
       <w:szCs w:val="24"/>
     </w:rPr>
   </w:style>
@@ -4202,8 +2426,14 @@
       <w:numPr>
         <w:numId w:val="1"/>
       </w:numPr>
+      <w:spacing w:after="80" w:line="300" w:lineRule="auto"/>
+      <w:ind w:left="540" w:hanging="271"/>
       <w:contextualSpacing/>
     </w:pPr>
+    <w:rPr>
+      <w:rFonts w:ascii="Calibri" w:hAnsi="Calibri"/>
+      <w:sz w:val="22"/>
+    </w:rPr>
   </w:style>
   <w:style w:type="paragraph" w:styleId="ListBullet2">
     <w:name w:val="List Bullet 2"/>
@@ -4241,8 +2471,14 @@
       <w:numPr>
         <w:numId w:val="5"/>
       </w:numPr>
+      <w:spacing w:after="80" w:line="300" w:lineRule="auto"/>
+      <w:ind w:left="540" w:hanging="271"/>
       <w:contextualSpacing/>
     </w:pPr>
+    <w:rPr>
+      <w:rFonts w:ascii="Calibri" w:hAnsi="Calibri"/>
+      <w:sz w:val="22"/>
+    </w:rPr>
   </w:style>
   <w:style w:type="paragraph" w:styleId="ListNumber2">
     <w:name w:val="List Number 2"/>

</xml_diff>